<commit_message>
continued working on the spell checker
</commit_message>
<xml_diff>
--- a/project_writeup/FinalReportV1.docx
+++ b/project_writeup/FinalReportV1.docx
@@ -377,7 +377,7 @@
           </mc:Choice>
           <mc:Fallback>
             <w:pict>
-              <v:line w14:anchorId="68BE0BCB" id="Straight Connector 4" o:spid="_x0000_s1026" style="position:absolute;z-index:251659264;visibility:visible;mso-wrap-style:square;mso-width-percent:0;mso-height-percent:0;mso-wrap-distance-left:9pt;mso-wrap-distance-top:0;mso-wrap-distance-right:9pt;mso-wrap-distance-bottom:0;mso-position-horizontal:absolute;mso-position-horizontal-relative:page;mso-position-vertical:absolute;mso-position-vertical-relative:page;mso-width-percent:0;mso-height-percent:0;mso-width-relative:page;mso-height-relative:page" from="13.05pt,197.5pt" to="580pt,197.5pt" o:gfxdata="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">
+              <v:line w14:anchorId="077E90BF" id="Straight Connector 4" o:spid="_x0000_s1026" style="position:absolute;z-index:251659264;visibility:visible;mso-wrap-style:square;mso-width-percent:0;mso-height-percent:0;mso-wrap-distance-left:9pt;mso-wrap-distance-top:0;mso-wrap-distance-right:9pt;mso-wrap-distance-bottom:0;mso-position-horizontal:absolute;mso-position-horizontal-relative:page;mso-position-vertical:absolute;mso-position-vertical-relative:page;mso-width-percent:0;mso-height-percent:0;mso-width-relative:page;mso-height-relative:page" from="13.05pt,197.5pt" to="580pt,197.5pt" o:gfxdata="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">
                 <w10:wrap anchorx="page" anchory="page"/>
                 <w10:anchorlock/>
               </v:line>
@@ -388,11 +388,9 @@
       <w:r>
         <w:t xml:space="preserve">An investigation into the effectiveness of various algorithms to help check spelling of English </w:t>
       </w:r>
-      <w:proofErr w:type="gramStart"/>
-      <w:r>
-        <w:t>words</w:t>
-      </w:r>
-      <w:proofErr w:type="gramEnd"/>
+      <w:r>
+        <w:t>words.</w:t>
+      </w:r>
     </w:p>
     <w:p>
       <w:pPr>
@@ -521,21 +519,7 @@
         <w:rPr>
           <w:i/>
         </w:rPr>
-        <w:t xml:space="preserve"> </w:t>
-      </w:r>
-      <w:proofErr w:type="gramStart"/>
-      <w:r>
-        <w:rPr>
-          <w:i/>
-        </w:rPr>
-        <w:t>example</w:t>
-      </w:r>
-      <w:proofErr w:type="gramEnd"/>
-      <w:r>
-        <w:rPr>
-          <w:i/>
-        </w:rPr>
-        <w:t>&gt;</w:t>
+        <w:t xml:space="preserve"> example&gt;</w:t>
       </w:r>
     </w:p>
     <w:tbl>
@@ -2380,149 +2364,6 @@
     </w:p>
     <w:p>
       <w:pPr>
-        <w:rPr>
-          <w:sz w:val="22"/>
-          <w:szCs w:val="22"/>
-        </w:rPr>
-      </w:pPr>
-      <w:r>
-        <w:rPr>
-          <w:sz w:val="22"/>
-          <w:szCs w:val="22"/>
-        </w:rPr>
-        <w:t>&lt;</w:t>
-      </w:r>
-      <w:r>
-        <w:rPr>
-          <w:sz w:val="22"/>
-          <w:szCs w:val="22"/>
-        </w:rPr>
-        <w:t>Recommend using</w:t>
-      </w:r>
-      <w:r>
-        <w:rPr>
-          <w:sz w:val="22"/>
-          <w:szCs w:val="22"/>
-        </w:rPr>
-        <w:t xml:space="preserve"> </w:t>
-      </w:r>
-      <w:r>
-        <w:rPr>
-          <w:sz w:val="22"/>
-          <w:szCs w:val="22"/>
-        </w:rPr>
-        <w:t xml:space="preserve">‘Heading 1’ for chapter titles, </w:t>
-      </w:r>
-      <w:r>
-        <w:rPr>
-          <w:sz w:val="22"/>
-          <w:szCs w:val="22"/>
-        </w:rPr>
-        <w:t>‘Heading 2’</w:t>
-      </w:r>
-      <w:r>
-        <w:rPr>
-          <w:sz w:val="22"/>
-          <w:szCs w:val="22"/>
-        </w:rPr>
-        <w:t xml:space="preserve"> style</w:t>
-      </w:r>
-      <w:r>
-        <w:rPr>
-          <w:sz w:val="22"/>
-          <w:szCs w:val="22"/>
-        </w:rPr>
-        <w:t xml:space="preserve"> for section headings, ‘Heading 3’ for subsection headings, and ‘Heading 4’ for sub-subsection headings</w:t>
-      </w:r>
-      <w:r>
-        <w:rPr>
-          <w:sz w:val="22"/>
-          <w:szCs w:val="22"/>
-        </w:rPr>
-        <w:t xml:space="preserve">, but whatever you choose </w:t>
-      </w:r>
-      <w:r>
-        <w:rPr>
-          <w:sz w:val="22"/>
-          <w:szCs w:val="22"/>
-        </w:rPr>
-        <w:t>you must</w:t>
-      </w:r>
-      <w:r>
-        <w:rPr>
-          <w:sz w:val="22"/>
-          <w:szCs w:val="22"/>
-        </w:rPr>
-        <w:t xml:space="preserve"> be consistent</w:t>
-      </w:r>
-      <w:r>
-        <w:rPr>
-          <w:sz w:val="22"/>
-          <w:szCs w:val="22"/>
-        </w:rPr>
-        <w:t xml:space="preserve">. Don’t forget that text </w:t>
-      </w:r>
-      <w:r>
-        <w:rPr>
-          <w:sz w:val="22"/>
-          <w:szCs w:val="22"/>
-        </w:rPr>
-        <w:t>(</w:t>
-      </w:r>
-      <w:r>
-        <w:rPr>
-          <w:sz w:val="22"/>
-          <w:szCs w:val="22"/>
-        </w:rPr>
-        <w:t>other than headings</w:t>
-      </w:r>
-      <w:r>
-        <w:rPr>
-          <w:sz w:val="22"/>
-          <w:szCs w:val="22"/>
-        </w:rPr>
-        <w:t>)</w:t>
-      </w:r>
-      <w:r>
-        <w:rPr>
-          <w:sz w:val="22"/>
-          <w:szCs w:val="22"/>
-        </w:rPr>
-        <w:t xml:space="preserve"> </w:t>
-      </w:r>
-      <w:r>
-        <w:rPr>
-          <w:sz w:val="22"/>
-          <w:szCs w:val="22"/>
-        </w:rPr>
-        <w:t xml:space="preserve">should be 11 </w:t>
-      </w:r>
-      <w:proofErr w:type="gramStart"/>
-      <w:r>
-        <w:rPr>
-          <w:sz w:val="22"/>
-          <w:szCs w:val="22"/>
-        </w:rPr>
-        <w:t>point</w:t>
-      </w:r>
-      <w:proofErr w:type="gramEnd"/>
-      <w:r>
-        <w:rPr>
-          <w:sz w:val="22"/>
-          <w:szCs w:val="22"/>
-        </w:rPr>
-        <w:t>.</w:t>
-      </w:r>
-      <w:r>
-        <w:rPr>
-          <w:sz w:val="22"/>
-          <w:szCs w:val="22"/>
-        </w:rPr>
-        <w:t>&gt;</w:t>
-      </w:r>
-    </w:p>
-    <w:p>
-      <w:pPr>
         <w:pStyle w:val="Heading2"/>
       </w:pPr>
       <w:bookmarkStart w:id="4" w:name="_Toc407145091"/>
@@ -2546,30 +2387,43 @@
           <w:sz w:val="22"/>
           <w:szCs w:val="22"/>
         </w:rPr>
-        <w:t xml:space="preserve">&lt;A brief introduction suitable for a non-specialist, </w:t>
-      </w:r>
-      <w:r>
-        <w:rPr>
-          <w:i/>
-          <w:iCs/>
-          <w:sz w:val="22"/>
-          <w:szCs w:val="22"/>
-        </w:rPr>
-        <w:t>i.e.</w:t>
-      </w:r>
-      <w:r>
-        <w:rPr>
-          <w:sz w:val="22"/>
-          <w:szCs w:val="22"/>
-        </w:rPr>
-        <w:t xml:space="preserve"> </w:t>
-      </w:r>
-      <w:r>
-        <w:rPr>
-          <w:sz w:val="22"/>
-          <w:szCs w:val="22"/>
-        </w:rPr>
-        <w:t>without using technical terms or jargon, as far as possible. This may be similar/the same as that in the 'Outline and Plan' document. The remainder of this chapter will normally cover everything to be assessed under the `Background Research` criterion in the mark scheme.&gt;</w:t>
+        <w:t xml:space="preserve">The use of spell checking in modern day computer systems is almost universal. From search engines to coding software, people have become reliant on computers to be able to not only fix spelling mistakes as they go along with their work, but even offer suggestions to better ways of writing. Such widespread use of this kind of system requires a large amount of processing of many words. For the English language, it is estimated that there are around </w:t>
+      </w:r>
+      <w:r>
+        <w:rPr>
+          <w:sz w:val="22"/>
+          <w:szCs w:val="22"/>
+        </w:rPr>
+        <w:t>&lt;n&gt;</w:t>
+      </w:r>
+      <w:r>
+        <w:rPr>
+          <w:sz w:val="22"/>
+          <w:szCs w:val="22"/>
+        </w:rPr>
+        <w:t xml:space="preserve"> words in current use today consistently. As such, a spell-checking system must have the capacity to store all these words and provide checks in a short window of time as to preserve the workflow of a computer user.</w:t>
+      </w:r>
+    </w:p>
+    <w:p>
+      <w:pPr>
+        <w:rPr>
+          <w:sz w:val="22"/>
+          <w:szCs w:val="22"/>
+        </w:rPr>
+      </w:pPr>
+      <w:r>
+        <w:rPr>
+          <w:sz w:val="22"/>
+          <w:szCs w:val="22"/>
+        </w:rPr>
+        <w:t xml:space="preserve">As such, </w:t>
+      </w:r>
+      <w:r>
+        <w:rPr>
+          <w:sz w:val="22"/>
+          <w:szCs w:val="22"/>
+        </w:rPr>
+        <w:t>this project is dedicated to using various ways of providing spell checks for English words. To accomplish this, an application was made which can read a set of English texts, recording the words within them, and then using those words to analyse the time it would take, as well as the accuracy of checks, to analyse what methods produce the best spell-checking results.</w:t>
       </w:r>
     </w:p>
     <w:p>
@@ -3303,7 +3157,7 @@
           <v:shape id="_x0000_i1025" type="#_x0000_t75" alt="" style="width:199.5pt;height:93.75pt;mso-width-percent:0;mso-height-percent:0;mso-width-percent:0;mso-height-percent:0" o:ole="" fillcolor="window">
             <v:imagedata r:id="rId10" o:title=""/>
           </v:shape>
-          <o:OLEObject Type="Embed" ProgID="MSDraw" ShapeID="_x0000_i1025" DrawAspect="Content" ObjectID="_1765187268" r:id="rId11">
+          <o:OLEObject Type="Embed" ProgID="MSDraw" ShapeID="_x0000_i1025" DrawAspect="Content" ObjectID="_1769601025" r:id="rId11">
             <o:FieldCodes>\* mergeformat</o:FieldCodes>
           </o:OLEObject>
         </w:object>
@@ -3645,25 +3499,7 @@
           <w:sz w:val="22"/>
           <w:szCs w:val="22"/>
         </w:rPr>
-        <w:t xml:space="preserve">It is expected that the list would reflect the breadth and depth of scholarly research undertaken by the student </w:t>
-      </w:r>
-      <w:proofErr w:type="gramStart"/>
-      <w:r>
-        <w:rPr>
-          <w:i/>
-          <w:sz w:val="22"/>
-          <w:szCs w:val="22"/>
-        </w:rPr>
-        <w:t>during the course of</w:t>
-      </w:r>
-      <w:proofErr w:type="gramEnd"/>
-      <w:r>
-        <w:rPr>
-          <w:i/>
-          <w:sz w:val="22"/>
-          <w:szCs w:val="22"/>
-        </w:rPr>
-        <w:t xml:space="preserve"> the project.</w:t>
+        <w:t>It is expected that the list would reflect the breadth and depth of scholarly research undertaken by the student during the course of the project.</w:t>
       </w:r>
       <w:r>
         <w:rPr>
@@ -3773,15 +3609,7 @@
         <w:pStyle w:val="Heading2"/>
       </w:pPr>
       <w:r>
-        <w:t xml:space="preserve">A.3 Legal, social, </w:t>
-      </w:r>
-      <w:proofErr w:type="gramStart"/>
-      <w:r>
-        <w:t>ethical</w:t>
-      </w:r>
-      <w:proofErr w:type="gramEnd"/>
-      <w:r>
-        <w:t xml:space="preserve"> and professional issues</w:t>
+        <w:t>A.3 Legal, social, ethical and professional issues</w:t>
       </w:r>
     </w:p>
     <w:p>
@@ -4019,23 +3847,7 @@
           <w:sz w:val="22"/>
           <w:szCs w:val="22"/>
         </w:rPr>
-        <w:t xml:space="preserve">&lt;This appendix should provide a brief record of materials used in the solution that are not the student's own work. Such materials might be pieces of codes made available from a research group/company or from the internet, datasets prepared by external </w:t>
-      </w:r>
-      <w:proofErr w:type="gramStart"/>
-      <w:r>
-        <w:rPr>
-          <w:sz w:val="22"/>
-          <w:szCs w:val="22"/>
-        </w:rPr>
-        <w:t>users</w:t>
-      </w:r>
-      <w:proofErr w:type="gramEnd"/>
-      <w:r>
-        <w:rPr>
-          <w:sz w:val="22"/>
-          <w:szCs w:val="22"/>
-        </w:rPr>
-        <w:t xml:space="preserve"> or any preliminary materials/drafts/notes provided by a supervisor. It should be clear what was used as ready-made components and what was developed as part of the project. This appendix should be included even if no external materials were used, in which case a statement to that effect is all that is required.&gt;</w:t>
+        <w:t>&lt;This appendix should provide a brief record of materials used in the solution that are not the student's own work. Such materials might be pieces of codes made available from a research group/company or from the internet, datasets prepared by external users or any preliminary materials/drafts/notes provided by a supervisor. It should be clear what was used as ready-made components and what was developed as part of the project. This appendix should be included even if no external materials were used, in which case a statement to that effect is all that is required.&gt;</w:t>
       </w:r>
     </w:p>
     <w:p>

</xml_diff>

<commit_message>
did some research into corpus parsing and spell checking algorithms
</commit_message>
<xml_diff>
--- a/project_writeup/FinalReportV1.docx
+++ b/project_writeup/FinalReportV1.docx
@@ -377,7 +377,7 @@
           </mc:Choice>
           <mc:Fallback>
             <w:pict>
-              <v:line w14:anchorId="077E90BF" id="Straight Connector 4" o:spid="_x0000_s1026" style="position:absolute;z-index:251659264;visibility:visible;mso-wrap-style:square;mso-width-percent:0;mso-height-percent:0;mso-wrap-distance-left:9pt;mso-wrap-distance-top:0;mso-wrap-distance-right:9pt;mso-wrap-distance-bottom:0;mso-position-horizontal:absolute;mso-position-horizontal-relative:page;mso-position-vertical:absolute;mso-position-vertical-relative:page;mso-width-percent:0;mso-height-percent:0;mso-width-relative:page;mso-height-relative:page" from="13.05pt,197.5pt" to="580pt,197.5pt" o:gfxdata="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">
+              <v:line w14:anchorId="57135CE1" id="Straight Connector 4" o:spid="_x0000_s1026" style="position:absolute;z-index:251659264;visibility:visible;mso-wrap-style:square;mso-width-percent:0;mso-height-percent:0;mso-wrap-distance-left:9pt;mso-wrap-distance-top:0;mso-wrap-distance-right:9pt;mso-wrap-distance-bottom:0;mso-position-horizontal:absolute;mso-position-horizontal-relative:page;mso-position-vertical:absolute;mso-position-vertical-relative:page;mso-width-percent:0;mso-height-percent:0;mso-width-relative:page;mso-height-relative:page" from="13.05pt,197.5pt" to="580pt,197.5pt" o:gfxdata="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">
                 <w10:wrap anchorx="page" anchory="page"/>
                 <w10:anchorlock/>
               </v:line>
@@ -1490,7 +1490,13 @@
         <w:rPr>
           <w:noProof/>
         </w:rPr>
-        <w:t>Chapter 1 Level 1 Heading with ‘heading 1’ Style</w:t>
+        <w:t xml:space="preserve">Chapter 1 </w:t>
+      </w:r>
+      <w:r>
+        <w:rPr>
+          <w:noProof/>
+        </w:rPr>
+        <w:t>Introduction and Background Research</w:t>
       </w:r>
       <w:r>
         <w:rPr>
@@ -1538,6 +1544,67 @@
       <w:pPr>
         <w:pStyle w:val="TOC2"/>
         <w:rPr>
+          <w:noProof/>
+        </w:rPr>
+      </w:pPr>
+      <w:r>
+        <w:rPr>
+          <w:noProof/>
+        </w:rPr>
+        <w:t xml:space="preserve">1.1  </w:t>
+      </w:r>
+      <w:r>
+        <w:rPr>
+          <w:noProof/>
+        </w:rPr>
+        <w:t>Introduction</w:t>
+      </w:r>
+      <w:r>
+        <w:rPr>
+          <w:noProof/>
+        </w:rPr>
+        <w:tab/>
+      </w:r>
+      <w:r>
+        <w:rPr>
+          <w:noProof/>
+        </w:rPr>
+        <w:fldChar w:fldCharType="begin"/>
+      </w:r>
+      <w:r>
+        <w:rPr>
+          <w:noProof/>
+        </w:rPr>
+        <w:instrText xml:space="preserve"> PAGEREF _Toc407145091 \h </w:instrText>
+      </w:r>
+      <w:r>
+        <w:rPr>
+          <w:noProof/>
+        </w:rPr>
+      </w:r>
+      <w:r>
+        <w:rPr>
+          <w:noProof/>
+        </w:rPr>
+        <w:fldChar w:fldCharType="separate"/>
+      </w:r>
+      <w:r>
+        <w:rPr>
+          <w:noProof/>
+        </w:rPr>
+        <w:t>1</w:t>
+      </w:r>
+      <w:r>
+        <w:rPr>
+          <w:noProof/>
+        </w:rPr>
+        <w:fldChar w:fldCharType="end"/>
+      </w:r>
+    </w:p>
+    <w:p>
+      <w:pPr>
+        <w:pStyle w:val="TOC2"/>
+        <w:rPr>
           <w:rFonts w:asciiTheme="minorHAnsi" w:eastAsiaTheme="minorEastAsia" w:hAnsiTheme="minorHAnsi" w:cstheme="minorBidi"/>
           <w:noProof/>
           <w:sz w:val="22"/>
@@ -1548,7 +1615,25 @@
         <w:rPr>
           <w:noProof/>
         </w:rPr>
-        <w:t>1.1  Level 2 Heading with ‘heading 2’ Style</w:t>
+        <w:t>1.</w:t>
+      </w:r>
+      <w:r>
+        <w:rPr>
+          <w:noProof/>
+        </w:rPr>
+        <w:t>2</w:t>
+      </w:r>
+      <w:r>
+        <w:rPr>
+          <w:noProof/>
+        </w:rPr>
+        <w:t xml:space="preserve">  L</w:t>
+      </w:r>
+      <w:r>
+        <w:rPr>
+          <w:noProof/>
+        </w:rPr>
+        <w:t>iterature Review</w:t>
       </w:r>
       <w:r>
         <w:rPr>
@@ -1566,123 +1651,7 @@
         <w:rPr>
           <w:noProof/>
         </w:rPr>
-        <w:instrText xml:space="preserve"> PAGEREF _Toc407145091 \h </w:instrText>
-      </w:r>
-      <w:r>
-        <w:rPr>
-          <w:noProof/>
-        </w:rPr>
-      </w:r>
-      <w:r>
-        <w:rPr>
-          <w:noProof/>
-        </w:rPr>
-        <w:fldChar w:fldCharType="separate"/>
-      </w:r>
-      <w:r>
-        <w:rPr>
-          <w:noProof/>
-        </w:rPr>
-        <w:t>1</w:t>
-      </w:r>
-      <w:r>
-        <w:rPr>
-          <w:noProof/>
-        </w:rPr>
-        <w:fldChar w:fldCharType="end"/>
-      </w:r>
-    </w:p>
-    <w:p>
-      <w:pPr>
-        <w:pStyle w:val="TOC3"/>
-        <w:rPr>
-          <w:rFonts w:asciiTheme="minorHAnsi" w:eastAsiaTheme="minorEastAsia" w:hAnsiTheme="minorHAnsi" w:cstheme="minorBidi"/>
-          <w:noProof/>
-          <w:sz w:val="22"/>
-          <w:szCs w:val="22"/>
-        </w:rPr>
-      </w:pPr>
-      <w:r>
-        <w:rPr>
-          <w:noProof/>
-        </w:rPr>
-        <w:t>1.1.1  Level 3 Heading with ‘heading 3’ Style</w:t>
-      </w:r>
-      <w:r>
-        <w:rPr>
-          <w:noProof/>
-        </w:rPr>
-        <w:tab/>
-      </w:r>
-      <w:r>
-        <w:rPr>
-          <w:noProof/>
-        </w:rPr>
-        <w:fldChar w:fldCharType="begin"/>
-      </w:r>
-      <w:r>
-        <w:rPr>
-          <w:noProof/>
-        </w:rPr>
         <w:instrText xml:space="preserve"> PAGEREF _Toc407145092 \h </w:instrText>
-      </w:r>
-      <w:r>
-        <w:rPr>
-          <w:noProof/>
-        </w:rPr>
-      </w:r>
-      <w:r>
-        <w:rPr>
-          <w:noProof/>
-        </w:rPr>
-        <w:fldChar w:fldCharType="separate"/>
-      </w:r>
-      <w:r>
-        <w:rPr>
-          <w:noProof/>
-        </w:rPr>
-        <w:t>1</w:t>
-      </w:r>
-      <w:r>
-        <w:rPr>
-          <w:noProof/>
-        </w:rPr>
-        <w:fldChar w:fldCharType="end"/>
-      </w:r>
-    </w:p>
-    <w:p>
-      <w:pPr>
-        <w:pStyle w:val="TOC4"/>
-        <w:rPr>
-          <w:rFonts w:asciiTheme="minorHAnsi" w:eastAsiaTheme="minorEastAsia" w:hAnsiTheme="minorHAnsi" w:cstheme="minorBidi"/>
-          <w:noProof/>
-          <w:sz w:val="22"/>
-          <w:szCs w:val="22"/>
-        </w:rPr>
-      </w:pPr>
-      <w:r>
-        <w:rPr>
-          <w:noProof/>
-        </w:rPr>
-        <w:t>1.1.1.1  Level 4 Heading with ‘heading 4’ Style</w:t>
-      </w:r>
-      <w:r>
-        <w:rPr>
-          <w:noProof/>
-        </w:rPr>
-        <w:tab/>
-      </w:r>
-      <w:r>
-        <w:rPr>
-          <w:noProof/>
-        </w:rPr>
-        <w:fldChar w:fldCharType="begin"/>
-      </w:r>
-      <w:r>
-        <w:rPr>
-          <w:noProof/>
-        </w:rPr>
-        <w:instrText xml:space="preserve"> PAGEREF _Toc407145093 \h </w:instrText>
       </w:r>
       <w:r>
         <w:rPr>
@@ -1723,7 +1692,13 @@
         <w:rPr>
           <w:noProof/>
         </w:rPr>
-        <w:t>Chapter 2 Tables and Figures</w:t>
+        <w:t xml:space="preserve">Chapter 2 </w:t>
+      </w:r>
+      <w:r>
+        <w:rPr>
+          <w:noProof/>
+        </w:rPr>
+        <w:t>Methods</w:t>
       </w:r>
       <w:r>
         <w:rPr>
@@ -1781,7 +1756,13 @@
         <w:rPr>
           <w:noProof/>
         </w:rPr>
-        <w:t>2.1  Tables using the ‘table caption’ and ‘table description’ Styles</w:t>
+        <w:t xml:space="preserve">2.1  </w:t>
+      </w:r>
+      <w:r>
+        <w:rPr>
+          <w:noProof/>
+        </w:rPr>
+        <w:t>Proof of concept</w:t>
       </w:r>
       <w:r>
         <w:rPr>
@@ -1829,17 +1810,574 @@
       <w:pPr>
         <w:pStyle w:val="TOC2"/>
         <w:rPr>
-          <w:rFonts w:asciiTheme="minorHAnsi" w:eastAsiaTheme="minorEastAsia" w:hAnsiTheme="minorHAnsi" w:cstheme="minorBidi"/>
-          <w:noProof/>
-          <w:sz w:val="22"/>
-          <w:szCs w:val="22"/>
-        </w:rPr>
-      </w:pPr>
-      <w:r>
-        <w:rPr>
-          <w:noProof/>
-        </w:rPr>
-        <w:t>2.2  Figures using the ‘figure caption’ and ‘figure description’ Styles</w:t>
+          <w:noProof/>
+        </w:rPr>
+      </w:pPr>
+      <w:r>
+        <w:rPr>
+          <w:noProof/>
+        </w:rPr>
+        <w:t xml:space="preserve">2.2  </w:t>
+      </w:r>
+      <w:r>
+        <w:rPr>
+          <w:noProof/>
+        </w:rPr>
+        <w:t>Phase One (corpus extraction)</w:t>
+      </w:r>
+      <w:r>
+        <w:rPr>
+          <w:noProof/>
+        </w:rPr>
+        <w:tab/>
+      </w:r>
+      <w:r>
+        <w:rPr>
+          <w:noProof/>
+        </w:rPr>
+        <w:fldChar w:fldCharType="begin"/>
+      </w:r>
+      <w:r>
+        <w:rPr>
+          <w:noProof/>
+        </w:rPr>
+        <w:instrText xml:space="preserve"> PAGEREF _Toc407145096 \h </w:instrText>
+      </w:r>
+      <w:r>
+        <w:rPr>
+          <w:noProof/>
+        </w:rPr>
+      </w:r>
+      <w:r>
+        <w:rPr>
+          <w:noProof/>
+        </w:rPr>
+        <w:fldChar w:fldCharType="separate"/>
+      </w:r>
+      <w:r>
+        <w:rPr>
+          <w:noProof/>
+        </w:rPr>
+        <w:t>2</w:t>
+      </w:r>
+      <w:r>
+        <w:rPr>
+          <w:noProof/>
+        </w:rPr>
+        <w:fldChar w:fldCharType="end"/>
+      </w:r>
+    </w:p>
+    <w:p>
+      <w:pPr>
+        <w:pStyle w:val="TOC2"/>
+        <w:rPr>
+          <w:noProof/>
+        </w:rPr>
+      </w:pPr>
+      <w:r>
+        <w:rPr>
+          <w:noProof/>
+        </w:rPr>
+        <w:t>2.</w:t>
+      </w:r>
+      <w:r>
+        <w:rPr>
+          <w:noProof/>
+        </w:rPr>
+        <w:t>3</w:t>
+      </w:r>
+      <w:r>
+        <w:rPr>
+          <w:noProof/>
+        </w:rPr>
+        <w:t xml:space="preserve">  </w:t>
+      </w:r>
+      <w:r>
+        <w:rPr>
+          <w:noProof/>
+        </w:rPr>
+        <w:t>Phase Two (spell checking)</w:t>
+      </w:r>
+      <w:r>
+        <w:rPr>
+          <w:noProof/>
+        </w:rPr>
+        <w:tab/>
+      </w:r>
+      <w:r>
+        <w:rPr>
+          <w:noProof/>
+        </w:rPr>
+        <w:fldChar w:fldCharType="begin"/>
+      </w:r>
+      <w:r>
+        <w:rPr>
+          <w:noProof/>
+        </w:rPr>
+        <w:instrText xml:space="preserve"> PAGEREF _Toc407145096 \h </w:instrText>
+      </w:r>
+      <w:r>
+        <w:rPr>
+          <w:noProof/>
+        </w:rPr>
+      </w:r>
+      <w:r>
+        <w:rPr>
+          <w:noProof/>
+        </w:rPr>
+        <w:fldChar w:fldCharType="separate"/>
+      </w:r>
+      <w:r>
+        <w:rPr>
+          <w:noProof/>
+        </w:rPr>
+        <w:t>2</w:t>
+      </w:r>
+      <w:r>
+        <w:rPr>
+          <w:noProof/>
+        </w:rPr>
+        <w:fldChar w:fldCharType="end"/>
+      </w:r>
+    </w:p>
+    <w:p>
+      <w:pPr>
+        <w:pStyle w:val="TOC2"/>
+        <w:rPr>
+          <w:noProof/>
+        </w:rPr>
+      </w:pPr>
+      <w:r>
+        <w:rPr>
+          <w:noProof/>
+        </w:rPr>
+        <w:t xml:space="preserve">2.2  </w:t>
+      </w:r>
+      <w:r>
+        <w:rPr>
+          <w:noProof/>
+        </w:rPr>
+        <w:t>Phase Three (testing)</w:t>
+      </w:r>
+      <w:r>
+        <w:rPr>
+          <w:noProof/>
+        </w:rPr>
+        <w:tab/>
+      </w:r>
+      <w:r>
+        <w:rPr>
+          <w:noProof/>
+        </w:rPr>
+        <w:fldChar w:fldCharType="begin"/>
+      </w:r>
+      <w:r>
+        <w:rPr>
+          <w:noProof/>
+        </w:rPr>
+        <w:instrText xml:space="preserve"> PAGEREF _Toc407145096 \h </w:instrText>
+      </w:r>
+      <w:r>
+        <w:rPr>
+          <w:noProof/>
+        </w:rPr>
+      </w:r>
+      <w:r>
+        <w:rPr>
+          <w:noProof/>
+        </w:rPr>
+        <w:fldChar w:fldCharType="separate"/>
+      </w:r>
+      <w:r>
+        <w:rPr>
+          <w:noProof/>
+        </w:rPr>
+        <w:t>2</w:t>
+      </w:r>
+      <w:r>
+        <w:rPr>
+          <w:noProof/>
+        </w:rPr>
+        <w:fldChar w:fldCharType="end"/>
+      </w:r>
+    </w:p>
+    <w:p>
+      <w:pPr>
+        <w:pStyle w:val="TOC1"/>
+        <w:rPr>
+          <w:noProof/>
+        </w:rPr>
+      </w:pPr>
+      <w:r>
+        <w:rPr>
+          <w:noProof/>
+        </w:rPr>
+        <w:t xml:space="preserve">Chapter </w:t>
+      </w:r>
+      <w:r>
+        <w:rPr>
+          <w:noProof/>
+        </w:rPr>
+        <w:t>3 Results</w:t>
+      </w:r>
+      <w:r>
+        <w:rPr>
+          <w:noProof/>
+        </w:rPr>
+        <w:tab/>
+      </w:r>
+      <w:r>
+        <w:rPr>
+          <w:noProof/>
+        </w:rPr>
+        <w:fldChar w:fldCharType="begin"/>
+      </w:r>
+      <w:r>
+        <w:rPr>
+          <w:noProof/>
+        </w:rPr>
+        <w:instrText xml:space="preserve"> PAGEREF _Toc407145094 \h </w:instrText>
+      </w:r>
+      <w:r>
+        <w:rPr>
+          <w:noProof/>
+        </w:rPr>
+      </w:r>
+      <w:r>
+        <w:rPr>
+          <w:noProof/>
+        </w:rPr>
+        <w:fldChar w:fldCharType="separate"/>
+      </w:r>
+      <w:r>
+        <w:rPr>
+          <w:noProof/>
+        </w:rPr>
+        <w:t>2</w:t>
+      </w:r>
+      <w:r>
+        <w:rPr>
+          <w:noProof/>
+        </w:rPr>
+        <w:fldChar w:fldCharType="end"/>
+      </w:r>
+    </w:p>
+    <w:p>
+      <w:pPr>
+        <w:pStyle w:val="TOC2"/>
+        <w:rPr>
+          <w:noProof/>
+        </w:rPr>
+      </w:pPr>
+      <w:r>
+        <w:rPr>
+          <w:noProof/>
+        </w:rPr>
+        <w:t>3</w:t>
+      </w:r>
+      <w:r>
+        <w:rPr>
+          <w:noProof/>
+        </w:rPr>
+        <w:t>.</w:t>
+      </w:r>
+      <w:r>
+        <w:rPr>
+          <w:noProof/>
+        </w:rPr>
+        <w:t>1</w:t>
+      </w:r>
+      <w:r>
+        <w:rPr>
+          <w:noProof/>
+        </w:rPr>
+        <w:t xml:space="preserve">  </w:t>
+      </w:r>
+      <w:r>
+        <w:rPr>
+          <w:noProof/>
+        </w:rPr>
+        <w:t>Results from automated testing</w:t>
+      </w:r>
+      <w:r>
+        <w:rPr>
+          <w:noProof/>
+        </w:rPr>
+        <w:tab/>
+      </w:r>
+      <w:r>
+        <w:rPr>
+          <w:noProof/>
+        </w:rPr>
+        <w:fldChar w:fldCharType="begin"/>
+      </w:r>
+      <w:r>
+        <w:rPr>
+          <w:noProof/>
+        </w:rPr>
+        <w:instrText xml:space="preserve"> PAGEREF _Toc407145096 \h </w:instrText>
+      </w:r>
+      <w:r>
+        <w:rPr>
+          <w:noProof/>
+        </w:rPr>
+      </w:r>
+      <w:r>
+        <w:rPr>
+          <w:noProof/>
+        </w:rPr>
+        <w:fldChar w:fldCharType="separate"/>
+      </w:r>
+      <w:r>
+        <w:rPr>
+          <w:noProof/>
+        </w:rPr>
+        <w:t>2</w:t>
+      </w:r>
+      <w:r>
+        <w:rPr>
+          <w:noProof/>
+        </w:rPr>
+        <w:fldChar w:fldCharType="end"/>
+      </w:r>
+    </w:p>
+    <w:p>
+      <w:pPr>
+        <w:pStyle w:val="TOC2"/>
+        <w:rPr>
+          <w:noProof/>
+        </w:rPr>
+      </w:pPr>
+      <w:r>
+        <w:rPr>
+          <w:noProof/>
+        </w:rPr>
+        <w:t>3</w:t>
+      </w:r>
+      <w:r>
+        <w:rPr>
+          <w:noProof/>
+        </w:rPr>
+        <w:t xml:space="preserve">.2  </w:t>
+      </w:r>
+      <w:r>
+        <w:rPr>
+          <w:noProof/>
+        </w:rPr>
+        <w:t>Results from user testing</w:t>
+      </w:r>
+      <w:r>
+        <w:rPr>
+          <w:noProof/>
+        </w:rPr>
+        <w:tab/>
+      </w:r>
+      <w:r>
+        <w:rPr>
+          <w:noProof/>
+        </w:rPr>
+        <w:fldChar w:fldCharType="begin"/>
+      </w:r>
+      <w:r>
+        <w:rPr>
+          <w:noProof/>
+        </w:rPr>
+        <w:instrText xml:space="preserve"> PAGEREF _Toc407145096 \h </w:instrText>
+      </w:r>
+      <w:r>
+        <w:rPr>
+          <w:noProof/>
+        </w:rPr>
+      </w:r>
+      <w:r>
+        <w:rPr>
+          <w:noProof/>
+        </w:rPr>
+        <w:fldChar w:fldCharType="separate"/>
+      </w:r>
+      <w:r>
+        <w:rPr>
+          <w:noProof/>
+        </w:rPr>
+        <w:t>2</w:t>
+      </w:r>
+      <w:r>
+        <w:rPr>
+          <w:noProof/>
+        </w:rPr>
+        <w:fldChar w:fldCharType="end"/>
+      </w:r>
+    </w:p>
+    <w:p>
+      <w:pPr>
+        <w:pStyle w:val="TOC1"/>
+        <w:rPr>
+          <w:noProof/>
+        </w:rPr>
+      </w:pPr>
+      <w:r>
+        <w:rPr>
+          <w:noProof/>
+        </w:rPr>
+        <w:t xml:space="preserve">Chapter </w:t>
+      </w:r>
+      <w:r>
+        <w:rPr>
+          <w:noProof/>
+        </w:rPr>
+        <w:t>4</w:t>
+      </w:r>
+      <w:r>
+        <w:rPr>
+          <w:noProof/>
+        </w:rPr>
+        <w:t xml:space="preserve"> </w:t>
+      </w:r>
+      <w:r>
+        <w:rPr>
+          <w:noProof/>
+        </w:rPr>
+        <w:t>Discussion</w:t>
+      </w:r>
+      <w:r>
+        <w:rPr>
+          <w:noProof/>
+        </w:rPr>
+        <w:tab/>
+      </w:r>
+      <w:r>
+        <w:rPr>
+          <w:noProof/>
+        </w:rPr>
+        <w:fldChar w:fldCharType="begin"/>
+      </w:r>
+      <w:r>
+        <w:rPr>
+          <w:noProof/>
+        </w:rPr>
+        <w:instrText xml:space="preserve"> PAGEREF _Toc407145094 \h </w:instrText>
+      </w:r>
+      <w:r>
+        <w:rPr>
+          <w:noProof/>
+        </w:rPr>
+      </w:r>
+      <w:r>
+        <w:rPr>
+          <w:noProof/>
+        </w:rPr>
+        <w:fldChar w:fldCharType="separate"/>
+      </w:r>
+      <w:r>
+        <w:rPr>
+          <w:noProof/>
+        </w:rPr>
+        <w:t>2</w:t>
+      </w:r>
+      <w:r>
+        <w:rPr>
+          <w:noProof/>
+        </w:rPr>
+        <w:fldChar w:fldCharType="end"/>
+      </w:r>
+    </w:p>
+    <w:p>
+      <w:pPr>
+        <w:pStyle w:val="TOC2"/>
+        <w:rPr>
+          <w:noProof/>
+        </w:rPr>
+      </w:pPr>
+      <w:r>
+        <w:rPr>
+          <w:noProof/>
+        </w:rPr>
+        <w:t>3</w:t>
+      </w:r>
+      <w:r>
+        <w:rPr>
+          <w:noProof/>
+        </w:rPr>
+        <w:t>.</w:t>
+      </w:r>
+      <w:r>
+        <w:rPr>
+          <w:noProof/>
+        </w:rPr>
+        <w:t>3</w:t>
+      </w:r>
+      <w:r>
+        <w:rPr>
+          <w:noProof/>
+        </w:rPr>
+        <w:t xml:space="preserve">  </w:t>
+      </w:r>
+      <w:r>
+        <w:rPr>
+          <w:noProof/>
+        </w:rPr>
+        <w:t>Conclusions</w:t>
+      </w:r>
+      <w:r>
+        <w:rPr>
+          <w:noProof/>
+        </w:rPr>
+        <w:tab/>
+      </w:r>
+      <w:r>
+        <w:rPr>
+          <w:noProof/>
+        </w:rPr>
+        <w:fldChar w:fldCharType="begin"/>
+      </w:r>
+      <w:r>
+        <w:rPr>
+          <w:noProof/>
+        </w:rPr>
+        <w:instrText xml:space="preserve"> PAGEREF _Toc407145096 \h </w:instrText>
+      </w:r>
+      <w:r>
+        <w:rPr>
+          <w:noProof/>
+        </w:rPr>
+      </w:r>
+      <w:r>
+        <w:rPr>
+          <w:noProof/>
+        </w:rPr>
+        <w:fldChar w:fldCharType="separate"/>
+      </w:r>
+      <w:r>
+        <w:rPr>
+          <w:noProof/>
+        </w:rPr>
+        <w:t>2</w:t>
+      </w:r>
+      <w:r>
+        <w:rPr>
+          <w:noProof/>
+        </w:rPr>
+        <w:fldChar w:fldCharType="end"/>
+      </w:r>
+    </w:p>
+    <w:p>
+      <w:pPr>
+        <w:pStyle w:val="TOC2"/>
+        <w:rPr>
+          <w:noProof/>
+        </w:rPr>
+      </w:pPr>
+      <w:r>
+        <w:rPr>
+          <w:noProof/>
+        </w:rPr>
+        <w:t xml:space="preserve">3.3  </w:t>
+      </w:r>
+      <w:r>
+        <w:rPr>
+          <w:noProof/>
+        </w:rPr>
+        <w:t>Ideas for future work</w:t>
       </w:r>
       <w:r>
         <w:rPr>
@@ -2232,72 +2770,6 @@
         </w:rPr>
         <w:fldChar w:fldCharType="end"/>
       </w:r>
-    </w:p>
-    <w:p>
-      <w:pPr>
-        <w:pStyle w:val="TOC2"/>
-        <w:rPr>
-          <w:rFonts w:asciiTheme="minorHAnsi" w:eastAsiaTheme="minorEastAsia" w:hAnsiTheme="minorHAnsi" w:cstheme="minorBidi"/>
-          <w:noProof/>
-          <w:sz w:val="22"/>
-          <w:szCs w:val="22"/>
-        </w:rPr>
-      </w:pPr>
-      <w:r>
-        <w:rPr>
-          <w:noProof/>
-        </w:rPr>
-        <w:t>B.1  Level 2 Heading with ‘heading 2’ Style</w:t>
-      </w:r>
-      <w:r>
-        <w:rPr>
-          <w:noProof/>
-        </w:rPr>
-        <w:tab/>
-      </w:r>
-      <w:r>
-        <w:rPr>
-          <w:noProof/>
-        </w:rPr>
-        <w:fldChar w:fldCharType="begin"/>
-      </w:r>
-      <w:r>
-        <w:rPr>
-          <w:noProof/>
-        </w:rPr>
-        <w:instrText xml:space="preserve"> PAGEREF _Toc407145099 \h </w:instrText>
-      </w:r>
-      <w:r>
-        <w:rPr>
-          <w:noProof/>
-        </w:rPr>
-      </w:r>
-      <w:r>
-        <w:rPr>
-          <w:noProof/>
-        </w:rPr>
-        <w:fldChar w:fldCharType="separate"/>
-      </w:r>
-      <w:r>
-        <w:rPr>
-          <w:noProof/>
-        </w:rPr>
-        <w:t>4</w:t>
-      </w:r>
-      <w:r>
-        <w:rPr>
-          <w:noProof/>
-        </w:rPr>
-        <w:fldChar w:fldCharType="end"/>
-      </w:r>
-    </w:p>
-    <w:p>
-      <w:pPr>
-        <w:pStyle w:val="TOC1"/>
-        <w:rPr>
-          <w:noProof/>
-        </w:rPr>
-      </w:pPr>
     </w:p>
     <w:p>
       <w:pPr>
@@ -3157,7 +3629,7 @@
           <v:shape id="_x0000_i1025" type="#_x0000_t75" alt="" style="width:199.5pt;height:93.75pt;mso-width-percent:0;mso-height-percent:0;mso-width-percent:0;mso-height-percent:0" o:ole="" fillcolor="window">
             <v:imagedata r:id="rId10" o:title=""/>
           </v:shape>
-          <o:OLEObject Type="Embed" ProgID="MSDraw" ShapeID="_x0000_i1025" DrawAspect="Content" ObjectID="_1769601025" r:id="rId11">
+          <o:OLEObject Type="Embed" ProgID="MSDraw" ShapeID="_x0000_i1025" DrawAspect="Content" ObjectID="_1770661337" r:id="rId11">
             <o:FieldCodes>\* mergeformat</o:FieldCodes>
           </o:OLEObject>
         </w:object>

</xml_diff>

<commit_message>
started writeup and working on new sorting algorithms
</commit_message>
<xml_diff>
--- a/project_writeup/FinalReportV1.docx
+++ b/project_writeup/FinalReportV1.docx
@@ -377,7 +377,7 @@
           </mc:Choice>
           <mc:Fallback>
             <w:pict>
-              <v:line w14:anchorId="57135CE1" id="Straight Connector 4" o:spid="_x0000_s1026" style="position:absolute;z-index:251659264;visibility:visible;mso-wrap-style:square;mso-width-percent:0;mso-height-percent:0;mso-wrap-distance-left:9pt;mso-wrap-distance-top:0;mso-wrap-distance-right:9pt;mso-wrap-distance-bottom:0;mso-position-horizontal:absolute;mso-position-horizontal-relative:page;mso-position-vertical:absolute;mso-position-vertical-relative:page;mso-width-percent:0;mso-height-percent:0;mso-width-relative:page;mso-height-relative:page" from="13.05pt,197.5pt" to="580pt,197.5pt" o:gfxdata="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">
+              <v:line w14:anchorId="2BFEB50B" id="Straight Connector 4" o:spid="_x0000_s1026" style="position:absolute;z-index:251659264;visibility:visible;mso-wrap-style:square;mso-width-percent:0;mso-height-percent:0;mso-wrap-distance-left:9pt;mso-wrap-distance-top:0;mso-wrap-distance-right:9pt;mso-wrap-distance-bottom:0;mso-position-horizontal:absolute;mso-position-horizontal-relative:page;mso-position-vertical:absolute;mso-position-vertical-relative:page;mso-width-percent:0;mso-height-percent:0;mso-width-relative:page;mso-height-relative:page" from="13.05pt,197.5pt" to="580pt,197.5pt" o:gfxdata="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">
                 <w10:wrap anchorx="page" anchory="page"/>
                 <w10:anchorlock/>
               </v:line>
@@ -519,7 +519,21 @@
         <w:rPr>
           <w:i/>
         </w:rPr>
-        <w:t xml:space="preserve"> example&gt;</w:t>
+        <w:t xml:space="preserve"> </w:t>
+      </w:r>
+      <w:proofErr w:type="gramStart"/>
+      <w:r>
+        <w:rPr>
+          <w:i/>
+        </w:rPr>
+        <w:t>example</w:t>
+      </w:r>
+      <w:proofErr w:type="gramEnd"/>
+      <w:r>
+        <w:rPr>
+          <w:i/>
+        </w:rPr>
+        <w:t>&gt;</w:t>
       </w:r>
     </w:p>
     <w:tbl>
@@ -1132,6 +1146,86 @@
       <w:pPr>
         <w:jc w:val="both"/>
         <w:rPr>
+          <w:iCs/>
+          <w:sz w:val="22"/>
+          <w:szCs w:val="22"/>
+        </w:rPr>
+      </w:pPr>
+      <w:r>
+        <w:rPr>
+          <w:iCs/>
+          <w:sz w:val="22"/>
+          <w:szCs w:val="22"/>
+        </w:rPr>
+        <w:t>In this report, I attempted to establish an understanding of how spell checkers work on a fundamental level and analyse how they find words like others that are misspelled. For this, research was done into the primary method of measuring string similarity, L</w:t>
+      </w:r>
+      <w:r>
+        <w:rPr>
+          <w:iCs/>
+          <w:sz w:val="22"/>
+          <w:szCs w:val="22"/>
+        </w:rPr>
+        <w:t xml:space="preserve">evenshtein </w:t>
+      </w:r>
+      <w:r>
+        <w:rPr>
+          <w:iCs/>
+          <w:sz w:val="22"/>
+          <w:szCs w:val="22"/>
+        </w:rPr>
+        <w:t>Distance. To help analyse the use of this algorithm, a separate system was implemented which collects words for a corpus and stores them in a piece of software for use in the spell checker to see if a given word is valid or not. This task naturally allowed for the further analysis of other searching and storing algorithms for collecting and then finding words in efficient ways.</w:t>
+      </w:r>
+    </w:p>
+    <w:p>
+      <w:pPr>
+        <w:jc w:val="both"/>
+        <w:rPr>
+          <w:iCs/>
+          <w:sz w:val="22"/>
+          <w:szCs w:val="22"/>
+        </w:rPr>
+      </w:pPr>
+      <w:r>
+        <w:rPr>
+          <w:iCs/>
+          <w:sz w:val="22"/>
+          <w:szCs w:val="22"/>
+        </w:rPr>
+        <w:t>…Method?</w:t>
+      </w:r>
+    </w:p>
+    <w:p>
+      <w:pPr>
+        <w:jc w:val="both"/>
+        <w:rPr>
+          <w:iCs/>
+          <w:sz w:val="22"/>
+          <w:szCs w:val="22"/>
+        </w:rPr>
+      </w:pPr>
+      <w:r>
+        <w:rPr>
+          <w:iCs/>
+          <w:sz w:val="22"/>
+          <w:szCs w:val="22"/>
+        </w:rPr>
+        <w:t>…conclusion?</w:t>
+      </w:r>
+    </w:p>
+    <w:p>
+      <w:pPr>
+        <w:jc w:val="both"/>
+        <w:rPr>
+          <w:i/>
+          <w:sz w:val="22"/>
+          <w:szCs w:val="22"/>
+        </w:rPr>
+      </w:pPr>
+    </w:p>
+    <w:p>
+      <w:pPr>
+        <w:jc w:val="both"/>
+        <w:rPr>
           <w:i/>
           <w:sz w:val="22"/>
           <w:szCs w:val="22"/>
@@ -1238,8 +1332,18 @@
           <w:sz w:val="22"/>
           <w:szCs w:val="22"/>
         </w:rPr>
-        <w:t>‘proof reading’ which is defined as “the systematic checking and identification of errors in spelling, punctuation, grammar and sentence construction, formatting and layout in the text”; see</w:t>
-      </w:r>
+        <w:t xml:space="preserve">‘proof reading’ which is defined as “the systematic checking and identification of errors in spelling, punctuation, grammar and sentence construction, formatting and layout in the text”; </w:t>
+      </w:r>
+      <w:proofErr w:type="gramStart"/>
+      <w:r>
+        <w:rPr>
+          <w:i/>
+          <w:sz w:val="22"/>
+          <w:szCs w:val="22"/>
+        </w:rPr>
+        <w:t>see</w:t>
+      </w:r>
+      <w:proofErr w:type="gramEnd"/>
     </w:p>
     <w:p>
       <w:pPr>
@@ -1605,6 +1709,117 @@
       <w:pPr>
         <w:pStyle w:val="TOC2"/>
         <w:rPr>
+          <w:noProof/>
+        </w:rPr>
+      </w:pPr>
+      <w:r>
+        <w:rPr>
+          <w:noProof/>
+        </w:rPr>
+        <w:t>1.2  Overview of algorithms</w:t>
+      </w:r>
+      <w:r>
+        <w:rPr>
+          <w:noProof/>
+        </w:rPr>
+        <w:tab/>
+      </w:r>
+      <w:r>
+        <w:rPr>
+          <w:noProof/>
+        </w:rPr>
+        <w:fldChar w:fldCharType="begin"/>
+      </w:r>
+      <w:r>
+        <w:rPr>
+          <w:noProof/>
+        </w:rPr>
+        <w:instrText xml:space="preserve"> PAGEREF _Toc407145091 \h </w:instrText>
+      </w:r>
+      <w:r>
+        <w:rPr>
+          <w:noProof/>
+        </w:rPr>
+      </w:r>
+      <w:r>
+        <w:rPr>
+          <w:noProof/>
+        </w:rPr>
+        <w:fldChar w:fldCharType="separate"/>
+      </w:r>
+      <w:r>
+        <w:rPr>
+          <w:noProof/>
+        </w:rPr>
+        <w:t>1</w:t>
+      </w:r>
+      <w:r>
+        <w:rPr>
+          <w:noProof/>
+        </w:rPr>
+        <w:fldChar w:fldCharType="end"/>
+      </w:r>
+    </w:p>
+    <w:p>
+      <w:pPr>
+        <w:pStyle w:val="TOC2"/>
+        <w:rPr>
+          <w:noProof/>
+        </w:rPr>
+      </w:pPr>
+      <w:r>
+        <w:rPr>
+          <w:noProof/>
+        </w:rPr>
+        <w:tab/>
+        <w:t>1.2.1  Levenshtein Distance</w:t>
+      </w:r>
+      <w:r>
+        <w:rPr>
+          <w:noProof/>
+        </w:rPr>
+        <w:tab/>
+      </w:r>
+      <w:r>
+        <w:rPr>
+          <w:noProof/>
+        </w:rPr>
+        <w:fldChar w:fldCharType="begin"/>
+      </w:r>
+      <w:r>
+        <w:rPr>
+          <w:noProof/>
+        </w:rPr>
+        <w:instrText xml:space="preserve"> PAGEREF _Toc407145091 \h </w:instrText>
+      </w:r>
+      <w:r>
+        <w:rPr>
+          <w:noProof/>
+        </w:rPr>
+      </w:r>
+      <w:r>
+        <w:rPr>
+          <w:noProof/>
+        </w:rPr>
+        <w:fldChar w:fldCharType="separate"/>
+      </w:r>
+      <w:r>
+        <w:rPr>
+          <w:noProof/>
+        </w:rPr>
+        <w:t>1</w:t>
+      </w:r>
+      <w:r>
+        <w:rPr>
+          <w:noProof/>
+        </w:rPr>
+        <w:fldChar w:fldCharType="end"/>
+      </w:r>
+    </w:p>
+    <w:p>
+      <w:pPr>
+        <w:pStyle w:val="TOC2"/>
+        <w:rPr>
           <w:rFonts w:asciiTheme="minorHAnsi" w:eastAsiaTheme="minorEastAsia" w:hAnsiTheme="minorHAnsi" w:cstheme="minorBidi"/>
           <w:noProof/>
           <w:sz w:val="22"/>
@@ -1621,7 +1836,7 @@
         <w:rPr>
           <w:noProof/>
         </w:rPr>
-        <w:t>2</w:t>
+        <w:t>3</w:t>
       </w:r>
       <w:r>
         <w:rPr>
@@ -1878,25 +2093,7 @@
         <w:rPr>
           <w:noProof/>
         </w:rPr>
-        <w:t>2.</w:t>
-      </w:r>
-      <w:r>
-        <w:rPr>
-          <w:noProof/>
-        </w:rPr>
-        <w:t>3</w:t>
-      </w:r>
-      <w:r>
-        <w:rPr>
-          <w:noProof/>
-        </w:rPr>
-        <w:t xml:space="preserve">  </w:t>
-      </w:r>
-      <w:r>
-        <w:rPr>
-          <w:noProof/>
-        </w:rPr>
-        <w:t>Phase Two (spell checking)</w:t>
+        <w:t>2.3  Phase Two (spell checking)</w:t>
       </w:r>
       <w:r>
         <w:rPr>
@@ -1951,13 +2148,7 @@
         <w:rPr>
           <w:noProof/>
         </w:rPr>
-        <w:t xml:space="preserve">2.2  </w:t>
-      </w:r>
-      <w:r>
-        <w:rPr>
-          <w:noProof/>
-        </w:rPr>
-        <w:t>Phase Three (testing)</w:t>
+        <w:t>2.2  Phase Three (testing)</w:t>
       </w:r>
       <w:r>
         <w:rPr>
@@ -2012,13 +2203,7 @@
         <w:rPr>
           <w:noProof/>
         </w:rPr>
-        <w:t xml:space="preserve">Chapter </w:t>
-      </w:r>
-      <w:r>
-        <w:rPr>
-          <w:noProof/>
-        </w:rPr>
-        <w:t>3 Results</w:t>
+        <w:t>Chapter 3 Results</w:t>
       </w:r>
       <w:r>
         <w:rPr>
@@ -2073,31 +2258,7 @@
         <w:rPr>
           <w:noProof/>
         </w:rPr>
-        <w:t>3</w:t>
-      </w:r>
-      <w:r>
-        <w:rPr>
-          <w:noProof/>
-        </w:rPr>
-        <w:t>.</w:t>
-      </w:r>
-      <w:r>
-        <w:rPr>
-          <w:noProof/>
-        </w:rPr>
-        <w:t>1</w:t>
-      </w:r>
-      <w:r>
-        <w:rPr>
-          <w:noProof/>
-        </w:rPr>
-        <w:t xml:space="preserve">  </w:t>
-      </w:r>
-      <w:r>
-        <w:rPr>
-          <w:noProof/>
-        </w:rPr>
-        <w:t>Results from automated testing</w:t>
+        <w:t>3.1  Results from automated testing</w:t>
       </w:r>
       <w:r>
         <w:rPr>
@@ -2152,19 +2313,7 @@
         <w:rPr>
           <w:noProof/>
         </w:rPr>
-        <w:t>3</w:t>
-      </w:r>
-      <w:r>
-        <w:rPr>
-          <w:noProof/>
-        </w:rPr>
-        <w:t xml:space="preserve">.2  </w:t>
-      </w:r>
-      <w:r>
-        <w:rPr>
-          <w:noProof/>
-        </w:rPr>
-        <w:t>Results from user testing</w:t>
+        <w:t>3.2  Results from user testing</w:t>
       </w:r>
       <w:r>
         <w:rPr>
@@ -2219,25 +2368,7 @@
         <w:rPr>
           <w:noProof/>
         </w:rPr>
-        <w:t xml:space="preserve">Chapter </w:t>
-      </w:r>
-      <w:r>
-        <w:rPr>
-          <w:noProof/>
-        </w:rPr>
-        <w:t>4</w:t>
-      </w:r>
-      <w:r>
-        <w:rPr>
-          <w:noProof/>
-        </w:rPr>
-        <w:t xml:space="preserve"> </w:t>
-      </w:r>
-      <w:r>
-        <w:rPr>
-          <w:noProof/>
-        </w:rPr>
-        <w:t>Discussion</w:t>
+        <w:t>Chapter 4 Discussion</w:t>
       </w:r>
       <w:r>
         <w:rPr>
@@ -2292,31 +2423,7 @@
         <w:rPr>
           <w:noProof/>
         </w:rPr>
-        <w:t>3</w:t>
-      </w:r>
-      <w:r>
-        <w:rPr>
-          <w:noProof/>
-        </w:rPr>
-        <w:t>.</w:t>
-      </w:r>
-      <w:r>
-        <w:rPr>
-          <w:noProof/>
-        </w:rPr>
-        <w:t>3</w:t>
-      </w:r>
-      <w:r>
-        <w:rPr>
-          <w:noProof/>
-        </w:rPr>
-        <w:t xml:space="preserve">  </w:t>
-      </w:r>
-      <w:r>
-        <w:rPr>
-          <w:noProof/>
-        </w:rPr>
-        <w:t>Conclusions</w:t>
+        <w:t>3.3  Conclusions</w:t>
       </w:r>
       <w:r>
         <w:rPr>
@@ -2371,13 +2478,7 @@
         <w:rPr>
           <w:noProof/>
         </w:rPr>
-        <w:t xml:space="preserve">3.3  </w:t>
-      </w:r>
-      <w:r>
-        <w:rPr>
-          <w:noProof/>
-        </w:rPr>
-        <w:t>Ideas for future work</w:t>
+        <w:t>3.3  Ideas for future work</w:t>
       </w:r>
       <w:r>
         <w:rPr>
@@ -2425,11 +2526,7 @@
       <w:pPr>
         <w:pStyle w:val="TOC1"/>
         <w:rPr>
-          <w:rFonts w:asciiTheme="minorHAnsi" w:eastAsiaTheme="minorEastAsia" w:hAnsiTheme="minorHAnsi" w:cstheme="minorBidi"/>
-          <w:b w:val="0"/>
-          <w:noProof/>
-          <w:sz w:val="22"/>
-          <w:szCs w:val="22"/>
+          <w:noProof/>
         </w:rPr>
       </w:pPr>
       <w:r>
@@ -2902,12 +2999,527 @@
       <w:pPr>
         <w:pStyle w:val="Heading2"/>
       </w:pPr>
+      <w:r>
+        <w:t>1.</w:t>
+      </w:r>
+      <w:r>
+        <w:t>2</w:t>
+      </w:r>
+      <w:r>
+        <w:t xml:space="preserve">  </w:t>
+      </w:r>
+      <w:r>
+        <w:t>Overview of algorithms</w:t>
+      </w:r>
+    </w:p>
+    <w:p>
+      <w:pPr>
+        <w:pStyle w:val="Heading2"/>
+        <w:rPr>
+          <w:sz w:val="24"/>
+          <w:szCs w:val="18"/>
+        </w:rPr>
+      </w:pPr>
+      <w:r>
+        <w:rPr>
+          <w:sz w:val="24"/>
+          <w:szCs w:val="18"/>
+        </w:rPr>
+        <w:t xml:space="preserve">1.2.1  </w:t>
+      </w:r>
+      <w:r>
+        <w:rPr>
+          <w:sz w:val="24"/>
+          <w:szCs w:val="18"/>
+        </w:rPr>
+        <w:t>Levenshtein Distance</w:t>
+      </w:r>
+    </w:p>
+    <w:p>
+      <w:pPr>
+        <w:rPr>
+          <w:sz w:val="22"/>
+          <w:szCs w:val="18"/>
+        </w:rPr>
+      </w:pPr>
+      <w:r>
+        <w:rPr>
+          <w:sz w:val="22"/>
+          <w:szCs w:val="18"/>
+        </w:rPr>
+        <w:t>Levenshtein distance is an algorithm used to measure the distance / difference between two strings,</w:t>
+      </w:r>
+      <w:r>
+        <w:rPr>
+          <w:sz w:val="22"/>
+          <w:szCs w:val="18"/>
+        </w:rPr>
+        <w:t xml:space="preserve"> represented as a single value. The algorithm used is recursive and works as follows:</w:t>
+      </w:r>
+    </w:p>
+    <w:p>
+      <w:pPr>
+        <w:jc w:val="center"/>
+        <w:rPr>
+          <w:sz w:val="22"/>
+          <w:szCs w:val="18"/>
+        </w:rPr>
+      </w:pPr>
+      <w:r>
+        <w:rPr>
+          <w:noProof/>
+        </w:rPr>
+        <w:drawing>
+          <wp:inline distT="0" distB="0" distL="0" distR="0" wp14:anchorId="5D9BAE45" wp14:editId="61502604">
+            <wp:extent cx="5731510" cy="1218565"/>
+            <wp:effectExtent l="0" t="0" r="2540" b="635"/>
+            <wp:docPr id="190166101" name="Picture 1" descr="A math equations with numbers&#10;&#10;Description automatically generated with medium confidence"/>
+            <wp:cNvGraphicFramePr>
+              <a:graphicFrameLocks xmlns:a="http://schemas.openxmlformats.org/drawingml/2006/main" noChangeAspect="1"/>
+            </wp:cNvGraphicFramePr>
+            <a:graphic xmlns:a="http://schemas.openxmlformats.org/drawingml/2006/main">
+              <a:graphicData uri="http://schemas.openxmlformats.org/drawingml/2006/picture">
+                <pic:pic xmlns:pic="http://schemas.openxmlformats.org/drawingml/2006/picture">
+                  <pic:nvPicPr>
+                    <pic:cNvPr id="190166101" name="Picture 1" descr="A math equations with numbers&#10;&#10;Description automatically generated with medium confidence"/>
+                    <pic:cNvPicPr/>
+                  </pic:nvPicPr>
+                  <pic:blipFill>
+                    <a:blip r:embed="rId10"/>
+                    <a:stretch>
+                      <a:fillRect/>
+                    </a:stretch>
+                  </pic:blipFill>
+                  <pic:spPr>
+                    <a:xfrm>
+                      <a:off x="0" y="0"/>
+                      <a:ext cx="5731510" cy="1218565"/>
+                    </a:xfrm>
+                    <a:prstGeom prst="rect">
+                      <a:avLst/>
+                    </a:prstGeom>
+                  </pic:spPr>
+                </pic:pic>
+              </a:graphicData>
+            </a:graphic>
+          </wp:inline>
+        </w:drawing>
+      </w:r>
+    </w:p>
+    <w:p>
+      <w:pPr>
+        <w:jc w:val="center"/>
+        <w:rPr>
+          <w:sz w:val="22"/>
+          <w:szCs w:val="18"/>
+        </w:rPr>
+      </w:pPr>
+      <w:r>
+        <w:rPr>
+          <w:b/>
+          <w:bCs/>
+          <w:sz w:val="22"/>
+          <w:szCs w:val="18"/>
+        </w:rPr>
+        <w:t>Figure 1</w:t>
+      </w:r>
+      <w:r>
+        <w:rPr>
+          <w:sz w:val="22"/>
+          <w:szCs w:val="18"/>
+        </w:rPr>
+        <w:t>. Levenstein Distance algorithm</w:t>
+      </w:r>
+    </w:p>
+    <w:p>
+      <w:pPr>
+        <w:rPr>
+          <w:sz w:val="22"/>
+          <w:szCs w:val="18"/>
+        </w:rPr>
+      </w:pPr>
+      <w:r>
+        <w:rPr>
+          <w:sz w:val="22"/>
+          <w:szCs w:val="18"/>
+        </w:rPr>
+        <w:t xml:space="preserve">Where, </w:t>
+      </w:r>
+      <w:proofErr w:type="spellStart"/>
+      <w:r>
+        <w:rPr>
+          <w:sz w:val="22"/>
+          <w:szCs w:val="18"/>
+        </w:rPr>
+        <w:t>i</w:t>
+      </w:r>
+      <w:proofErr w:type="spellEnd"/>
+      <w:r>
+        <w:rPr>
+          <w:sz w:val="22"/>
+          <w:szCs w:val="18"/>
+        </w:rPr>
+        <w:t xml:space="preserve"> and j are the two strings. </w:t>
+      </w:r>
+      <w:r>
+        <w:rPr>
+          <w:sz w:val="22"/>
+          <w:szCs w:val="18"/>
+        </w:rPr>
+        <w:t>The larger the distance, the more different the two strings are. As an example,</w:t>
+      </w:r>
+      <w:r>
+        <w:rPr>
+          <w:sz w:val="22"/>
+          <w:szCs w:val="18"/>
+        </w:rPr>
+        <w:t xml:space="preserve"> if you had the strings “kitten” and “sitting”:</w:t>
+      </w:r>
+    </w:p>
+    <w:p>
+      <w:pPr>
+        <w:pStyle w:val="ListParagraph"/>
+        <w:numPr>
+          <w:ilvl w:val="0"/>
+          <w:numId w:val="25"/>
+        </w:numPr>
+        <w:rPr>
+          <w:sz w:val="22"/>
+          <w:szCs w:val="18"/>
+        </w:rPr>
+      </w:pPr>
+      <w:r>
+        <w:rPr>
+          <w:b/>
+          <w:bCs/>
+          <w:sz w:val="22"/>
+          <w:szCs w:val="18"/>
+        </w:rPr>
+        <w:t>k</w:t>
+      </w:r>
+      <w:r>
+        <w:rPr>
+          <w:sz w:val="22"/>
+          <w:szCs w:val="18"/>
+        </w:rPr>
+        <w:t xml:space="preserve">itten -&gt; </w:t>
+      </w:r>
+      <w:r>
+        <w:rPr>
+          <w:b/>
+          <w:bCs/>
+          <w:sz w:val="22"/>
+          <w:szCs w:val="18"/>
+        </w:rPr>
+        <w:t>s</w:t>
+      </w:r>
+      <w:r>
+        <w:rPr>
+          <w:sz w:val="22"/>
+          <w:szCs w:val="18"/>
+        </w:rPr>
+        <w:t>itten (</w:t>
+      </w:r>
+      <w:r>
+        <w:rPr>
+          <w:sz w:val="22"/>
+          <w:szCs w:val="18"/>
+        </w:rPr>
+        <w:t>delete</w:t>
+      </w:r>
+      <w:r>
+        <w:rPr>
+          <w:sz w:val="22"/>
+          <w:szCs w:val="18"/>
+        </w:rPr>
+        <w:t xml:space="preserve"> ‘k’</w:t>
+      </w:r>
+      <w:r>
+        <w:rPr>
+          <w:sz w:val="22"/>
+          <w:szCs w:val="18"/>
+        </w:rPr>
+        <w:t xml:space="preserve"> at index 0, and insert</w:t>
+      </w:r>
+      <w:r>
+        <w:rPr>
+          <w:sz w:val="22"/>
+          <w:szCs w:val="18"/>
+        </w:rPr>
+        <w:t xml:space="preserve"> ‘s’</w:t>
+      </w:r>
+      <w:r>
+        <w:rPr>
+          <w:sz w:val="22"/>
+          <w:szCs w:val="18"/>
+        </w:rPr>
+        <w:t xml:space="preserve"> at index 0</w:t>
+      </w:r>
+      <w:r>
+        <w:rPr>
+          <w:sz w:val="22"/>
+          <w:szCs w:val="18"/>
+        </w:rPr>
+        <w:t>)</w:t>
+      </w:r>
+    </w:p>
+    <w:p>
+      <w:pPr>
+        <w:pStyle w:val="ListParagraph"/>
+        <w:numPr>
+          <w:ilvl w:val="0"/>
+          <w:numId w:val="25"/>
+        </w:numPr>
+        <w:rPr>
+          <w:sz w:val="22"/>
+          <w:szCs w:val="18"/>
+        </w:rPr>
+      </w:pPr>
+      <w:r>
+        <w:rPr>
+          <w:sz w:val="22"/>
+          <w:szCs w:val="18"/>
+        </w:rPr>
+        <w:t>sitt</w:t>
+      </w:r>
+      <w:r>
+        <w:rPr>
+          <w:b/>
+          <w:bCs/>
+          <w:sz w:val="22"/>
+          <w:szCs w:val="18"/>
+        </w:rPr>
+        <w:t>e</w:t>
+      </w:r>
+      <w:r>
+        <w:rPr>
+          <w:sz w:val="22"/>
+          <w:szCs w:val="18"/>
+        </w:rPr>
+        <w:t xml:space="preserve">n -&gt; </w:t>
+      </w:r>
+      <w:r>
+        <w:rPr>
+          <w:sz w:val="22"/>
+          <w:szCs w:val="18"/>
+        </w:rPr>
+        <w:t>sitt</w:t>
+      </w:r>
+      <w:r>
+        <w:rPr>
+          <w:b/>
+          <w:bCs/>
+          <w:sz w:val="22"/>
+          <w:szCs w:val="18"/>
+        </w:rPr>
+        <w:t>i</w:t>
+      </w:r>
+      <w:r>
+        <w:rPr>
+          <w:sz w:val="22"/>
+          <w:szCs w:val="18"/>
+        </w:rPr>
+        <w:t>n (</w:t>
+      </w:r>
+      <w:r>
+        <w:rPr>
+          <w:sz w:val="22"/>
+          <w:szCs w:val="18"/>
+        </w:rPr>
+        <w:t>delete</w:t>
+      </w:r>
+      <w:r>
+        <w:rPr>
+          <w:sz w:val="22"/>
+          <w:szCs w:val="18"/>
+        </w:rPr>
+        <w:t xml:space="preserve"> ‘e’</w:t>
+      </w:r>
+      <w:r>
+        <w:rPr>
+          <w:sz w:val="22"/>
+          <w:szCs w:val="18"/>
+        </w:rPr>
+        <w:t xml:space="preserve"> at index 4, and insert</w:t>
+      </w:r>
+      <w:r>
+        <w:rPr>
+          <w:sz w:val="22"/>
+          <w:szCs w:val="18"/>
+        </w:rPr>
+        <w:t xml:space="preserve"> ‘</w:t>
+      </w:r>
+      <w:proofErr w:type="spellStart"/>
+      <w:r>
+        <w:rPr>
+          <w:sz w:val="22"/>
+          <w:szCs w:val="18"/>
+        </w:rPr>
+        <w:t>i</w:t>
+      </w:r>
+      <w:proofErr w:type="spellEnd"/>
+      <w:r>
+        <w:rPr>
+          <w:sz w:val="22"/>
+          <w:szCs w:val="18"/>
+        </w:rPr>
+        <w:t>’</w:t>
+      </w:r>
+      <w:r>
+        <w:rPr>
+          <w:sz w:val="22"/>
+          <w:szCs w:val="18"/>
+        </w:rPr>
+        <w:t xml:space="preserve"> at index 4</w:t>
+      </w:r>
+      <w:r>
+        <w:rPr>
+          <w:sz w:val="22"/>
+          <w:szCs w:val="18"/>
+        </w:rPr>
+        <w:t>)</w:t>
+      </w:r>
+    </w:p>
+    <w:p>
+      <w:pPr>
+        <w:pStyle w:val="ListParagraph"/>
+        <w:numPr>
+          <w:ilvl w:val="0"/>
+          <w:numId w:val="25"/>
+        </w:numPr>
+        <w:rPr>
+          <w:sz w:val="22"/>
+          <w:szCs w:val="18"/>
+        </w:rPr>
+      </w:pPr>
+      <w:r>
+        <w:rPr>
+          <w:sz w:val="22"/>
+          <w:szCs w:val="18"/>
+        </w:rPr>
+        <w:lastRenderedPageBreak/>
+        <w:t xml:space="preserve">sittin -&gt; sitting (insert g at </w:t>
+      </w:r>
+      <w:r>
+        <w:rPr>
+          <w:sz w:val="22"/>
+          <w:szCs w:val="18"/>
+        </w:rPr>
+        <w:t>index 6</w:t>
+      </w:r>
+      <w:r>
+        <w:rPr>
+          <w:sz w:val="22"/>
+          <w:szCs w:val="18"/>
+        </w:rPr>
+        <w:t>)</w:t>
+      </w:r>
+    </w:p>
+    <w:p>
+      <w:pPr>
+        <w:rPr>
+          <w:sz w:val="22"/>
+          <w:szCs w:val="18"/>
+        </w:rPr>
+      </w:pPr>
+      <w:r>
+        <w:rPr>
+          <w:sz w:val="22"/>
+          <w:szCs w:val="18"/>
+        </w:rPr>
+        <w:t xml:space="preserve">As there were </w:t>
+      </w:r>
+      <w:r>
+        <w:rPr>
+          <w:sz w:val="22"/>
+          <w:szCs w:val="18"/>
+        </w:rPr>
+        <w:t>5</w:t>
+      </w:r>
+      <w:r>
+        <w:rPr>
+          <w:sz w:val="22"/>
+          <w:szCs w:val="18"/>
+        </w:rPr>
+        <w:t xml:space="preserve"> </w:t>
+      </w:r>
+      <w:r>
+        <w:rPr>
+          <w:sz w:val="22"/>
+          <w:szCs w:val="18"/>
+        </w:rPr>
+        <w:t>operations</w:t>
+      </w:r>
+      <w:r>
+        <w:rPr>
+          <w:sz w:val="22"/>
+          <w:szCs w:val="18"/>
+        </w:rPr>
+        <w:t xml:space="preserve"> that needed to occur to change the string, the levenshtein distance between the two words is </w:t>
+      </w:r>
+      <w:r>
+        <w:rPr>
+          <w:sz w:val="22"/>
+          <w:szCs w:val="18"/>
+        </w:rPr>
+        <w:t>5</w:t>
+      </w:r>
+      <w:r>
+        <w:rPr>
+          <w:sz w:val="22"/>
+          <w:szCs w:val="18"/>
+        </w:rPr>
+        <w:t>.</w:t>
+      </w:r>
+      <w:r>
+        <w:rPr>
+          <w:sz w:val="22"/>
+          <w:szCs w:val="18"/>
+        </w:rPr>
+        <w:t xml:space="preserve"> </w:t>
+      </w:r>
+    </w:p>
+    <w:p>
+      <w:pPr>
+        <w:rPr>
+          <w:sz w:val="22"/>
+          <w:szCs w:val="18"/>
+        </w:rPr>
+      </w:pPr>
+      <w:r>
+        <w:rPr>
+          <w:sz w:val="22"/>
+          <w:szCs w:val="18"/>
+        </w:rPr>
+        <w:t xml:space="preserve">This algorithm will be used to find words closest to </w:t>
+      </w:r>
+      <w:proofErr w:type="gramStart"/>
+      <w:r>
+        <w:rPr>
+          <w:sz w:val="22"/>
+          <w:szCs w:val="18"/>
+        </w:rPr>
+        <w:t>a</w:t>
+      </w:r>
+      <w:proofErr w:type="gramEnd"/>
+      <w:r>
+        <w:rPr>
+          <w:sz w:val="22"/>
+          <w:szCs w:val="18"/>
+        </w:rPr>
+        <w:t xml:space="preserve"> entry given by the user to mimic suggestions you would receive in a writing application.</w:t>
+      </w:r>
+    </w:p>
+    <w:p>
+      <w:pPr>
+        <w:pStyle w:val="Heading2"/>
+      </w:pPr>
       <w:bookmarkStart w:id="5" w:name="_Toc407145092"/>
       <w:r>
         <w:t>1.</w:t>
       </w:r>
       <w:r>
-        <w:t>2</w:t>
+        <w:t>3</w:t>
       </w:r>
       <w:r>
         <w:t xml:space="preserve">  </w:t>
@@ -2947,6 +3559,148 @@
           <w:szCs w:val="22"/>
         </w:rPr>
         <w:t>.&gt;</w:t>
+      </w:r>
+    </w:p>
+    <w:p>
+      <w:pPr>
+        <w:rPr>
+          <w:sz w:val="22"/>
+          <w:szCs w:val="22"/>
+        </w:rPr>
+      </w:pPr>
+    </w:p>
+    <w:p>
+      <w:pPr>
+        <w:rPr>
+          <w:sz w:val="22"/>
+          <w:szCs w:val="22"/>
+        </w:rPr>
+      </w:pPr>
+      <w:r>
+        <w:rPr>
+          <w:sz w:val="22"/>
+          <w:szCs w:val="22"/>
+        </w:rPr>
+        <w:t>Study used:</w:t>
+      </w:r>
+      <w:r>
+        <w:t xml:space="preserve"> </w:t>
+      </w:r>
+      <w:hyperlink r:id="rId11" w:history="1">
+        <w:r>
+          <w:rPr>
+            <w:rStyle w:val="Hyperlink"/>
+            <w:sz w:val="22"/>
+            <w:szCs w:val="22"/>
+          </w:rPr>
+          <w:t>https://citeseerx.ist.psu.edu/document?repid=rep1&amp;type=pdf&amp;doi=939835023700f66cc7fbb861a76af93824b3b082</w:t>
+        </w:r>
+      </w:hyperlink>
+    </w:p>
+    <w:p>
+      <w:pPr>
+        <w:rPr>
+          <w:sz w:val="22"/>
+          <w:szCs w:val="22"/>
+        </w:rPr>
+      </w:pPr>
+      <w:r>
+        <w:rPr>
+          <w:sz w:val="22"/>
+          <w:szCs w:val="22"/>
+        </w:rPr>
+        <w:t xml:space="preserve">For some cases of developing spell checkers the implementation seems quite simple and straightforward. As outlined in </w:t>
+      </w:r>
+      <w:r>
+        <w:rPr>
+          <w:sz w:val="22"/>
+          <w:szCs w:val="22"/>
+        </w:rPr>
+        <w:t>the 2015 paper</w:t>
+      </w:r>
+      <w:r>
+        <w:rPr>
+          <w:sz w:val="22"/>
+          <w:szCs w:val="22"/>
+        </w:rPr>
+        <w:t xml:space="preserve"> titled</w:t>
+      </w:r>
+      <w:r>
+        <w:rPr>
+          <w:sz w:val="22"/>
+          <w:szCs w:val="22"/>
+        </w:rPr>
+        <w:t xml:space="preserve"> ‘Spell Checker’</w:t>
+      </w:r>
+      <w:r>
+        <w:rPr>
+          <w:rStyle w:val="FootnoteReference"/>
+          <w:szCs w:val="22"/>
+        </w:rPr>
+        <w:footnoteReference w:id="1"/>
+      </w:r>
+      <w:r>
+        <w:rPr>
+          <w:sz w:val="22"/>
+          <w:szCs w:val="22"/>
+        </w:rPr>
+        <w:t xml:space="preserve">, the obvious choice would be to use the </w:t>
+      </w:r>
+      <w:r>
+        <w:rPr>
+          <w:sz w:val="22"/>
+          <w:szCs w:val="22"/>
+        </w:rPr>
+        <w:t xml:space="preserve">Levenshtein distance algorithm </w:t>
+      </w:r>
+      <w:r>
+        <w:rPr>
+          <w:sz w:val="22"/>
+          <w:szCs w:val="22"/>
+        </w:rPr>
+        <w:t xml:space="preserve">to calculate the difference between </w:t>
+      </w:r>
+      <w:r>
+        <w:rPr>
+          <w:sz w:val="22"/>
+          <w:szCs w:val="22"/>
+        </w:rPr>
+        <w:t xml:space="preserve">an entered word and a word in a generated dictionary. They argue that </w:t>
+      </w:r>
+      <w:r>
+        <w:rPr>
+          <w:sz w:val="22"/>
+          <w:szCs w:val="22"/>
+        </w:rPr>
+        <w:t>using</w:t>
+      </w:r>
+      <w:r>
+        <w:rPr>
+          <w:sz w:val="22"/>
+          <w:szCs w:val="22"/>
+        </w:rPr>
+        <w:t xml:space="preserve"> the method, it can produce </w:t>
+      </w:r>
+      <w:r>
+        <w:rPr>
+          <w:sz w:val="22"/>
+          <w:szCs w:val="22"/>
+        </w:rPr>
+        <w:t>a</w:t>
+      </w:r>
+      <w:r>
+        <w:rPr>
+          <w:sz w:val="22"/>
+          <w:szCs w:val="22"/>
+        </w:rPr>
+        <w:t xml:space="preserve"> list of suggestions by comparing a misspelled word to those in a dictionary the program has access to, one of which should be correct spelling of the word. </w:t>
+      </w:r>
+      <w:r>
+        <w:rPr>
+          <w:sz w:val="22"/>
+          <w:szCs w:val="22"/>
+        </w:rPr>
+        <w:t>The also make the point to say that the algorithm provides easy identification of misspellings and can offer results very quickly, reducing the runtime of the application used.</w:t>
       </w:r>
     </w:p>
     <w:p>
@@ -2999,710 +3753,108 @@
         <w:pStyle w:val="Heading2"/>
       </w:pPr>
       <w:r>
-        <w:t>2.1</w:t>
+        <w:t xml:space="preserve">2.1  </w:t>
+      </w:r>
+      <w:r>
+        <w:t>Proof of Concept</w:t>
+      </w:r>
+    </w:p>
+    <w:p>
+      <w:pPr>
+        <w:rPr>
+          <w:b/>
+          <w:bCs/>
+        </w:rPr>
+      </w:pPr>
+      <w:r>
+        <w:rPr>
+          <w:b/>
+          <w:bCs/>
+        </w:rPr>
+        <w:t>2.1.1 Design</w:t>
+      </w:r>
+    </w:p>
+    <w:p>
+      <w:pPr>
+        <w:rPr>
+          <w:b/>
+          <w:bCs/>
+        </w:rPr>
+      </w:pPr>
+      <w:r>
+        <w:rPr>
+          <w:b/>
+          <w:bCs/>
+        </w:rPr>
+        <w:t>2.1.2 Conclusions</w:t>
+      </w:r>
+    </w:p>
+    <w:p>
+      <w:pPr>
+        <w:pStyle w:val="Heading2"/>
+      </w:pPr>
+      <w:r>
+        <w:t>2.</w:t>
+      </w:r>
+      <w:r>
+        <w:t>2</w:t>
       </w:r>
       <w:r>
         <w:t xml:space="preserve">  </w:t>
       </w:r>
-      <w:bookmarkEnd w:id="10"/>
-      <w:bookmarkEnd w:id="11"/>
-      <w:bookmarkEnd w:id="12"/>
-      <w:bookmarkEnd w:id="13"/>
-      <w:r>
-        <w:t>Table example</w:t>
-      </w:r>
-    </w:p>
-    <w:tbl>
-      <w:tblPr>
-        <w:tblpPr w:leftFromText="180" w:rightFromText="180" w:vertAnchor="text" w:horzAnchor="margin" w:tblpY="1461"/>
-        <w:tblW w:w="0" w:type="auto"/>
-        <w:tblLayout w:type="fixed"/>
-        <w:tblCellMar>
-          <w:left w:w="0" w:type="dxa"/>
-          <w:right w:w="0" w:type="dxa"/>
-        </w:tblCellMar>
-        <w:tblLook w:val="0000" w:firstRow="0" w:lastRow="0" w:firstColumn="0" w:lastColumn="0" w:noHBand="0" w:noVBand="0"/>
-      </w:tblPr>
-      <w:tblGrid>
-        <w:gridCol w:w="2205"/>
-        <w:gridCol w:w="2160"/>
-        <w:gridCol w:w="2745"/>
-      </w:tblGrid>
-      <w:tr>
-        <w:trPr>
-          <w:cantSplit/>
-        </w:trPr>
-        <w:tc>
-          <w:tcPr>
-            <w:tcW w:w="2205" w:type="dxa"/>
-            <w:tcBorders>
-              <w:top w:val="single" w:sz="6" w:space="0" w:color="auto"/>
-              <w:left w:val="single" w:sz="6" w:space="0" w:color="auto"/>
-              <w:right w:val="single" w:sz="6" w:space="0" w:color="auto"/>
-            </w:tcBorders>
-          </w:tcPr>
-          <w:p>
-            <w:pPr>
-              <w:pStyle w:val="centred"/>
-              <w:tabs>
-                <w:tab w:val="decimal" w:pos="1123"/>
-              </w:tabs>
-              <w:rPr>
-                <w:b/>
-                <w:sz w:val="22"/>
-                <w:szCs w:val="22"/>
-              </w:rPr>
-            </w:pPr>
-            <w:r>
-              <w:rPr>
-                <w:b/>
-                <w:sz w:val="22"/>
-                <w:szCs w:val="22"/>
-              </w:rPr>
-              <w:t>Heading One</w:t>
-            </w:r>
-          </w:p>
-        </w:tc>
-        <w:tc>
-          <w:tcPr>
-            <w:tcW w:w="2160" w:type="dxa"/>
-            <w:tcBorders>
-              <w:top w:val="single" w:sz="6" w:space="0" w:color="auto"/>
-              <w:right w:val="single" w:sz="6" w:space="0" w:color="auto"/>
-            </w:tcBorders>
-          </w:tcPr>
-          <w:p>
-            <w:pPr>
-              <w:pStyle w:val="centred"/>
-              <w:tabs>
-                <w:tab w:val="decimal" w:pos="1044"/>
-              </w:tabs>
-              <w:rPr>
-                <w:b/>
-                <w:sz w:val="22"/>
-                <w:szCs w:val="22"/>
-              </w:rPr>
-            </w:pPr>
-            <w:r>
-              <w:rPr>
-                <w:b/>
-                <w:sz w:val="22"/>
-                <w:szCs w:val="22"/>
-              </w:rPr>
-              <w:t>Heading Two</w:t>
-            </w:r>
-          </w:p>
-        </w:tc>
-        <w:tc>
-          <w:tcPr>
-            <w:tcW w:w="2745" w:type="dxa"/>
-            <w:tcBorders>
-              <w:top w:val="single" w:sz="6" w:space="0" w:color="auto"/>
-              <w:right w:val="single" w:sz="6" w:space="0" w:color="auto"/>
-            </w:tcBorders>
-          </w:tcPr>
-          <w:p>
-            <w:pPr>
-              <w:pStyle w:val="centred"/>
-              <w:tabs>
-                <w:tab w:val="decimal" w:pos="1269"/>
-              </w:tabs>
-              <w:rPr>
-                <w:b/>
-                <w:sz w:val="22"/>
-                <w:szCs w:val="22"/>
-              </w:rPr>
-            </w:pPr>
-            <w:r>
-              <w:rPr>
-                <w:b/>
-                <w:sz w:val="22"/>
-                <w:szCs w:val="22"/>
-              </w:rPr>
-              <w:t>Heading Three</w:t>
-            </w:r>
-          </w:p>
-        </w:tc>
-      </w:tr>
-      <w:tr>
-        <w:trPr>
-          <w:cantSplit/>
-        </w:trPr>
-        <w:tc>
-          <w:tcPr>
-            <w:tcW w:w="2205" w:type="dxa"/>
-            <w:tcBorders>
-              <w:top w:val="single" w:sz="6" w:space="0" w:color="auto"/>
-              <w:left w:val="single" w:sz="6" w:space="0" w:color="auto"/>
-              <w:right w:val="single" w:sz="6" w:space="0" w:color="auto"/>
-            </w:tcBorders>
-          </w:tcPr>
-          <w:p>
-            <w:pPr>
-              <w:tabs>
-                <w:tab w:val="decimal" w:pos="1123"/>
-              </w:tabs>
-              <w:rPr>
-                <w:sz w:val="22"/>
-                <w:szCs w:val="22"/>
-              </w:rPr>
-            </w:pPr>
-            <w:r>
-              <w:rPr>
-                <w:sz w:val="22"/>
-                <w:szCs w:val="22"/>
-              </w:rPr>
-              <w:t>1.1</w:t>
-            </w:r>
-          </w:p>
-        </w:tc>
-        <w:tc>
-          <w:tcPr>
-            <w:tcW w:w="2160" w:type="dxa"/>
-            <w:tcBorders>
-              <w:top w:val="single" w:sz="6" w:space="0" w:color="auto"/>
-            </w:tcBorders>
-          </w:tcPr>
-          <w:p>
-            <w:pPr>
-              <w:tabs>
-                <w:tab w:val="decimal" w:pos="1044"/>
-              </w:tabs>
-              <w:rPr>
-                <w:sz w:val="22"/>
-                <w:szCs w:val="22"/>
-              </w:rPr>
-            </w:pPr>
-            <w:r>
-              <w:rPr>
-                <w:sz w:val="22"/>
-                <w:szCs w:val="22"/>
-              </w:rPr>
-              <w:t>1.2</w:t>
-            </w:r>
-          </w:p>
-        </w:tc>
-        <w:tc>
-          <w:tcPr>
-            <w:tcW w:w="2745" w:type="dxa"/>
-            <w:tcBorders>
-              <w:top w:val="single" w:sz="6" w:space="0" w:color="auto"/>
-              <w:left w:val="single" w:sz="6" w:space="0" w:color="auto"/>
-              <w:right w:val="single" w:sz="6" w:space="0" w:color="auto"/>
-            </w:tcBorders>
-          </w:tcPr>
-          <w:p>
-            <w:pPr>
-              <w:tabs>
-                <w:tab w:val="decimal" w:pos="1269"/>
-              </w:tabs>
-              <w:rPr>
-                <w:sz w:val="22"/>
-                <w:szCs w:val="22"/>
-              </w:rPr>
-            </w:pPr>
-            <w:r>
-              <w:rPr>
-                <w:sz w:val="22"/>
-                <w:szCs w:val="22"/>
-              </w:rPr>
-              <w:t>1.3</w:t>
-            </w:r>
-          </w:p>
-        </w:tc>
-      </w:tr>
-      <w:tr>
-        <w:trPr>
-          <w:cantSplit/>
-        </w:trPr>
-        <w:tc>
-          <w:tcPr>
-            <w:tcW w:w="2205" w:type="dxa"/>
-            <w:tcBorders>
-              <w:left w:val="single" w:sz="6" w:space="0" w:color="auto"/>
-              <w:right w:val="single" w:sz="6" w:space="0" w:color="auto"/>
-            </w:tcBorders>
-          </w:tcPr>
-          <w:p>
-            <w:pPr>
-              <w:tabs>
-                <w:tab w:val="decimal" w:pos="1123"/>
-              </w:tabs>
-              <w:rPr>
-                <w:sz w:val="22"/>
-                <w:szCs w:val="22"/>
-              </w:rPr>
-            </w:pPr>
-            <w:r>
-              <w:rPr>
-                <w:sz w:val="22"/>
-                <w:szCs w:val="22"/>
-              </w:rPr>
-              <w:t>1.21</w:t>
-            </w:r>
-          </w:p>
-        </w:tc>
-        <w:tc>
-          <w:tcPr>
-            <w:tcW w:w="2160" w:type="dxa"/>
-          </w:tcPr>
-          <w:p>
-            <w:pPr>
-              <w:tabs>
-                <w:tab w:val="decimal" w:pos="1044"/>
-              </w:tabs>
-              <w:rPr>
-                <w:sz w:val="22"/>
-                <w:szCs w:val="22"/>
-              </w:rPr>
-            </w:pPr>
-            <w:r>
-              <w:rPr>
-                <w:sz w:val="22"/>
-                <w:szCs w:val="22"/>
-              </w:rPr>
-              <w:t>1.22</w:t>
-            </w:r>
-          </w:p>
-        </w:tc>
-        <w:tc>
-          <w:tcPr>
-            <w:tcW w:w="2745" w:type="dxa"/>
-            <w:tcBorders>
-              <w:left w:val="single" w:sz="6" w:space="0" w:color="auto"/>
-              <w:right w:val="single" w:sz="6" w:space="0" w:color="auto"/>
-            </w:tcBorders>
-          </w:tcPr>
-          <w:p>
-            <w:pPr>
-              <w:tabs>
-                <w:tab w:val="decimal" w:pos="1269"/>
-              </w:tabs>
-              <w:rPr>
-                <w:sz w:val="22"/>
-                <w:szCs w:val="22"/>
-              </w:rPr>
-            </w:pPr>
-            <w:r>
-              <w:rPr>
-                <w:sz w:val="22"/>
-                <w:szCs w:val="22"/>
-              </w:rPr>
-              <w:t>12.3</w:t>
-            </w:r>
-          </w:p>
-        </w:tc>
-      </w:tr>
-      <w:tr>
-        <w:trPr>
-          <w:cantSplit/>
-        </w:trPr>
-        <w:tc>
-          <w:tcPr>
-            <w:tcW w:w="2205" w:type="dxa"/>
-            <w:tcBorders>
-              <w:left w:val="single" w:sz="6" w:space="0" w:color="auto"/>
-              <w:bottom w:val="single" w:sz="6" w:space="0" w:color="auto"/>
-              <w:right w:val="single" w:sz="6" w:space="0" w:color="auto"/>
-            </w:tcBorders>
-          </w:tcPr>
-          <w:p>
-            <w:pPr>
-              <w:tabs>
-                <w:tab w:val="decimal" w:pos="1123"/>
-              </w:tabs>
-              <w:rPr>
-                <w:sz w:val="22"/>
-                <w:szCs w:val="22"/>
-              </w:rPr>
-            </w:pPr>
-            <w:r>
-              <w:rPr>
-                <w:sz w:val="22"/>
-                <w:szCs w:val="22"/>
-              </w:rPr>
-              <w:t>12.31</w:t>
-            </w:r>
-          </w:p>
-        </w:tc>
-        <w:tc>
-          <w:tcPr>
-            <w:tcW w:w="2160" w:type="dxa"/>
-            <w:tcBorders>
-              <w:bottom w:val="single" w:sz="6" w:space="0" w:color="auto"/>
-            </w:tcBorders>
-          </w:tcPr>
-          <w:p>
-            <w:pPr>
-              <w:tabs>
-                <w:tab w:val="decimal" w:pos="1044"/>
-              </w:tabs>
-              <w:rPr>
-                <w:sz w:val="22"/>
-                <w:szCs w:val="22"/>
-              </w:rPr>
-            </w:pPr>
-            <w:r>
-              <w:rPr>
-                <w:sz w:val="22"/>
-                <w:szCs w:val="22"/>
-              </w:rPr>
-              <w:t>12.32</w:t>
-            </w:r>
-          </w:p>
-        </w:tc>
-        <w:tc>
-          <w:tcPr>
-            <w:tcW w:w="2745" w:type="dxa"/>
-            <w:tcBorders>
-              <w:left w:val="single" w:sz="6" w:space="0" w:color="auto"/>
-              <w:bottom w:val="single" w:sz="6" w:space="0" w:color="auto"/>
-              <w:right w:val="single" w:sz="6" w:space="0" w:color="auto"/>
-            </w:tcBorders>
-          </w:tcPr>
-          <w:p>
-            <w:pPr>
-              <w:tabs>
-                <w:tab w:val="decimal" w:pos="1269"/>
-              </w:tabs>
-              <w:rPr>
-                <w:sz w:val="22"/>
-                <w:szCs w:val="22"/>
-              </w:rPr>
-            </w:pPr>
-            <w:r>
-              <w:rPr>
-                <w:sz w:val="22"/>
-                <w:szCs w:val="22"/>
-              </w:rPr>
-              <w:t>12.33</w:t>
-            </w:r>
-          </w:p>
-        </w:tc>
-      </w:tr>
-    </w:tbl>
-    <w:p>
-      <w:pPr>
-        <w:rPr>
-          <w:sz w:val="22"/>
-          <w:szCs w:val="22"/>
-        </w:rPr>
-      </w:pPr>
-      <w:r>
-        <w:rPr>
-          <w:sz w:val="22"/>
-          <w:szCs w:val="22"/>
-        </w:rPr>
-        <w:t>Text before table.  Text before table.  Text before table.  Text before table.  Text before table.  Text before table.  Text before table.  Text before table.  Text before table.  Text before table.</w:t>
-      </w:r>
-    </w:p>
-    <w:p>
-      <w:pPr>
-        <w:rPr>
-          <w:sz w:val="22"/>
-          <w:szCs w:val="22"/>
-        </w:rPr>
-      </w:pPr>
-    </w:p>
-    <w:p>
-      <w:pPr>
-        <w:pStyle w:val="tablecaption"/>
-        <w:rPr>
-          <w:b/>
-          <w:sz w:val="22"/>
-          <w:szCs w:val="22"/>
-        </w:rPr>
-      </w:pPr>
-      <w:bookmarkStart w:id="17" w:name="_Ref211243133"/>
-      <w:bookmarkStart w:id="18" w:name="_Ref211244070"/>
-      <w:bookmarkStart w:id="19" w:name="_Ref211244082"/>
-      <w:bookmarkStart w:id="20" w:name="_Ref211246315"/>
-      <w:bookmarkStart w:id="21" w:name="_Toc274043718"/>
-      <w:bookmarkStart w:id="22" w:name="_Toc274124477"/>
-    </w:p>
-    <w:p>
-      <w:pPr>
-        <w:pStyle w:val="tablecaption"/>
-        <w:rPr>
-          <w:b/>
-          <w:sz w:val="22"/>
-          <w:szCs w:val="22"/>
-        </w:rPr>
-      </w:pPr>
-    </w:p>
-    <w:p>
-      <w:pPr>
-        <w:pStyle w:val="tablecaption"/>
-        <w:rPr>
-          <w:b/>
-          <w:sz w:val="22"/>
-          <w:szCs w:val="22"/>
-        </w:rPr>
-      </w:pPr>
-    </w:p>
-    <w:p>
-      <w:pPr>
-        <w:pStyle w:val="tablecaption"/>
-        <w:rPr>
-          <w:b/>
-          <w:sz w:val="22"/>
-          <w:szCs w:val="22"/>
-        </w:rPr>
-      </w:pPr>
-    </w:p>
-    <w:p>
-      <w:pPr>
-        <w:pStyle w:val="tablecaption"/>
-        <w:ind w:left="0" w:firstLine="0"/>
-        <w:rPr>
-          <w:sz w:val="22"/>
-          <w:szCs w:val="22"/>
-        </w:rPr>
-      </w:pPr>
-      <w:r>
-        <w:rPr>
-          <w:b/>
-          <w:sz w:val="22"/>
-          <w:szCs w:val="22"/>
-        </w:rPr>
-        <w:t xml:space="preserve">Table </w:t>
-      </w:r>
-      <w:bookmarkEnd w:id="17"/>
-      <w:r>
-        <w:rPr>
-          <w:b/>
-          <w:sz w:val="22"/>
-          <w:szCs w:val="22"/>
-        </w:rPr>
-        <w:t>2.1</w:t>
-      </w:r>
-      <w:r>
-        <w:rPr>
-          <w:sz w:val="22"/>
-          <w:szCs w:val="22"/>
-        </w:rPr>
+      <w:r>
+        <w:t>Phase One (corpus extraction)</w:t>
+      </w:r>
+    </w:p>
+    <w:p>
+      <w:pPr>
+        <w:pStyle w:val="Heading2"/>
+      </w:pPr>
+      <w:r>
+        <w:t>2.</w:t>
+      </w:r>
+      <w:r>
+        <w:t>3</w:t>
+      </w:r>
+      <w:r>
         <w:t xml:space="preserve">  </w:t>
       </w:r>
-      <w:bookmarkEnd w:id="18"/>
-      <w:bookmarkEnd w:id="19"/>
-      <w:bookmarkEnd w:id="20"/>
-      <w:bookmarkEnd w:id="21"/>
-      <w:bookmarkEnd w:id="22"/>
-      <w:r>
-        <w:rPr>
-          <w:sz w:val="22"/>
-          <w:szCs w:val="22"/>
-        </w:rPr>
-        <w:t>This is the table description in the ‘</w:t>
-      </w:r>
-      <w:r>
-        <w:rPr>
-          <w:sz w:val="22"/>
-          <w:szCs w:val="22"/>
-        </w:rPr>
-        <w:t>table description</w:t>
-      </w:r>
-      <w:r>
-        <w:rPr>
-          <w:sz w:val="22"/>
-          <w:szCs w:val="22"/>
-        </w:rPr>
-        <w:t>’ style</w:t>
-      </w:r>
-      <w:r>
-        <w:rPr>
-          <w:sz w:val="22"/>
-          <w:szCs w:val="22"/>
-        </w:rPr>
-        <w:t>.</w:t>
-      </w:r>
-    </w:p>
-    <w:p>
-      <w:pPr>
-        <w:rPr>
-          <w:sz w:val="22"/>
-          <w:szCs w:val="22"/>
-        </w:rPr>
-      </w:pPr>
+      <w:r>
+        <w:t>Phase Two (spell checking)</w:t>
+      </w:r>
     </w:p>
     <w:p>
       <w:pPr>
         <w:pStyle w:val="Heading2"/>
       </w:pPr>
-      <w:bookmarkStart w:id="23" w:name="_Toc407145096"/>
       <w:r>
         <w:t>2.</w:t>
       </w:r>
       <w:r>
-        <w:t>2</w:t>
-      </w:r>
-      <w:r>
-        <w:t xml:space="preserve">  Figure </w:t>
-      </w:r>
-      <w:bookmarkEnd w:id="14"/>
-      <w:bookmarkEnd w:id="15"/>
-      <w:bookmarkEnd w:id="16"/>
-      <w:bookmarkEnd w:id="23"/>
-      <w:r>
-        <w:t>example</w:t>
-      </w:r>
-    </w:p>
-    <w:p>
-      <w:pPr>
-        <w:rPr>
-          <w:sz w:val="22"/>
-          <w:szCs w:val="22"/>
-        </w:rPr>
-      </w:pPr>
-      <w:r>
-        <w:rPr>
-          <w:sz w:val="22"/>
-          <w:szCs w:val="22"/>
-        </w:rPr>
-        <w:t xml:space="preserve">Figures can be added using the </w:t>
-      </w:r>
-      <w:r>
-        <w:rPr>
-          <w:sz w:val="22"/>
-          <w:szCs w:val="22"/>
-        </w:rPr>
-        <w:t>Illustrations section of</w:t>
-      </w:r>
-      <w:r>
-        <w:rPr>
-          <w:sz w:val="22"/>
-          <w:szCs w:val="22"/>
-        </w:rPr>
-        <w:t xml:space="preserve"> the </w:t>
-      </w:r>
-      <w:r>
-        <w:rPr>
-          <w:sz w:val="22"/>
-          <w:szCs w:val="22"/>
-        </w:rPr>
-        <w:t>Insert tab</w:t>
-      </w:r>
-      <w:r>
-        <w:rPr>
-          <w:sz w:val="22"/>
-          <w:szCs w:val="22"/>
-        </w:rPr>
-        <w:t>.</w:t>
-      </w:r>
-    </w:p>
-    <w:p>
-      <w:pPr>
-        <w:keepNext/>
-        <w:keepLines/>
-        <w:jc w:val="center"/>
-        <w:rPr>
-          <w:sz w:val="22"/>
-          <w:szCs w:val="22"/>
-        </w:rPr>
-      </w:pPr>
-      <w:r>
-        <w:rPr>
-          <w:noProof/>
-          <w:sz w:val="22"/>
-          <w:szCs w:val="22"/>
-        </w:rPr>
-        <w:object w:dxaOrig="4001" w:dyaOrig="1840" w14:anchorId="339A407C">
-          <v:shapetype id="_x0000_t75" coordsize="21600,21600" o:spt="75" o:preferrelative="t" path="m@4@5l@4@11@9@11@9@5xe" filled="f" stroked="f">
-            <v:stroke joinstyle="miter"/>
-            <v:formulas>
-              <v:f eqn="if lineDrawn pixelLineWidth 0"/>
-              <v:f eqn="sum @0 1 0"/>
-              <v:f eqn="sum 0 0 @1"/>
-              <v:f eqn="prod @2 1 2"/>
-              <v:f eqn="prod @3 21600 pixelWidth"/>
-              <v:f eqn="prod @3 21600 pixelHeight"/>
-              <v:f eqn="sum @0 0 1"/>
-              <v:f eqn="prod @6 1 2"/>
-              <v:f eqn="prod @7 21600 pixelWidth"/>
-              <v:f eqn="sum @8 21600 0"/>
-              <v:f eqn="prod @7 21600 pixelHeight"/>
-              <v:f eqn="sum @10 21600 0"/>
-            </v:formulas>
-            <v:path o:extrusionok="f" gradientshapeok="t" o:connecttype="rect"/>
-            <o:lock v:ext="edit" aspectratio="t"/>
-          </v:shapetype>
-          <v:shape id="_x0000_i1025" type="#_x0000_t75" alt="" style="width:199.5pt;height:93.75pt;mso-width-percent:0;mso-height-percent:0;mso-width-percent:0;mso-height-percent:0" o:ole="" fillcolor="window">
-            <v:imagedata r:id="rId10" o:title=""/>
-          </v:shape>
-          <o:OLEObject Type="Embed" ProgID="MSDraw" ShapeID="_x0000_i1025" DrawAspect="Content" ObjectID="_1770661337" r:id="rId11">
-            <o:FieldCodes>\* mergeformat</o:FieldCodes>
-          </o:OLEObject>
-        </w:object>
-      </w:r>
-    </w:p>
-    <w:p>
-      <w:pPr>
-        <w:pStyle w:val="figurecaption"/>
-        <w:rPr>
-          <w:sz w:val="22"/>
-          <w:szCs w:val="22"/>
-        </w:rPr>
-      </w:pPr>
-      <w:bookmarkStart w:id="24" w:name="_Ref211247495"/>
-      <w:bookmarkStart w:id="25" w:name="_Ref211247554"/>
-      <w:bookmarkStart w:id="26" w:name="_Ref211247577"/>
-      <w:bookmarkStart w:id="27" w:name="_Toc274124197"/>
-      <w:r>
-        <w:rPr>
-          <w:b/>
-          <w:sz w:val="22"/>
-          <w:szCs w:val="22"/>
-        </w:rPr>
-        <w:t xml:space="preserve">Figure </w:t>
-      </w:r>
-      <w:bookmarkEnd w:id="24"/>
-      <w:r>
-        <w:rPr>
-          <w:b/>
-          <w:sz w:val="22"/>
-          <w:szCs w:val="22"/>
-        </w:rPr>
-        <w:t>2.1</w:t>
-      </w:r>
-      <w:r>
-        <w:rPr>
-          <w:sz w:val="22"/>
-          <w:szCs w:val="22"/>
-        </w:rPr>
+        <w:t>4</w:t>
+      </w:r>
+      <w:r>
         <w:t xml:space="preserve">  </w:t>
       </w:r>
-      <w:bookmarkEnd w:id="25"/>
-      <w:bookmarkEnd w:id="26"/>
-      <w:bookmarkEnd w:id="27"/>
-      <w:r>
-        <w:rPr>
-          <w:sz w:val="22"/>
-          <w:szCs w:val="22"/>
-        </w:rPr>
-        <w:t>This is the figure description</w:t>
-      </w:r>
-      <w:r>
-        <w:rPr>
-          <w:sz w:val="22"/>
-          <w:szCs w:val="22"/>
-        </w:rPr>
-        <w:t xml:space="preserve"> in the ‘figure d</w:t>
-      </w:r>
-      <w:r>
-        <w:rPr>
-          <w:sz w:val="22"/>
-          <w:szCs w:val="22"/>
-        </w:rPr>
-        <w:t>escription’ style</w:t>
-      </w:r>
-      <w:r>
-        <w:rPr>
-          <w:sz w:val="22"/>
-          <w:szCs w:val="22"/>
-        </w:rPr>
-        <w:t>.</w:t>
-      </w:r>
-    </w:p>
+      <w:r>
+        <w:t>Phase Three (testing)</w:t>
+      </w:r>
+    </w:p>
+    <w:p>
+      <w:pPr>
+        <w:rPr>
+          <w:sz w:val="22"/>
+          <w:szCs w:val="22"/>
+        </w:rPr>
+      </w:pPr>
+    </w:p>
+    <w:bookmarkEnd w:id="10"/>
+    <w:bookmarkEnd w:id="11"/>
+    <w:bookmarkEnd w:id="12"/>
+    <w:bookmarkEnd w:id="13"/>
+    <w:bookmarkEnd w:id="14"/>
+    <w:bookmarkEnd w:id="15"/>
+    <w:bookmarkEnd w:id="16"/>
     <w:p>
       <w:pPr>
         <w:pStyle w:val="Heading1"/>
@@ -3783,7 +3935,7 @@
       <w:pPr>
         <w:pStyle w:val="Heading1"/>
       </w:pPr>
-      <w:bookmarkStart w:id="28" w:name="_Toc407145097"/>
+      <w:bookmarkStart w:id="17" w:name="_Toc407145097"/>
       <w:r>
         <w:lastRenderedPageBreak/>
         <w:t xml:space="preserve">Chapter </w:t>
@@ -3947,7 +4099,7 @@
         <w:lastRenderedPageBreak/>
         <w:t>List of References</w:t>
       </w:r>
-      <w:bookmarkEnd w:id="28"/>
+      <w:bookmarkEnd w:id="17"/>
     </w:p>
     <w:p>
       <w:pPr>
@@ -3971,23 +4123,162 @@
           <w:sz w:val="22"/>
           <w:szCs w:val="22"/>
         </w:rPr>
-        <w:t>It is expected that the list would reflect the breadth and depth of scholarly research undertaken by the student during the course of the project.</w:t>
-      </w:r>
+        <w:t xml:space="preserve">It is expected that the list would reflect the breadth and depth of scholarly research undertaken by the student </w:t>
+      </w:r>
+      <w:proofErr w:type="gramStart"/>
       <w:r>
         <w:rPr>
           <w:i/>
           <w:sz w:val="22"/>
           <w:szCs w:val="22"/>
         </w:rPr>
+        <w:t>during the course of</w:t>
+      </w:r>
+      <w:proofErr w:type="gramEnd"/>
+      <w:r>
+        <w:rPr>
+          <w:i/>
+          <w:sz w:val="22"/>
+          <w:szCs w:val="22"/>
+        </w:rPr>
+        <w:t xml:space="preserve"> the project.</w:t>
+      </w:r>
+      <w:r>
+        <w:rPr>
+          <w:i/>
+          <w:sz w:val="22"/>
+          <w:szCs w:val="22"/>
+        </w:rPr>
         <w:t>&gt;</w:t>
       </w:r>
     </w:p>
-    <w:p/>
+    <w:p>
+      <w:pPr>
+        <w:pStyle w:val="ListParagraph"/>
+        <w:numPr>
+          <w:ilvl w:val="0"/>
+          <w:numId w:val="24"/>
+        </w:numPr>
+        <w:rPr>
+          <w:sz w:val="22"/>
+          <w:szCs w:val="22"/>
+        </w:rPr>
+      </w:pPr>
+      <w:r>
+        <w:rPr>
+          <w:sz w:val="22"/>
+          <w:szCs w:val="22"/>
+        </w:rPr>
+        <w:t>Bhaire, VV, et al. 2015. Spell Checker. [online]</w:t>
+      </w:r>
+      <w:r>
+        <w:rPr>
+          <w:sz w:val="22"/>
+          <w:szCs w:val="22"/>
+        </w:rPr>
+        <w:t xml:space="preserve">. </w:t>
+      </w:r>
+      <w:r>
+        <w:rPr>
+          <w:sz w:val="22"/>
+          <w:szCs w:val="22"/>
+        </w:rPr>
+        <w:t>International Journal of Scientific and Research Publications</w:t>
+      </w:r>
+      <w:r>
+        <w:rPr>
+          <w:sz w:val="22"/>
+          <w:szCs w:val="22"/>
+        </w:rPr>
+        <w:t xml:space="preserve"> [Accessed 18/03/24]. Available from: </w:t>
+      </w:r>
+      <w:hyperlink r:id="rId12" w:history="1">
+        <w:r>
+          <w:rPr>
+            <w:rStyle w:val="Hyperlink"/>
+            <w:sz w:val="22"/>
+            <w:szCs w:val="22"/>
+          </w:rPr>
+          <w:t>https://citeseerx.ist.psu.edu/document?repid=rep1&amp;type=pdf&amp;doi=939835023700f66cc7fbb861a76af93824b3b082</w:t>
+        </w:r>
+      </w:hyperlink>
+      <w:r>
+        <w:rPr>
+          <w:sz w:val="22"/>
+          <w:szCs w:val="22"/>
+        </w:rPr>
+        <w:t xml:space="preserve"> (Literature Review)</w:t>
+      </w:r>
+    </w:p>
+    <w:p>
+      <w:pPr>
+        <w:pStyle w:val="ListParagraph"/>
+        <w:numPr>
+          <w:ilvl w:val="0"/>
+          <w:numId w:val="24"/>
+        </w:numPr>
+        <w:rPr>
+          <w:sz w:val="22"/>
+          <w:szCs w:val="22"/>
+        </w:rPr>
+      </w:pPr>
+      <w:r>
+        <w:rPr>
+          <w:sz w:val="22"/>
+          <w:szCs w:val="22"/>
+        </w:rPr>
+        <w:t xml:space="preserve">Nam, E, 2019. Understanding the Levenshtein Distance Equation for Beginners. [online]. [Accessed 18/03/24]. Available from: </w:t>
+      </w:r>
+      <w:hyperlink r:id="rId13" w:history="1">
+        <w:r>
+          <w:rPr>
+            <w:rStyle w:val="Hyperlink"/>
+            <w:sz w:val="22"/>
+            <w:szCs w:val="22"/>
+          </w:rPr>
+          <w:t>https://medium.com/@ethannam/understanding-the-levenshtein-distance-equation-for-beginners-c4285a5604f0</w:t>
+        </w:r>
+      </w:hyperlink>
+      <w:r>
+        <w:rPr>
+          <w:sz w:val="22"/>
+          <w:szCs w:val="22"/>
+        </w:rPr>
+        <w:t xml:space="preserve"> (Figure 1</w:t>
+      </w:r>
+      <w:r>
+        <w:rPr>
+          <w:sz w:val="22"/>
+          <w:szCs w:val="22"/>
+        </w:rPr>
+        <w:t>, Overview of algorithms</w:t>
+      </w:r>
+      <w:r>
+        <w:rPr>
+          <w:sz w:val="22"/>
+          <w:szCs w:val="22"/>
+        </w:rPr>
+        <w:t>)</w:t>
+      </w:r>
+    </w:p>
+    <w:p>
+      <w:pPr>
+        <w:pStyle w:val="ListParagraph"/>
+        <w:numPr>
+          <w:ilvl w:val="0"/>
+          <w:numId w:val="24"/>
+        </w:numPr>
+        <w:rPr>
+          <w:sz w:val="22"/>
+          <w:szCs w:val="22"/>
+        </w:rPr>
+      </w:pPr>
+    </w:p>
     <w:p>
       <w:pPr>
         <w:pStyle w:val="Heading1"/>
       </w:pPr>
-      <w:bookmarkStart w:id="29" w:name="_Toc407145098"/>
+      <w:bookmarkStart w:id="18" w:name="_Toc407145098"/>
       <w:r>
         <w:lastRenderedPageBreak/>
         <w:t>Appendix A</w:t>
@@ -4081,7 +4372,15 @@
         <w:pStyle w:val="Heading2"/>
       </w:pPr>
       <w:r>
-        <w:t>A.3 Legal, social, ethical and professional issues</w:t>
+        <w:t xml:space="preserve">A.3 Legal, social, </w:t>
+      </w:r>
+      <w:proofErr w:type="gramStart"/>
+      <w:r>
+        <w:t>ethical</w:t>
+      </w:r>
+      <w:proofErr w:type="gramEnd"/>
+      <w:r>
+        <w:t xml:space="preserve"> and professional issues</w:t>
       </w:r>
     </w:p>
     <w:p>
@@ -4305,21 +4604,37 @@
       <w:r>
         <w:t>External Materials</w:t>
       </w:r>
-      <w:bookmarkEnd w:id="29"/>
-    </w:p>
-    <w:p>
-      <w:pPr>
-        <w:rPr>
-          <w:sz w:val="22"/>
-          <w:szCs w:val="22"/>
-        </w:rPr>
-      </w:pPr>
-      <w:r>
-        <w:rPr>
-          <w:sz w:val="22"/>
-          <w:szCs w:val="22"/>
-        </w:rPr>
-        <w:t>&lt;This appendix should provide a brief record of materials used in the solution that are not the student's own work. Such materials might be pieces of codes made available from a research group/company or from the internet, datasets prepared by external users or any preliminary materials/drafts/notes provided by a supervisor. It should be clear what was used as ready-made components and what was developed as part of the project. This appendix should be included even if no external materials were used, in which case a statement to that effect is all that is required.&gt;</w:t>
+      <w:bookmarkEnd w:id="18"/>
+    </w:p>
+    <w:p>
+      <w:pPr>
+        <w:rPr>
+          <w:sz w:val="22"/>
+          <w:szCs w:val="22"/>
+        </w:rPr>
+      </w:pPr>
+      <w:r>
+        <w:rPr>
+          <w:sz w:val="22"/>
+          <w:szCs w:val="22"/>
+        </w:rPr>
+        <w:t xml:space="preserve">&lt;This appendix should provide a brief record of materials used in the solution that are not the student's own work. Such materials might be pieces of codes made available from a research group/company or from the internet, datasets prepared by external </w:t>
+      </w:r>
+      <w:proofErr w:type="gramStart"/>
+      <w:r>
+        <w:rPr>
+          <w:sz w:val="22"/>
+          <w:szCs w:val="22"/>
+        </w:rPr>
+        <w:t>users</w:t>
+      </w:r>
+      <w:proofErr w:type="gramEnd"/>
+      <w:r>
+        <w:rPr>
+          <w:sz w:val="22"/>
+          <w:szCs w:val="22"/>
+        </w:rPr>
+        <w:t xml:space="preserve"> or any preliminary materials/drafts/notes provided by a supervisor. It should be clear what was used as ready-made components and what was developed as part of the project. This appendix should be included even if no external materials were used, in which case a statement to that effect is all that is required.&gt;</w:t>
       </w:r>
     </w:p>
     <w:p>
@@ -4331,7 +4646,7 @@
       </w:pPr>
     </w:p>
     <w:sectPr>
-      <w:headerReference w:type="default" r:id="rId12"/>
+      <w:headerReference w:type="default" r:id="rId14"/>
       <w:footnotePr>
         <w:numRestart w:val="eachSect"/>
       </w:footnotePr>
@@ -4378,6 +4693,22 @@
     <w:p>
       <w:r>
         <w:continuationSeparator/>
+      </w:r>
+    </w:p>
+  </w:footnote>
+  <w:footnote w:id="1">
+    <w:p>
+      <w:pPr>
+        <w:pStyle w:val="FootnoteText"/>
+      </w:pPr>
+      <w:r>
+        <w:rPr>
+          <w:rStyle w:val="FootnoteReference"/>
+        </w:rPr>
+        <w:footnoteRef/>
+      </w:r>
+      <w:r>
+        <w:t xml:space="preserve"> Bhaire et al. (2015)</w:t>
       </w:r>
     </w:p>
   </w:footnote>
@@ -4869,6 +5200,92 @@
     </w:lvl>
   </w:abstractNum>
   <w:abstractNum w:abstractNumId="12" w15:restartNumberingAfterBreak="0">
+    <w:nsid w:val="13AF5426"/>
+    <w:multiLevelType w:val="hybridMultilevel"/>
+    <w:tmpl w:val="F60A93A2"/>
+    <w:lvl w:ilvl="0" w:tplc="0809000F">
+      <w:start w:val="1"/>
+      <w:numFmt w:val="decimal"/>
+      <w:lvlText w:val="%1."/>
+      <w:lvlJc w:val="left"/>
+      <w:pPr>
+        <w:ind w:left="720" w:hanging="360"/>
+      </w:pPr>
+    </w:lvl>
+    <w:lvl w:ilvl="1" w:tplc="08090019" w:tentative="1">
+      <w:start w:val="1"/>
+      <w:numFmt w:val="lowerLetter"/>
+      <w:lvlText w:val="%2."/>
+      <w:lvlJc w:val="left"/>
+      <w:pPr>
+        <w:ind w:left="1440" w:hanging="360"/>
+      </w:pPr>
+    </w:lvl>
+    <w:lvl w:ilvl="2" w:tplc="0809001B" w:tentative="1">
+      <w:start w:val="1"/>
+      <w:numFmt w:val="lowerRoman"/>
+      <w:lvlText w:val="%3."/>
+      <w:lvlJc w:val="right"/>
+      <w:pPr>
+        <w:ind w:left="2160" w:hanging="180"/>
+      </w:pPr>
+    </w:lvl>
+    <w:lvl w:ilvl="3" w:tplc="0809000F" w:tentative="1">
+      <w:start w:val="1"/>
+      <w:numFmt w:val="decimal"/>
+      <w:lvlText w:val="%4."/>
+      <w:lvlJc w:val="left"/>
+      <w:pPr>
+        <w:ind w:left="2880" w:hanging="360"/>
+      </w:pPr>
+    </w:lvl>
+    <w:lvl w:ilvl="4" w:tplc="08090019" w:tentative="1">
+      <w:start w:val="1"/>
+      <w:numFmt w:val="lowerLetter"/>
+      <w:lvlText w:val="%5."/>
+      <w:lvlJc w:val="left"/>
+      <w:pPr>
+        <w:ind w:left="3600" w:hanging="360"/>
+      </w:pPr>
+    </w:lvl>
+    <w:lvl w:ilvl="5" w:tplc="0809001B" w:tentative="1">
+      <w:start w:val="1"/>
+      <w:numFmt w:val="lowerRoman"/>
+      <w:lvlText w:val="%6."/>
+      <w:lvlJc w:val="right"/>
+      <w:pPr>
+        <w:ind w:left="4320" w:hanging="180"/>
+      </w:pPr>
+    </w:lvl>
+    <w:lvl w:ilvl="6" w:tplc="0809000F" w:tentative="1">
+      <w:start w:val="1"/>
+      <w:numFmt w:val="decimal"/>
+      <w:lvlText w:val="%7."/>
+      <w:lvlJc w:val="left"/>
+      <w:pPr>
+        <w:ind w:left="5040" w:hanging="360"/>
+      </w:pPr>
+    </w:lvl>
+    <w:lvl w:ilvl="7" w:tplc="08090019" w:tentative="1">
+      <w:start w:val="1"/>
+      <w:numFmt w:val="lowerLetter"/>
+      <w:lvlText w:val="%8."/>
+      <w:lvlJc w:val="left"/>
+      <w:pPr>
+        <w:ind w:left="5760" w:hanging="360"/>
+      </w:pPr>
+    </w:lvl>
+    <w:lvl w:ilvl="8" w:tplc="0809001B" w:tentative="1">
+      <w:start w:val="1"/>
+      <w:numFmt w:val="lowerRoman"/>
+      <w:lvlText w:val="%9."/>
+      <w:lvlJc w:val="right"/>
+      <w:pPr>
+        <w:ind w:left="6480" w:hanging="180"/>
+      </w:pPr>
+    </w:lvl>
+  </w:abstractNum>
+  <w:abstractNum w:abstractNumId="13" w15:restartNumberingAfterBreak="0">
     <w:nsid w:val="24131BB9"/>
     <w:multiLevelType w:val="hybridMultilevel"/>
     <w:tmpl w:val="9B8A6800"/>
@@ -4981,7 +5398,179 @@
       </w:rPr>
     </w:lvl>
   </w:abstractNum>
-  <w:abstractNum w:abstractNumId="13" w15:restartNumberingAfterBreak="0">
+  <w:abstractNum w:abstractNumId="14" w15:restartNumberingAfterBreak="0">
+    <w:nsid w:val="26DF742E"/>
+    <w:multiLevelType w:val="hybridMultilevel"/>
+    <w:tmpl w:val="90385B24"/>
+    <w:lvl w:ilvl="0" w:tplc="0809000F">
+      <w:start w:val="1"/>
+      <w:numFmt w:val="decimal"/>
+      <w:lvlText w:val="%1."/>
+      <w:lvlJc w:val="left"/>
+      <w:pPr>
+        <w:ind w:left="360" w:hanging="360"/>
+      </w:pPr>
+    </w:lvl>
+    <w:lvl w:ilvl="1" w:tplc="08090019" w:tentative="1">
+      <w:start w:val="1"/>
+      <w:numFmt w:val="lowerLetter"/>
+      <w:lvlText w:val="%2."/>
+      <w:lvlJc w:val="left"/>
+      <w:pPr>
+        <w:ind w:left="1080" w:hanging="360"/>
+      </w:pPr>
+    </w:lvl>
+    <w:lvl w:ilvl="2" w:tplc="0809001B" w:tentative="1">
+      <w:start w:val="1"/>
+      <w:numFmt w:val="lowerRoman"/>
+      <w:lvlText w:val="%3."/>
+      <w:lvlJc w:val="right"/>
+      <w:pPr>
+        <w:ind w:left="1800" w:hanging="180"/>
+      </w:pPr>
+    </w:lvl>
+    <w:lvl w:ilvl="3" w:tplc="0809000F" w:tentative="1">
+      <w:start w:val="1"/>
+      <w:numFmt w:val="decimal"/>
+      <w:lvlText w:val="%4."/>
+      <w:lvlJc w:val="left"/>
+      <w:pPr>
+        <w:ind w:left="2520" w:hanging="360"/>
+      </w:pPr>
+    </w:lvl>
+    <w:lvl w:ilvl="4" w:tplc="08090019" w:tentative="1">
+      <w:start w:val="1"/>
+      <w:numFmt w:val="lowerLetter"/>
+      <w:lvlText w:val="%5."/>
+      <w:lvlJc w:val="left"/>
+      <w:pPr>
+        <w:ind w:left="3240" w:hanging="360"/>
+      </w:pPr>
+    </w:lvl>
+    <w:lvl w:ilvl="5" w:tplc="0809001B" w:tentative="1">
+      <w:start w:val="1"/>
+      <w:numFmt w:val="lowerRoman"/>
+      <w:lvlText w:val="%6."/>
+      <w:lvlJc w:val="right"/>
+      <w:pPr>
+        <w:ind w:left="3960" w:hanging="180"/>
+      </w:pPr>
+    </w:lvl>
+    <w:lvl w:ilvl="6" w:tplc="0809000F" w:tentative="1">
+      <w:start w:val="1"/>
+      <w:numFmt w:val="decimal"/>
+      <w:lvlText w:val="%7."/>
+      <w:lvlJc w:val="left"/>
+      <w:pPr>
+        <w:ind w:left="4680" w:hanging="360"/>
+      </w:pPr>
+    </w:lvl>
+    <w:lvl w:ilvl="7" w:tplc="08090019" w:tentative="1">
+      <w:start w:val="1"/>
+      <w:numFmt w:val="lowerLetter"/>
+      <w:lvlText w:val="%8."/>
+      <w:lvlJc w:val="left"/>
+      <w:pPr>
+        <w:ind w:left="5400" w:hanging="360"/>
+      </w:pPr>
+    </w:lvl>
+    <w:lvl w:ilvl="8" w:tplc="0809001B" w:tentative="1">
+      <w:start w:val="1"/>
+      <w:numFmt w:val="lowerRoman"/>
+      <w:lvlText w:val="%9."/>
+      <w:lvlJc w:val="right"/>
+      <w:pPr>
+        <w:ind w:left="6120" w:hanging="180"/>
+      </w:pPr>
+    </w:lvl>
+  </w:abstractNum>
+  <w:abstractNum w:abstractNumId="15" w15:restartNumberingAfterBreak="0">
+    <w:nsid w:val="27FD4269"/>
+    <w:multiLevelType w:val="hybridMultilevel"/>
+    <w:tmpl w:val="F50C8050"/>
+    <w:lvl w:ilvl="0" w:tplc="08090011">
+      <w:start w:val="1"/>
+      <w:numFmt w:val="decimal"/>
+      <w:lvlText w:val="%1)"/>
+      <w:lvlJc w:val="left"/>
+      <w:pPr>
+        <w:ind w:left="780" w:hanging="360"/>
+      </w:pPr>
+    </w:lvl>
+    <w:lvl w:ilvl="1" w:tplc="08090019" w:tentative="1">
+      <w:start w:val="1"/>
+      <w:numFmt w:val="lowerLetter"/>
+      <w:lvlText w:val="%2."/>
+      <w:lvlJc w:val="left"/>
+      <w:pPr>
+        <w:ind w:left="1500" w:hanging="360"/>
+      </w:pPr>
+    </w:lvl>
+    <w:lvl w:ilvl="2" w:tplc="0809001B" w:tentative="1">
+      <w:start w:val="1"/>
+      <w:numFmt w:val="lowerRoman"/>
+      <w:lvlText w:val="%3."/>
+      <w:lvlJc w:val="right"/>
+      <w:pPr>
+        <w:ind w:left="2220" w:hanging="180"/>
+      </w:pPr>
+    </w:lvl>
+    <w:lvl w:ilvl="3" w:tplc="0809000F" w:tentative="1">
+      <w:start w:val="1"/>
+      <w:numFmt w:val="decimal"/>
+      <w:lvlText w:val="%4."/>
+      <w:lvlJc w:val="left"/>
+      <w:pPr>
+        <w:ind w:left="2940" w:hanging="360"/>
+      </w:pPr>
+    </w:lvl>
+    <w:lvl w:ilvl="4" w:tplc="08090019" w:tentative="1">
+      <w:start w:val="1"/>
+      <w:numFmt w:val="lowerLetter"/>
+      <w:lvlText w:val="%5."/>
+      <w:lvlJc w:val="left"/>
+      <w:pPr>
+        <w:ind w:left="3660" w:hanging="360"/>
+      </w:pPr>
+    </w:lvl>
+    <w:lvl w:ilvl="5" w:tplc="0809001B" w:tentative="1">
+      <w:start w:val="1"/>
+      <w:numFmt w:val="lowerRoman"/>
+      <w:lvlText w:val="%6."/>
+      <w:lvlJc w:val="right"/>
+      <w:pPr>
+        <w:ind w:left="4380" w:hanging="180"/>
+      </w:pPr>
+    </w:lvl>
+    <w:lvl w:ilvl="6" w:tplc="0809000F" w:tentative="1">
+      <w:start w:val="1"/>
+      <w:numFmt w:val="decimal"/>
+      <w:lvlText w:val="%7."/>
+      <w:lvlJc w:val="left"/>
+      <w:pPr>
+        <w:ind w:left="5100" w:hanging="360"/>
+      </w:pPr>
+    </w:lvl>
+    <w:lvl w:ilvl="7" w:tplc="08090019" w:tentative="1">
+      <w:start w:val="1"/>
+      <w:numFmt w:val="lowerLetter"/>
+      <w:lvlText w:val="%8."/>
+      <w:lvlJc w:val="left"/>
+      <w:pPr>
+        <w:ind w:left="5820" w:hanging="360"/>
+      </w:pPr>
+    </w:lvl>
+    <w:lvl w:ilvl="8" w:tplc="0809001B" w:tentative="1">
+      <w:start w:val="1"/>
+      <w:numFmt w:val="lowerRoman"/>
+      <w:lvlText w:val="%9."/>
+      <w:lvlJc w:val="right"/>
+      <w:pPr>
+        <w:ind w:left="6540" w:hanging="180"/>
+      </w:pPr>
+    </w:lvl>
+  </w:abstractNum>
+  <w:abstractNum w:abstractNumId="16" w15:restartNumberingAfterBreak="0">
     <w:nsid w:val="307355F0"/>
     <w:multiLevelType w:val="hybridMultilevel"/>
     <w:tmpl w:val="34305C04"/>
@@ -5094,7 +5683,7 @@
       </w:rPr>
     </w:lvl>
   </w:abstractNum>
-  <w:abstractNum w:abstractNumId="14" w15:restartNumberingAfterBreak="0">
+  <w:abstractNum w:abstractNumId="17" w15:restartNumberingAfterBreak="0">
     <w:nsid w:val="36AC243D"/>
     <w:multiLevelType w:val="hybridMultilevel"/>
     <w:tmpl w:val="F0347DCA"/>
@@ -5207,7 +5796,7 @@
       </w:rPr>
     </w:lvl>
   </w:abstractNum>
-  <w:abstractNum w:abstractNumId="15" w15:restartNumberingAfterBreak="0">
+  <w:abstractNum w:abstractNumId="18" w15:restartNumberingAfterBreak="0">
     <w:nsid w:val="445F2AF6"/>
     <w:multiLevelType w:val="hybridMultilevel"/>
     <w:tmpl w:val="9034ACCE"/>
@@ -5320,7 +5909,7 @@
       </w:rPr>
     </w:lvl>
   </w:abstractNum>
-  <w:abstractNum w:abstractNumId="16" w15:restartNumberingAfterBreak="0">
+  <w:abstractNum w:abstractNumId="19" w15:restartNumberingAfterBreak="0">
     <w:nsid w:val="571504CC"/>
     <w:multiLevelType w:val="hybridMultilevel"/>
     <w:tmpl w:val="91AA967C"/>
@@ -5433,7 +6022,319 @@
       </w:rPr>
     </w:lvl>
   </w:abstractNum>
-  <w:abstractNum w:abstractNumId="17" w15:restartNumberingAfterBreak="0">
+  <w:abstractNum w:abstractNumId="20" w15:restartNumberingAfterBreak="0">
+    <w:nsid w:val="5F674711"/>
+    <w:multiLevelType w:val="hybridMultilevel"/>
+    <w:tmpl w:val="594E6644"/>
+    <w:lvl w:ilvl="0" w:tplc="08090001">
+      <w:start w:val="1"/>
+      <w:numFmt w:val="bullet"/>
+      <w:lvlText w:val=""/>
+      <w:lvlJc w:val="left"/>
+      <w:pPr>
+        <w:ind w:left="720" w:hanging="360"/>
+      </w:pPr>
+      <w:rPr>
+        <w:rFonts w:ascii="Symbol" w:hAnsi="Symbol" w:hint="default"/>
+      </w:rPr>
+    </w:lvl>
+    <w:lvl w:ilvl="1" w:tplc="08090003" w:tentative="1">
+      <w:start w:val="1"/>
+      <w:numFmt w:val="bullet"/>
+      <w:lvlText w:val="o"/>
+      <w:lvlJc w:val="left"/>
+      <w:pPr>
+        <w:ind w:left="1440" w:hanging="360"/>
+      </w:pPr>
+      <w:rPr>
+        <w:rFonts w:ascii="Courier New" w:hAnsi="Courier New" w:cs="Courier New" w:hint="default"/>
+      </w:rPr>
+    </w:lvl>
+    <w:lvl w:ilvl="2" w:tplc="08090005" w:tentative="1">
+      <w:start w:val="1"/>
+      <w:numFmt w:val="bullet"/>
+      <w:lvlText w:val=""/>
+      <w:lvlJc w:val="left"/>
+      <w:pPr>
+        <w:ind w:left="2160" w:hanging="360"/>
+      </w:pPr>
+      <w:rPr>
+        <w:rFonts w:ascii="Wingdings" w:hAnsi="Wingdings" w:hint="default"/>
+      </w:rPr>
+    </w:lvl>
+    <w:lvl w:ilvl="3" w:tplc="08090001" w:tentative="1">
+      <w:start w:val="1"/>
+      <w:numFmt w:val="bullet"/>
+      <w:lvlText w:val=""/>
+      <w:lvlJc w:val="left"/>
+      <w:pPr>
+        <w:ind w:left="2880" w:hanging="360"/>
+      </w:pPr>
+      <w:rPr>
+        <w:rFonts w:ascii="Symbol" w:hAnsi="Symbol" w:hint="default"/>
+      </w:rPr>
+    </w:lvl>
+    <w:lvl w:ilvl="4" w:tplc="08090003" w:tentative="1">
+      <w:start w:val="1"/>
+      <w:numFmt w:val="bullet"/>
+      <w:lvlText w:val="o"/>
+      <w:lvlJc w:val="left"/>
+      <w:pPr>
+        <w:ind w:left="3600" w:hanging="360"/>
+      </w:pPr>
+      <w:rPr>
+        <w:rFonts w:ascii="Courier New" w:hAnsi="Courier New" w:cs="Courier New" w:hint="default"/>
+      </w:rPr>
+    </w:lvl>
+    <w:lvl w:ilvl="5" w:tplc="08090005" w:tentative="1">
+      <w:start w:val="1"/>
+      <w:numFmt w:val="bullet"/>
+      <w:lvlText w:val=""/>
+      <w:lvlJc w:val="left"/>
+      <w:pPr>
+        <w:ind w:left="4320" w:hanging="360"/>
+      </w:pPr>
+      <w:rPr>
+        <w:rFonts w:ascii="Wingdings" w:hAnsi="Wingdings" w:hint="default"/>
+      </w:rPr>
+    </w:lvl>
+    <w:lvl w:ilvl="6" w:tplc="08090001" w:tentative="1">
+      <w:start w:val="1"/>
+      <w:numFmt w:val="bullet"/>
+      <w:lvlText w:val=""/>
+      <w:lvlJc w:val="left"/>
+      <w:pPr>
+        <w:ind w:left="5040" w:hanging="360"/>
+      </w:pPr>
+      <w:rPr>
+        <w:rFonts w:ascii="Symbol" w:hAnsi="Symbol" w:hint="default"/>
+      </w:rPr>
+    </w:lvl>
+    <w:lvl w:ilvl="7" w:tplc="08090003" w:tentative="1">
+      <w:start w:val="1"/>
+      <w:numFmt w:val="bullet"/>
+      <w:lvlText w:val="o"/>
+      <w:lvlJc w:val="left"/>
+      <w:pPr>
+        <w:ind w:left="5760" w:hanging="360"/>
+      </w:pPr>
+      <w:rPr>
+        <w:rFonts w:ascii="Courier New" w:hAnsi="Courier New" w:cs="Courier New" w:hint="default"/>
+      </w:rPr>
+    </w:lvl>
+    <w:lvl w:ilvl="8" w:tplc="08090005" w:tentative="1">
+      <w:start w:val="1"/>
+      <w:numFmt w:val="bullet"/>
+      <w:lvlText w:val=""/>
+      <w:lvlJc w:val="left"/>
+      <w:pPr>
+        <w:ind w:left="6480" w:hanging="360"/>
+      </w:pPr>
+      <w:rPr>
+        <w:rFonts w:ascii="Wingdings" w:hAnsi="Wingdings" w:hint="default"/>
+      </w:rPr>
+    </w:lvl>
+  </w:abstractNum>
+  <w:abstractNum w:abstractNumId="21" w15:restartNumberingAfterBreak="0">
+    <w:nsid w:val="60A6001C"/>
+    <w:multiLevelType w:val="hybridMultilevel"/>
+    <w:tmpl w:val="C4907370"/>
+    <w:lvl w:ilvl="0" w:tplc="08090001">
+      <w:start w:val="1"/>
+      <w:numFmt w:val="bullet"/>
+      <w:lvlText w:val=""/>
+      <w:lvlJc w:val="left"/>
+      <w:pPr>
+        <w:ind w:left="720" w:hanging="360"/>
+      </w:pPr>
+      <w:rPr>
+        <w:rFonts w:ascii="Symbol" w:hAnsi="Symbol" w:hint="default"/>
+      </w:rPr>
+    </w:lvl>
+    <w:lvl w:ilvl="1" w:tplc="08090003" w:tentative="1">
+      <w:start w:val="1"/>
+      <w:numFmt w:val="bullet"/>
+      <w:lvlText w:val="o"/>
+      <w:lvlJc w:val="left"/>
+      <w:pPr>
+        <w:ind w:left="1440" w:hanging="360"/>
+      </w:pPr>
+      <w:rPr>
+        <w:rFonts w:ascii="Courier New" w:hAnsi="Courier New" w:cs="Courier New" w:hint="default"/>
+      </w:rPr>
+    </w:lvl>
+    <w:lvl w:ilvl="2" w:tplc="08090005" w:tentative="1">
+      <w:start w:val="1"/>
+      <w:numFmt w:val="bullet"/>
+      <w:lvlText w:val=""/>
+      <w:lvlJc w:val="left"/>
+      <w:pPr>
+        <w:ind w:left="2160" w:hanging="360"/>
+      </w:pPr>
+      <w:rPr>
+        <w:rFonts w:ascii="Wingdings" w:hAnsi="Wingdings" w:hint="default"/>
+      </w:rPr>
+    </w:lvl>
+    <w:lvl w:ilvl="3" w:tplc="08090001" w:tentative="1">
+      <w:start w:val="1"/>
+      <w:numFmt w:val="bullet"/>
+      <w:lvlText w:val=""/>
+      <w:lvlJc w:val="left"/>
+      <w:pPr>
+        <w:ind w:left="2880" w:hanging="360"/>
+      </w:pPr>
+      <w:rPr>
+        <w:rFonts w:ascii="Symbol" w:hAnsi="Symbol" w:hint="default"/>
+      </w:rPr>
+    </w:lvl>
+    <w:lvl w:ilvl="4" w:tplc="08090003" w:tentative="1">
+      <w:start w:val="1"/>
+      <w:numFmt w:val="bullet"/>
+      <w:lvlText w:val="o"/>
+      <w:lvlJc w:val="left"/>
+      <w:pPr>
+        <w:ind w:left="3600" w:hanging="360"/>
+      </w:pPr>
+      <w:rPr>
+        <w:rFonts w:ascii="Courier New" w:hAnsi="Courier New" w:cs="Courier New" w:hint="default"/>
+      </w:rPr>
+    </w:lvl>
+    <w:lvl w:ilvl="5" w:tplc="08090005" w:tentative="1">
+      <w:start w:val="1"/>
+      <w:numFmt w:val="bullet"/>
+      <w:lvlText w:val=""/>
+      <w:lvlJc w:val="left"/>
+      <w:pPr>
+        <w:ind w:left="4320" w:hanging="360"/>
+      </w:pPr>
+      <w:rPr>
+        <w:rFonts w:ascii="Wingdings" w:hAnsi="Wingdings" w:hint="default"/>
+      </w:rPr>
+    </w:lvl>
+    <w:lvl w:ilvl="6" w:tplc="08090001" w:tentative="1">
+      <w:start w:val="1"/>
+      <w:numFmt w:val="bullet"/>
+      <w:lvlText w:val=""/>
+      <w:lvlJc w:val="left"/>
+      <w:pPr>
+        <w:ind w:left="5040" w:hanging="360"/>
+      </w:pPr>
+      <w:rPr>
+        <w:rFonts w:ascii="Symbol" w:hAnsi="Symbol" w:hint="default"/>
+      </w:rPr>
+    </w:lvl>
+    <w:lvl w:ilvl="7" w:tplc="08090003" w:tentative="1">
+      <w:start w:val="1"/>
+      <w:numFmt w:val="bullet"/>
+      <w:lvlText w:val="o"/>
+      <w:lvlJc w:val="left"/>
+      <w:pPr>
+        <w:ind w:left="5760" w:hanging="360"/>
+      </w:pPr>
+      <w:rPr>
+        <w:rFonts w:ascii="Courier New" w:hAnsi="Courier New" w:cs="Courier New" w:hint="default"/>
+      </w:rPr>
+    </w:lvl>
+    <w:lvl w:ilvl="8" w:tplc="08090005" w:tentative="1">
+      <w:start w:val="1"/>
+      <w:numFmt w:val="bullet"/>
+      <w:lvlText w:val=""/>
+      <w:lvlJc w:val="left"/>
+      <w:pPr>
+        <w:ind w:left="6480" w:hanging="360"/>
+      </w:pPr>
+      <w:rPr>
+        <w:rFonts w:ascii="Wingdings" w:hAnsi="Wingdings" w:hint="default"/>
+      </w:rPr>
+    </w:lvl>
+  </w:abstractNum>
+  <w:abstractNum w:abstractNumId="22" w15:restartNumberingAfterBreak="0">
+    <w:nsid w:val="66E40E99"/>
+    <w:multiLevelType w:val="hybridMultilevel"/>
+    <w:tmpl w:val="01A8CF44"/>
+    <w:lvl w:ilvl="0" w:tplc="08090011">
+      <w:start w:val="1"/>
+      <w:numFmt w:val="decimal"/>
+      <w:lvlText w:val="%1)"/>
+      <w:lvlJc w:val="left"/>
+      <w:pPr>
+        <w:ind w:left="360" w:hanging="360"/>
+      </w:pPr>
+    </w:lvl>
+    <w:lvl w:ilvl="1" w:tplc="08090019">
+      <w:start w:val="1"/>
+      <w:numFmt w:val="lowerLetter"/>
+      <w:lvlText w:val="%2."/>
+      <w:lvlJc w:val="left"/>
+      <w:pPr>
+        <w:ind w:left="1080" w:hanging="360"/>
+      </w:pPr>
+    </w:lvl>
+    <w:lvl w:ilvl="2" w:tplc="0809001B" w:tentative="1">
+      <w:start w:val="1"/>
+      <w:numFmt w:val="lowerRoman"/>
+      <w:lvlText w:val="%3."/>
+      <w:lvlJc w:val="right"/>
+      <w:pPr>
+        <w:ind w:left="1800" w:hanging="180"/>
+      </w:pPr>
+    </w:lvl>
+    <w:lvl w:ilvl="3" w:tplc="0809000F" w:tentative="1">
+      <w:start w:val="1"/>
+      <w:numFmt w:val="decimal"/>
+      <w:lvlText w:val="%4."/>
+      <w:lvlJc w:val="left"/>
+      <w:pPr>
+        <w:ind w:left="2520" w:hanging="360"/>
+      </w:pPr>
+    </w:lvl>
+    <w:lvl w:ilvl="4" w:tplc="08090019" w:tentative="1">
+      <w:start w:val="1"/>
+      <w:numFmt w:val="lowerLetter"/>
+      <w:lvlText w:val="%5."/>
+      <w:lvlJc w:val="left"/>
+      <w:pPr>
+        <w:ind w:left="3240" w:hanging="360"/>
+      </w:pPr>
+    </w:lvl>
+    <w:lvl w:ilvl="5" w:tplc="0809001B" w:tentative="1">
+      <w:start w:val="1"/>
+      <w:numFmt w:val="lowerRoman"/>
+      <w:lvlText w:val="%6."/>
+      <w:lvlJc w:val="right"/>
+      <w:pPr>
+        <w:ind w:left="3960" w:hanging="180"/>
+      </w:pPr>
+    </w:lvl>
+    <w:lvl w:ilvl="6" w:tplc="0809000F" w:tentative="1">
+      <w:start w:val="1"/>
+      <w:numFmt w:val="decimal"/>
+      <w:lvlText w:val="%7."/>
+      <w:lvlJc w:val="left"/>
+      <w:pPr>
+        <w:ind w:left="4680" w:hanging="360"/>
+      </w:pPr>
+    </w:lvl>
+    <w:lvl w:ilvl="7" w:tplc="08090019" w:tentative="1">
+      <w:start w:val="1"/>
+      <w:numFmt w:val="lowerLetter"/>
+      <w:lvlText w:val="%8."/>
+      <w:lvlJc w:val="left"/>
+      <w:pPr>
+        <w:ind w:left="5400" w:hanging="360"/>
+      </w:pPr>
+    </w:lvl>
+    <w:lvl w:ilvl="8" w:tplc="0809001B" w:tentative="1">
+      <w:start w:val="1"/>
+      <w:numFmt w:val="lowerRoman"/>
+      <w:lvlText w:val="%9."/>
+      <w:lvlJc w:val="right"/>
+      <w:pPr>
+        <w:ind w:left="6120" w:hanging="180"/>
+      </w:pPr>
+    </w:lvl>
+  </w:abstractNum>
+  <w:abstractNum w:abstractNumId="23" w15:restartNumberingAfterBreak="0">
     <w:nsid w:val="6A917ECD"/>
     <w:multiLevelType w:val="hybridMultilevel"/>
     <w:tmpl w:val="27044AE2"/>
@@ -5546,7 +6447,7 @@
       </w:rPr>
     </w:lvl>
   </w:abstractNum>
-  <w:abstractNum w:abstractNumId="18" w15:restartNumberingAfterBreak="0">
+  <w:abstractNum w:abstractNumId="24" w15:restartNumberingAfterBreak="0">
     <w:nsid w:val="6DF04E0F"/>
     <w:multiLevelType w:val="hybridMultilevel"/>
     <w:tmpl w:val="295C1118"/>
@@ -5660,19 +6561,19 @@
     </w:lvl>
   </w:abstractNum>
   <w:num w:numId="1" w16cid:durableId="1421681331">
-    <w:abstractNumId w:val="16"/>
+    <w:abstractNumId w:val="19"/>
   </w:num>
   <w:num w:numId="2" w16cid:durableId="2010060922">
     <w:abstractNumId w:val="10"/>
   </w:num>
   <w:num w:numId="3" w16cid:durableId="1855722437">
-    <w:abstractNumId w:val="15"/>
+    <w:abstractNumId w:val="18"/>
   </w:num>
   <w:num w:numId="4" w16cid:durableId="839731692">
-    <w:abstractNumId w:val="14"/>
+    <w:abstractNumId w:val="17"/>
   </w:num>
   <w:num w:numId="5" w16cid:durableId="2032411283">
-    <w:abstractNumId w:val="13"/>
+    <w:abstractNumId w:val="16"/>
   </w:num>
   <w:num w:numId="6" w16cid:durableId="65609718">
     <w:abstractNumId w:val="11"/>
@@ -5708,13 +6609,31 @@
     <w:abstractNumId w:val="0"/>
   </w:num>
   <w:num w:numId="17" w16cid:durableId="29190081">
+    <w:abstractNumId w:val="13"/>
+  </w:num>
+  <w:num w:numId="18" w16cid:durableId="45228633">
+    <w:abstractNumId w:val="24"/>
+  </w:num>
+  <w:num w:numId="19" w16cid:durableId="806162269">
+    <w:abstractNumId w:val="23"/>
+  </w:num>
+  <w:num w:numId="20" w16cid:durableId="627013061">
+    <w:abstractNumId w:val="21"/>
+  </w:num>
+  <w:num w:numId="21" w16cid:durableId="1294560109">
     <w:abstractNumId w:val="12"/>
   </w:num>
-  <w:num w:numId="18" w16cid:durableId="45228633">
-    <w:abstractNumId w:val="18"/>
+  <w:num w:numId="22" w16cid:durableId="2070420655">
+    <w:abstractNumId w:val="14"/>
   </w:num>
-  <w:num w:numId="19" w16cid:durableId="806162269">
-    <w:abstractNumId w:val="17"/>
+  <w:num w:numId="23" w16cid:durableId="1664046201">
+    <w:abstractNumId w:val="22"/>
+  </w:num>
+  <w:num w:numId="24" w16cid:durableId="919673762">
+    <w:abstractNumId w:val="20"/>
+  </w:num>
+  <w:num w:numId="25" w16cid:durableId="418599671">
+    <w:abstractNumId w:val="15"/>
   </w:num>
 </w:numbering>
 </file>
@@ -6705,6 +7624,37 @@
       <w:bCs/>
     </w:rPr>
   </w:style>
+  <w:style w:type="character" w:styleId="UnresolvedMention">
+    <w:name w:val="Unresolved Mention"/>
+    <w:basedOn w:val="DefaultParagraphFont"/>
+    <w:rsid w:val="00AF6F6A"/>
+    <w:rPr>
+      <w:color w:val="605E5C"/>
+      <w:shd w:val="clear" w:color="auto" w:fill="E1DFDD"/>
+    </w:rPr>
+  </w:style>
+  <w:style w:type="character" w:styleId="FollowedHyperlink">
+    <w:name w:val="FollowedHyperlink"/>
+    <w:basedOn w:val="DefaultParagraphFont"/>
+    <w:semiHidden/>
+    <w:unhideWhenUsed/>
+    <w:rsid w:val="002F5ADE"/>
+    <w:rPr>
+      <w:color w:val="800080" w:themeColor="followedHyperlink"/>
+      <w:u w:val="single"/>
+    </w:rPr>
+  </w:style>
+  <w:style w:type="paragraph" w:styleId="ListParagraph">
+    <w:name w:val="List Paragraph"/>
+    <w:basedOn w:val="Normal"/>
+    <w:uiPriority w:val="34"/>
+    <w:qFormat/>
+    <w:rsid w:val="002F5ADE"/>
+    <w:pPr>
+      <w:ind w:left="720"/>
+      <w:contextualSpacing/>
+    </w:pPr>
+  </w:style>
 </w:styles>
 </file>
 

</xml_diff>

<commit_message>
continued with writeup, fixed some mistakes with naming variables
</commit_message>
<xml_diff>
--- a/project_writeup/FinalReportV1.docx
+++ b/project_writeup/FinalReportV1.docx
@@ -377,7 +377,7 @@
           </mc:Choice>
           <mc:Fallback>
             <w:pict>
-              <v:line w14:anchorId="5BBE5B6C" id="Straight Connector 4" o:spid="_x0000_s1026" style="position:absolute;z-index:251659264;visibility:visible;mso-wrap-style:square;mso-width-percent:0;mso-height-percent:0;mso-wrap-distance-left:9pt;mso-wrap-distance-top:0;mso-wrap-distance-right:9pt;mso-wrap-distance-bottom:0;mso-position-horizontal:absolute;mso-position-horizontal-relative:page;mso-position-vertical:absolute;mso-position-vertical-relative:page;mso-width-percent:0;mso-height-percent:0;mso-width-relative:page;mso-height-relative:page" from="13.05pt,197.5pt" to="580pt,197.5pt" o:gfxdata="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">
+              <v:line w14:anchorId="2FC3C502" id="Straight Connector 4" o:spid="_x0000_s1026" style="position:absolute;z-index:251659264;visibility:visible;mso-wrap-style:square;mso-width-percent:0;mso-height-percent:0;mso-wrap-distance-left:9pt;mso-wrap-distance-top:0;mso-wrap-distance-right:9pt;mso-wrap-distance-bottom:0;mso-position-horizontal:absolute;mso-position-horizontal-relative:page;mso-position-vertical:absolute;mso-position-vertical-relative:page;mso-width-percent:0;mso-height-percent:0;mso-width-relative:page;mso-height-relative:page" from="13.05pt,197.5pt" to="580pt,197.5pt" o:gfxdata="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">
                 <w10:wrap anchorx="page" anchory="page"/>
                 <w10:anchorlock/>
               </v:line>
@@ -519,21 +519,7 @@
         <w:rPr>
           <w:i/>
         </w:rPr>
-        <w:t xml:space="preserve"> </w:t>
-      </w:r>
-      <w:proofErr w:type="gramStart"/>
-      <w:r>
-        <w:rPr>
-          <w:i/>
-        </w:rPr>
-        <w:t>example</w:t>
-      </w:r>
-      <w:proofErr w:type="gramEnd"/>
-      <w:r>
-        <w:rPr>
-          <w:i/>
-        </w:rPr>
-        <w:t>&gt;</w:t>
+        <w:t xml:space="preserve"> example&gt;</w:t>
       </w:r>
     </w:p>
     <w:tbl>
@@ -1332,18 +1318,8 @@
           <w:sz w:val="22"/>
           <w:szCs w:val="22"/>
         </w:rPr>
-        <w:t xml:space="preserve">‘proof reading’ which is defined as “the systematic checking and identification of errors in spelling, punctuation, grammar and sentence construction, formatting and layout in the text”; </w:t>
-      </w:r>
-      <w:proofErr w:type="gramStart"/>
-      <w:r>
-        <w:rPr>
-          <w:i/>
-          <w:sz w:val="22"/>
-          <w:szCs w:val="22"/>
-        </w:rPr>
-        <w:t>see</w:t>
-      </w:r>
-      <w:proofErr w:type="gramEnd"/>
+        <w:t>‘proof reading’ which is defined as “the systematic checking and identification of errors in spelling, punctuation, grammar and sentence construction, formatting and layout in the text”; see</w:t>
+      </w:r>
     </w:p>
     <w:p>
       <w:pPr>
@@ -1828,25 +1804,184 @@
           <w:noProof/>
         </w:rPr>
         <w:tab/>
-      </w:r>
-      <w:r>
-        <w:rPr>
-          <w:noProof/>
-        </w:rPr>
+        <w:t>1.2.1  Optimal String Alignment Distance</w:t>
+      </w:r>
+      <w:r>
+        <w:rPr>
+          <w:noProof/>
+        </w:rPr>
+        <w:tab/>
+      </w:r>
+      <w:r>
+        <w:rPr>
+          <w:noProof/>
+        </w:rPr>
+        <w:fldChar w:fldCharType="begin"/>
+      </w:r>
+      <w:r>
+        <w:rPr>
+          <w:noProof/>
+        </w:rPr>
+        <w:instrText xml:space="preserve"> PAGEREF _Toc407145091 \h </w:instrText>
+      </w:r>
+      <w:r>
+        <w:rPr>
+          <w:noProof/>
+        </w:rPr>
+      </w:r>
+      <w:r>
+        <w:rPr>
+          <w:noProof/>
+        </w:rPr>
+        <w:fldChar w:fldCharType="separate"/>
+      </w:r>
+      <w:r>
+        <w:rPr>
+          <w:noProof/>
+        </w:rPr>
+        <w:t>1</w:t>
+      </w:r>
+      <w:r>
+        <w:rPr>
+          <w:noProof/>
+        </w:rPr>
+        <w:fldChar w:fldCharType="end"/>
+      </w:r>
+    </w:p>
+    <w:p>
+      <w:pPr>
+        <w:pStyle w:val="TOC2"/>
+        <w:rPr>
+          <w:noProof/>
+        </w:rPr>
+      </w:pPr>
+      <w:r>
+        <w:rPr>
+          <w:noProof/>
+        </w:rPr>
+        <w:tab/>
+        <w:t>1.2.1  Damerau Levenshtein Distance</w:t>
+      </w:r>
+      <w:r>
+        <w:rPr>
+          <w:noProof/>
+        </w:rPr>
+        <w:tab/>
+      </w:r>
+      <w:r>
+        <w:rPr>
+          <w:noProof/>
+        </w:rPr>
+        <w:fldChar w:fldCharType="begin"/>
+      </w:r>
+      <w:r>
+        <w:rPr>
+          <w:noProof/>
+        </w:rPr>
+        <w:instrText xml:space="preserve"> PAGEREF _Toc407145091 \h </w:instrText>
+      </w:r>
+      <w:r>
+        <w:rPr>
+          <w:noProof/>
+        </w:rPr>
+      </w:r>
+      <w:r>
+        <w:rPr>
+          <w:noProof/>
+        </w:rPr>
+        <w:fldChar w:fldCharType="separate"/>
+      </w:r>
+      <w:r>
+        <w:rPr>
+          <w:noProof/>
+        </w:rPr>
+        <w:t>1</w:t>
+      </w:r>
+      <w:r>
+        <w:rPr>
+          <w:noProof/>
+        </w:rPr>
+        <w:fldChar w:fldCharType="end"/>
+      </w:r>
+    </w:p>
+    <w:p>
+      <w:pPr>
+        <w:pStyle w:val="TOC2"/>
+        <w:rPr>
+          <w:noProof/>
+        </w:rPr>
+      </w:pPr>
+      <w:r>
+        <w:rPr>
+          <w:noProof/>
+        </w:rPr>
+        <w:tab/>
+        <w:t>1.2.1  Hamming Distance</w:t>
+      </w:r>
+      <w:r>
+        <w:rPr>
+          <w:noProof/>
+        </w:rPr>
+        <w:tab/>
+      </w:r>
+      <w:r>
+        <w:rPr>
+          <w:noProof/>
+        </w:rPr>
+        <w:fldChar w:fldCharType="begin"/>
+      </w:r>
+      <w:r>
+        <w:rPr>
+          <w:noProof/>
+        </w:rPr>
+        <w:instrText xml:space="preserve"> PAGEREF _Toc407145091 \h </w:instrText>
+      </w:r>
+      <w:r>
+        <w:rPr>
+          <w:noProof/>
+        </w:rPr>
+      </w:r>
+      <w:r>
+        <w:rPr>
+          <w:noProof/>
+        </w:rPr>
+        <w:fldChar w:fldCharType="separate"/>
+      </w:r>
+      <w:r>
+        <w:rPr>
+          <w:noProof/>
+        </w:rPr>
+        <w:t>1</w:t>
+      </w:r>
+      <w:r>
+        <w:rPr>
+          <w:noProof/>
+        </w:rPr>
+        <w:fldChar w:fldCharType="end"/>
+      </w:r>
+    </w:p>
+    <w:p>
+      <w:pPr>
+        <w:pStyle w:val="TOC2"/>
+        <w:rPr>
+          <w:noProof/>
+        </w:rPr>
+      </w:pPr>
+      <w:r>
+        <w:rPr>
+          <w:noProof/>
+        </w:rPr>
+        <w:tab/>
         <w:t xml:space="preserve">1.2.1  </w:t>
       </w:r>
-      <w:r>
-        <w:rPr>
-          <w:noProof/>
-        </w:rPr>
-        <w:t>Optimal String Alignment</w:t>
-      </w:r>
-      <w:r>
-        <w:rPr>
-          <w:noProof/>
-        </w:rPr>
-        <w:t xml:space="preserve"> Distance</w:t>
-      </w:r>
+      <w:bookmarkStart w:id="3" w:name="_Hlk164525044"/>
+      <w:r>
+        <w:rPr>
+          <w:noProof/>
+        </w:rPr>
+        <w:t>Sørensen–Dice Coefficient</w:t>
+      </w:r>
+      <w:bookmarkEnd w:id="3"/>
       <w:r>
         <w:rPr>
           <w:noProof/>
@@ -1901,18 +2036,7 @@
           <w:noProof/>
         </w:rPr>
         <w:tab/>
-      </w:r>
-      <w:r>
-        <w:rPr>
-          <w:noProof/>
-        </w:rPr>
-        <w:t xml:space="preserve">1.2.1  </w:t>
-      </w:r>
-      <w:r>
-        <w:rPr>
-          <w:noProof/>
-        </w:rPr>
-        <w:t>Damerau Levenshtein Distance</w:t>
+        <w:t>1.2.1  Jaro Distance</w:t>
       </w:r>
       <w:r>
         <w:rPr>
@@ -1968,18 +2092,7 @@
           <w:noProof/>
         </w:rPr>
         <w:tab/>
-      </w:r>
-      <w:r>
-        <w:rPr>
-          <w:noProof/>
-        </w:rPr>
-        <w:t xml:space="preserve">1.2.1  </w:t>
-      </w:r>
-      <w:r>
-        <w:rPr>
-          <w:noProof/>
-        </w:rPr>
-        <w:t>Hamming Distance</w:t>
+        <w:t>1.2.1  Jaro-Winkler Distance</w:t>
       </w:r>
       <w:r>
         <w:rPr>
@@ -2034,27 +2147,69 @@
         <w:rPr>
           <w:noProof/>
         </w:rPr>
+        <w:t>1.3  Overview of search methods</w:t>
+      </w:r>
+      <w:r>
+        <w:rPr>
+          <w:noProof/>
+        </w:rPr>
         <w:tab/>
       </w:r>
       <w:r>
         <w:rPr>
           <w:noProof/>
         </w:rPr>
-        <w:t xml:space="preserve">1.2.1  </w:t>
-      </w:r>
-      <w:bookmarkStart w:id="3" w:name="_Hlk164525044"/>
-      <w:r>
-        <w:rPr>
-          <w:noProof/>
-        </w:rPr>
-        <w:t>Sørensen–Dice Coefficient</w:t>
-      </w:r>
-      <w:bookmarkEnd w:id="3"/>
+        <w:fldChar w:fldCharType="begin"/>
+      </w:r>
+      <w:r>
+        <w:rPr>
+          <w:noProof/>
+        </w:rPr>
+        <w:instrText xml:space="preserve"> PAGEREF _Toc407145091 \h </w:instrText>
+      </w:r>
+      <w:r>
+        <w:rPr>
+          <w:noProof/>
+        </w:rPr>
+      </w:r>
+      <w:r>
+        <w:rPr>
+          <w:noProof/>
+        </w:rPr>
+        <w:fldChar w:fldCharType="separate"/>
+      </w:r>
+      <w:r>
+        <w:rPr>
+          <w:noProof/>
+        </w:rPr>
+        <w:t>1</w:t>
+      </w:r>
+      <w:r>
+        <w:rPr>
+          <w:noProof/>
+        </w:rPr>
+        <w:fldChar w:fldCharType="end"/>
+      </w:r>
+    </w:p>
+    <w:p>
+      <w:pPr>
+        <w:pStyle w:val="TOC2"/>
+        <w:rPr>
+          <w:noProof/>
+        </w:rPr>
+      </w:pPr>
       <w:r>
         <w:rPr>
           <w:noProof/>
         </w:rPr>
         <w:tab/>
+        <w:t>1.3.1  Linear Search</w:t>
+      </w:r>
+      <w:r>
+        <w:rPr>
+          <w:noProof/>
+        </w:rPr>
+        <w:tab/>
       </w:r>
       <w:r>
         <w:rPr>
@@ -2104,24 +2259,7 @@
           <w:noProof/>
         </w:rPr>
         <w:tab/>
-      </w:r>
-      <w:r>
-        <w:rPr>
-          <w:noProof/>
-        </w:rPr>
-        <w:t xml:space="preserve">1.2.1  </w:t>
-      </w:r>
-      <w:r>
-        <w:rPr>
-          <w:noProof/>
-        </w:rPr>
-        <w:t>Jaro</w:t>
-      </w:r>
-      <w:r>
-        <w:rPr>
-          <w:noProof/>
-        </w:rPr>
-        <w:t xml:space="preserve"> Distance</w:t>
+        <w:t>1.3.2  Binary Search</w:t>
       </w:r>
       <w:r>
         <w:rPr>
@@ -2177,337 +2315,7 @@
           <w:noProof/>
         </w:rPr>
         <w:tab/>
-      </w:r>
-      <w:r>
-        <w:rPr>
-          <w:noProof/>
-        </w:rPr>
-        <w:t xml:space="preserve">1.2.1  </w:t>
-      </w:r>
-      <w:r>
-        <w:rPr>
-          <w:noProof/>
-        </w:rPr>
-        <w:t>Jaro-Winkler</w:t>
-      </w:r>
-      <w:r>
-        <w:rPr>
-          <w:noProof/>
-        </w:rPr>
-        <w:t xml:space="preserve"> Distance</w:t>
-      </w:r>
-      <w:r>
-        <w:rPr>
-          <w:noProof/>
-        </w:rPr>
-        <w:tab/>
-      </w:r>
-      <w:r>
-        <w:rPr>
-          <w:noProof/>
-        </w:rPr>
-        <w:fldChar w:fldCharType="begin"/>
-      </w:r>
-      <w:r>
-        <w:rPr>
-          <w:noProof/>
-        </w:rPr>
-        <w:instrText xml:space="preserve"> PAGEREF _Toc407145091 \h </w:instrText>
-      </w:r>
-      <w:r>
-        <w:rPr>
-          <w:noProof/>
-        </w:rPr>
-      </w:r>
-      <w:r>
-        <w:rPr>
-          <w:noProof/>
-        </w:rPr>
-        <w:fldChar w:fldCharType="separate"/>
-      </w:r>
-      <w:r>
-        <w:rPr>
-          <w:noProof/>
-        </w:rPr>
-        <w:t>1</w:t>
-      </w:r>
-      <w:r>
-        <w:rPr>
-          <w:noProof/>
-        </w:rPr>
-        <w:fldChar w:fldCharType="end"/>
-      </w:r>
-    </w:p>
-    <w:p>
-      <w:pPr>
-        <w:pStyle w:val="TOC2"/>
-        <w:rPr>
-          <w:noProof/>
-        </w:rPr>
-      </w:pPr>
-      <w:r>
-        <w:rPr>
-          <w:noProof/>
-        </w:rPr>
-        <w:t>1.</w:t>
-      </w:r>
-      <w:r>
-        <w:rPr>
-          <w:noProof/>
-        </w:rPr>
-        <w:t>3</w:t>
-      </w:r>
-      <w:r>
-        <w:rPr>
-          <w:noProof/>
-        </w:rPr>
-        <w:t xml:space="preserve">  Overview of </w:t>
-      </w:r>
-      <w:r>
-        <w:rPr>
-          <w:noProof/>
-        </w:rPr>
-        <w:t>search methods</w:t>
-      </w:r>
-      <w:r>
-        <w:rPr>
-          <w:noProof/>
-        </w:rPr>
-        <w:tab/>
-      </w:r>
-      <w:r>
-        <w:rPr>
-          <w:noProof/>
-        </w:rPr>
-        <w:fldChar w:fldCharType="begin"/>
-      </w:r>
-      <w:r>
-        <w:rPr>
-          <w:noProof/>
-        </w:rPr>
-        <w:instrText xml:space="preserve"> PAGEREF _Toc407145091 \h </w:instrText>
-      </w:r>
-      <w:r>
-        <w:rPr>
-          <w:noProof/>
-        </w:rPr>
-      </w:r>
-      <w:r>
-        <w:rPr>
-          <w:noProof/>
-        </w:rPr>
-        <w:fldChar w:fldCharType="separate"/>
-      </w:r>
-      <w:r>
-        <w:rPr>
-          <w:noProof/>
-        </w:rPr>
-        <w:t>1</w:t>
-      </w:r>
-      <w:r>
-        <w:rPr>
-          <w:noProof/>
-        </w:rPr>
-        <w:fldChar w:fldCharType="end"/>
-      </w:r>
-    </w:p>
-    <w:p>
-      <w:pPr>
-        <w:pStyle w:val="TOC2"/>
-        <w:rPr>
-          <w:noProof/>
-        </w:rPr>
-      </w:pPr>
-      <w:r>
-        <w:rPr>
-          <w:noProof/>
-        </w:rPr>
-        <w:tab/>
-        <w:t>1.</w:t>
-      </w:r>
-      <w:r>
-        <w:rPr>
-          <w:noProof/>
-        </w:rPr>
-        <w:t>3</w:t>
-      </w:r>
-      <w:r>
-        <w:rPr>
-          <w:noProof/>
-        </w:rPr>
-        <w:t>.1  L</w:t>
-      </w:r>
-      <w:r>
-        <w:rPr>
-          <w:noProof/>
-        </w:rPr>
-        <w:t>inear Search</w:t>
-      </w:r>
-      <w:r>
-        <w:rPr>
-          <w:noProof/>
-        </w:rPr>
-        <w:tab/>
-      </w:r>
-      <w:r>
-        <w:rPr>
-          <w:noProof/>
-        </w:rPr>
-        <w:fldChar w:fldCharType="begin"/>
-      </w:r>
-      <w:r>
-        <w:rPr>
-          <w:noProof/>
-        </w:rPr>
-        <w:instrText xml:space="preserve"> PAGEREF _Toc407145091 \h </w:instrText>
-      </w:r>
-      <w:r>
-        <w:rPr>
-          <w:noProof/>
-        </w:rPr>
-      </w:r>
-      <w:r>
-        <w:rPr>
-          <w:noProof/>
-        </w:rPr>
-        <w:fldChar w:fldCharType="separate"/>
-      </w:r>
-      <w:r>
-        <w:rPr>
-          <w:noProof/>
-        </w:rPr>
-        <w:t>1</w:t>
-      </w:r>
-      <w:r>
-        <w:rPr>
-          <w:noProof/>
-        </w:rPr>
-        <w:fldChar w:fldCharType="end"/>
-      </w:r>
-    </w:p>
-    <w:p>
-      <w:pPr>
-        <w:pStyle w:val="TOC2"/>
-        <w:rPr>
-          <w:noProof/>
-        </w:rPr>
-      </w:pPr>
-      <w:r>
-        <w:rPr>
-          <w:noProof/>
-        </w:rPr>
-        <w:tab/>
-        <w:t>1.</w:t>
-      </w:r>
-      <w:r>
-        <w:rPr>
-          <w:noProof/>
-        </w:rPr>
-        <w:t>3</w:t>
-      </w:r>
-      <w:r>
-        <w:rPr>
-          <w:noProof/>
-        </w:rPr>
-        <w:t>.</w:t>
-      </w:r>
-      <w:r>
-        <w:rPr>
-          <w:noProof/>
-        </w:rPr>
-        <w:t>2</w:t>
-      </w:r>
-      <w:r>
-        <w:rPr>
-          <w:noProof/>
-        </w:rPr>
-        <w:t xml:space="preserve">  </w:t>
-      </w:r>
-      <w:r>
-        <w:rPr>
-          <w:noProof/>
-        </w:rPr>
-        <w:t>Binary Search</w:t>
-      </w:r>
-      <w:r>
-        <w:rPr>
-          <w:noProof/>
-        </w:rPr>
-        <w:tab/>
-      </w:r>
-      <w:r>
-        <w:rPr>
-          <w:noProof/>
-        </w:rPr>
-        <w:fldChar w:fldCharType="begin"/>
-      </w:r>
-      <w:r>
-        <w:rPr>
-          <w:noProof/>
-        </w:rPr>
-        <w:instrText xml:space="preserve"> PAGEREF _Toc407145091 \h </w:instrText>
-      </w:r>
-      <w:r>
-        <w:rPr>
-          <w:noProof/>
-        </w:rPr>
-      </w:r>
-      <w:r>
-        <w:rPr>
-          <w:noProof/>
-        </w:rPr>
-        <w:fldChar w:fldCharType="separate"/>
-      </w:r>
-      <w:r>
-        <w:rPr>
-          <w:noProof/>
-        </w:rPr>
-        <w:t>1</w:t>
-      </w:r>
-      <w:r>
-        <w:rPr>
-          <w:noProof/>
-        </w:rPr>
-        <w:fldChar w:fldCharType="end"/>
-      </w:r>
-    </w:p>
-    <w:p>
-      <w:pPr>
-        <w:pStyle w:val="TOC2"/>
-        <w:rPr>
-          <w:noProof/>
-        </w:rPr>
-      </w:pPr>
-      <w:r>
-        <w:rPr>
-          <w:noProof/>
-        </w:rPr>
-        <w:tab/>
-        <w:t>1.</w:t>
-      </w:r>
-      <w:r>
-        <w:rPr>
-          <w:noProof/>
-        </w:rPr>
-        <w:t>3</w:t>
-      </w:r>
-      <w:r>
-        <w:rPr>
-          <w:noProof/>
-        </w:rPr>
-        <w:t>.</w:t>
-      </w:r>
-      <w:r>
-        <w:rPr>
-          <w:noProof/>
-        </w:rPr>
-        <w:t>3</w:t>
-      </w:r>
-      <w:r>
-        <w:rPr>
-          <w:noProof/>
-        </w:rPr>
-        <w:t xml:space="preserve">  </w:t>
+        <w:t xml:space="preserve">1.3.3  </w:t>
       </w:r>
       <w:r>
         <w:rPr>
@@ -2835,19 +2643,7 @@
           <w:noProof/>
         </w:rPr>
         <w:tab/>
-        <w:t>2</w:t>
-      </w:r>
-      <w:r>
-        <w:rPr>
-          <w:noProof/>
-        </w:rPr>
-        <w:t xml:space="preserve">.2.1  </w:t>
-      </w:r>
-      <w:r>
-        <w:rPr>
-          <w:noProof/>
-        </w:rPr>
-        <w:t>Corpus Extraction</w:t>
+        <w:t>2.2.1  Corpus Extraction</w:t>
       </w:r>
       <w:r>
         <w:rPr>
@@ -2903,13 +2699,7 @@
           <w:noProof/>
         </w:rPr>
         <w:tab/>
-        <w:t xml:space="preserve">2.2.1  </w:t>
-      </w:r>
-      <w:r>
-        <w:rPr>
-          <w:noProof/>
-        </w:rPr>
-        <w:t>Spell Checking and Testing</w:t>
+        <w:t>2.2.1  Spell Checking and Testing</w:t>
       </w:r>
       <w:r>
         <w:rPr>
@@ -3970,57 +3760,50 @@
       <w:pPr>
         <w:pStyle w:val="Heading2"/>
         <w:rPr>
-          <w:sz w:val="24"/>
-          <w:szCs w:val="18"/>
-        </w:rPr>
-      </w:pPr>
-      <w:r>
-        <w:rPr>
-          <w:sz w:val="24"/>
-          <w:szCs w:val="18"/>
-        </w:rPr>
-        <w:t xml:space="preserve">1.2.1  </w:t>
-      </w:r>
-      <w:r>
-        <w:rPr>
-          <w:sz w:val="24"/>
-          <w:szCs w:val="18"/>
-        </w:rPr>
-        <w:t>Levenshtein Distance</w:t>
-      </w:r>
-    </w:p>
-    <w:p>
-      <w:pPr>
-        <w:rPr>
-          <w:sz w:val="22"/>
-          <w:szCs w:val="18"/>
-        </w:rPr>
-      </w:pPr>
-      <w:r>
-        <w:rPr>
-          <w:sz w:val="22"/>
-          <w:szCs w:val="18"/>
+          <w:sz w:val="22"/>
+          <w:szCs w:val="22"/>
+        </w:rPr>
+      </w:pPr>
+      <w:r>
+        <w:rPr>
+          <w:sz w:val="22"/>
+          <w:szCs w:val="22"/>
+        </w:rPr>
+        <w:t>1.2.1  Levenshtein Distance</w:t>
+      </w:r>
+    </w:p>
+    <w:p>
+      <w:pPr>
+        <w:rPr>
+          <w:sz w:val="22"/>
+          <w:szCs w:val="22"/>
+        </w:rPr>
+      </w:pPr>
+      <w:r>
+        <w:rPr>
+          <w:sz w:val="22"/>
+          <w:szCs w:val="22"/>
         </w:rPr>
         <w:t>Levenshtein distance is an algorithm used to measure the distance / difference between two strings,</w:t>
       </w:r>
       <w:r>
         <w:rPr>
           <w:sz w:val="22"/>
-          <w:szCs w:val="18"/>
+          <w:szCs w:val="22"/>
         </w:rPr>
         <w:t xml:space="preserve"> represented as a single </w:t>
       </w:r>
       <w:r>
         <w:rPr>
           <w:sz w:val="22"/>
-          <w:szCs w:val="18"/>
+          <w:szCs w:val="22"/>
         </w:rPr>
         <w:t xml:space="preserve">integer </w:t>
       </w:r>
       <w:r>
         <w:rPr>
           <w:sz w:val="22"/>
-          <w:szCs w:val="18"/>
+          <w:szCs w:val="22"/>
         </w:rPr>
         <w:t>value. The algorithm used is recursive and works as follows:</w:t>
       </w:r>
@@ -4030,18 +3813,20 @@
         <w:jc w:val="center"/>
         <w:rPr>
           <w:sz w:val="22"/>
-          <w:szCs w:val="18"/>
-        </w:rPr>
-      </w:pPr>
-      <w:r>
-        <w:rPr>
-          <w:noProof/>
+          <w:szCs w:val="22"/>
+        </w:rPr>
+      </w:pPr>
+      <w:r>
+        <w:rPr>
+          <w:noProof/>
+          <w:sz w:val="22"/>
+          <w:szCs w:val="22"/>
         </w:rPr>
         <w:drawing>
-          <wp:inline distT="0" distB="0" distL="0" distR="0" wp14:anchorId="5D9BAE45" wp14:editId="61502604">
-            <wp:extent cx="5731510" cy="1218565"/>
-            <wp:effectExtent l="0" t="0" r="2540" b="635"/>
-            <wp:docPr id="190166101" name="Picture 1" descr="A math equations with numbers&#10;&#10;Description automatically generated with medium confidence"/>
+          <wp:inline distT="0" distB="0" distL="0" distR="0" wp14:anchorId="32DA3926" wp14:editId="52751527">
+            <wp:extent cx="5095875" cy="2237420"/>
+            <wp:effectExtent l="19050" t="19050" r="9525" b="10795"/>
+            <wp:docPr id="1537603008" name="Picture 1" descr="A screenshot of a computer program&#10;&#10;Description automatically generated"/>
             <wp:cNvGraphicFramePr>
               <a:graphicFrameLocks xmlns:a="http://schemas.openxmlformats.org/drawingml/2006/main" noChangeAspect="1"/>
             </wp:cNvGraphicFramePr>
@@ -4049,7 +3834,7 @@
               <a:graphicData uri="http://schemas.openxmlformats.org/drawingml/2006/picture">
                 <pic:pic xmlns:pic="http://schemas.openxmlformats.org/drawingml/2006/picture">
                   <pic:nvPicPr>
-                    <pic:cNvPr id="190166101" name="Picture 1" descr="A math equations with numbers&#10;&#10;Description automatically generated with medium confidence"/>
+                    <pic:cNvPr id="1537603008" name="Picture 1" descr="A screenshot of a computer program&#10;&#10;Description automatically generated"/>
                     <pic:cNvPicPr/>
                   </pic:nvPicPr>
                   <pic:blipFill>
@@ -4061,11 +3846,16 @@
                   <pic:spPr>
                     <a:xfrm>
                       <a:off x="0" y="0"/>
-                      <a:ext cx="5731510" cy="1218565"/>
+                      <a:ext cx="5103964" cy="2240972"/>
                     </a:xfrm>
                     <a:prstGeom prst="rect">
                       <a:avLst/>
                     </a:prstGeom>
+                    <a:ln>
+                      <a:solidFill>
+                        <a:schemeClr val="tx1"/>
+                      </a:solidFill>
+                    </a:ln>
                   </pic:spPr>
                 </pic:pic>
               </a:graphicData>
@@ -4073,13 +3863,21 @@
           </wp:inline>
         </w:drawing>
       </w:r>
+      <w:r>
+        <w:rPr>
+          <w:noProof/>
+          <w:sz w:val="22"/>
+          <w:szCs w:val="22"/>
+        </w:rPr>
+        <w:t xml:space="preserve"> </w:t>
+      </w:r>
     </w:p>
     <w:p>
       <w:pPr>
         <w:jc w:val="center"/>
         <w:rPr>
           <w:sz w:val="22"/>
-          <w:szCs w:val="18"/>
+          <w:szCs w:val="22"/>
         </w:rPr>
       </w:pPr>
       <w:r>
@@ -4087,419 +3885,150 @@
           <w:b/>
           <w:bCs/>
           <w:sz w:val="22"/>
-          <w:szCs w:val="18"/>
-        </w:rPr>
+          <w:szCs w:val="22"/>
+        </w:rPr>
+        <w:lastRenderedPageBreak/>
         <w:t>Figure 1</w:t>
       </w:r>
       <w:r>
         <w:rPr>
           <w:sz w:val="22"/>
-          <w:szCs w:val="18"/>
+          <w:szCs w:val="22"/>
         </w:rPr>
         <w:t>. Levenstein Distance algorithm</w:t>
       </w:r>
       <w:r>
         <w:rPr>
           <w:sz w:val="22"/>
-          <w:szCs w:val="18"/>
-        </w:rPr>
-        <w:t xml:space="preserve"> (from </w:t>
-      </w:r>
-    </w:p>
-    <w:p>
-      <w:pPr>
-        <w:rPr>
-          <w:sz w:val="22"/>
-          <w:szCs w:val="18"/>
-        </w:rPr>
-      </w:pPr>
-      <w:r>
-        <w:rPr>
-          <w:sz w:val="22"/>
-          <w:szCs w:val="18"/>
-        </w:rPr>
-        <w:t xml:space="preserve">Where, </w:t>
-      </w:r>
-      <w:proofErr w:type="spellStart"/>
-      <w:r>
-        <w:rPr>
-          <w:sz w:val="22"/>
-          <w:szCs w:val="18"/>
-        </w:rPr>
-        <w:t>i</w:t>
-      </w:r>
-      <w:proofErr w:type="spellEnd"/>
-      <w:r>
-        <w:rPr>
-          <w:sz w:val="22"/>
-          <w:szCs w:val="18"/>
-        </w:rPr>
-        <w:t xml:space="preserve"> and j are the two strings. </w:t>
-      </w:r>
-      <w:r>
-        <w:rPr>
-          <w:sz w:val="22"/>
-          <w:szCs w:val="18"/>
-        </w:rPr>
-        <w:t>The larger the distance, the more different the two strings are. As an example,</w:t>
-      </w:r>
-      <w:r>
-        <w:rPr>
-          <w:sz w:val="22"/>
-          <w:szCs w:val="18"/>
-        </w:rPr>
-        <w:t xml:space="preserve"> if you had the strings “kitten” and “sitting”:</w:t>
-      </w:r>
-    </w:p>
-    <w:p>
-      <w:pPr>
-        <w:pStyle w:val="ListParagraph"/>
-        <w:numPr>
-          <w:ilvl w:val="0"/>
-          <w:numId w:val="25"/>
-        </w:numPr>
-        <w:rPr>
-          <w:sz w:val="22"/>
-          <w:szCs w:val="18"/>
-        </w:rPr>
-      </w:pPr>
-      <w:r>
-        <w:rPr>
-          <w:b/>
-          <w:bCs/>
-          <w:sz w:val="22"/>
-          <w:szCs w:val="18"/>
-        </w:rPr>
-        <w:t>k</w:t>
-      </w:r>
-      <w:r>
-        <w:rPr>
-          <w:sz w:val="22"/>
-          <w:szCs w:val="18"/>
-        </w:rPr>
-        <w:t xml:space="preserve">itten -&gt; </w:t>
-      </w:r>
-      <w:r>
-        <w:rPr>
-          <w:b/>
-          <w:bCs/>
-          <w:sz w:val="22"/>
-          <w:szCs w:val="18"/>
-        </w:rPr>
-        <w:t>s</w:t>
-      </w:r>
-      <w:r>
-        <w:rPr>
-          <w:sz w:val="22"/>
-          <w:szCs w:val="18"/>
-        </w:rPr>
-        <w:t>itten (</w:t>
-      </w:r>
-      <w:r>
-        <w:rPr>
-          <w:sz w:val="22"/>
-          <w:szCs w:val="18"/>
-        </w:rPr>
-        <w:t>delete</w:t>
-      </w:r>
-      <w:r>
-        <w:rPr>
-          <w:sz w:val="22"/>
-          <w:szCs w:val="18"/>
-        </w:rPr>
-        <w:t xml:space="preserve"> ‘k’</w:t>
-      </w:r>
-      <w:r>
-        <w:rPr>
-          <w:sz w:val="22"/>
-          <w:szCs w:val="18"/>
-        </w:rPr>
-        <w:t xml:space="preserve"> at index 0, and insert</w:t>
-      </w:r>
-      <w:r>
-        <w:rPr>
-          <w:sz w:val="22"/>
-          <w:szCs w:val="18"/>
-        </w:rPr>
-        <w:t xml:space="preserve"> ‘s’</w:t>
-      </w:r>
-      <w:r>
-        <w:rPr>
-          <w:sz w:val="22"/>
-          <w:szCs w:val="18"/>
-        </w:rPr>
-        <w:t xml:space="preserve"> at index 0</w:t>
-      </w:r>
-      <w:r>
-        <w:rPr>
-          <w:sz w:val="22"/>
-          <w:szCs w:val="18"/>
-        </w:rPr>
-        <w:t>)</w:t>
-      </w:r>
-    </w:p>
-    <w:p>
-      <w:pPr>
-        <w:pStyle w:val="ListParagraph"/>
-        <w:numPr>
-          <w:ilvl w:val="0"/>
-          <w:numId w:val="25"/>
-        </w:numPr>
-        <w:rPr>
-          <w:sz w:val="22"/>
-          <w:szCs w:val="18"/>
-        </w:rPr>
-      </w:pPr>
-      <w:r>
-        <w:rPr>
-          <w:sz w:val="22"/>
-          <w:szCs w:val="18"/>
-        </w:rPr>
-        <w:lastRenderedPageBreak/>
-        <w:t>sitt</w:t>
-      </w:r>
-      <w:r>
-        <w:rPr>
-          <w:b/>
-          <w:bCs/>
-          <w:sz w:val="22"/>
-          <w:szCs w:val="18"/>
-        </w:rPr>
-        <w:t>e</w:t>
-      </w:r>
-      <w:r>
-        <w:rPr>
-          <w:sz w:val="22"/>
-          <w:szCs w:val="18"/>
-        </w:rPr>
-        <w:t xml:space="preserve">n -&gt; </w:t>
-      </w:r>
-      <w:r>
-        <w:rPr>
-          <w:sz w:val="22"/>
-          <w:szCs w:val="18"/>
-        </w:rPr>
-        <w:t>sitt</w:t>
-      </w:r>
-      <w:r>
-        <w:rPr>
-          <w:b/>
-          <w:bCs/>
-          <w:sz w:val="22"/>
-          <w:szCs w:val="18"/>
-        </w:rPr>
-        <w:t>i</w:t>
-      </w:r>
-      <w:r>
-        <w:rPr>
-          <w:sz w:val="22"/>
-          <w:szCs w:val="18"/>
-        </w:rPr>
-        <w:t>n (</w:t>
-      </w:r>
-      <w:r>
-        <w:rPr>
-          <w:sz w:val="22"/>
-          <w:szCs w:val="18"/>
-        </w:rPr>
-        <w:t>delete</w:t>
-      </w:r>
-      <w:r>
-        <w:rPr>
-          <w:sz w:val="22"/>
-          <w:szCs w:val="18"/>
-        </w:rPr>
-        <w:t xml:space="preserve"> ‘e’</w:t>
-      </w:r>
-      <w:r>
-        <w:rPr>
-          <w:sz w:val="22"/>
-          <w:szCs w:val="18"/>
-        </w:rPr>
-        <w:t xml:space="preserve"> at index 4, and insert</w:t>
-      </w:r>
-      <w:r>
-        <w:rPr>
-          <w:sz w:val="22"/>
-          <w:szCs w:val="18"/>
-        </w:rPr>
-        <w:t xml:space="preserve"> ‘</w:t>
-      </w:r>
-      <w:proofErr w:type="spellStart"/>
-      <w:r>
-        <w:rPr>
-          <w:sz w:val="22"/>
-          <w:szCs w:val="18"/>
-        </w:rPr>
-        <w:t>i</w:t>
-      </w:r>
-      <w:proofErr w:type="spellEnd"/>
-      <w:r>
-        <w:rPr>
-          <w:sz w:val="22"/>
-          <w:szCs w:val="18"/>
-        </w:rPr>
-        <w:t>’</w:t>
-      </w:r>
-      <w:r>
-        <w:rPr>
-          <w:sz w:val="22"/>
-          <w:szCs w:val="18"/>
-        </w:rPr>
-        <w:t xml:space="preserve"> at index 4</w:t>
-      </w:r>
-      <w:r>
-        <w:rPr>
-          <w:sz w:val="22"/>
-          <w:szCs w:val="18"/>
-        </w:rPr>
-        <w:t>)</w:t>
-      </w:r>
-    </w:p>
-    <w:p>
-      <w:pPr>
-        <w:pStyle w:val="ListParagraph"/>
-        <w:numPr>
-          <w:ilvl w:val="0"/>
-          <w:numId w:val="25"/>
-        </w:numPr>
-        <w:rPr>
-          <w:sz w:val="22"/>
-          <w:szCs w:val="18"/>
-        </w:rPr>
-      </w:pPr>
-      <w:r>
-        <w:rPr>
-          <w:sz w:val="22"/>
-          <w:szCs w:val="18"/>
-        </w:rPr>
-        <w:t xml:space="preserve">sittin -&gt; sitting (insert g at </w:t>
-      </w:r>
-      <w:r>
-        <w:rPr>
-          <w:sz w:val="22"/>
-          <w:szCs w:val="18"/>
-        </w:rPr>
-        <w:t>index 6</w:t>
-      </w:r>
-      <w:r>
-        <w:rPr>
-          <w:sz w:val="22"/>
-          <w:szCs w:val="18"/>
-        </w:rPr>
-        <w:t>)</w:t>
-      </w:r>
-    </w:p>
-    <w:p>
-      <w:pPr>
-        <w:rPr>
-          <w:sz w:val="22"/>
-          <w:szCs w:val="18"/>
-        </w:rPr>
-      </w:pPr>
-      <w:r>
-        <w:rPr>
-          <w:sz w:val="22"/>
-          <w:szCs w:val="18"/>
-        </w:rPr>
-        <w:t xml:space="preserve">As there were </w:t>
-      </w:r>
-      <w:r>
-        <w:rPr>
-          <w:sz w:val="22"/>
-          <w:szCs w:val="18"/>
-        </w:rPr>
-        <w:t>5</w:t>
-      </w:r>
-      <w:r>
-        <w:rPr>
-          <w:sz w:val="22"/>
-          <w:szCs w:val="18"/>
-        </w:rPr>
-        <w:t xml:space="preserve"> </w:t>
-      </w:r>
-      <w:r>
-        <w:rPr>
-          <w:sz w:val="22"/>
-          <w:szCs w:val="18"/>
-        </w:rPr>
-        <w:t>operations</w:t>
-      </w:r>
-      <w:r>
-        <w:rPr>
-          <w:sz w:val="22"/>
-          <w:szCs w:val="18"/>
-        </w:rPr>
-        <w:t xml:space="preserve"> that needed to occur to change the string, the levenshtein distance between the two words is </w:t>
-      </w:r>
-      <w:r>
-        <w:rPr>
-          <w:sz w:val="22"/>
-          <w:szCs w:val="18"/>
-        </w:rPr>
-        <w:t>5</w:t>
-      </w:r>
-      <w:r>
-        <w:rPr>
-          <w:sz w:val="22"/>
-          <w:szCs w:val="18"/>
-        </w:rPr>
-        <w:t>.</w:t>
+          <w:szCs w:val="22"/>
+        </w:rPr>
+        <w:t xml:space="preserve"> (</w:t>
+      </w:r>
+      <w:r>
+        <w:rPr>
+          <w:sz w:val="22"/>
+          <w:szCs w:val="22"/>
+        </w:rPr>
+        <w:t xml:space="preserve">pseudocode adapted from: </w:t>
+      </w:r>
+      <w:hyperlink r:id="rId11" w:history="1">
+        <w:r>
+          <w:rPr>
+            <w:rStyle w:val="Hyperlink"/>
+            <w:sz w:val="22"/>
+            <w:szCs w:val="22"/>
+          </w:rPr>
+          <w:t>https://www.geeksforgeeks.org/introduction-to-levenshtein-distance/</w:t>
+        </w:r>
+      </w:hyperlink>
+      <w:r>
+        <w:rPr>
+          <w:sz w:val="22"/>
+          <w:szCs w:val="22"/>
+        </w:rPr>
+        <w:t xml:space="preserve"> )</w:t>
+      </w:r>
+    </w:p>
+    <w:p>
+      <w:pPr>
+        <w:rPr>
+          <w:sz w:val="22"/>
+          <w:szCs w:val="22"/>
+        </w:rPr>
+      </w:pPr>
+      <w:r>
+        <w:rPr>
+          <w:sz w:val="22"/>
+          <w:szCs w:val="22"/>
+        </w:rPr>
+        <w:t xml:space="preserve">The larger the distance, the more different the two strings are. </w:t>
+      </w:r>
+      <w:r>
+        <w:rPr>
+          <w:sz w:val="22"/>
+          <w:szCs w:val="22"/>
+        </w:rPr>
+        <w:t xml:space="preserve">Here, each string is compared for how many insertions, deletions and replacements need to occur </w:t>
+      </w:r>
+      <w:r>
+        <w:rPr>
+          <w:sz w:val="22"/>
+          <w:szCs w:val="22"/>
+        </w:rPr>
+        <w:t>to</w:t>
+      </w:r>
+      <w:r>
+        <w:rPr>
+          <w:sz w:val="22"/>
+          <w:szCs w:val="22"/>
+        </w:rPr>
+        <w:t xml:space="preserve"> transform the first string to the second string.</w:t>
+      </w:r>
+    </w:p>
+    <w:p>
+      <w:pPr>
+        <w:rPr>
+          <w:sz w:val="22"/>
+          <w:szCs w:val="22"/>
+        </w:rPr>
+      </w:pPr>
+      <w:r>
+        <w:rPr>
+          <w:sz w:val="22"/>
+          <w:szCs w:val="22"/>
+        </w:rPr>
+        <w:t>The time complexity of this algorithm is O(3</w:t>
+      </w:r>
+      <w:r>
+        <w:rPr>
+          <w:sz w:val="22"/>
+          <w:szCs w:val="22"/>
+          <w:vertAlign w:val="superscript"/>
+        </w:rPr>
+        <w:t>n * m</w:t>
+      </w:r>
+      <w:r>
+        <w:rPr>
+          <w:sz w:val="22"/>
+          <w:szCs w:val="22"/>
+        </w:rPr>
+        <w:t>) where n and m are the lengths of each string. While the space complexity would be O(m + n).</w:t>
       </w:r>
     </w:p>
     <w:p>
       <w:pPr>
         <w:pStyle w:val="Heading2"/>
         <w:rPr>
-          <w:sz w:val="24"/>
-          <w:szCs w:val="18"/>
-        </w:rPr>
-      </w:pPr>
-      <w:r>
-        <w:rPr>
-          <w:sz w:val="24"/>
-          <w:szCs w:val="18"/>
-        </w:rPr>
-        <w:t>1.2.</w:t>
-      </w:r>
-      <w:r>
-        <w:rPr>
-          <w:sz w:val="24"/>
-          <w:szCs w:val="18"/>
-        </w:rPr>
-        <w:t>2</w:t>
-      </w:r>
-      <w:r>
-        <w:rPr>
-          <w:sz w:val="24"/>
-          <w:szCs w:val="18"/>
-        </w:rPr>
-        <w:t xml:space="preserve">  </w:t>
-      </w:r>
-      <w:r>
-        <w:rPr>
-          <w:sz w:val="24"/>
-          <w:szCs w:val="18"/>
-        </w:rPr>
-        <w:t>Optimal String Alignment</w:t>
-      </w:r>
-      <w:r>
-        <w:rPr>
-          <w:sz w:val="24"/>
-          <w:szCs w:val="18"/>
-        </w:rPr>
-        <w:t xml:space="preserve"> Distance</w:t>
-      </w:r>
-    </w:p>
-    <w:p>
-      <w:r>
-        <w:rPr>
-          <w:noProof/>
+          <w:sz w:val="22"/>
+          <w:szCs w:val="22"/>
+        </w:rPr>
+      </w:pPr>
+      <w:r>
+        <w:rPr>
+          <w:sz w:val="22"/>
+          <w:szCs w:val="22"/>
+        </w:rPr>
+        <w:t>1.2.2  Optimal String Alignment Distance</w:t>
+      </w:r>
+    </w:p>
+    <w:p>
+      <w:pPr>
+        <w:jc w:val="center"/>
+        <w:rPr>
+          <w:sz w:val="22"/>
+          <w:szCs w:val="22"/>
+        </w:rPr>
+      </w:pPr>
+      <w:r>
+        <w:rPr>
+          <w:noProof/>
+          <w:sz w:val="22"/>
+          <w:szCs w:val="22"/>
         </w:rPr>
         <w:drawing>
-          <wp:inline distT="0" distB="0" distL="0" distR="0" wp14:anchorId="72EBD1DA" wp14:editId="6712EA36">
-            <wp:extent cx="5695950" cy="2919915"/>
-            <wp:effectExtent l="0" t="0" r="0" b="0"/>
+          <wp:inline distT="0" distB="0" distL="0" distR="0" wp14:anchorId="72EBD1DA" wp14:editId="20E73047">
+            <wp:extent cx="5429250" cy="2783196"/>
+            <wp:effectExtent l="19050" t="19050" r="19050" b="17780"/>
             <wp:docPr id="782275208" name="Picture 1" descr="A screenshot of a computer code&#10;&#10;Description automatically generated"/>
             <wp:cNvGraphicFramePr>
               <a:graphicFrameLocks xmlns:a="http://schemas.openxmlformats.org/drawingml/2006/main" noChangeAspect="1"/>
@@ -4512,7 +4041,7 @@
                     <pic:cNvPicPr/>
                   </pic:nvPicPr>
                   <pic:blipFill>
-                    <a:blip r:embed="rId11"/>
+                    <a:blip r:embed="rId12"/>
                     <a:stretch>
                       <a:fillRect/>
                     </a:stretch>
@@ -4520,11 +4049,16 @@
                   <pic:spPr>
                     <a:xfrm>
                       <a:off x="0" y="0"/>
-                      <a:ext cx="5708689" cy="2926445"/>
+                      <a:ext cx="5445382" cy="2791466"/>
                     </a:xfrm>
                     <a:prstGeom prst="rect">
                       <a:avLst/>
                     </a:prstGeom>
+                    <a:ln>
+                      <a:solidFill>
+                        <a:schemeClr val="tx1"/>
+                      </a:solidFill>
+                    </a:ln>
                   </pic:spPr>
                 </pic:pic>
               </a:graphicData>
@@ -4538,7 +4072,7 @@
         <w:jc w:val="center"/>
         <w:rPr>
           <w:sz w:val="22"/>
-          <w:szCs w:val="18"/>
+          <w:szCs w:val="22"/>
         </w:rPr>
       </w:pPr>
       <w:r>
@@ -4546,32 +4080,23 @@
           <w:b/>
           <w:bCs/>
           <w:sz w:val="22"/>
-          <w:szCs w:val="18"/>
-        </w:rPr>
-        <w:t>Figure 2</w:t>
-      </w:r>
-      <w:r>
-        <w:rPr>
-          <w:b/>
-          <w:bCs/>
-          <w:sz w:val="22"/>
-          <w:szCs w:val="18"/>
-        </w:rPr>
-        <w:t xml:space="preserve">. </w:t>
-      </w:r>
-      <w:r>
-        <w:rPr>
-          <w:sz w:val="22"/>
-          <w:szCs w:val="18"/>
+          <w:szCs w:val="22"/>
+        </w:rPr>
+        <w:t xml:space="preserve">Figure 2. </w:t>
+      </w:r>
+      <w:r>
+        <w:rPr>
+          <w:sz w:val="22"/>
+          <w:szCs w:val="22"/>
         </w:rPr>
         <w:t xml:space="preserve">Optimal String Alignment Algorithm pseudocode (from: </w:t>
       </w:r>
-      <w:hyperlink r:id="rId12" w:history="1">
+      <w:hyperlink r:id="rId13" w:history="1">
         <w:r>
           <w:rPr>
             <w:rStyle w:val="Hyperlink"/>
             <w:sz w:val="22"/>
-            <w:szCs w:val="18"/>
+            <w:szCs w:val="22"/>
           </w:rPr>
           <w:t>https://en.wikipedia.org/wiki/Damerau%E2%80%93Levenshtein_distance</w:t>
         </w:r>
@@ -4579,67 +4104,31 @@
       <w:r>
         <w:rPr>
           <w:sz w:val="22"/>
-          <w:szCs w:val="18"/>
+          <w:szCs w:val="22"/>
         </w:rPr>
         <w:t>)</w:t>
       </w:r>
     </w:p>
     <w:p>
-      <w:r>
+      <w:pPr>
+        <w:rPr>
+          <w:sz w:val="22"/>
+          <w:szCs w:val="22"/>
+        </w:rPr>
+      </w:pPr>
+      <w:r>
+        <w:rPr>
+          <w:sz w:val="22"/>
+          <w:szCs w:val="22"/>
+        </w:rPr>
         <w:t>This algorithm is a step up from the Levenshtein algorithm, in that is allows transpositions to be included into the list of edit operations. This means that the swapping of two adjacent characters in a string.</w:t>
       </w:r>
       <w:r>
-        <w:t xml:space="preserve"> You are however, not allowed to apply multiple transforms to the same substring. As an example: if you had a string “ca” and “</w:t>
-      </w:r>
-      <w:r>
-        <w:t>ab</w:t>
-      </w:r>
-      <w:r>
-        <w:t>c”:</w:t>
-      </w:r>
-    </w:p>
-    <w:p>
-      <w:pPr>
-        <w:pStyle w:val="ListParagraph"/>
-        <w:numPr>
-          <w:ilvl w:val="0"/>
-          <w:numId w:val="26"/>
-        </w:numPr>
-      </w:pPr>
-      <w:r>
-        <w:t>ca -&gt; a</w:t>
-      </w:r>
-      <w:r>
-        <w:t xml:space="preserve"> (deletion)</w:t>
-      </w:r>
-    </w:p>
-    <w:p>
-      <w:pPr>
-        <w:pStyle w:val="ListParagraph"/>
-        <w:numPr>
-          <w:ilvl w:val="0"/>
-          <w:numId w:val="26"/>
-        </w:numPr>
-      </w:pPr>
-      <w:r>
-        <w:t>a -&gt; ab (insertion)</w:t>
-      </w:r>
-    </w:p>
-    <w:p>
-      <w:pPr>
-        <w:pStyle w:val="ListParagraph"/>
-        <w:numPr>
-          <w:ilvl w:val="0"/>
-          <w:numId w:val="26"/>
-        </w:numPr>
-      </w:pPr>
-      <w:r>
-        <w:t>ab -&gt; abc (insertion)</w:t>
-      </w:r>
-    </w:p>
-    <w:p>
-      <w:r>
-        <w:t>which gives a distance of 3.</w:t>
+        <w:rPr>
+          <w:sz w:val="22"/>
+          <w:szCs w:val="22"/>
+        </w:rPr>
+        <w:t xml:space="preserve"> You are however, not allowed to apply multiple transforms to the same substring. </w:t>
       </w:r>
     </w:p>
     <w:p>
@@ -4647,56 +4136,37 @@
         <w:pStyle w:val="Heading2"/>
         <w:ind w:left="0" w:firstLine="0"/>
         <w:rPr>
-          <w:sz w:val="24"/>
-          <w:szCs w:val="18"/>
-        </w:rPr>
-      </w:pPr>
-      <w:r>
-        <w:rPr>
-          <w:sz w:val="24"/>
-          <w:szCs w:val="18"/>
+          <w:sz w:val="22"/>
+          <w:szCs w:val="22"/>
+        </w:rPr>
+      </w:pPr>
+      <w:r>
+        <w:rPr>
+          <w:sz w:val="22"/>
+          <w:szCs w:val="22"/>
         </w:rPr>
         <w:lastRenderedPageBreak/>
-        <w:t>1.2.</w:t>
-      </w:r>
-      <w:r>
-        <w:rPr>
-          <w:sz w:val="24"/>
-          <w:szCs w:val="18"/>
-        </w:rPr>
-        <w:t>3</w:t>
-      </w:r>
-      <w:r>
-        <w:rPr>
-          <w:sz w:val="24"/>
-          <w:szCs w:val="18"/>
-        </w:rPr>
-        <w:t xml:space="preserve">  </w:t>
-      </w:r>
-      <w:r>
-        <w:rPr>
-          <w:sz w:val="24"/>
-          <w:szCs w:val="18"/>
-        </w:rPr>
-        <w:t xml:space="preserve">Damerau </w:t>
-      </w:r>
-      <w:r>
-        <w:rPr>
-          <w:sz w:val="24"/>
-          <w:szCs w:val="18"/>
-        </w:rPr>
-        <w:t>Levenshtein Distance</w:t>
-      </w:r>
-    </w:p>
-    <w:p>
-      <w:r>
-        <w:rPr>
-          <w:noProof/>
+        <w:t>1.2.3  Damerau Levenshtein Distance</w:t>
+      </w:r>
+    </w:p>
+    <w:p>
+      <w:pPr>
+        <w:jc w:val="center"/>
+        <w:rPr>
+          <w:sz w:val="22"/>
+          <w:szCs w:val="22"/>
+        </w:rPr>
+      </w:pPr>
+      <w:r>
+        <w:rPr>
+          <w:noProof/>
+          <w:sz w:val="22"/>
+          <w:szCs w:val="22"/>
         </w:rPr>
         <w:drawing>
-          <wp:inline distT="0" distB="0" distL="0" distR="0" wp14:anchorId="22D33C44" wp14:editId="5255434C">
-            <wp:extent cx="5731510" cy="4362450"/>
-            <wp:effectExtent l="0" t="0" r="2540" b="0"/>
+          <wp:inline distT="0" distB="0" distL="0" distR="0" wp14:anchorId="22D33C44" wp14:editId="23EB44D9">
+            <wp:extent cx="4467225" cy="3400160"/>
+            <wp:effectExtent l="19050" t="19050" r="9525" b="10160"/>
             <wp:docPr id="776109500" name="Picture 1" descr="A screenshot of a computer program&#10;&#10;Description automatically generated"/>
             <wp:cNvGraphicFramePr>
               <a:graphicFrameLocks xmlns:a="http://schemas.openxmlformats.org/drawingml/2006/main" noChangeAspect="1"/>
@@ -4709,7 +4179,7 @@
                     <pic:cNvPicPr/>
                   </pic:nvPicPr>
                   <pic:blipFill>
-                    <a:blip r:embed="rId13"/>
+                    <a:blip r:embed="rId14"/>
                     <a:stretch>
                       <a:fillRect/>
                     </a:stretch>
@@ -4717,11 +4187,16 @@
                   <pic:spPr>
                     <a:xfrm>
                       <a:off x="0" y="0"/>
-                      <a:ext cx="5731510" cy="4362450"/>
+                      <a:ext cx="4490913" cy="3418190"/>
                     </a:xfrm>
                     <a:prstGeom prst="rect">
                       <a:avLst/>
                     </a:prstGeom>
+                    <a:ln>
+                      <a:solidFill>
+                        <a:schemeClr val="tx1"/>
+                      </a:solidFill>
+                    </a:ln>
                   </pic:spPr>
                 </pic:pic>
               </a:graphicData>
@@ -4735,7 +4210,7 @@
         <w:jc w:val="center"/>
         <w:rPr>
           <w:sz w:val="22"/>
-          <w:szCs w:val="18"/>
+          <w:szCs w:val="22"/>
         </w:rPr>
       </w:pPr>
       <w:r>
@@ -4743,501 +4218,1304 @@
           <w:b/>
           <w:bCs/>
           <w:sz w:val="22"/>
-          <w:szCs w:val="18"/>
-        </w:rPr>
-        <w:t>Figure 3.</w:t>
-      </w:r>
+          <w:szCs w:val="22"/>
+        </w:rPr>
+        <w:t xml:space="preserve">Figure 3. </w:t>
+      </w:r>
+      <w:r>
+        <w:rPr>
+          <w:sz w:val="22"/>
+          <w:szCs w:val="22"/>
+        </w:rPr>
+        <w:t>Pseudocode for the Damerau Levenshtein Distance Algorithm</w:t>
+      </w:r>
+      <w:r>
+        <w:rPr>
+          <w:sz w:val="22"/>
+          <w:szCs w:val="22"/>
+        </w:rPr>
+        <w:t xml:space="preserve"> </w:t>
+      </w:r>
+      <w:r>
+        <w:rPr>
+          <w:sz w:val="22"/>
+          <w:szCs w:val="22"/>
+        </w:rPr>
+        <w:t xml:space="preserve">(from: </w:t>
+      </w:r>
+      <w:hyperlink r:id="rId15" w:history="1">
+        <w:r>
+          <w:rPr>
+            <w:rStyle w:val="Hyperlink"/>
+            <w:sz w:val="22"/>
+            <w:szCs w:val="22"/>
+          </w:rPr>
+          <w:t>https://en.wikipedia.org/wiki/Damerau%E2%80%93Levenshtein_distance</w:t>
+        </w:r>
+      </w:hyperlink>
+      <w:r>
+        <w:rPr>
+          <w:sz w:val="22"/>
+          <w:szCs w:val="22"/>
+        </w:rPr>
+        <w:t>)</w:t>
+      </w:r>
+    </w:p>
+    <w:p>
+      <w:pPr>
+        <w:jc w:val="center"/>
+        <w:rPr>
+          <w:sz w:val="22"/>
+          <w:szCs w:val="22"/>
+        </w:rPr>
+      </w:pPr>
+    </w:p>
+    <w:p>
+      <w:pPr>
+        <w:rPr>
+          <w:sz w:val="22"/>
+          <w:szCs w:val="22"/>
+        </w:rPr>
+      </w:pPr>
+      <w:r>
+        <w:rPr>
+          <w:sz w:val="22"/>
+          <w:szCs w:val="22"/>
+        </w:rPr>
+        <w:t>This algorithm is a further advancement on the Optimal String Alignment (OSA) Algorithm, as it fully incorporates the use of transpositions, which can be done on the same substring.</w:t>
+      </w:r>
+    </w:p>
+    <w:p>
+      <w:pPr>
+        <w:pStyle w:val="Heading2"/>
+        <w:rPr>
+          <w:sz w:val="22"/>
+          <w:szCs w:val="22"/>
+        </w:rPr>
+      </w:pPr>
+      <w:r>
+        <w:rPr>
+          <w:sz w:val="22"/>
+          <w:szCs w:val="22"/>
+        </w:rPr>
+        <w:t>1.2.4  Hamming Distance</w:t>
+      </w:r>
+    </w:p>
+    <w:p>
+      <w:pPr>
+        <w:jc w:val="center"/>
+        <w:rPr>
+          <w:sz w:val="22"/>
+          <w:szCs w:val="22"/>
+        </w:rPr>
+      </w:pPr>
+      <w:r>
+        <w:rPr>
+          <w:noProof/>
+          <w:sz w:val="22"/>
+          <w:szCs w:val="22"/>
+        </w:rPr>
+        <w:drawing>
+          <wp:inline distT="0" distB="0" distL="0" distR="0" wp14:anchorId="30F5129B" wp14:editId="198E3F27">
+            <wp:extent cx="4362450" cy="2101477"/>
+            <wp:effectExtent l="19050" t="19050" r="19050" b="13335"/>
+            <wp:docPr id="1390746968" name="Picture 1" descr="A white text with black text&#10;&#10;Description automatically generated with medium confidence"/>
+            <wp:cNvGraphicFramePr>
+              <a:graphicFrameLocks xmlns:a="http://schemas.openxmlformats.org/drawingml/2006/main" noChangeAspect="1"/>
+            </wp:cNvGraphicFramePr>
+            <a:graphic xmlns:a="http://schemas.openxmlformats.org/drawingml/2006/main">
+              <a:graphicData uri="http://schemas.openxmlformats.org/drawingml/2006/picture">
+                <pic:pic xmlns:pic="http://schemas.openxmlformats.org/drawingml/2006/picture">
+                  <pic:nvPicPr>
+                    <pic:cNvPr id="1390746968" name="Picture 1" descr="A white text with black text&#10;&#10;Description automatically generated with medium confidence"/>
+                    <pic:cNvPicPr/>
+                  </pic:nvPicPr>
+                  <pic:blipFill>
+                    <a:blip r:embed="rId16"/>
+                    <a:stretch>
+                      <a:fillRect/>
+                    </a:stretch>
+                  </pic:blipFill>
+                  <pic:spPr>
+                    <a:xfrm>
+                      <a:off x="0" y="0"/>
+                      <a:ext cx="4389849" cy="2114676"/>
+                    </a:xfrm>
+                    <a:prstGeom prst="rect">
+                      <a:avLst/>
+                    </a:prstGeom>
+                    <a:ln>
+                      <a:solidFill>
+                        <a:schemeClr val="tx1"/>
+                      </a:solidFill>
+                    </a:ln>
+                  </pic:spPr>
+                </pic:pic>
+              </a:graphicData>
+            </a:graphic>
+          </wp:inline>
+        </w:drawing>
+      </w:r>
+    </w:p>
+    <w:p>
+      <w:pPr>
+        <w:jc w:val="center"/>
+        <w:rPr>
+          <w:sz w:val="22"/>
+          <w:szCs w:val="22"/>
+        </w:rPr>
+      </w:pPr>
       <w:r>
         <w:rPr>
           <w:b/>
           <w:bCs/>
           <w:sz w:val="22"/>
+          <w:szCs w:val="22"/>
+        </w:rPr>
+        <w:t>Figure 4.</w:t>
+      </w:r>
+      <w:r>
+        <w:rPr>
+          <w:sz w:val="22"/>
+          <w:szCs w:val="22"/>
+        </w:rPr>
+        <w:t xml:space="preserve"> Hamming Distance Algorithm (pseudocode written by me)</w:t>
+      </w:r>
+    </w:p>
+    <w:p>
+      <w:pPr>
+        <w:rPr>
+          <w:sz w:val="22"/>
+          <w:szCs w:val="22"/>
+        </w:rPr>
+      </w:pPr>
+      <w:r>
+        <w:rPr>
+          <w:sz w:val="22"/>
+          <w:szCs w:val="22"/>
+        </w:rPr>
+        <w:t xml:space="preserve">This is the simplest algorithm tested, given that it only works on strings of the same length. This method goes through both words, updating a local count if any characters are different </w:t>
+      </w:r>
+      <w:r>
+        <w:rPr>
+          <w:sz w:val="22"/>
+          <w:szCs w:val="22"/>
+        </w:rPr>
+        <w:lastRenderedPageBreak/>
+        <w:t xml:space="preserve">at a certain index. The final count is the distance between the two strings, where a score of zero means they are identical, while large scores indicate larger divergence. </w:t>
+      </w:r>
+    </w:p>
+    <w:p>
+      <w:pPr>
+        <w:pStyle w:val="Heading2"/>
+        <w:rPr>
+          <w:sz w:val="22"/>
+          <w:szCs w:val="22"/>
+        </w:rPr>
+      </w:pPr>
+      <w:r>
+        <w:rPr>
+          <w:sz w:val="22"/>
+          <w:szCs w:val="22"/>
+        </w:rPr>
+        <w:t>1.2.5  Sørensen–Dice Coefficient</w:t>
+      </w:r>
+    </w:p>
+    <w:p>
+      <w:pPr>
+        <w:jc w:val="center"/>
+        <w:rPr>
+          <w:sz w:val="22"/>
+          <w:szCs w:val="22"/>
+        </w:rPr>
+      </w:pPr>
+      <w:r>
+        <w:rPr>
+          <w:noProof/>
+          <w:sz w:val="22"/>
+          <w:szCs w:val="22"/>
+        </w:rPr>
+        <w:drawing>
+          <wp:inline distT="0" distB="0" distL="0" distR="0" wp14:anchorId="30279F5B" wp14:editId="4130A6EE">
+            <wp:extent cx="3657600" cy="3109284"/>
+            <wp:effectExtent l="19050" t="19050" r="19050" b="15240"/>
+            <wp:docPr id="1450988322" name="Picture 1" descr="A screenshot of a computer program&#10;&#10;Description automatically generated"/>
+            <wp:cNvGraphicFramePr>
+              <a:graphicFrameLocks xmlns:a="http://schemas.openxmlformats.org/drawingml/2006/main" noChangeAspect="1"/>
+            </wp:cNvGraphicFramePr>
+            <a:graphic xmlns:a="http://schemas.openxmlformats.org/drawingml/2006/main">
+              <a:graphicData uri="http://schemas.openxmlformats.org/drawingml/2006/picture">
+                <pic:pic xmlns:pic="http://schemas.openxmlformats.org/drawingml/2006/picture">
+                  <pic:nvPicPr>
+                    <pic:cNvPr id="1450988322" name="Picture 1" descr="A screenshot of a computer program&#10;&#10;Description automatically generated"/>
+                    <pic:cNvPicPr/>
+                  </pic:nvPicPr>
+                  <pic:blipFill>
+                    <a:blip r:embed="rId17"/>
+                    <a:stretch>
+                      <a:fillRect/>
+                    </a:stretch>
+                  </pic:blipFill>
+                  <pic:spPr>
+                    <a:xfrm>
+                      <a:off x="0" y="0"/>
+                      <a:ext cx="3684321" cy="3131999"/>
+                    </a:xfrm>
+                    <a:prstGeom prst="rect">
+                      <a:avLst/>
+                    </a:prstGeom>
+                    <a:ln>
+                      <a:solidFill>
+                        <a:schemeClr val="tx1"/>
+                      </a:solidFill>
+                    </a:ln>
+                  </pic:spPr>
+                </pic:pic>
+              </a:graphicData>
+            </a:graphic>
+          </wp:inline>
+        </w:drawing>
+      </w:r>
+    </w:p>
+    <w:p>
+      <w:pPr>
+        <w:jc w:val="center"/>
+        <w:rPr>
+          <w:sz w:val="22"/>
+          <w:szCs w:val="22"/>
+        </w:rPr>
+      </w:pPr>
+      <w:r>
+        <w:rPr>
+          <w:b/>
+          <w:bCs/>
+          <w:sz w:val="22"/>
+          <w:szCs w:val="22"/>
+        </w:rPr>
+        <w:t>Figure 5.</w:t>
+      </w:r>
+      <w:r>
+        <w:rPr>
+          <w:sz w:val="22"/>
+          <w:szCs w:val="22"/>
+        </w:rPr>
+        <w:t xml:space="preserve"> </w:t>
+      </w:r>
+      <w:r>
+        <w:rPr>
+          <w:sz w:val="22"/>
+          <w:szCs w:val="22"/>
+        </w:rPr>
+        <w:t>Sørensen–Dice</w:t>
+      </w:r>
+      <w:r>
+        <w:rPr>
+          <w:sz w:val="22"/>
+          <w:szCs w:val="22"/>
+        </w:rPr>
+        <w:t xml:space="preserve"> C</w:t>
+      </w:r>
+      <w:r>
+        <w:rPr>
+          <w:sz w:val="22"/>
+          <w:szCs w:val="22"/>
+        </w:rPr>
+        <w:t>oefficient</w:t>
+      </w:r>
+      <w:r>
+        <w:rPr>
+          <w:sz w:val="22"/>
+          <w:szCs w:val="22"/>
+        </w:rPr>
+        <w:t xml:space="preserve"> string algorithm</w:t>
+      </w:r>
+      <w:r>
+        <w:rPr>
+          <w:sz w:val="22"/>
+          <w:szCs w:val="22"/>
+        </w:rPr>
+        <w:t xml:space="preserve"> (pseudocode written by me)</w:t>
+      </w:r>
+    </w:p>
+    <w:p>
+      <w:pPr>
+        <w:spacing w:line="360" w:lineRule="auto"/>
+        <w:rPr>
+          <w:sz w:val="22"/>
+          <w:szCs w:val="22"/>
+        </w:rPr>
+      </w:pPr>
+      <w:r>
+        <w:rPr>
+          <w:sz w:val="22"/>
+          <w:szCs w:val="22"/>
+        </w:rPr>
+        <w:t>This algorithm in a similar vein to Hamming distance. However instead of comparing individual characters, it compares the</w:t>
+      </w:r>
+      <w:r>
+        <w:rPr>
+          <w:sz w:val="22"/>
+          <w:szCs w:val="22"/>
+        </w:rPr>
+        <w:t>ir bigrams instead. Is also differs in that it can handle strings of different lengths. Once the number of similar bigrams is counted, the overall score s of similarity is calculated using the following formula:</w:t>
+      </w:r>
+    </w:p>
+    <w:p>
+      <w:pPr>
+        <w:jc w:val="center"/>
+        <w:rPr>
+          <w:sz w:val="22"/>
+          <w:szCs w:val="22"/>
+        </w:rPr>
+      </w:pPr>
+      <m:oMathPara>
+        <m:oMath>
+          <m:r>
+            <w:rPr>
+              <w:rFonts w:ascii="Cambria Math" w:hAnsi="Cambria Math"/>
+              <w:sz w:val="22"/>
+              <w:szCs w:val="22"/>
+            </w:rPr>
+            <m:t>s=</m:t>
+          </m:r>
+          <m:f>
+            <m:fPr>
+              <m:ctrlPr>
+                <w:rPr>
+                  <w:rFonts w:ascii="Cambria Math" w:hAnsi="Cambria Math"/>
+                  <w:i/>
+                  <w:sz w:val="22"/>
+                  <w:szCs w:val="22"/>
+                </w:rPr>
+              </m:ctrlPr>
+            </m:fPr>
+            <m:num>
+              <m:r>
+                <w:rPr>
+                  <w:rFonts w:ascii="Cambria Math" w:hAnsi="Cambria Math"/>
+                  <w:sz w:val="22"/>
+                  <w:szCs w:val="22"/>
+                </w:rPr>
+                <m:t>2</m:t>
+              </m:r>
+              <m:sSub>
+                <m:sSubPr>
+                  <m:ctrlPr>
+                    <w:rPr>
+                      <w:rFonts w:ascii="Cambria Math" w:hAnsi="Cambria Math"/>
+                      <w:i/>
+                      <w:sz w:val="22"/>
+                      <w:szCs w:val="22"/>
+                    </w:rPr>
+                  </m:ctrlPr>
+                </m:sSubPr>
+                <m:e>
+                  <m:r>
+                    <w:rPr>
+                      <w:rFonts w:ascii="Cambria Math" w:hAnsi="Cambria Math"/>
+                      <w:sz w:val="22"/>
+                      <w:szCs w:val="22"/>
+                    </w:rPr>
+                    <m:t>n</m:t>
+                  </m:r>
+                </m:e>
+                <m:sub>
+                  <m:r>
+                    <w:rPr>
+                      <w:rFonts w:ascii="Cambria Math" w:hAnsi="Cambria Math"/>
+                      <w:sz w:val="22"/>
+                      <w:szCs w:val="22"/>
+                    </w:rPr>
+                    <m:t>t</m:t>
+                  </m:r>
+                </m:sub>
+              </m:sSub>
+            </m:num>
+            <m:den>
+              <m:sSub>
+                <m:sSubPr>
+                  <m:ctrlPr>
+                    <w:rPr>
+                      <w:rFonts w:ascii="Cambria Math" w:hAnsi="Cambria Math"/>
+                      <w:i/>
+                      <w:sz w:val="22"/>
+                      <w:szCs w:val="22"/>
+                    </w:rPr>
+                  </m:ctrlPr>
+                </m:sSubPr>
+                <m:e>
+                  <m:r>
+                    <w:rPr>
+                      <w:rFonts w:ascii="Cambria Math" w:hAnsi="Cambria Math"/>
+                      <w:sz w:val="22"/>
+                      <w:szCs w:val="22"/>
+                    </w:rPr>
+                    <m:t>n</m:t>
+                  </m:r>
+                </m:e>
+                <m:sub>
+                  <m:r>
+                    <w:rPr>
+                      <w:rFonts w:ascii="Cambria Math" w:hAnsi="Cambria Math"/>
+                      <w:sz w:val="22"/>
+                      <w:szCs w:val="22"/>
+                    </w:rPr>
+                    <m:t>a</m:t>
+                  </m:r>
+                </m:sub>
+              </m:sSub>
+              <m:r>
+                <w:rPr>
+                  <w:rFonts w:ascii="Cambria Math" w:hAnsi="Cambria Math"/>
+                  <w:sz w:val="22"/>
+                  <w:szCs w:val="22"/>
+                </w:rPr>
+                <m:t>+</m:t>
+              </m:r>
+              <m:sSub>
+                <m:sSubPr>
+                  <m:ctrlPr>
+                    <w:rPr>
+                      <w:rFonts w:ascii="Cambria Math" w:hAnsi="Cambria Math"/>
+                      <w:i/>
+                      <w:sz w:val="22"/>
+                      <w:szCs w:val="22"/>
+                    </w:rPr>
+                  </m:ctrlPr>
+                </m:sSubPr>
+                <m:e>
+                  <m:r>
+                    <w:rPr>
+                      <w:rFonts w:ascii="Cambria Math" w:hAnsi="Cambria Math"/>
+                      <w:sz w:val="22"/>
+                      <w:szCs w:val="22"/>
+                    </w:rPr>
+                    <m:t>n</m:t>
+                  </m:r>
+                </m:e>
+                <m:sub>
+                  <m:r>
+                    <w:rPr>
+                      <w:rFonts w:ascii="Cambria Math" w:hAnsi="Cambria Math"/>
+                      <w:sz w:val="22"/>
+                      <w:szCs w:val="22"/>
+                    </w:rPr>
+                    <m:t>b</m:t>
+                  </m:r>
+                </m:sub>
+              </m:sSub>
+            </m:den>
+          </m:f>
+        </m:oMath>
+      </m:oMathPara>
+    </w:p>
+    <w:p>
+      <w:pPr>
+        <w:rPr>
+          <w:sz w:val="22"/>
+          <w:szCs w:val="22"/>
+        </w:rPr>
+      </w:pPr>
+      <w:r>
+        <w:rPr>
+          <w:sz w:val="22"/>
+          <w:szCs w:val="22"/>
+        </w:rPr>
+        <w:t xml:space="preserve">Where  </w:t>
+      </w:r>
+      <m:oMath>
+        <m:sSub>
+          <m:sSubPr>
+            <m:ctrlPr>
+              <w:rPr>
+                <w:rFonts w:ascii="Cambria Math" w:hAnsi="Cambria Math"/>
+                <w:i/>
+                <w:sz w:val="22"/>
+                <w:szCs w:val="22"/>
+              </w:rPr>
+            </m:ctrlPr>
+          </m:sSubPr>
+          <m:e>
+            <m:r>
+              <w:rPr>
+                <w:rFonts w:ascii="Cambria Math" w:hAnsi="Cambria Math"/>
+                <w:sz w:val="22"/>
+                <w:szCs w:val="22"/>
+              </w:rPr>
+              <m:t>n</m:t>
+            </m:r>
+          </m:e>
+          <m:sub>
+            <m:r>
+              <w:rPr>
+                <w:rFonts w:ascii="Cambria Math" w:hAnsi="Cambria Math"/>
+                <w:sz w:val="22"/>
+                <w:szCs w:val="22"/>
+              </w:rPr>
+              <m:t>t</m:t>
+            </m:r>
+          </m:sub>
+        </m:sSub>
+      </m:oMath>
+      <w:r>
+        <w:rPr>
+          <w:sz w:val="22"/>
+          <w:szCs w:val="22"/>
+        </w:rPr>
+        <w:t xml:space="preserve"> is the is the number of bigrams found in both strings, </w:t>
+      </w:r>
+      <m:oMath>
+        <m:sSub>
+          <m:sSubPr>
+            <m:ctrlPr>
+              <w:rPr>
+                <w:rFonts w:ascii="Cambria Math" w:hAnsi="Cambria Math"/>
+                <w:i/>
+                <w:sz w:val="22"/>
+                <w:szCs w:val="22"/>
+              </w:rPr>
+            </m:ctrlPr>
+          </m:sSubPr>
+          <m:e>
+            <m:r>
+              <w:rPr>
+                <w:rFonts w:ascii="Cambria Math" w:hAnsi="Cambria Math"/>
+                <w:sz w:val="22"/>
+                <w:szCs w:val="22"/>
+              </w:rPr>
+              <m:t>n</m:t>
+            </m:r>
+          </m:e>
+          <m:sub>
+            <m:r>
+              <w:rPr>
+                <w:rFonts w:ascii="Cambria Math" w:hAnsi="Cambria Math"/>
+                <w:sz w:val="22"/>
+                <w:szCs w:val="22"/>
+              </w:rPr>
+              <m:t>a</m:t>
+            </m:r>
+          </m:sub>
+        </m:sSub>
+      </m:oMath>
+      <w:r>
+        <w:rPr>
+          <w:sz w:val="22"/>
+          <w:szCs w:val="22"/>
+        </w:rPr>
+        <w:t xml:space="preserve"> is the number of bigrams in string a, and </w:t>
+      </w:r>
+      <m:oMath>
+        <m:sSub>
+          <m:sSubPr>
+            <m:ctrlPr>
+              <w:rPr>
+                <w:rFonts w:ascii="Cambria Math" w:hAnsi="Cambria Math"/>
+                <w:i/>
+                <w:sz w:val="22"/>
+                <w:szCs w:val="22"/>
+              </w:rPr>
+            </m:ctrlPr>
+          </m:sSubPr>
+          <m:e>
+            <m:r>
+              <w:rPr>
+                <w:rFonts w:ascii="Cambria Math" w:hAnsi="Cambria Math"/>
+                <w:sz w:val="22"/>
+                <w:szCs w:val="22"/>
+              </w:rPr>
+              <m:t>n</m:t>
+            </m:r>
+          </m:e>
+          <m:sub>
+            <m:r>
+              <w:rPr>
+                <w:rFonts w:ascii="Cambria Math" w:hAnsi="Cambria Math"/>
+                <w:sz w:val="22"/>
+                <w:szCs w:val="22"/>
+              </w:rPr>
+              <m:t>b</m:t>
+            </m:r>
+          </m:sub>
+        </m:sSub>
+      </m:oMath>
+      <w:r>
+        <w:rPr>
+          <w:sz w:val="22"/>
+          <w:szCs w:val="22"/>
+        </w:rPr>
+        <w:t>is the number of bigrams in string b.</w:t>
+      </w:r>
+    </w:p>
+    <w:p>
+      <w:pPr>
+        <w:rPr>
+          <w:sz w:val="22"/>
+          <w:szCs w:val="22"/>
+        </w:rPr>
+      </w:pPr>
+      <w:r>
+        <w:rPr>
+          <w:sz w:val="22"/>
+          <w:szCs w:val="22"/>
+        </w:rPr>
+        <w:t xml:space="preserve">This method means values are of the set [0, 1], where the more similar two strings are, the closer the coefficient </w:t>
+      </w:r>
+      <w:r>
+        <w:rPr>
+          <w:sz w:val="22"/>
+          <w:szCs w:val="22"/>
+        </w:rPr>
+        <w:t>returned is to 1</w:t>
+      </w:r>
+      <w:r>
+        <w:rPr>
+          <w:sz w:val="22"/>
+          <w:szCs w:val="22"/>
+        </w:rPr>
+        <w:t>.</w:t>
+      </w:r>
+    </w:p>
+    <w:p>
+      <w:pPr>
+        <w:pStyle w:val="Heading2"/>
+        <w:rPr>
+          <w:sz w:val="22"/>
+          <w:szCs w:val="22"/>
+        </w:rPr>
+      </w:pPr>
+      <w:r>
+        <w:rPr>
+          <w:sz w:val="22"/>
+          <w:szCs w:val="22"/>
+        </w:rPr>
+        <w:lastRenderedPageBreak/>
+        <w:t>1.2.4  Jaro Distance</w:t>
+      </w:r>
+    </w:p>
+    <w:p>
+      <w:pPr>
+        <w:jc w:val="center"/>
+        <w:rPr>
+          <w:sz w:val="22"/>
+          <w:szCs w:val="22"/>
+        </w:rPr>
+      </w:pPr>
+      <w:r>
+        <w:rPr>
+          <w:noProof/>
+          <w:sz w:val="22"/>
+          <w:szCs w:val="22"/>
+        </w:rPr>
+        <w:drawing>
+          <wp:inline distT="0" distB="0" distL="0" distR="0" wp14:anchorId="72F62D6F" wp14:editId="0C634469">
+            <wp:extent cx="4038600" cy="4563002"/>
+            <wp:effectExtent l="19050" t="19050" r="19050" b="28575"/>
+            <wp:docPr id="936243345" name="Picture 1" descr="A screenshot of a computer code&#10;&#10;Description automatically generated"/>
+            <wp:cNvGraphicFramePr>
+              <a:graphicFrameLocks xmlns:a="http://schemas.openxmlformats.org/drawingml/2006/main" noChangeAspect="1"/>
+            </wp:cNvGraphicFramePr>
+            <a:graphic xmlns:a="http://schemas.openxmlformats.org/drawingml/2006/main">
+              <a:graphicData uri="http://schemas.openxmlformats.org/drawingml/2006/picture">
+                <pic:pic xmlns:pic="http://schemas.openxmlformats.org/drawingml/2006/picture">
+                  <pic:nvPicPr>
+                    <pic:cNvPr id="936243345" name="Picture 1" descr="A screenshot of a computer code&#10;&#10;Description automatically generated"/>
+                    <pic:cNvPicPr/>
+                  </pic:nvPicPr>
+                  <pic:blipFill>
+                    <a:blip r:embed="rId18"/>
+                    <a:stretch>
+                      <a:fillRect/>
+                    </a:stretch>
+                  </pic:blipFill>
+                  <pic:spPr>
+                    <a:xfrm>
+                      <a:off x="0" y="0"/>
+                      <a:ext cx="4053465" cy="4579797"/>
+                    </a:xfrm>
+                    <a:prstGeom prst="rect">
+                      <a:avLst/>
+                    </a:prstGeom>
+                    <a:ln>
+                      <a:solidFill>
+                        <a:schemeClr val="tx1"/>
+                      </a:solidFill>
+                    </a:ln>
+                  </pic:spPr>
+                </pic:pic>
+              </a:graphicData>
+            </a:graphic>
+          </wp:inline>
+        </w:drawing>
+      </w:r>
+    </w:p>
+    <w:p>
+      <w:pPr>
+        <w:jc w:val="center"/>
+        <w:rPr>
+          <w:sz w:val="22"/>
+          <w:szCs w:val="22"/>
+        </w:rPr>
+      </w:pPr>
+      <w:r>
+        <w:rPr>
+          <w:b/>
+          <w:bCs/>
+          <w:sz w:val="22"/>
+          <w:szCs w:val="22"/>
+        </w:rPr>
+        <w:t>Figure 6.</w:t>
+      </w:r>
+      <w:r>
+        <w:rPr>
+          <w:sz w:val="22"/>
+          <w:szCs w:val="22"/>
+        </w:rPr>
+        <w:t xml:space="preserve"> Jaro Distance algorithm (pseudocode adapted from: </w:t>
+      </w:r>
+      <w:hyperlink r:id="rId19" w:history="1">
+        <w:r>
+          <w:rPr>
+            <w:rStyle w:val="Hyperlink"/>
+            <w:sz w:val="22"/>
+            <w:szCs w:val="22"/>
+          </w:rPr>
+          <w:t>https://www.geeksforgeeks.org/jaro-and-jaro-winkler-similarity/</w:t>
+        </w:r>
+      </w:hyperlink>
+      <w:r>
+        <w:rPr>
+          <w:sz w:val="22"/>
+          <w:szCs w:val="22"/>
+        </w:rPr>
+        <w:t xml:space="preserve"> )</w:t>
+      </w:r>
+    </w:p>
+    <w:p>
+      <w:pPr>
+        <w:rPr>
+          <w:sz w:val="22"/>
+          <w:szCs w:val="22"/>
+        </w:rPr>
+      </w:pPr>
+      <w:r>
+        <w:rPr>
+          <w:sz w:val="22"/>
+          <w:szCs w:val="22"/>
+        </w:rPr>
+        <w:t xml:space="preserve">Like the </w:t>
+      </w:r>
+      <w:r>
+        <w:rPr>
+          <w:sz w:val="22"/>
+          <w:szCs w:val="22"/>
+        </w:rPr>
+        <w:t>Sørensen–Dice Coefficient</w:t>
+      </w:r>
+      <w:r>
+        <w:rPr>
+          <w:sz w:val="22"/>
+          <w:szCs w:val="22"/>
+        </w:rPr>
+        <w:t xml:space="preserve"> algorithm, Jaro distance scores strings on a scale of 0 to 1, where the more similar the words are, the closer the final value is to 1.</w:t>
+      </w:r>
+      <w:r>
+        <w:rPr>
+          <w:sz w:val="22"/>
+          <w:szCs w:val="22"/>
+        </w:rPr>
+        <w:t xml:space="preserve">  </w:t>
+      </w:r>
+    </w:p>
+    <w:p>
+      <w:pPr>
+        <w:pStyle w:val="Heading2"/>
+        <w:rPr>
+          <w:sz w:val="22"/>
+          <w:szCs w:val="22"/>
+        </w:rPr>
+      </w:pPr>
+      <w:r>
+        <w:rPr>
+          <w:sz w:val="22"/>
+          <w:szCs w:val="22"/>
+        </w:rPr>
+        <w:lastRenderedPageBreak/>
+        <w:t>1.2.4  Jaro-Winkler Distance</w:t>
+      </w:r>
+    </w:p>
+    <w:p>
+      <w:pPr>
+        <w:jc w:val="center"/>
+        <w:rPr>
+          <w:sz w:val="22"/>
+          <w:szCs w:val="22"/>
+        </w:rPr>
+      </w:pPr>
+      <w:r>
+        <w:rPr>
+          <w:noProof/>
+          <w:sz w:val="22"/>
+          <w:szCs w:val="22"/>
+        </w:rPr>
+        <w:drawing>
+          <wp:inline distT="0" distB="0" distL="0" distR="0" wp14:anchorId="79F8C32A" wp14:editId="3F21632A">
+            <wp:extent cx="3834516" cy="3124200"/>
+            <wp:effectExtent l="19050" t="19050" r="13970" b="19050"/>
+            <wp:docPr id="1925768505" name="Picture 1" descr="A screenshot of a computer code&#10;&#10;Description automatically generated"/>
+            <wp:cNvGraphicFramePr>
+              <a:graphicFrameLocks xmlns:a="http://schemas.openxmlformats.org/drawingml/2006/main" noChangeAspect="1"/>
+            </wp:cNvGraphicFramePr>
+            <a:graphic xmlns:a="http://schemas.openxmlformats.org/drawingml/2006/main">
+              <a:graphicData uri="http://schemas.openxmlformats.org/drawingml/2006/picture">
+                <pic:pic xmlns:pic="http://schemas.openxmlformats.org/drawingml/2006/picture">
+                  <pic:nvPicPr>
+                    <pic:cNvPr id="1925768505" name="Picture 1" descr="A screenshot of a computer code&#10;&#10;Description automatically generated"/>
+                    <pic:cNvPicPr/>
+                  </pic:nvPicPr>
+                  <pic:blipFill>
+                    <a:blip r:embed="rId20"/>
+                    <a:stretch>
+                      <a:fillRect/>
+                    </a:stretch>
+                  </pic:blipFill>
+                  <pic:spPr>
+                    <a:xfrm>
+                      <a:off x="0" y="0"/>
+                      <a:ext cx="3838332" cy="3127309"/>
+                    </a:xfrm>
+                    <a:prstGeom prst="rect">
+                      <a:avLst/>
+                    </a:prstGeom>
+                    <a:ln>
+                      <a:solidFill>
+                        <a:schemeClr val="tx1"/>
+                      </a:solidFill>
+                    </a:ln>
+                  </pic:spPr>
+                </pic:pic>
+              </a:graphicData>
+            </a:graphic>
+          </wp:inline>
+        </w:drawing>
+      </w:r>
+    </w:p>
+    <w:p>
+      <w:pPr>
+        <w:jc w:val="center"/>
+        <w:rPr>
+          <w:sz w:val="22"/>
+          <w:szCs w:val="22"/>
+        </w:rPr>
+      </w:pPr>
+      <w:r>
+        <w:rPr>
+          <w:b/>
+          <w:bCs/>
+          <w:sz w:val="22"/>
+          <w:szCs w:val="22"/>
+        </w:rPr>
+        <w:t xml:space="preserve">Figure </w:t>
+      </w:r>
+      <w:r>
+        <w:rPr>
+          <w:b/>
+          <w:bCs/>
+          <w:sz w:val="22"/>
+          <w:szCs w:val="22"/>
+        </w:rPr>
+        <w:t>7</w:t>
+      </w:r>
+      <w:r>
+        <w:rPr>
+          <w:b/>
+          <w:bCs/>
+          <w:sz w:val="22"/>
+          <w:szCs w:val="22"/>
+        </w:rPr>
+        <w:t>.</w:t>
+      </w:r>
+      <w:r>
+        <w:rPr>
+          <w:sz w:val="22"/>
+          <w:szCs w:val="22"/>
+        </w:rPr>
+        <w:t xml:space="preserve"> Jaro</w:t>
+      </w:r>
+      <w:r>
+        <w:rPr>
+          <w:sz w:val="22"/>
+          <w:szCs w:val="22"/>
+        </w:rPr>
+        <w:t>-Winkler</w:t>
+      </w:r>
+      <w:r>
+        <w:rPr>
+          <w:sz w:val="22"/>
+          <w:szCs w:val="22"/>
+        </w:rPr>
+        <w:t xml:space="preserve"> Distance algorithm (pseudocode adapted from: </w:t>
+      </w:r>
+      <w:hyperlink r:id="rId21" w:history="1">
+        <w:r>
+          <w:rPr>
+            <w:rStyle w:val="Hyperlink"/>
+            <w:sz w:val="22"/>
+            <w:szCs w:val="22"/>
+          </w:rPr>
+          <w:t>https://www.geeksforgeeks.org/jaro-and-jaro-winkler-similarity/</w:t>
+        </w:r>
+      </w:hyperlink>
+      <w:r>
+        <w:rPr>
+          <w:sz w:val="22"/>
+          <w:szCs w:val="22"/>
+        </w:rPr>
+        <w:t xml:space="preserve"> )</w:t>
+      </w:r>
+    </w:p>
+    <w:p>
+      <w:pPr>
+        <w:jc w:val="center"/>
+        <w:rPr>
+          <w:sz w:val="22"/>
+          <w:szCs w:val="22"/>
+        </w:rPr>
+      </w:pPr>
+    </w:p>
+    <w:p>
+      <w:pPr>
+        <w:pStyle w:val="Heading2"/>
+        <w:rPr>
+          <w:sz w:val="22"/>
+          <w:szCs w:val="22"/>
+        </w:rPr>
+      </w:pPr>
+      <w:r>
+        <w:rPr>
+          <w:sz w:val="22"/>
+          <w:szCs w:val="22"/>
+        </w:rPr>
+        <w:t xml:space="preserve">1.3  Overview of search methods </w:t>
+      </w:r>
+    </w:p>
+    <w:p>
+      <w:pPr>
+        <w:rPr>
+          <w:sz w:val="22"/>
+          <w:szCs w:val="22"/>
+        </w:rPr>
+      </w:pPr>
+      <w:r>
+        <w:rPr>
+          <w:sz w:val="22"/>
+          <w:szCs w:val="22"/>
+        </w:rPr>
+        <w:t>To search for certain words in the program, a search method must be used. These methods also depend on how the words are organised as to how they could be extracted and exploited for greater performance and reduce wasted time on checking redundant strings.</w:t>
+      </w:r>
+    </w:p>
+    <w:p>
+      <w:pPr>
+        <w:pStyle w:val="Heading2"/>
+        <w:rPr>
+          <w:sz w:val="22"/>
+          <w:szCs w:val="22"/>
+        </w:rPr>
+      </w:pPr>
+      <w:r>
+        <w:rPr>
+          <w:sz w:val="22"/>
+          <w:szCs w:val="22"/>
+        </w:rPr>
+        <w:t>1.3.1  Linear Search</w:t>
+      </w:r>
+    </w:p>
+    <w:p>
+      <w:pPr>
+        <w:rPr>
+          <w:sz w:val="22"/>
+          <w:szCs w:val="22"/>
+        </w:rPr>
+      </w:pPr>
+      <w:r>
+        <w:rPr>
+          <w:sz w:val="22"/>
+          <w:szCs w:val="22"/>
+        </w:rPr>
+        <w:t xml:space="preserve">The most basic approach for checking if a user’s word matches a word in the system is by using a linear search method. </w:t>
+      </w:r>
+    </w:p>
+    <w:p>
+      <w:pPr>
+        <w:rPr>
+          <w:sz w:val="22"/>
+          <w:szCs w:val="22"/>
+        </w:rPr>
+      </w:pPr>
+      <w:r>
+        <w:rPr>
+          <w:sz w:val="22"/>
+          <w:szCs w:val="22"/>
+        </w:rPr>
+        <w:t>In this system, words would be organised into a long 1-dimensional array. Then, when a word needs to be checked if it exists in the array, each item would be looked at from the first index, till either it is found, or the end of the array is reached.</w:t>
+      </w:r>
+    </w:p>
+    <w:p>
+      <w:pPr>
+        <w:rPr>
+          <w:sz w:val="22"/>
+          <w:szCs w:val="22"/>
+        </w:rPr>
+      </w:pPr>
+      <w:r>
+        <w:rPr>
+          <w:sz w:val="22"/>
+          <w:szCs w:val="22"/>
+        </w:rPr>
+        <w:t>This gives a</w:t>
+      </w:r>
+      <w:r>
+        <w:rPr>
+          <w:sz w:val="22"/>
+          <w:szCs w:val="22"/>
+        </w:rPr>
+        <w:t>n average</w:t>
+      </w:r>
+      <w:r>
+        <w:rPr>
+          <w:sz w:val="22"/>
+          <w:szCs w:val="22"/>
+        </w:rPr>
+        <w:t xml:space="preserve"> runtime of O(n) where n is the number of words in the array.</w:t>
+      </w:r>
+    </w:p>
+    <w:p>
+      <w:pPr>
+        <w:pStyle w:val="Heading2"/>
+        <w:rPr>
+          <w:sz w:val="22"/>
+          <w:szCs w:val="22"/>
+        </w:rPr>
+      </w:pPr>
+      <w:r>
+        <w:rPr>
+          <w:sz w:val="22"/>
+          <w:szCs w:val="22"/>
+        </w:rPr>
+        <w:lastRenderedPageBreak/>
+        <w:t>1.3.1  Binary Search</w:t>
+      </w:r>
+    </w:p>
+    <w:p>
+      <w:pPr>
+        <w:rPr>
+          <w:sz w:val="22"/>
+          <w:szCs w:val="22"/>
+        </w:rPr>
+      </w:pPr>
+      <w:r>
+        <w:rPr>
+          <w:sz w:val="22"/>
+          <w:szCs w:val="22"/>
+        </w:rPr>
+        <w:t xml:space="preserve">Another approach to searching is with the binary search. This method works the same with linear search, in that it requires the words to be organised in a long 1-dimensional array. However, for the method to work it would require the array to be sorted in alphabetical order. </w:t>
+      </w:r>
+    </w:p>
+    <w:p>
+      <w:pPr>
+        <w:rPr>
+          <w:sz w:val="22"/>
+          <w:szCs w:val="22"/>
+        </w:rPr>
+      </w:pPr>
+      <w:r>
+        <w:rPr>
+          <w:sz w:val="22"/>
+          <w:szCs w:val="22"/>
+        </w:rPr>
+        <w:t>W</w:t>
+      </w:r>
+      <w:r>
+        <w:rPr>
+          <w:sz w:val="22"/>
+          <w:szCs w:val="22"/>
+        </w:rPr>
+        <w:t>hen a u</w:t>
+      </w:r>
+      <w:r>
+        <w:rPr>
+          <w:sz w:val="22"/>
+          <w:szCs w:val="22"/>
+        </w:rPr>
+        <w:t>ser entered word needs to be checked, the string at the middle index of the array is examined. If the string doesn’t match, then the half of the array the word is unlikely to be in is discarded, and the process is repeated until either the word is found, or an end clause is reached.</w:t>
+      </w:r>
+    </w:p>
+    <w:p>
+      <w:pPr>
+        <w:rPr>
+          <w:sz w:val="22"/>
+          <w:szCs w:val="22"/>
+        </w:rPr>
+      </w:pPr>
+      <w:r>
+        <w:rPr>
+          <w:sz w:val="22"/>
+          <w:szCs w:val="22"/>
+        </w:rPr>
+        <w:t>This gives a</w:t>
+      </w:r>
+      <w:r>
+        <w:rPr>
+          <w:sz w:val="22"/>
+          <w:szCs w:val="22"/>
+        </w:rPr>
+        <w:t>n average</w:t>
+      </w:r>
+      <w:r>
+        <w:rPr>
+          <w:sz w:val="22"/>
+          <w:szCs w:val="22"/>
+        </w:rPr>
+        <w:t xml:space="preserve"> runtime of O(log n) where n is the number of words in the array.</w:t>
+      </w:r>
+    </w:p>
+    <w:p>
+      <w:pPr>
+        <w:pStyle w:val="Heading2"/>
+        <w:rPr>
+          <w:sz w:val="22"/>
+          <w:szCs w:val="16"/>
+        </w:rPr>
+      </w:pPr>
+      <w:r>
+        <w:rPr>
+          <w:sz w:val="22"/>
+          <w:szCs w:val="16"/>
+        </w:rPr>
+        <w:t>1.3.1  Hash Tables and Linked Lists</w:t>
+      </w:r>
+    </w:p>
+    <w:p>
+      <w:pPr>
+        <w:rPr>
+          <w:sz w:val="22"/>
           <w:szCs w:val="18"/>
         </w:rPr>
+      </w:pPr>
+      <w:r>
+        <w:rPr>
+          <w:sz w:val="22"/>
+          <w:szCs w:val="18"/>
+        </w:rPr>
+        <w:t xml:space="preserve">The final approach to searching is with the use of hash tables and linked lists. This method works by organising the words into a hash table, where each string would be used to calculate a hash value, which would then be used as the index for where to store the word. If there is the case that there is a clash and two words would be put in the same spot, then a linked list would be used, which would be organised </w:t>
+      </w:r>
+      <w:r>
+        <w:rPr>
+          <w:sz w:val="22"/>
+          <w:szCs w:val="18"/>
+        </w:rPr>
+        <w:t>like</w:t>
+      </w:r>
+      <w:r>
+        <w:rPr>
+          <w:sz w:val="22"/>
+          <w:szCs w:val="18"/>
+        </w:rPr>
+        <w:t xml:space="preserve"> an array that the other search methods used.</w:t>
+      </w:r>
+    </w:p>
+    <w:p>
+      <w:pPr>
+        <w:rPr>
+          <w:sz w:val="22"/>
+          <w:szCs w:val="18"/>
+        </w:rPr>
+      </w:pPr>
+      <w:r>
+        <w:rPr>
+          <w:sz w:val="22"/>
+          <w:szCs w:val="18"/>
+        </w:rPr>
+        <w:t>The benefits of this are that it gives a best-case scenario runtime of O(1), however depending on how well the hash table is organised and how many words congregate in one linked list, it could give a worst-case scenario runtime of O(n) where n is the number of words in the array.</w:t>
+      </w:r>
+    </w:p>
+    <w:p>
+      <w:pPr>
+        <w:pStyle w:val="Heading2"/>
+      </w:pPr>
+      <w:bookmarkStart w:id="6" w:name="_Toc407145092"/>
+      <w:r>
+        <w:t>1.</w:t>
+      </w:r>
+      <w:r>
+        <w:t>4</w:t>
+      </w:r>
+      <w:r>
+        <w:t xml:space="preserve">  </w:t>
+      </w:r>
+      <w:bookmarkEnd w:id="6"/>
+      <w:r>
+        <w:t>Literature Review</w:t>
+      </w:r>
+      <w:r>
         <w:t xml:space="preserve"> </w:t>
       </w:r>
-      <w:r>
-        <w:rPr>
-          <w:sz w:val="22"/>
-          <w:szCs w:val="18"/>
-        </w:rPr>
-        <w:t>Pseudocode for the Damerau Levenshtein Distance Algorithm</w:t>
-      </w:r>
-    </w:p>
-    <w:p>
-      <w:r>
-        <w:t>This algorithm is a further advancement on the Optimal String Alignment (OSA) Algorithm, as it fully incorporates the use of transpositions, which can be done on the same substring.</w:t>
-      </w:r>
-    </w:p>
-    <w:p>
-      <w:r>
-        <w:t>Using the same example as with OSA with strings “ca” and “abc”:</w:t>
-      </w:r>
-    </w:p>
-    <w:p>
-      <w:pPr>
-        <w:pStyle w:val="ListParagraph"/>
-        <w:numPr>
-          <w:ilvl w:val="0"/>
-          <w:numId w:val="27"/>
-        </w:numPr>
-      </w:pPr>
-      <w:r>
-        <w:t>ca - &gt; ac (transposition)</w:t>
-      </w:r>
-    </w:p>
-    <w:p>
-      <w:pPr>
-        <w:pStyle w:val="ListParagraph"/>
-        <w:numPr>
-          <w:ilvl w:val="0"/>
-          <w:numId w:val="27"/>
-        </w:numPr>
-      </w:pPr>
-      <w:r>
-        <w:t>ac -&gt; abc (insertion)</w:t>
-      </w:r>
-    </w:p>
-    <w:p>
-      <w:r>
-        <w:t>Which gives a distance of 2.</w:t>
-      </w:r>
-    </w:p>
-    <w:p>
-      <w:pPr>
-        <w:pStyle w:val="Heading2"/>
-        <w:rPr>
-          <w:sz w:val="24"/>
-          <w:szCs w:val="18"/>
-        </w:rPr>
-      </w:pPr>
-      <w:r>
-        <w:rPr>
-          <w:sz w:val="24"/>
-          <w:szCs w:val="18"/>
-        </w:rPr>
-        <w:t>1.2.</w:t>
-      </w:r>
-      <w:r>
-        <w:rPr>
-          <w:sz w:val="24"/>
-          <w:szCs w:val="18"/>
-        </w:rPr>
-        <w:t>4</w:t>
-      </w:r>
-      <w:r>
-        <w:rPr>
-          <w:sz w:val="24"/>
-          <w:szCs w:val="18"/>
-        </w:rPr>
-        <w:t xml:space="preserve">  </w:t>
-      </w:r>
-      <w:r>
-        <w:rPr>
-          <w:sz w:val="24"/>
-          <w:szCs w:val="18"/>
-        </w:rPr>
-        <w:t>Hamming</w:t>
-      </w:r>
-      <w:r>
-        <w:rPr>
-          <w:sz w:val="24"/>
-          <w:szCs w:val="18"/>
-        </w:rPr>
-        <w:t xml:space="preserve"> Distance</w:t>
-      </w:r>
-    </w:p>
-    <w:p/>
-    <w:p>
-      <w:pPr>
-        <w:pStyle w:val="Heading2"/>
-        <w:rPr>
-          <w:sz w:val="24"/>
-          <w:szCs w:val="18"/>
-        </w:rPr>
-      </w:pPr>
-      <w:r>
-        <w:rPr>
-          <w:sz w:val="24"/>
-          <w:szCs w:val="18"/>
-        </w:rPr>
-        <w:t>1.2.</w:t>
-      </w:r>
-      <w:r>
-        <w:rPr>
-          <w:sz w:val="24"/>
-          <w:szCs w:val="18"/>
-        </w:rPr>
-        <w:t>5</w:t>
-      </w:r>
-      <w:r>
-        <w:rPr>
-          <w:sz w:val="24"/>
-          <w:szCs w:val="18"/>
-        </w:rPr>
-        <w:t xml:space="preserve">  </w:t>
-      </w:r>
-      <w:r>
-        <w:rPr>
-          <w:sz w:val="24"/>
-          <w:szCs w:val="18"/>
-        </w:rPr>
-        <w:t>Sørensen–Dice Coefficient</w:t>
-      </w:r>
-    </w:p>
-    <w:p/>
-    <w:p>
-      <w:pPr>
-        <w:pStyle w:val="Heading2"/>
-        <w:rPr>
-          <w:sz w:val="24"/>
-          <w:szCs w:val="18"/>
-        </w:rPr>
-      </w:pPr>
-      <w:r>
-        <w:rPr>
-          <w:sz w:val="24"/>
-          <w:szCs w:val="18"/>
-        </w:rPr>
-        <w:lastRenderedPageBreak/>
-        <w:t>1.2.</w:t>
-      </w:r>
-      <w:r>
-        <w:rPr>
-          <w:sz w:val="24"/>
-          <w:szCs w:val="18"/>
-        </w:rPr>
-        <w:t>4</w:t>
-      </w:r>
-      <w:r>
-        <w:rPr>
-          <w:sz w:val="24"/>
-          <w:szCs w:val="18"/>
-        </w:rPr>
-        <w:t xml:space="preserve">  </w:t>
-      </w:r>
-      <w:r>
-        <w:rPr>
-          <w:sz w:val="24"/>
-          <w:szCs w:val="18"/>
-        </w:rPr>
-        <w:t>Jaro</w:t>
-      </w:r>
-      <w:r>
-        <w:rPr>
-          <w:sz w:val="24"/>
-          <w:szCs w:val="18"/>
-        </w:rPr>
-        <w:t xml:space="preserve"> Distance</w:t>
-      </w:r>
-    </w:p>
-    <w:p/>
-    <w:p>
-      <w:pPr>
-        <w:pStyle w:val="Heading2"/>
-        <w:rPr>
-          <w:sz w:val="24"/>
-          <w:szCs w:val="18"/>
-        </w:rPr>
-      </w:pPr>
-      <w:r>
-        <w:rPr>
-          <w:sz w:val="24"/>
-          <w:szCs w:val="18"/>
-        </w:rPr>
-        <w:t>1.2.</w:t>
-      </w:r>
-      <w:r>
-        <w:rPr>
-          <w:sz w:val="24"/>
-          <w:szCs w:val="18"/>
-        </w:rPr>
-        <w:t>4</w:t>
-      </w:r>
-      <w:r>
-        <w:rPr>
-          <w:sz w:val="24"/>
-          <w:szCs w:val="18"/>
-        </w:rPr>
-        <w:t xml:space="preserve">  </w:t>
-      </w:r>
-      <w:r>
-        <w:rPr>
-          <w:sz w:val="24"/>
-          <w:szCs w:val="18"/>
-        </w:rPr>
-        <w:t xml:space="preserve">Jaro-Winkler </w:t>
-      </w:r>
-      <w:r>
-        <w:rPr>
-          <w:sz w:val="24"/>
-          <w:szCs w:val="18"/>
-        </w:rPr>
-        <w:t>Distance</w:t>
-      </w:r>
-    </w:p>
-    <w:p/>
-    <w:p>
-      <w:pPr>
-        <w:pStyle w:val="Heading2"/>
-      </w:pPr>
-      <w:r>
-        <w:t>1.</w:t>
-      </w:r>
-      <w:r>
-        <w:t>3</w:t>
-      </w:r>
-      <w:r>
-        <w:t xml:space="preserve">  </w:t>
-      </w:r>
-      <w:r>
-        <w:t>Overview of search methods</w:t>
+    </w:p>
+    <w:p>
+      <w:pPr>
+        <w:rPr>
+          <w:sz w:val="22"/>
+          <w:szCs w:val="22"/>
+        </w:rPr>
+      </w:pPr>
+      <w:r>
+        <w:rPr>
+          <w:sz w:val="22"/>
+          <w:szCs w:val="22"/>
+        </w:rPr>
+        <w:t xml:space="preserve">&lt;This section heading is purely a suggestion -- you should subdivide this chapter in whatever manner you think makes most sense for your project. It may also make sense to spread the `Background Research' over more than one chapter, in which case they should be named </w:t>
+      </w:r>
+      <w:r>
+        <w:rPr>
+          <w:sz w:val="22"/>
+          <w:szCs w:val="22"/>
+        </w:rPr>
+        <w:t>sensibly</w:t>
+      </w:r>
+      <w:r>
+        <w:rPr>
+          <w:sz w:val="22"/>
+          <w:szCs w:val="22"/>
+        </w:rPr>
+        <w:t>.&gt;</w:t>
+      </w:r>
+    </w:p>
+    <w:p>
+      <w:pPr>
+        <w:rPr>
+          <w:sz w:val="22"/>
+          <w:szCs w:val="22"/>
+        </w:rPr>
+      </w:pPr>
+    </w:p>
+    <w:p>
+      <w:pPr>
+        <w:rPr>
+          <w:sz w:val="22"/>
+          <w:szCs w:val="22"/>
+        </w:rPr>
+      </w:pPr>
+      <w:r>
+        <w:rPr>
+          <w:sz w:val="22"/>
+          <w:szCs w:val="22"/>
+        </w:rPr>
+        <w:t>Study used:</w:t>
       </w:r>
       <w:r>
         <w:t xml:space="preserve"> </w:t>
       </w:r>
-    </w:p>
-    <w:p/>
-    <w:p>
-      <w:pPr>
-        <w:pStyle w:val="Heading2"/>
-        <w:rPr>
-          <w:sz w:val="24"/>
-          <w:szCs w:val="18"/>
-        </w:rPr>
-      </w:pPr>
-      <w:r>
-        <w:rPr>
-          <w:sz w:val="24"/>
-          <w:szCs w:val="18"/>
-        </w:rPr>
-        <w:t>1.</w:t>
-      </w:r>
-      <w:r>
-        <w:rPr>
-          <w:sz w:val="24"/>
-          <w:szCs w:val="18"/>
-        </w:rPr>
-        <w:t>3</w:t>
-      </w:r>
-      <w:r>
-        <w:rPr>
-          <w:sz w:val="24"/>
-          <w:szCs w:val="18"/>
-        </w:rPr>
-        <w:t>.</w:t>
-      </w:r>
-      <w:r>
-        <w:rPr>
-          <w:sz w:val="24"/>
-          <w:szCs w:val="18"/>
-        </w:rPr>
-        <w:t>1</w:t>
-      </w:r>
-      <w:r>
-        <w:rPr>
-          <w:sz w:val="24"/>
-          <w:szCs w:val="18"/>
-        </w:rPr>
-        <w:t xml:space="preserve">  </w:t>
-      </w:r>
-      <w:r>
-        <w:rPr>
-          <w:sz w:val="24"/>
-          <w:szCs w:val="18"/>
-        </w:rPr>
-        <w:t>Linear Search</w:t>
-      </w:r>
-    </w:p>
-    <w:p/>
-    <w:p>
-      <w:pPr>
-        <w:pStyle w:val="Heading2"/>
-        <w:rPr>
-          <w:sz w:val="24"/>
-          <w:szCs w:val="18"/>
-        </w:rPr>
-      </w:pPr>
-      <w:r>
-        <w:rPr>
-          <w:sz w:val="24"/>
-          <w:szCs w:val="18"/>
-        </w:rPr>
-        <w:t>1.</w:t>
-      </w:r>
-      <w:r>
-        <w:rPr>
-          <w:sz w:val="24"/>
-          <w:szCs w:val="18"/>
-        </w:rPr>
-        <w:t>3</w:t>
-      </w:r>
-      <w:r>
-        <w:rPr>
-          <w:sz w:val="24"/>
-          <w:szCs w:val="18"/>
-        </w:rPr>
-        <w:t>.</w:t>
-      </w:r>
-      <w:r>
-        <w:rPr>
-          <w:sz w:val="24"/>
-          <w:szCs w:val="18"/>
-        </w:rPr>
-        <w:t>1</w:t>
-      </w:r>
-      <w:r>
-        <w:rPr>
-          <w:sz w:val="24"/>
-          <w:szCs w:val="18"/>
-        </w:rPr>
-        <w:t xml:space="preserve">  </w:t>
-      </w:r>
-      <w:r>
-        <w:rPr>
-          <w:sz w:val="24"/>
-          <w:szCs w:val="18"/>
-        </w:rPr>
-        <w:t>Binary</w:t>
-      </w:r>
-      <w:r>
-        <w:rPr>
-          <w:sz w:val="24"/>
-          <w:szCs w:val="18"/>
-        </w:rPr>
-        <w:t xml:space="preserve"> Search</w:t>
-      </w:r>
-    </w:p>
-    <w:p/>
-    <w:p>
-      <w:pPr>
-        <w:pStyle w:val="Heading2"/>
-        <w:rPr>
-          <w:sz w:val="24"/>
-          <w:szCs w:val="18"/>
-        </w:rPr>
-      </w:pPr>
-      <w:r>
-        <w:rPr>
-          <w:sz w:val="24"/>
-          <w:szCs w:val="18"/>
-        </w:rPr>
-        <w:t>1.</w:t>
-      </w:r>
-      <w:r>
-        <w:rPr>
-          <w:sz w:val="24"/>
-          <w:szCs w:val="18"/>
-        </w:rPr>
-        <w:t>3</w:t>
-      </w:r>
-      <w:r>
-        <w:rPr>
-          <w:sz w:val="24"/>
-          <w:szCs w:val="18"/>
-        </w:rPr>
-        <w:t>.</w:t>
-      </w:r>
-      <w:r>
-        <w:rPr>
-          <w:sz w:val="24"/>
-          <w:szCs w:val="18"/>
-        </w:rPr>
-        <w:t>1</w:t>
-      </w:r>
-      <w:r>
-        <w:rPr>
-          <w:sz w:val="24"/>
-          <w:szCs w:val="18"/>
-        </w:rPr>
-        <w:t xml:space="preserve">  </w:t>
-      </w:r>
-      <w:r>
-        <w:rPr>
-          <w:sz w:val="24"/>
-          <w:szCs w:val="18"/>
-        </w:rPr>
-        <w:t>Hash Tables and Linked Lists</w:t>
-      </w:r>
-    </w:p>
-    <w:p/>
-    <w:p>
-      <w:pPr>
-        <w:pStyle w:val="Heading2"/>
-      </w:pPr>
-      <w:bookmarkStart w:id="6" w:name="_Toc407145092"/>
-      <w:r>
-        <w:t>1.</w:t>
-      </w:r>
-      <w:r>
-        <w:t>4</w:t>
-      </w:r>
-      <w:r>
-        <w:t xml:space="preserve">  </w:t>
-      </w:r>
-      <w:bookmarkEnd w:id="6"/>
-      <w:r>
-        <w:t>Literature Review</w:t>
-      </w:r>
-      <w:r>
-        <w:t xml:space="preserve"> </w:t>
-      </w:r>
-    </w:p>
-    <w:p>
-      <w:pPr>
-        <w:rPr>
-          <w:sz w:val="22"/>
-          <w:szCs w:val="22"/>
-        </w:rPr>
-      </w:pPr>
-      <w:r>
-        <w:rPr>
-          <w:sz w:val="22"/>
-          <w:szCs w:val="22"/>
-        </w:rPr>
-        <w:t xml:space="preserve">&lt;This section heading is purely a suggestion -- you should subdivide this chapter in whatever manner you think makes most sense for your project. It may also make sense to spread the `Background Research' over more than one chapter, in which case they should be named </w:t>
-      </w:r>
-      <w:r>
-        <w:rPr>
-          <w:sz w:val="22"/>
-          <w:szCs w:val="22"/>
-        </w:rPr>
-        <w:t>sensibly</w:t>
-      </w:r>
-      <w:r>
-        <w:rPr>
-          <w:sz w:val="22"/>
-          <w:szCs w:val="22"/>
-        </w:rPr>
-        <w:t>.&gt;</w:t>
-      </w:r>
-    </w:p>
-    <w:p>
-      <w:pPr>
-        <w:rPr>
-          <w:sz w:val="22"/>
-          <w:szCs w:val="22"/>
-        </w:rPr>
-      </w:pPr>
-    </w:p>
-    <w:p>
-      <w:pPr>
-        <w:rPr>
-          <w:sz w:val="22"/>
-          <w:szCs w:val="22"/>
-        </w:rPr>
-      </w:pPr>
-      <w:r>
-        <w:rPr>
-          <w:sz w:val="22"/>
-          <w:szCs w:val="22"/>
-        </w:rPr>
-        <w:t>Study used:</w:t>
-      </w:r>
-      <w:r>
-        <w:t xml:space="preserve"> </w:t>
-      </w:r>
-      <w:hyperlink r:id="rId14" w:history="1">
+      <w:hyperlink r:id="rId22" w:history="1">
         <w:r>
           <w:rPr>
             <w:rStyle w:val="Hyperlink"/>
@@ -5260,6 +5538,7 @@
           <w:sz w:val="22"/>
           <w:szCs w:val="22"/>
         </w:rPr>
+        <w:lastRenderedPageBreak/>
         <w:t xml:space="preserve">For some cases of developing spell checkers the implementation seems quite simple and straightforward. As outlined in </w:t>
       </w:r>
       <w:r>
@@ -5316,15 +5595,7 @@
           <w:sz w:val="22"/>
           <w:szCs w:val="22"/>
         </w:rPr>
-        <w:t xml:space="preserve">an </w:t>
-      </w:r>
-      <w:r>
-        <w:rPr>
-          <w:sz w:val="22"/>
-          <w:szCs w:val="22"/>
-        </w:rPr>
-        <w:lastRenderedPageBreak/>
-        <w:t xml:space="preserve">entered word and a word in a generated dictionary. They argue that </w:t>
+        <w:t xml:space="preserve">an entered word and a word in a generated dictionary. They argue that </w:t>
       </w:r>
       <w:r>
         <w:rPr>
@@ -5462,7 +5733,7 @@
         <w:t xml:space="preserve">  </w:t>
       </w:r>
       <w:r>
-        <w:t>Phase One (corpus extraction)</w:t>
+        <w:t>C Program</w:t>
       </w:r>
     </w:p>
     <w:p>
@@ -5479,24 +5750,10 @@
         <w:t xml:space="preserve">  </w:t>
       </w:r>
       <w:r>
-        <w:t>Phase Two (spell checking)</w:t>
-      </w:r>
-    </w:p>
-    <w:p>
-      <w:pPr>
-        <w:pStyle w:val="Heading2"/>
-      </w:pPr>
-      <w:r>
-        <w:t>2.</w:t>
-      </w:r>
-      <w:r>
-        <w:t>4</w:t>
-      </w:r>
-      <w:r>
-        <w:t xml:space="preserve">  </w:t>
-      </w:r>
-      <w:r>
-        <w:t>Phase Three (testing)</w:t>
+        <w:t>P</w:t>
+      </w:r>
+      <w:r>
+        <w:t>ython Program</w:t>
       </w:r>
     </w:p>
     <w:p>
@@ -5782,25 +6039,7 @@
           <w:sz w:val="22"/>
           <w:szCs w:val="22"/>
         </w:rPr>
-        <w:t xml:space="preserve">It is expected that the list would reflect the breadth and depth of scholarly research undertaken by the student </w:t>
-      </w:r>
-      <w:proofErr w:type="gramStart"/>
-      <w:r>
-        <w:rPr>
-          <w:i/>
-          <w:sz w:val="22"/>
-          <w:szCs w:val="22"/>
-        </w:rPr>
-        <w:t>during the course of</w:t>
-      </w:r>
-      <w:proofErr w:type="gramEnd"/>
-      <w:r>
-        <w:rPr>
-          <w:i/>
-          <w:sz w:val="22"/>
-          <w:szCs w:val="22"/>
-        </w:rPr>
-        <w:t xml:space="preserve"> the project.</w:t>
+        <w:t>It is expected that the list would reflect the breadth and depth of scholarly research undertaken by the student during the course of the project.</w:t>
       </w:r>
       <w:r>
         <w:rPr>
@@ -5837,7 +6076,7 @@
         </w:rPr>
         <w:t xml:space="preserve">. International Journal of Scientific and Research Publications [Accessed 18/03/24]. Available from: </w:t>
       </w:r>
-      <w:hyperlink r:id="rId15" w:history="1">
+      <w:hyperlink r:id="rId23" w:history="1">
         <w:r>
           <w:rPr>
             <w:rStyle w:val="Hyperlink"/>
@@ -5874,7 +6113,7 @@
         </w:rPr>
         <w:t xml:space="preserve">Nam, E, 2019. Understanding the Levenshtein Distance Equation for Beginners. [online]. [Accessed 18/03/24]. Available from: </w:t>
       </w:r>
-      <w:hyperlink r:id="rId16" w:history="1">
+      <w:hyperlink r:id="rId24" w:history="1">
         <w:r>
           <w:rPr>
             <w:rStyle w:val="Hyperlink"/>
@@ -6017,15 +6256,7 @@
         <w:pStyle w:val="Heading2"/>
       </w:pPr>
       <w:r>
-        <w:t xml:space="preserve">A.3 Legal, social, </w:t>
-      </w:r>
-      <w:proofErr w:type="gramStart"/>
-      <w:r>
-        <w:t>ethical</w:t>
-      </w:r>
-      <w:proofErr w:type="gramEnd"/>
-      <w:r>
-        <w:t xml:space="preserve"> and professional issues</w:t>
+        <w:t>A.3 Legal, social, ethical and professional issues</w:t>
       </w:r>
     </w:p>
     <w:p>
@@ -6263,23 +6494,7 @@
           <w:sz w:val="22"/>
           <w:szCs w:val="22"/>
         </w:rPr>
-        <w:t xml:space="preserve">&lt;This appendix should provide a brief record of materials used in the solution that are not the student's own work. Such materials might be pieces of codes made available from a research group/company or from the internet, datasets prepared by external </w:t>
-      </w:r>
-      <w:proofErr w:type="gramStart"/>
-      <w:r>
-        <w:rPr>
-          <w:sz w:val="22"/>
-          <w:szCs w:val="22"/>
-        </w:rPr>
-        <w:t>users</w:t>
-      </w:r>
-      <w:proofErr w:type="gramEnd"/>
-      <w:r>
-        <w:rPr>
-          <w:sz w:val="22"/>
-          <w:szCs w:val="22"/>
-        </w:rPr>
-        <w:t xml:space="preserve"> or any preliminary materials/drafts/notes provided by a supervisor. It should be clear what was used as ready-made components and what was developed as part of the project. This appendix should be included even if no external materials were used, in which case a statement to that effect is all that is required.&gt;</w:t>
+        <w:t>&lt;This appendix should provide a brief record of materials used in the solution that are not the student's own work. Such materials might be pieces of codes made available from a research group/company or from the internet, datasets prepared by external users or any preliminary materials/drafts/notes provided by a supervisor. It should be clear what was used as ready-made components and what was developed as part of the project. This appendix should be included even if no external materials were used, in which case a statement to that effect is all that is required.&gt;</w:t>
       </w:r>
     </w:p>
     <w:p>
@@ -6291,7 +6506,7 @@
       </w:pPr>
     </w:p>
     <w:sectPr>
-      <w:headerReference w:type="default" r:id="rId17"/>
+      <w:headerReference w:type="default" r:id="rId25"/>
       <w:footnotePr>
         <w:numRestart w:val="eachSect"/>
       </w:footnotePr>
@@ -7216,6 +7431,92 @@
     </w:lvl>
   </w:abstractNum>
   <w:abstractNum w:abstractNumId="16" w15:restartNumberingAfterBreak="0">
+    <w:nsid w:val="2D414921"/>
+    <w:multiLevelType w:val="hybridMultilevel"/>
+    <w:tmpl w:val="FD869FE4"/>
+    <w:lvl w:ilvl="0" w:tplc="08090011">
+      <w:start w:val="1"/>
+      <w:numFmt w:val="decimal"/>
+      <w:lvlText w:val="%1)"/>
+      <w:lvlJc w:val="left"/>
+      <w:pPr>
+        <w:ind w:left="720" w:hanging="360"/>
+      </w:pPr>
+    </w:lvl>
+    <w:lvl w:ilvl="1" w:tplc="08090019" w:tentative="1">
+      <w:start w:val="1"/>
+      <w:numFmt w:val="lowerLetter"/>
+      <w:lvlText w:val="%2."/>
+      <w:lvlJc w:val="left"/>
+      <w:pPr>
+        <w:ind w:left="1440" w:hanging="360"/>
+      </w:pPr>
+    </w:lvl>
+    <w:lvl w:ilvl="2" w:tplc="0809001B" w:tentative="1">
+      <w:start w:val="1"/>
+      <w:numFmt w:val="lowerRoman"/>
+      <w:lvlText w:val="%3."/>
+      <w:lvlJc w:val="right"/>
+      <w:pPr>
+        <w:ind w:left="2160" w:hanging="180"/>
+      </w:pPr>
+    </w:lvl>
+    <w:lvl w:ilvl="3" w:tplc="0809000F" w:tentative="1">
+      <w:start w:val="1"/>
+      <w:numFmt w:val="decimal"/>
+      <w:lvlText w:val="%4."/>
+      <w:lvlJc w:val="left"/>
+      <w:pPr>
+        <w:ind w:left="2880" w:hanging="360"/>
+      </w:pPr>
+    </w:lvl>
+    <w:lvl w:ilvl="4" w:tplc="08090019" w:tentative="1">
+      <w:start w:val="1"/>
+      <w:numFmt w:val="lowerLetter"/>
+      <w:lvlText w:val="%5."/>
+      <w:lvlJc w:val="left"/>
+      <w:pPr>
+        <w:ind w:left="3600" w:hanging="360"/>
+      </w:pPr>
+    </w:lvl>
+    <w:lvl w:ilvl="5" w:tplc="0809001B" w:tentative="1">
+      <w:start w:val="1"/>
+      <w:numFmt w:val="lowerRoman"/>
+      <w:lvlText w:val="%6."/>
+      <w:lvlJc w:val="right"/>
+      <w:pPr>
+        <w:ind w:left="4320" w:hanging="180"/>
+      </w:pPr>
+    </w:lvl>
+    <w:lvl w:ilvl="6" w:tplc="0809000F" w:tentative="1">
+      <w:start w:val="1"/>
+      <w:numFmt w:val="decimal"/>
+      <w:lvlText w:val="%7."/>
+      <w:lvlJc w:val="left"/>
+      <w:pPr>
+        <w:ind w:left="5040" w:hanging="360"/>
+      </w:pPr>
+    </w:lvl>
+    <w:lvl w:ilvl="7" w:tplc="08090019" w:tentative="1">
+      <w:start w:val="1"/>
+      <w:numFmt w:val="lowerLetter"/>
+      <w:lvlText w:val="%8."/>
+      <w:lvlJc w:val="left"/>
+      <w:pPr>
+        <w:ind w:left="5760" w:hanging="360"/>
+      </w:pPr>
+    </w:lvl>
+    <w:lvl w:ilvl="8" w:tplc="0809001B" w:tentative="1">
+      <w:start w:val="1"/>
+      <w:numFmt w:val="lowerRoman"/>
+      <w:lvlText w:val="%9."/>
+      <w:lvlJc w:val="right"/>
+      <w:pPr>
+        <w:ind w:left="6480" w:hanging="180"/>
+      </w:pPr>
+    </w:lvl>
+  </w:abstractNum>
+  <w:abstractNum w:abstractNumId="17" w15:restartNumberingAfterBreak="0">
     <w:nsid w:val="307355F0"/>
     <w:multiLevelType w:val="hybridMultilevel"/>
     <w:tmpl w:val="34305C04"/>
@@ -7328,7 +7629,7 @@
       </w:rPr>
     </w:lvl>
   </w:abstractNum>
-  <w:abstractNum w:abstractNumId="17" w15:restartNumberingAfterBreak="0">
+  <w:abstractNum w:abstractNumId="18" w15:restartNumberingAfterBreak="0">
     <w:nsid w:val="36AC243D"/>
     <w:multiLevelType w:val="hybridMultilevel"/>
     <w:tmpl w:val="F0347DCA"/>
@@ -7441,7 +7742,7 @@
       </w:rPr>
     </w:lvl>
   </w:abstractNum>
-  <w:abstractNum w:abstractNumId="18" w15:restartNumberingAfterBreak="0">
+  <w:abstractNum w:abstractNumId="19" w15:restartNumberingAfterBreak="0">
     <w:nsid w:val="445F2AF6"/>
     <w:multiLevelType w:val="hybridMultilevel"/>
     <w:tmpl w:val="9034ACCE"/>
@@ -7554,7 +7855,7 @@
       </w:rPr>
     </w:lvl>
   </w:abstractNum>
-  <w:abstractNum w:abstractNumId="19" w15:restartNumberingAfterBreak="0">
+  <w:abstractNum w:abstractNumId="20" w15:restartNumberingAfterBreak="0">
     <w:nsid w:val="571504CC"/>
     <w:multiLevelType w:val="hybridMultilevel"/>
     <w:tmpl w:val="91AA967C"/>
@@ -7667,7 +7968,7 @@
       </w:rPr>
     </w:lvl>
   </w:abstractNum>
-  <w:abstractNum w:abstractNumId="20" w15:restartNumberingAfterBreak="0">
+  <w:abstractNum w:abstractNumId="21" w15:restartNumberingAfterBreak="0">
     <w:nsid w:val="5BF46FBD"/>
     <w:multiLevelType w:val="hybridMultilevel"/>
     <w:tmpl w:val="9B5C93DE"/>
@@ -7756,7 +8057,7 @@
       </w:pPr>
     </w:lvl>
   </w:abstractNum>
-  <w:abstractNum w:abstractNumId="21" w15:restartNumberingAfterBreak="0">
+  <w:abstractNum w:abstractNumId="22" w15:restartNumberingAfterBreak="0">
     <w:nsid w:val="5F674711"/>
     <w:multiLevelType w:val="hybridMultilevel"/>
     <w:tmpl w:val="594E6644"/>
@@ -7869,7 +8170,7 @@
       </w:rPr>
     </w:lvl>
   </w:abstractNum>
-  <w:abstractNum w:abstractNumId="22" w15:restartNumberingAfterBreak="0">
+  <w:abstractNum w:abstractNumId="23" w15:restartNumberingAfterBreak="0">
     <w:nsid w:val="60A6001C"/>
     <w:multiLevelType w:val="hybridMultilevel"/>
     <w:tmpl w:val="C4907370"/>
@@ -7982,7 +8283,7 @@
       </w:rPr>
     </w:lvl>
   </w:abstractNum>
-  <w:abstractNum w:abstractNumId="23" w15:restartNumberingAfterBreak="0">
+  <w:abstractNum w:abstractNumId="24" w15:restartNumberingAfterBreak="0">
     <w:nsid w:val="66E40E99"/>
     <w:multiLevelType w:val="hybridMultilevel"/>
     <w:tmpl w:val="01A8CF44"/>
@@ -8068,7 +8369,7 @@
       </w:pPr>
     </w:lvl>
   </w:abstractNum>
-  <w:abstractNum w:abstractNumId="24" w15:restartNumberingAfterBreak="0">
+  <w:abstractNum w:abstractNumId="25" w15:restartNumberingAfterBreak="0">
     <w:nsid w:val="6A917ECD"/>
     <w:multiLevelType w:val="hybridMultilevel"/>
     <w:tmpl w:val="27044AE2"/>
@@ -8181,7 +8482,7 @@
       </w:rPr>
     </w:lvl>
   </w:abstractNum>
-  <w:abstractNum w:abstractNumId="25" w15:restartNumberingAfterBreak="0">
+  <w:abstractNum w:abstractNumId="26" w15:restartNumberingAfterBreak="0">
     <w:nsid w:val="6DF04E0F"/>
     <w:multiLevelType w:val="hybridMultilevel"/>
     <w:tmpl w:val="295C1118"/>
@@ -8294,7 +8595,7 @@
       </w:rPr>
     </w:lvl>
   </w:abstractNum>
-  <w:abstractNum w:abstractNumId="26" w15:restartNumberingAfterBreak="0">
+  <w:abstractNum w:abstractNumId="27" w15:restartNumberingAfterBreak="0">
     <w:nsid w:val="730C5146"/>
     <w:multiLevelType w:val="hybridMultilevel"/>
     <w:tmpl w:val="57D62FA0"/>
@@ -8381,19 +8682,19 @@
     </w:lvl>
   </w:abstractNum>
   <w:num w:numId="1" w16cid:durableId="1421681331">
-    <w:abstractNumId w:val="19"/>
+    <w:abstractNumId w:val="20"/>
   </w:num>
   <w:num w:numId="2" w16cid:durableId="2010060922">
     <w:abstractNumId w:val="10"/>
   </w:num>
   <w:num w:numId="3" w16cid:durableId="1855722437">
+    <w:abstractNumId w:val="19"/>
+  </w:num>
+  <w:num w:numId="4" w16cid:durableId="839731692">
     <w:abstractNumId w:val="18"/>
   </w:num>
-  <w:num w:numId="4" w16cid:durableId="839731692">
+  <w:num w:numId="5" w16cid:durableId="2032411283">
     <w:abstractNumId w:val="17"/>
-  </w:num>
-  <w:num w:numId="5" w16cid:durableId="2032411283">
-    <w:abstractNumId w:val="16"/>
   </w:num>
   <w:num w:numId="6" w16cid:durableId="65609718">
     <w:abstractNumId w:val="11"/>
@@ -8432,13 +8733,13 @@
     <w:abstractNumId w:val="13"/>
   </w:num>
   <w:num w:numId="18" w16cid:durableId="45228633">
+    <w:abstractNumId w:val="26"/>
+  </w:num>
+  <w:num w:numId="19" w16cid:durableId="806162269">
     <w:abstractNumId w:val="25"/>
   </w:num>
-  <w:num w:numId="19" w16cid:durableId="806162269">
-    <w:abstractNumId w:val="24"/>
-  </w:num>
   <w:num w:numId="20" w16cid:durableId="627013061">
-    <w:abstractNumId w:val="22"/>
+    <w:abstractNumId w:val="23"/>
   </w:num>
   <w:num w:numId="21" w16cid:durableId="1294560109">
     <w:abstractNumId w:val="12"/>
@@ -8447,19 +8748,22 @@
     <w:abstractNumId w:val="14"/>
   </w:num>
   <w:num w:numId="23" w16cid:durableId="1664046201">
-    <w:abstractNumId w:val="23"/>
+    <w:abstractNumId w:val="24"/>
   </w:num>
   <w:num w:numId="24" w16cid:durableId="919673762">
-    <w:abstractNumId w:val="21"/>
+    <w:abstractNumId w:val="22"/>
   </w:num>
   <w:num w:numId="25" w16cid:durableId="418599671">
     <w:abstractNumId w:val="15"/>
   </w:num>
   <w:num w:numId="26" w16cid:durableId="1860586850">
-    <w:abstractNumId w:val="20"/>
+    <w:abstractNumId w:val="21"/>
   </w:num>
   <w:num w:numId="27" w16cid:durableId="886911959">
-    <w:abstractNumId w:val="26"/>
+    <w:abstractNumId w:val="27"/>
+  </w:num>
+  <w:num w:numId="28" w16cid:durableId="95442003">
+    <w:abstractNumId w:val="16"/>
   </w:num>
 </w:numbering>
 </file>
@@ -9481,6 +9785,16 @@
       <w:contextualSpacing/>
     </w:pPr>
   </w:style>
+  <w:style w:type="character" w:styleId="PlaceholderText">
+    <w:name w:val="Placeholder Text"/>
+    <w:basedOn w:val="DefaultParagraphFont"/>
+    <w:uiPriority w:val="99"/>
+    <w:semiHidden/>
+    <w:rsid w:val="00E874AF"/>
+    <w:rPr>
+      <w:color w:val="666666"/>
+    </w:rPr>
+  </w:style>
 </w:styles>
 </file>
 

</xml_diff>

<commit_message>
update levenshtein distance algorithm to be more efficient, made tweaks to other files and continued writeup
</commit_message>
<xml_diff>
--- a/project_writeup/FinalReportV1.docx
+++ b/project_writeup/FinalReportV1.docx
@@ -81,227 +81,87 @@
       <w:r>
         <w:rPr>
           <w:noProof/>
+        </w:rPr>
+        <w:pict w14:anchorId="715FFC00">
+          <v:shapetype id="_x0000_t202" coordsize="21600,21600" o:spt="202" path="m,l,21600r21600,l21600,xe">
+            <v:stroke joinstyle="miter"/>
+            <v:path gradientshapeok="t" o:connecttype="rect"/>
+          </v:shapetype>
+          <v:shape id="Text Box 2" o:spid="_x0000_s1027" type="#_x0000_t202" style="position:absolute;left:0;text-align:left;margin-left:66.45pt;margin-top:114.2pt;width:175.15pt;height:68.4pt;z-index:251658240;visibility:visible;mso-wrap-style:square;mso-width-percent:0;mso-height-percent:0;mso-wrap-distance-left:9pt;mso-wrap-distance-top:0;mso-wrap-distance-right:9pt;mso-wrap-distance-bottom:0;mso-position-horizontal:absolute;mso-position-horizontal-relative:page;mso-position-vertical:absolute;mso-position-vertical-relative:page;mso-width-percent:0;mso-height-percent:0;mso-width-relative:page;mso-height-relative:page;v-text-anchor:top" o:gfxdata="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" filled="f" stroked="f">
+            <v:textbox inset="0,0,0,0">
+              <w:txbxContent>
+                <w:tbl>
+                  <w:tblPr>
+                    <w:tblStyle w:val="TableGrid"/>
+                    <w:tblW w:w="0" w:type="auto"/>
+                    <w:tblBorders>
+                      <w:top w:val="none" w:sz="0" w:space="0" w:color="auto"/>
+                      <w:left w:val="none" w:sz="0" w:space="0" w:color="auto"/>
+                      <w:bottom w:val="none" w:sz="0" w:space="0" w:color="auto"/>
+                      <w:right w:val="none" w:sz="0" w:space="0" w:color="auto"/>
+                      <w:insideH w:val="none" w:sz="0" w:space="0" w:color="auto"/>
+                      <w:insideV w:val="none" w:sz="0" w:space="0" w:color="auto"/>
+                    </w:tblBorders>
+                    <w:tblCellMar>
+                      <w:left w:w="0" w:type="dxa"/>
+                      <w:right w:w="0" w:type="dxa"/>
+                    </w:tblCellMar>
+                    <w:tblLook w:val="01E0" w:firstRow="1" w:lastRow="1" w:firstColumn="1" w:lastColumn="1" w:noHBand="0" w:noVBand="0"/>
+                  </w:tblPr>
+                  <w:tblGrid>
+                    <w:gridCol w:w="3518"/>
+                  </w:tblGrid>
+                  <w:tr>
+                    <w:trPr>
+                      <w:trHeight w:val="1338"/>
+                    </w:trPr>
+                    <w:tc>
+                      <w:tcPr>
+                        <w:tcW w:w="5399" w:type="dxa"/>
+                        <w:tcMar>
+                          <w:left w:w="0" w:type="dxa"/>
+                          <w:right w:w="0" w:type="dxa"/>
+                        </w:tcMar>
+                        <w:vAlign w:val="bottom"/>
+                      </w:tcPr>
+                      <w:p>
+                        <w:pPr>
+                          <w:pStyle w:val="LEUFPSchool"/>
+                        </w:pPr>
+                        <w:r>
+                          <w:t>School of Computing</w:t>
+                        </w:r>
+                      </w:p>
+                      <w:p>
+                        <w:pPr>
+                          <w:pStyle w:val="LEUFPFac"/>
+                        </w:pPr>
+                        <w:r>
+                          <w:t xml:space="preserve">Faculty of Engineering </w:t>
+                        </w:r>
+                        <w:r>
+                          <w:t>AND PHYSICAL SCIENCE</w:t>
+                        </w:r>
+                        <w:r>
+                          <w:t>S</w:t>
+                        </w:r>
+                      </w:p>
+                    </w:tc>
+                  </w:tr>
+                </w:tbl>
+                <w:p/>
+              </w:txbxContent>
+            </v:textbox>
+            <w10:wrap anchorx="page" anchory="page"/>
+            <w10:anchorlock/>
+          </v:shape>
+        </w:pict>
+      </w:r>
+      <w:r>
+        <w:rPr>
           <w:sz w:val="36"/>
           <w:szCs w:val="36"/>
         </w:rPr>
-        <mc:AlternateContent>
-          <mc:Choice Requires="wps">
-            <w:drawing>
-              <wp:anchor distT="0" distB="0" distL="114300" distR="114300" simplePos="0" relativeHeight="251658240" behindDoc="0" locked="1" layoutInCell="1" allowOverlap="1" wp14:anchorId="09B43DA5" wp14:editId="0FD90100">
-                <wp:simplePos x="0" y="0"/>
-                <wp:positionH relativeFrom="page">
-                  <wp:posOffset>843915</wp:posOffset>
-                </wp:positionH>
-                <wp:positionV relativeFrom="page">
-                  <wp:posOffset>1450340</wp:posOffset>
-                </wp:positionV>
-                <wp:extent cx="2224405" cy="868680"/>
-                <wp:effectExtent l="0" t="0" r="10795" b="7620"/>
-                <wp:wrapNone/>
-                <wp:docPr id="2" name="Text Box 2"/>
-                <wp:cNvGraphicFramePr>
-                  <a:graphicFrameLocks xmlns:a="http://schemas.openxmlformats.org/drawingml/2006/main"/>
-                </wp:cNvGraphicFramePr>
-                <a:graphic xmlns:a="http://schemas.openxmlformats.org/drawingml/2006/main">
-                  <a:graphicData uri="http://schemas.microsoft.com/office/word/2010/wordprocessingShape">
-                    <wps:wsp>
-                      <wps:cNvSpPr txBox="1">
-                        <a:spLocks noChangeArrowheads="1"/>
-                      </wps:cNvSpPr>
-                      <wps:spPr bwMode="auto">
-                        <a:xfrm>
-                          <a:off x="0" y="0"/>
-                          <a:ext cx="2224405" cy="868680"/>
-                        </a:xfrm>
-                        <a:prstGeom prst="rect">
-                          <a:avLst/>
-                        </a:prstGeom>
-                        <a:noFill/>
-                        <a:ln>
-                          <a:noFill/>
-                        </a:ln>
-                        <a:extLst>
-                          <a:ext uri="{909E8E84-426E-40DD-AFC4-6F175D3DCCD1}">
-                            <a14:hiddenFill xmlns:a14="http://schemas.microsoft.com/office/drawing/2010/main">
-                              <a:solidFill>
-                                <a:srgbClr val="FFFFFF"/>
-                              </a:solidFill>
-                            </a14:hiddenFill>
-                          </a:ext>
-                          <a:ext uri="{91240B29-F687-4F45-9708-019B960494DF}">
-                            <a14:hiddenLine xmlns:a14="http://schemas.microsoft.com/office/drawing/2010/main" w="9525">
-                              <a:solidFill>
-                                <a:srgbClr val="000000"/>
-                              </a:solidFill>
-                              <a:miter lim="800000"/>
-                              <a:headEnd/>
-                              <a:tailEnd/>
-                            </a14:hiddenLine>
-                          </a:ext>
-                        </a:extLst>
-                      </wps:spPr>
-                      <wps:txbx>
-                        <w:txbxContent>
-                          <w:tbl>
-                            <w:tblPr>
-                              <w:tblStyle w:val="TableGrid"/>
-                              <w:tblW w:w="0" w:type="auto"/>
-                              <w:tblBorders>
-                                <w:top w:val="none" w:sz="0" w:space="0" w:color="auto"/>
-                                <w:left w:val="none" w:sz="0" w:space="0" w:color="auto"/>
-                                <w:bottom w:val="none" w:sz="0" w:space="0" w:color="auto"/>
-                                <w:right w:val="none" w:sz="0" w:space="0" w:color="auto"/>
-                                <w:insideH w:val="none" w:sz="0" w:space="0" w:color="auto"/>
-                                <w:insideV w:val="none" w:sz="0" w:space="0" w:color="auto"/>
-                              </w:tblBorders>
-                              <w:tblCellMar>
-                                <w:left w:w="0" w:type="dxa"/>
-                                <w:right w:w="0" w:type="dxa"/>
-                              </w:tblCellMar>
-                              <w:tblLook w:val="01E0" w:firstRow="1" w:lastRow="1" w:firstColumn="1" w:lastColumn="1" w:noHBand="0" w:noVBand="0"/>
-                            </w:tblPr>
-                            <w:tblGrid>
-                              <w:gridCol w:w="3518"/>
-                            </w:tblGrid>
-                            <w:tr>
-                              <w:trPr>
-                                <w:trHeight w:val="1338"/>
-                              </w:trPr>
-                              <w:tc>
-                                <w:tcPr>
-                                  <w:tcW w:w="5399" w:type="dxa"/>
-                                  <w:tcMar>
-                                    <w:left w:w="0" w:type="dxa"/>
-                                    <w:right w:w="0" w:type="dxa"/>
-                                  </w:tcMar>
-                                  <w:vAlign w:val="bottom"/>
-                                </w:tcPr>
-                                <w:p>
-                                  <w:pPr>
-                                    <w:pStyle w:val="LEUFPSchool"/>
-                                  </w:pPr>
-                                  <w:r>
-                                    <w:t>School of Computing</w:t>
-                                  </w:r>
-                                </w:p>
-                                <w:p>
-                                  <w:pPr>
-                                    <w:pStyle w:val="LEUFPFac"/>
-                                  </w:pPr>
-                                  <w:r>
-                                    <w:t xml:space="preserve">Faculty of Engineering </w:t>
-                                  </w:r>
-                                  <w:r>
-                                    <w:t>AND PHYSICAL SCIENCE</w:t>
-                                  </w:r>
-                                  <w:r>
-                                    <w:t>S</w:t>
-                                  </w:r>
-                                </w:p>
-                              </w:tc>
-                            </w:tr>
-                          </w:tbl>
-                          <w:p/>
-                        </w:txbxContent>
-                      </wps:txbx>
-                      <wps:bodyPr rot="0" vert="horz" wrap="square" lIns="0" tIns="0" rIns="0" bIns="0" anchor="t" anchorCtr="0" upright="1">
-                        <a:noAutofit/>
-                      </wps:bodyPr>
-                    </wps:wsp>
-                  </a:graphicData>
-                </a:graphic>
-                <wp14:sizeRelH relativeFrom="page">
-                  <wp14:pctWidth>0</wp14:pctWidth>
-                </wp14:sizeRelH>
-                <wp14:sizeRelV relativeFrom="page">
-                  <wp14:pctHeight>0</wp14:pctHeight>
-                </wp14:sizeRelV>
-              </wp:anchor>
-            </w:drawing>
-          </mc:Choice>
-          <mc:Fallback>
-            <w:pict>
-              <v:shapetype w14:anchorId="09B43DA5" id="_x0000_t202" coordsize="21600,21600" o:spt="202" path="m,l,21600r21600,l21600,xe">
-                <v:stroke joinstyle="miter"/>
-                <v:path gradientshapeok="t" o:connecttype="rect"/>
-              </v:shapetype>
-              <v:shape id="Text Box 2" o:spid="_x0000_s1026" type="#_x0000_t202" style="position:absolute;left:0;text-align:left;margin-left:66.45pt;margin-top:114.2pt;width:175.15pt;height:68.4pt;z-index:251658240;visibility:visible;mso-wrap-style:square;mso-width-percent:0;mso-height-percent:0;mso-wrap-distance-left:9pt;mso-wrap-distance-top:0;mso-wrap-distance-right:9pt;mso-wrap-distance-bottom:0;mso-position-horizontal:absolute;mso-position-horizontal-relative:page;mso-position-vertical:absolute;mso-position-vertical-relative:page;mso-width-percent:0;mso-height-percent:0;mso-width-relative:page;mso-height-relative:page;v-text-anchor:top" o:gfxdata="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" filled="f" stroked="f">
-                <v:textbox inset="0,0,0,0">
-                  <w:txbxContent>
-                    <w:tbl>
-                      <w:tblPr>
-                        <w:tblStyle w:val="TableGrid"/>
-                        <w:tblW w:w="0" w:type="auto"/>
-                        <w:tblBorders>
-                          <w:top w:val="none" w:sz="0" w:space="0" w:color="auto"/>
-                          <w:left w:val="none" w:sz="0" w:space="0" w:color="auto"/>
-                          <w:bottom w:val="none" w:sz="0" w:space="0" w:color="auto"/>
-                          <w:right w:val="none" w:sz="0" w:space="0" w:color="auto"/>
-                          <w:insideH w:val="none" w:sz="0" w:space="0" w:color="auto"/>
-                          <w:insideV w:val="none" w:sz="0" w:space="0" w:color="auto"/>
-                        </w:tblBorders>
-                        <w:tblCellMar>
-                          <w:left w:w="0" w:type="dxa"/>
-                          <w:right w:w="0" w:type="dxa"/>
-                        </w:tblCellMar>
-                        <w:tblLook w:val="01E0" w:firstRow="1" w:lastRow="1" w:firstColumn="1" w:lastColumn="1" w:noHBand="0" w:noVBand="0"/>
-                      </w:tblPr>
-                      <w:tblGrid>
-                        <w:gridCol w:w="3518"/>
-                      </w:tblGrid>
-                      <w:tr>
-                        <w:trPr>
-                          <w:trHeight w:val="1338"/>
-                        </w:trPr>
-                        <w:tc>
-                          <w:tcPr>
-                            <w:tcW w:w="5399" w:type="dxa"/>
-                            <w:tcMar>
-                              <w:left w:w="0" w:type="dxa"/>
-                              <w:right w:w="0" w:type="dxa"/>
-                            </w:tcMar>
-                            <w:vAlign w:val="bottom"/>
-                          </w:tcPr>
-                          <w:p>
-                            <w:pPr>
-                              <w:pStyle w:val="LEUFPSchool"/>
-                            </w:pPr>
-                            <w:r>
-                              <w:t>School of Computing</w:t>
-                            </w:r>
-                          </w:p>
-                          <w:p>
-                            <w:pPr>
-                              <w:pStyle w:val="LEUFPFac"/>
-                            </w:pPr>
-                            <w:r>
-                              <w:t xml:space="preserve">Faculty of Engineering </w:t>
-                            </w:r>
-                            <w:r>
-                              <w:t>AND PHYSICAL SCIENCE</w:t>
-                            </w:r>
-                            <w:r>
-                              <w:t>S</w:t>
-                            </w:r>
-                          </w:p>
-                        </w:tc>
-                      </w:tr>
-                    </w:tbl>
-                    <w:p/>
-                  </w:txbxContent>
-                </v:textbox>
-                <w10:wrap anchorx="page" anchory="page"/>
-                <w10:anchorlock/>
-              </v:shape>
-            </w:pict>
-          </mc:Fallback>
-        </mc:AlternateContent>
-      </w:r>
-      <w:r>
-        <w:rPr>
-          <w:sz w:val="36"/>
-          <w:szCs w:val="36"/>
-        </w:rPr>
         <w:t>Final Report</w:t>
       </w:r>
     </w:p>
@@ -313,77 +173,12 @@
         <w:rPr>
           <w:noProof/>
         </w:rPr>
-        <mc:AlternateContent>
-          <mc:Choice Requires="wps">
-            <w:drawing>
-              <wp:anchor distT="0" distB="0" distL="114300" distR="114300" simplePos="0" relativeHeight="251659264" behindDoc="0" locked="1" layoutInCell="1" allowOverlap="1" wp14:anchorId="3A08862E" wp14:editId="7410625B">
-                <wp:simplePos x="0" y="0"/>
-                <wp:positionH relativeFrom="page">
-                  <wp:posOffset>165735</wp:posOffset>
-                </wp:positionH>
-                <wp:positionV relativeFrom="page">
-                  <wp:posOffset>2508250</wp:posOffset>
-                </wp:positionV>
-                <wp:extent cx="7200265" cy="0"/>
-                <wp:effectExtent l="13335" t="12700" r="6350" b="6350"/>
-                <wp:wrapNone/>
-                <wp:docPr id="4" name="Straight Connector 4"/>
-                <wp:cNvGraphicFramePr>
-                  <a:graphicFrameLocks xmlns:a="http://schemas.openxmlformats.org/drawingml/2006/main"/>
-                </wp:cNvGraphicFramePr>
-                <a:graphic xmlns:a="http://schemas.openxmlformats.org/drawingml/2006/main">
-                  <a:graphicData uri="http://schemas.microsoft.com/office/word/2010/wordprocessingShape">
-                    <wps:wsp>
-                      <wps:cNvCnPr>
-                        <a:cxnSpLocks noChangeShapeType="1"/>
-                      </wps:cNvCnPr>
-                      <wps:spPr bwMode="auto">
-                        <a:xfrm>
-                          <a:off x="0" y="0"/>
-                          <a:ext cx="7200265" cy="0"/>
-                        </a:xfrm>
-                        <a:prstGeom prst="line">
-                          <a:avLst/>
-                        </a:prstGeom>
-                        <a:noFill/>
-                        <a:ln w="9525">
-                          <a:solidFill>
-                            <a:srgbClr val="000000"/>
-                          </a:solidFill>
-                          <a:round/>
-                          <a:headEnd/>
-                          <a:tailEnd/>
-                        </a:ln>
-                        <a:extLst>
-                          <a:ext uri="{909E8E84-426E-40DD-AFC4-6F175D3DCCD1}">
-                            <a14:hiddenFill xmlns:a14="http://schemas.microsoft.com/office/drawing/2010/main">
-                              <a:noFill/>
-                            </a14:hiddenFill>
-                          </a:ext>
-                        </a:extLst>
-                      </wps:spPr>
-                      <wps:bodyPr/>
-                    </wps:wsp>
-                  </a:graphicData>
-                </a:graphic>
-                <wp14:sizeRelH relativeFrom="page">
-                  <wp14:pctWidth>0</wp14:pctWidth>
-                </wp14:sizeRelH>
-                <wp14:sizeRelV relativeFrom="page">
-                  <wp14:pctHeight>0</wp14:pctHeight>
-                </wp14:sizeRelV>
-              </wp:anchor>
-            </w:drawing>
-          </mc:Choice>
-          <mc:Fallback>
-            <w:pict>
-              <v:line w14:anchorId="2FC3C502" id="Straight Connector 4" o:spid="_x0000_s1026" style="position:absolute;z-index:251659264;visibility:visible;mso-wrap-style:square;mso-width-percent:0;mso-height-percent:0;mso-wrap-distance-left:9pt;mso-wrap-distance-top:0;mso-wrap-distance-right:9pt;mso-wrap-distance-bottom:0;mso-position-horizontal:absolute;mso-position-horizontal-relative:page;mso-position-vertical:absolute;mso-position-vertical-relative:page;mso-width-percent:0;mso-height-percent:0;mso-width-relative:page;mso-height-relative:page" from="13.05pt,197.5pt" to="580pt,197.5pt" o:gfxdata="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">
-                <w10:wrap anchorx="page" anchory="page"/>
-                <w10:anchorlock/>
-              </v:line>
-            </w:pict>
-          </mc:Fallback>
-        </mc:AlternateContent>
+        <w:pict w14:anchorId="66D24773">
+          <v:line id="Straight Connector 4" o:spid="_x0000_s1026" style="position:absolute;left:0;text-align:left;z-index:251659264;visibility:visible;mso-wrap-style:square;mso-width-percent:0;mso-height-percent:0;mso-wrap-distance-left:9pt;mso-wrap-distance-top:0;mso-wrap-distance-right:9pt;mso-wrap-distance-bottom:0;mso-position-horizontal:absolute;mso-position-horizontal-relative:page;mso-position-vertical:absolute;mso-position-vertical-relative:page;mso-width-percent:0;mso-height-percent:0;mso-width-relative:page;mso-height-relative:page" from="13.05pt,197.5pt" to="580pt,197.5pt" o:gfxdata="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">
+            <w10:wrap anchorx="page" anchory="page"/>
+            <w10:anchorlock/>
+          </v:line>
+        </w:pict>
       </w:r>
       <w:r>
         <w:t xml:space="preserve">An investigation into the effectiveness of various algorithms to help check spelling of English </w:t>
@@ -536,7 +331,7 @@
       <w:tr>
         <w:tc>
           <w:tcPr>
-            <w:tcW w:w="3124" w:type="dxa"/>
+            <w:tcW w:w="3077" w:type="dxa"/>
           </w:tcPr>
           <w:p>
             <w:pPr>
@@ -554,7 +349,7 @@
         </w:tc>
         <w:tc>
           <w:tcPr>
-            <w:tcW w:w="2796" w:type="dxa"/>
+            <w:tcW w:w="2750" w:type="dxa"/>
           </w:tcPr>
           <w:p>
             <w:pPr>
@@ -572,7 +367,7 @@
         </w:tc>
         <w:tc>
           <w:tcPr>
-            <w:tcW w:w="3452" w:type="dxa"/>
+            <w:tcW w:w="3403" w:type="dxa"/>
           </w:tcPr>
           <w:p>
             <w:pPr>
@@ -592,7 +387,7 @@
       <w:tr>
         <w:tc>
           <w:tcPr>
-            <w:tcW w:w="3124" w:type="dxa"/>
+            <w:tcW w:w="3077" w:type="dxa"/>
           </w:tcPr>
           <w:p>
             <w:pPr>
@@ -628,7 +423,7 @@
         </w:tc>
         <w:tc>
           <w:tcPr>
-            <w:tcW w:w="2796" w:type="dxa"/>
+            <w:tcW w:w="2750" w:type="dxa"/>
           </w:tcPr>
           <w:p>
             <w:pPr>
@@ -646,7 +441,7 @@
         </w:tc>
         <w:tc>
           <w:tcPr>
-            <w:tcW w:w="3452" w:type="dxa"/>
+            <w:tcW w:w="3403" w:type="dxa"/>
           </w:tcPr>
           <w:p>
             <w:pPr>
@@ -672,111 +467,7 @@
       <w:tr>
         <w:tc>
           <w:tcPr>
-            <w:tcW w:w="3124" w:type="dxa"/>
-          </w:tcPr>
-          <w:p>
-            <w:pPr>
-              <w:rPr>
-                <w:i/>
-              </w:rPr>
-            </w:pPr>
-            <w:r>
-              <w:rPr>
-                <w:i/>
-              </w:rPr>
-              <w:t>Scanned p</w:t>
-            </w:r>
-            <w:r>
-              <w:rPr>
-                <w:i/>
-              </w:rPr>
-              <w:t>articipant consent forms</w:t>
-            </w:r>
-          </w:p>
-        </w:tc>
-        <w:tc>
-          <w:tcPr>
-            <w:tcW w:w="2796" w:type="dxa"/>
-          </w:tcPr>
-          <w:p>
-            <w:pPr>
-              <w:rPr>
-                <w:i/>
-              </w:rPr>
-            </w:pPr>
-            <w:r>
-              <w:rPr>
-                <w:i/>
-              </w:rPr>
-              <w:t>PDF file / file archive</w:t>
-            </w:r>
-          </w:p>
-        </w:tc>
-        <w:tc>
-          <w:tcPr>
-            <w:tcW w:w="3452" w:type="dxa"/>
-          </w:tcPr>
-          <w:p>
-            <w:pPr>
-              <w:rPr>
-                <w:i/>
-              </w:rPr>
-            </w:pPr>
-            <w:r>
-              <w:rPr>
-                <w:i/>
-              </w:rPr>
-              <w:t>Uploaded to Minerva</w:t>
-            </w:r>
-            <w:r>
-              <w:rPr>
-                <w:i/>
-              </w:rPr>
-              <w:t xml:space="preserve"> (</w:t>
-            </w:r>
-            <w:r>
-              <w:rPr>
-                <w:i/>
-              </w:rPr>
-              <w:t>DD</w:t>
-            </w:r>
-            <w:r>
-              <w:rPr>
-                <w:i/>
-              </w:rPr>
-              <w:t>/</w:t>
-            </w:r>
-            <w:r>
-              <w:rPr>
-                <w:i/>
-              </w:rPr>
-              <w:t>MM</w:t>
-            </w:r>
-            <w:r>
-              <w:rPr>
-                <w:i/>
-              </w:rPr>
-              <w:t>/</w:t>
-            </w:r>
-            <w:r>
-              <w:rPr>
-                <w:i/>
-              </w:rPr>
-              <w:t>YY</w:t>
-            </w:r>
-            <w:r>
-              <w:rPr>
-                <w:i/>
-              </w:rPr>
-              <w:t>)</w:t>
-            </w:r>
-          </w:p>
-        </w:tc>
-      </w:tr>
-      <w:tr>
-        <w:tc>
-          <w:tcPr>
-            <w:tcW w:w="3124" w:type="dxa"/>
+            <w:tcW w:w="3077" w:type="dxa"/>
           </w:tcPr>
           <w:p>
             <w:pPr>
@@ -794,7 +485,7 @@
         </w:tc>
         <w:tc>
           <w:tcPr>
-            <w:tcW w:w="2796" w:type="dxa"/>
+            <w:tcW w:w="2750" w:type="dxa"/>
           </w:tcPr>
           <w:p>
             <w:pPr>
@@ -812,7 +503,7 @@
         </w:tc>
         <w:tc>
           <w:tcPr>
-            <w:tcW w:w="3452" w:type="dxa"/>
+            <w:tcW w:w="3403" w:type="dxa"/>
           </w:tcPr>
           <w:p>
             <w:pPr>
@@ -889,98 +580,6 @@
           </w:p>
         </w:tc>
       </w:tr>
-      <w:tr>
-        <w:tc>
-          <w:tcPr>
-            <w:tcW w:w="3124" w:type="dxa"/>
-          </w:tcPr>
-          <w:p>
-            <w:pPr>
-              <w:rPr>
-                <w:i/>
-              </w:rPr>
-            </w:pPr>
-            <w:r>
-              <w:rPr>
-                <w:i/>
-              </w:rPr>
-              <w:t>User manuals</w:t>
-            </w:r>
-          </w:p>
-        </w:tc>
-        <w:tc>
-          <w:tcPr>
-            <w:tcW w:w="2796" w:type="dxa"/>
-          </w:tcPr>
-          <w:p>
-            <w:pPr>
-              <w:rPr>
-                <w:i/>
-              </w:rPr>
-            </w:pPr>
-            <w:r>
-              <w:rPr>
-                <w:i/>
-              </w:rPr>
-              <w:t>PDF</w:t>
-            </w:r>
-          </w:p>
-        </w:tc>
-        <w:tc>
-          <w:tcPr>
-            <w:tcW w:w="3452" w:type="dxa"/>
-          </w:tcPr>
-          <w:p>
-            <w:pPr>
-              <w:rPr>
-                <w:i/>
-              </w:rPr>
-            </w:pPr>
-            <w:r>
-              <w:rPr>
-                <w:i/>
-              </w:rPr>
-              <w:t>Sent to c</w:t>
-            </w:r>
-            <w:r>
-              <w:rPr>
-                <w:i/>
-              </w:rPr>
-              <w:t>lient</w:t>
-            </w:r>
-            <w:r>
-              <w:rPr>
-                <w:i/>
-              </w:rPr>
-              <w:t xml:space="preserve"> and</w:t>
-            </w:r>
-            <w:r>
-              <w:rPr>
-                <w:i/>
-              </w:rPr>
-              <w:t xml:space="preserve"> supervisor</w:t>
-            </w:r>
-            <w:r>
-              <w:rPr>
-                <w:i/>
-              </w:rPr>
-              <w:t xml:space="preserve"> (</w:t>
-            </w:r>
-            <w:r>
-              <w:rPr>
-                <w:i/>
-              </w:rPr>
-              <w:t>DD/MM/YY</w:t>
-            </w:r>
-            <w:r>
-              <w:rPr>
-                <w:i/>
-              </w:rPr>
-              <w:t>)</w:t>
-            </w:r>
-          </w:p>
-        </w:tc>
-      </w:tr>
     </w:tbl>
     <w:p/>
     <w:p/>
@@ -2443,6 +2042,82 @@
     </w:p>
     <w:p>
       <w:pPr>
+        <w:pStyle w:val="TOC2"/>
+        <w:rPr>
+          <w:rFonts w:asciiTheme="minorHAnsi" w:eastAsiaTheme="minorEastAsia" w:hAnsiTheme="minorHAnsi" w:cstheme="minorBidi"/>
+          <w:noProof/>
+          <w:sz w:val="22"/>
+          <w:szCs w:val="22"/>
+        </w:rPr>
+      </w:pPr>
+      <w:r>
+        <w:rPr>
+          <w:noProof/>
+        </w:rPr>
+        <w:t>1</w:t>
+      </w:r>
+      <w:r>
+        <w:rPr>
+          <w:noProof/>
+        </w:rPr>
+        <w:t>.</w:t>
+      </w:r>
+      <w:r>
+        <w:rPr>
+          <w:noProof/>
+        </w:rPr>
+        <w:t>5</w:t>
+      </w:r>
+      <w:r>
+        <w:rPr>
+          <w:noProof/>
+        </w:rPr>
+        <w:t xml:space="preserve">  Proof of concept</w:t>
+      </w:r>
+      <w:r>
+        <w:rPr>
+          <w:noProof/>
+        </w:rPr>
+        <w:tab/>
+      </w:r>
+      <w:r>
+        <w:rPr>
+          <w:noProof/>
+        </w:rPr>
+        <w:fldChar w:fldCharType="begin"/>
+      </w:r>
+      <w:r>
+        <w:rPr>
+          <w:noProof/>
+        </w:rPr>
+        <w:instrText xml:space="preserve"> PAGEREF _Toc407145095 \h </w:instrText>
+      </w:r>
+      <w:r>
+        <w:rPr>
+          <w:noProof/>
+        </w:rPr>
+      </w:r>
+      <w:r>
+        <w:rPr>
+          <w:noProof/>
+        </w:rPr>
+        <w:fldChar w:fldCharType="separate"/>
+      </w:r>
+      <w:r>
+        <w:rPr>
+          <w:noProof/>
+        </w:rPr>
+        <w:t>2</w:t>
+      </w:r>
+      <w:r>
+        <w:rPr>
+          <w:noProof/>
+        </w:rPr>
+        <w:fldChar w:fldCharType="end"/>
+      </w:r>
+    </w:p>
+    <w:p>
+      <w:pPr>
         <w:pStyle w:val="TOC1"/>
         <w:rPr>
           <w:rFonts w:asciiTheme="minorHAnsi" w:eastAsiaTheme="minorEastAsia" w:hAnsiTheme="minorHAnsi" w:cstheme="minorBidi"/>
@@ -2510,78 +2185,26 @@
       <w:pPr>
         <w:pStyle w:val="TOC2"/>
         <w:rPr>
-          <w:rFonts w:asciiTheme="minorHAnsi" w:eastAsiaTheme="minorEastAsia" w:hAnsiTheme="minorHAnsi" w:cstheme="minorBidi"/>
-          <w:noProof/>
-          <w:sz w:val="22"/>
-          <w:szCs w:val="22"/>
-        </w:rPr>
-      </w:pPr>
-      <w:r>
-        <w:rPr>
-          <w:noProof/>
-        </w:rPr>
-        <w:t xml:space="preserve">2.1  </w:t>
-      </w:r>
-      <w:r>
-        <w:rPr>
-          <w:noProof/>
-        </w:rPr>
-        <w:t>Proof of concept</w:t>
-      </w:r>
-      <w:r>
-        <w:rPr>
-          <w:noProof/>
-        </w:rPr>
-        <w:tab/>
-      </w:r>
-      <w:r>
-        <w:rPr>
-          <w:noProof/>
-        </w:rPr>
-        <w:fldChar w:fldCharType="begin"/>
-      </w:r>
-      <w:r>
-        <w:rPr>
-          <w:noProof/>
-        </w:rPr>
-        <w:instrText xml:space="preserve"> PAGEREF _Toc407145095 \h </w:instrText>
-      </w:r>
-      <w:r>
-        <w:rPr>
-          <w:noProof/>
-        </w:rPr>
-      </w:r>
-      <w:r>
-        <w:rPr>
-          <w:noProof/>
-        </w:rPr>
-        <w:fldChar w:fldCharType="separate"/>
-      </w:r>
-      <w:r>
-        <w:rPr>
-          <w:noProof/>
-        </w:rPr>
-        <w:t>2</w:t>
-      </w:r>
-      <w:r>
-        <w:rPr>
-          <w:noProof/>
-        </w:rPr>
-        <w:fldChar w:fldCharType="end"/>
-      </w:r>
-    </w:p>
-    <w:p>
-      <w:pPr>
-        <w:pStyle w:val="TOC2"/>
-        <w:rPr>
-          <w:noProof/>
-        </w:rPr>
-      </w:pPr>
-      <w:r>
-        <w:rPr>
-          <w:noProof/>
-        </w:rPr>
-        <w:t xml:space="preserve">2.2  </w:t>
+          <w:noProof/>
+        </w:rPr>
+      </w:pPr>
+      <w:r>
+        <w:rPr>
+          <w:noProof/>
+        </w:rPr>
+        <w:t>2.</w:t>
+      </w:r>
+      <w:r>
+        <w:rPr>
+          <w:noProof/>
+        </w:rPr>
+        <w:t>1</w:t>
+      </w:r>
+      <w:r>
+        <w:rPr>
+          <w:noProof/>
+        </w:rPr>
+        <w:t xml:space="preserve">  </w:t>
       </w:r>
       <w:r>
         <w:rPr>
@@ -2754,7 +2377,19 @@
         <w:rPr>
           <w:noProof/>
         </w:rPr>
-        <w:t xml:space="preserve">2.3  </w:t>
+        <w:t>2.</w:t>
+      </w:r>
+      <w:r>
+        <w:rPr>
+          <w:noProof/>
+        </w:rPr>
+        <w:t>2</w:t>
+      </w:r>
+      <w:r>
+        <w:rPr>
+          <w:noProof/>
+        </w:rPr>
+        <w:t xml:space="preserve">  </w:t>
       </w:r>
       <w:r>
         <w:rPr>
@@ -3700,14 +3335,64 @@
           <w:sz w:val="22"/>
           <w:szCs w:val="22"/>
         </w:rPr>
-        <w:t xml:space="preserve">The use of spell checking in modern day computer systems is almost universal. From search engines to coding software, people have become reliant on computers to be able to not only fix spelling mistakes as they go along with their work, but even offer suggestions to better ways of writing. Such widespread use of this kind of system requires a large amount of processing of many words. For the English language, it is estimated that there are around </w:t>
-      </w:r>
-      <w:r>
-        <w:rPr>
-          <w:sz w:val="22"/>
-          <w:szCs w:val="22"/>
-        </w:rPr>
-        <w:t>&lt;n&gt;</w:t>
+        <w:t xml:space="preserve">The use of spell checking in modern day computer systems is almost universal. From search engines to coding software, people have become reliant on computers to be able to not only fix spelling mistakes as they go along with their work, but even offer suggestions to better ways of writing. </w:t>
+      </w:r>
+      <w:r>
+        <w:rPr>
+          <w:sz w:val="22"/>
+          <w:szCs w:val="22"/>
+        </w:rPr>
+        <w:t>The benefits of such mechanisms are that they reduce the workload on the person writing on their machine, given that it  can not only prevent them type/retyping badly written words, but in some cases predict what they are wanting to say and therefore cut the time to complete their work drastically.</w:t>
+      </w:r>
+    </w:p>
+    <w:p>
+      <w:pPr>
+        <w:rPr>
+          <w:sz w:val="22"/>
+          <w:szCs w:val="22"/>
+        </w:rPr>
+      </w:pPr>
+      <w:r>
+        <w:rPr>
+          <w:sz w:val="22"/>
+          <w:szCs w:val="22"/>
+        </w:rPr>
+        <w:t xml:space="preserve">Such widespread use of this kind of system requires a large amount of processing of </w:t>
+      </w:r>
+      <w:r>
+        <w:rPr>
+          <w:sz w:val="22"/>
+          <w:szCs w:val="22"/>
+        </w:rPr>
+        <w:t>word processing, which also needs to be done in real time given the nature of what this is for</w:t>
+      </w:r>
+      <w:r>
+        <w:rPr>
+          <w:sz w:val="22"/>
+          <w:szCs w:val="22"/>
+        </w:rPr>
+        <w:t xml:space="preserve">. </w:t>
+      </w:r>
+      <w:r>
+        <w:rPr>
+          <w:sz w:val="22"/>
+          <w:szCs w:val="22"/>
+        </w:rPr>
+        <w:t>With</w:t>
+      </w:r>
+      <w:r>
+        <w:rPr>
+          <w:sz w:val="22"/>
+          <w:szCs w:val="22"/>
+        </w:rPr>
+        <w:t xml:space="preserve"> the English language, it is estimated that there are around </w:t>
+      </w:r>
+      <w:r>
+        <w:rPr>
+          <w:sz w:val="22"/>
+          <w:szCs w:val="22"/>
+        </w:rPr>
+        <w:t>170,000</w:t>
       </w:r>
       <w:r>
         <w:rPr>
@@ -3729,7 +3414,14 @@
           <w:sz w:val="22"/>
           <w:szCs w:val="22"/>
         </w:rPr>
-        <w:t xml:space="preserve">As such, </w:t>
+        <w:t>Therefore</w:t>
+      </w:r>
+      <w:r>
+        <w:rPr>
+          <w:sz w:val="22"/>
+          <w:szCs w:val="22"/>
+        </w:rPr>
+        <w:t xml:space="preserve">, </w:t>
       </w:r>
       <w:r>
         <w:rPr>
@@ -3757,6 +3449,11 @@
       </w:r>
     </w:p>
     <w:p>
+      <w:r>
+        <w:t>As the primary means of testing how close two strings are, a series of string metric or string similarity metric algorithms were chosen. These algorithms are designed to measure the distance between two strings, which is useful is our case as the program can take a given string, and then check its similarity to all other strings to give optimal suggestions to misspellings. Some are heavily used in not only natural language processing systems, but also in other fields such as image analysis, machine learning, data mining and many other integrations.</w:t>
+      </w:r>
+    </w:p>
+    <w:p>
       <w:pPr>
         <w:pStyle w:val="Heading2"/>
         <w:rPr>
@@ -3769,6 +3466,7 @@
           <w:sz w:val="22"/>
           <w:szCs w:val="22"/>
         </w:rPr>
+        <w:lastRenderedPageBreak/>
         <w:t>1.2.1  Levenshtein Distance</w:t>
       </w:r>
     </w:p>
@@ -3819,14 +3517,12 @@
       <w:r>
         <w:rPr>
           <w:noProof/>
-          <w:sz w:val="22"/>
-          <w:szCs w:val="22"/>
         </w:rPr>
         <w:drawing>
-          <wp:inline distT="0" distB="0" distL="0" distR="0" wp14:anchorId="32DA3926" wp14:editId="52751527">
-            <wp:extent cx="5095875" cy="2237420"/>
-            <wp:effectExtent l="19050" t="19050" r="9525" b="10795"/>
-            <wp:docPr id="1537603008" name="Picture 1" descr="A screenshot of a computer program&#10;&#10;Description automatically generated"/>
+          <wp:inline distT="0" distB="0" distL="0" distR="0" wp14:anchorId="5232C598" wp14:editId="7A90A8DE">
+            <wp:extent cx="5581650" cy="2390104"/>
+            <wp:effectExtent l="19050" t="19050" r="19050" b="10795"/>
+            <wp:docPr id="902225645" name="Picture 1" descr="A computer screen shot of a computer code"/>
             <wp:cNvGraphicFramePr>
               <a:graphicFrameLocks xmlns:a="http://schemas.openxmlformats.org/drawingml/2006/main" noChangeAspect="1"/>
             </wp:cNvGraphicFramePr>
@@ -3834,7 +3530,7 @@
               <a:graphicData uri="http://schemas.openxmlformats.org/drawingml/2006/picture">
                 <pic:pic xmlns:pic="http://schemas.openxmlformats.org/drawingml/2006/picture">
                   <pic:nvPicPr>
-                    <pic:cNvPr id="1537603008" name="Picture 1" descr="A screenshot of a computer program&#10;&#10;Description automatically generated"/>
+                    <pic:cNvPr id="902225645" name="Picture 1" descr="A computer screen shot of a computer code"/>
                     <pic:cNvPicPr/>
                   </pic:nvPicPr>
                   <pic:blipFill>
@@ -3846,7 +3542,7 @@
                   <pic:spPr>
                     <a:xfrm>
                       <a:off x="0" y="0"/>
-                      <a:ext cx="5103964" cy="2240972"/>
+                      <a:ext cx="5584820" cy="2391461"/>
                     </a:xfrm>
                     <a:prstGeom prst="rect">
                       <a:avLst/>
@@ -3887,7 +3583,6 @@
           <w:sz w:val="22"/>
           <w:szCs w:val="22"/>
         </w:rPr>
-        <w:lastRenderedPageBreak/>
         <w:t>Figure 1</w:t>
       </w:r>
       <w:r>
@@ -4082,6 +3777,7 @@
           <w:sz w:val="22"/>
           <w:szCs w:val="22"/>
         </w:rPr>
+        <w:lastRenderedPageBreak/>
         <w:t xml:space="preserve">Figure 2. </w:t>
       </w:r>
       <w:r>
@@ -4145,7 +3841,6 @@
           <w:sz w:val="22"/>
           <w:szCs w:val="22"/>
         </w:rPr>
-        <w:lastRenderedPageBreak/>
         <w:t>1.2.3  Damerau Levenshtein Distance</w:t>
       </w:r>
     </w:p>
@@ -4234,14 +3929,7 @@
           <w:sz w:val="22"/>
           <w:szCs w:val="22"/>
         </w:rPr>
-        <w:t xml:space="preserve"> </w:t>
-      </w:r>
-      <w:r>
-        <w:rPr>
-          <w:sz w:val="22"/>
-          <w:szCs w:val="22"/>
-        </w:rPr>
-        <w:t xml:space="preserve">(from: </w:t>
+        <w:t xml:space="preserve"> (from: </w:t>
       </w:r>
       <w:hyperlink r:id="rId15" w:history="1">
         <w:r>
@@ -4298,6 +3986,7 @@
           <w:sz w:val="22"/>
           <w:szCs w:val="22"/>
         </w:rPr>
+        <w:lastRenderedPageBreak/>
         <w:t>1.2.4  Hamming Distance</w:t>
       </w:r>
     </w:p>
@@ -4394,15 +4083,7 @@
           <w:sz w:val="22"/>
           <w:szCs w:val="22"/>
         </w:rPr>
-        <w:t xml:space="preserve">This is the simplest algorithm tested, given that it only works on strings of the same length. This method goes through both words, updating a local count if any characters are different </w:t>
-      </w:r>
-      <w:r>
-        <w:rPr>
-          <w:sz w:val="22"/>
-          <w:szCs w:val="22"/>
-        </w:rPr>
-        <w:lastRenderedPageBreak/>
-        <w:t xml:space="preserve">at a certain index. The final count is the distance between the two strings, where a score of zero means they are identical, while large scores indicate larger divergence. </w:t>
+        <w:t xml:space="preserve">This is the simplest algorithm tested, given that it only works on strings of the same length. This method goes through both words, updating a local count if any characters are different at a certain index. The final count is the distance between the two strings, where a score of zero means they are identical, while large scores indicate larger divergence. </w:t>
       </w:r>
     </w:p>
     <w:p>
@@ -4499,35 +4180,7 @@
           <w:sz w:val="22"/>
           <w:szCs w:val="22"/>
         </w:rPr>
-        <w:t xml:space="preserve"> </w:t>
-      </w:r>
-      <w:r>
-        <w:rPr>
-          <w:sz w:val="22"/>
-          <w:szCs w:val="22"/>
-        </w:rPr>
-        <w:t>Sørensen–Dice</w:t>
-      </w:r>
-      <w:r>
-        <w:rPr>
-          <w:sz w:val="22"/>
-          <w:szCs w:val="22"/>
-        </w:rPr>
-        <w:t xml:space="preserve"> C</w:t>
-      </w:r>
-      <w:r>
-        <w:rPr>
-          <w:sz w:val="22"/>
-          <w:szCs w:val="22"/>
-        </w:rPr>
-        <w:t>oefficient</w:t>
-      </w:r>
-      <w:r>
-        <w:rPr>
-          <w:sz w:val="22"/>
-          <w:szCs w:val="22"/>
-        </w:rPr>
-        <w:t xml:space="preserve"> string algorithm</w:t>
+        <w:t xml:space="preserve"> Sørensen–Dice Coefficient string algorithm</w:t>
       </w:r>
       <w:r>
         <w:rPr>
@@ -4576,6 +4229,7 @@
               <w:sz w:val="22"/>
               <w:szCs w:val="22"/>
             </w:rPr>
+            <w:lastRenderedPageBreak/>
             <m:t>s=</m:t>
           </m:r>
           <m:f>
@@ -4889,7 +4543,6 @@
           <w:sz w:val="22"/>
           <w:szCs w:val="22"/>
         </w:rPr>
-        <w:lastRenderedPageBreak/>
         <w:t>1.2.4  Jaro Distance</w:t>
       </w:r>
     </w:p>
@@ -5003,21 +4656,7 @@
           <w:sz w:val="22"/>
           <w:szCs w:val="22"/>
         </w:rPr>
-        <w:t xml:space="preserve">Like the </w:t>
-      </w:r>
-      <w:r>
-        <w:rPr>
-          <w:sz w:val="22"/>
-          <w:szCs w:val="22"/>
-        </w:rPr>
-        <w:t>Sørensen–Dice Coefficient</w:t>
-      </w:r>
-      <w:r>
-        <w:rPr>
-          <w:sz w:val="22"/>
-          <w:szCs w:val="22"/>
-        </w:rPr>
-        <w:t xml:space="preserve"> algorithm, Jaro distance scores strings on a scale of 0 to 1, where the more similar the words are, the closer the final value is to 1.</w:t>
+        <w:t>Like the Sørensen–Dice Coefficient algorithm, Jaro distance scores strings on a scale of 0 to 1, where the more similar the words are, the closer the final value is to 1.</w:t>
       </w:r>
       <w:r>
         <w:rPr>
@@ -5115,46 +4754,14 @@
           <w:sz w:val="22"/>
           <w:szCs w:val="22"/>
         </w:rPr>
-        <w:t xml:space="preserve">Figure </w:t>
-      </w:r>
-      <w:r>
-        <w:rPr>
-          <w:b/>
-          <w:bCs/>
-          <w:sz w:val="22"/>
-          <w:szCs w:val="22"/>
-        </w:rPr>
-        <w:t>7</w:t>
-      </w:r>
-      <w:r>
-        <w:rPr>
-          <w:b/>
-          <w:bCs/>
-          <w:sz w:val="22"/>
-          <w:szCs w:val="22"/>
-        </w:rPr>
-        <w:t>.</w:t>
-      </w:r>
-      <w:r>
-        <w:rPr>
-          <w:sz w:val="22"/>
-          <w:szCs w:val="22"/>
-        </w:rPr>
-        <w:t xml:space="preserve"> Jaro</w:t>
-      </w:r>
-      <w:r>
-        <w:rPr>
-          <w:sz w:val="22"/>
-          <w:szCs w:val="22"/>
-        </w:rPr>
-        <w:t>-Winkler</w:t>
-      </w:r>
-      <w:r>
-        <w:rPr>
-          <w:sz w:val="22"/>
-          <w:szCs w:val="22"/>
-        </w:rPr>
-        <w:t xml:space="preserve"> Distance algorithm (pseudocode adapted from: </w:t>
+        <w:t>Figure 7.</w:t>
+      </w:r>
+      <w:r>
+        <w:rPr>
+          <w:sz w:val="22"/>
+          <w:szCs w:val="22"/>
+        </w:rPr>
+        <w:t xml:space="preserve"> Jaro-Winkler Distance algorithm (pseudocode adapted from: </w:t>
       </w:r>
       <w:hyperlink r:id="rId21" w:history="1">
         <w:r>
@@ -5473,43 +5080,6 @@
           <w:sz w:val="22"/>
           <w:szCs w:val="22"/>
         </w:rPr>
-        <w:t xml:space="preserve">&lt;This section heading is purely a suggestion -- you should subdivide this chapter in whatever manner you think makes most sense for your project. It may also make sense to spread the `Background Research' over more than one chapter, in which case they should be named </w:t>
-      </w:r>
-      <w:r>
-        <w:rPr>
-          <w:sz w:val="22"/>
-          <w:szCs w:val="22"/>
-        </w:rPr>
-        <w:t>sensibly</w:t>
-      </w:r>
-      <w:r>
-        <w:rPr>
-          <w:sz w:val="22"/>
-          <w:szCs w:val="22"/>
-        </w:rPr>
-        <w:t>.&gt;</w:t>
-      </w:r>
-    </w:p>
-    <w:p>
-      <w:pPr>
-        <w:rPr>
-          <w:sz w:val="22"/>
-          <w:szCs w:val="22"/>
-        </w:rPr>
-      </w:pPr>
-    </w:p>
-    <w:p>
-      <w:pPr>
-        <w:rPr>
-          <w:sz w:val="22"/>
-          <w:szCs w:val="22"/>
-        </w:rPr>
-      </w:pPr>
-      <w:r>
-        <w:rPr>
-          <w:sz w:val="22"/>
-          <w:szCs w:val="22"/>
-        </w:rPr>
         <w:t>Study used:</w:t>
       </w:r>
       <w:r>
@@ -5538,99 +5108,538 @@
           <w:sz w:val="22"/>
           <w:szCs w:val="22"/>
         </w:rPr>
+        <w:t xml:space="preserve">For some cases of developing spell checkers the implementation seems quite simple and straightforward. As outlined in </w:t>
+      </w:r>
+      <w:r>
+        <w:rPr>
+          <w:sz w:val="22"/>
+          <w:szCs w:val="22"/>
+        </w:rPr>
+        <w:t>the 2015 paper</w:t>
+      </w:r>
+      <w:r>
+        <w:rPr>
+          <w:sz w:val="22"/>
+          <w:szCs w:val="22"/>
+        </w:rPr>
+        <w:t xml:space="preserve"> titled</w:t>
+      </w:r>
+      <w:r>
+        <w:rPr>
+          <w:sz w:val="22"/>
+          <w:szCs w:val="22"/>
+        </w:rPr>
+        <w:t xml:space="preserve"> ‘Spell Checker’</w:t>
+      </w:r>
+      <w:r>
+        <w:rPr>
+          <w:rStyle w:val="FootnoteReference"/>
+          <w:szCs w:val="22"/>
+        </w:rPr>
+        <w:footnoteReference w:id="1"/>
+      </w:r>
+      <w:r>
+        <w:rPr>
+          <w:sz w:val="22"/>
+          <w:szCs w:val="22"/>
+        </w:rPr>
+        <w:t xml:space="preserve">, the obvious choice would be to use the </w:t>
+      </w:r>
+      <w:r>
+        <w:rPr>
+          <w:sz w:val="22"/>
+          <w:szCs w:val="22"/>
+        </w:rPr>
+        <w:t xml:space="preserve">Levenshtein distance algorithm </w:t>
+      </w:r>
+      <w:r>
+        <w:rPr>
+          <w:sz w:val="22"/>
+          <w:szCs w:val="22"/>
+        </w:rPr>
+        <w:t xml:space="preserve">to calculate the difference between </w:t>
+      </w:r>
+      <w:r>
+        <w:rPr>
+          <w:sz w:val="22"/>
+          <w:szCs w:val="22"/>
+        </w:rPr>
+        <w:t xml:space="preserve">an entered word and a word in a generated dictionary. They argue that </w:t>
+      </w:r>
+      <w:r>
+        <w:rPr>
+          <w:sz w:val="22"/>
+          <w:szCs w:val="22"/>
+        </w:rPr>
+        <w:t>using</w:t>
+      </w:r>
+      <w:r>
+        <w:rPr>
+          <w:sz w:val="22"/>
+          <w:szCs w:val="22"/>
+        </w:rPr>
+        <w:t xml:space="preserve"> the method, it can produce </w:t>
+      </w:r>
+      <w:r>
+        <w:rPr>
+          <w:sz w:val="22"/>
+          <w:szCs w:val="22"/>
+        </w:rPr>
+        <w:t>a</w:t>
+      </w:r>
+      <w:r>
+        <w:rPr>
+          <w:sz w:val="22"/>
+          <w:szCs w:val="22"/>
+        </w:rPr>
+        <w:t xml:space="preserve"> list of suggestions by comparing a misspelled word to those in a dictionary the program has access to, one of which should be correct spelling of the word. </w:t>
+      </w:r>
+      <w:r>
+        <w:rPr>
+          <w:sz w:val="22"/>
+          <w:szCs w:val="22"/>
+        </w:rPr>
+        <w:t xml:space="preserve">The also make </w:t>
+      </w:r>
+      <w:r>
+        <w:rPr>
+          <w:sz w:val="22"/>
+          <w:szCs w:val="22"/>
+        </w:rPr>
         <w:lastRenderedPageBreak/>
-        <w:t xml:space="preserve">For some cases of developing spell checkers the implementation seems quite simple and straightforward. As outlined in </w:t>
-      </w:r>
-      <w:r>
-        <w:rPr>
-          <w:sz w:val="22"/>
-          <w:szCs w:val="22"/>
-        </w:rPr>
-        <w:t>the 2015 paper</w:t>
-      </w:r>
-      <w:r>
-        <w:rPr>
-          <w:sz w:val="22"/>
-          <w:szCs w:val="22"/>
-        </w:rPr>
-        <w:t xml:space="preserve"> titled</w:t>
-      </w:r>
-      <w:r>
-        <w:rPr>
-          <w:sz w:val="22"/>
-          <w:szCs w:val="22"/>
-        </w:rPr>
-        <w:t xml:space="preserve"> ‘Spell Checker’</w:t>
-      </w:r>
-      <w:r>
-        <w:rPr>
-          <w:rStyle w:val="FootnoteReference"/>
-          <w:szCs w:val="22"/>
-        </w:rPr>
-        <w:footnoteReference w:id="1"/>
-      </w:r>
-      <w:r>
-        <w:rPr>
-          <w:sz w:val="22"/>
-          <w:szCs w:val="22"/>
-        </w:rPr>
-        <w:t xml:space="preserve">, the obvious choice would be to use the </w:t>
-      </w:r>
-      <w:r>
-        <w:rPr>
-          <w:sz w:val="22"/>
-          <w:szCs w:val="22"/>
-        </w:rPr>
-        <w:t xml:space="preserve">Levenshtein distance algorithm </w:t>
-      </w:r>
-      <w:r>
-        <w:rPr>
-          <w:sz w:val="22"/>
-          <w:szCs w:val="22"/>
-        </w:rPr>
-        <w:t xml:space="preserve">to calculate the difference between </w:t>
-      </w:r>
-      <w:r>
-        <w:rPr>
-          <w:sz w:val="22"/>
-          <w:szCs w:val="22"/>
-        </w:rPr>
-        <w:t xml:space="preserve">an entered word and a word in a generated dictionary. They argue that </w:t>
-      </w:r>
-      <w:r>
-        <w:rPr>
-          <w:sz w:val="22"/>
-          <w:szCs w:val="22"/>
-        </w:rPr>
-        <w:t>using</w:t>
-      </w:r>
-      <w:r>
-        <w:rPr>
-          <w:sz w:val="22"/>
-          <w:szCs w:val="22"/>
-        </w:rPr>
-        <w:t xml:space="preserve"> the method, it can produce </w:t>
-      </w:r>
-      <w:r>
-        <w:rPr>
-          <w:sz w:val="22"/>
-          <w:szCs w:val="22"/>
-        </w:rPr>
-        <w:t>a</w:t>
-      </w:r>
-      <w:r>
-        <w:rPr>
-          <w:sz w:val="22"/>
-          <w:szCs w:val="22"/>
-        </w:rPr>
-        <w:t xml:space="preserve"> list of suggestions by comparing a misspelled word to those in a dictionary the program has access to, one of which should be correct spelling of the word. </w:t>
-      </w:r>
-      <w:r>
-        <w:rPr>
-          <w:sz w:val="22"/>
-          <w:szCs w:val="22"/>
-        </w:rPr>
-        <w:t>The also make the point to say that the algorithm provides easy identification of misspellings and can offer results very quickly, reducing the runtime of the application used.</w:t>
+        <w:t>the point to say that the algorithm provides easy identification of misspellings and can offer results very quickly, reducing the runtime of the application used.</w:t>
+      </w:r>
+    </w:p>
+    <w:p>
+      <w:pPr>
+        <w:rPr>
+          <w:sz w:val="22"/>
+          <w:szCs w:val="22"/>
+        </w:rPr>
+      </w:pPr>
+    </w:p>
+    <w:p>
+      <w:pPr>
+        <w:pStyle w:val="Heading2"/>
+      </w:pPr>
+      <w:r>
+        <w:t>1</w:t>
+      </w:r>
+      <w:r>
+        <w:t>.</w:t>
+      </w:r>
+      <w:r>
+        <w:t>5</w:t>
+      </w:r>
+      <w:r>
+        <w:t xml:space="preserve">  </w:t>
+      </w:r>
+      <w:r>
+        <w:t>Proof of Concept</w:t>
+      </w:r>
+    </w:p>
+    <w:p>
+      <w:pPr>
+        <w:rPr>
+          <w:sz w:val="22"/>
+          <w:szCs w:val="18"/>
+        </w:rPr>
+      </w:pPr>
+      <w:r>
+        <w:rPr>
+          <w:sz w:val="22"/>
+          <w:szCs w:val="18"/>
+        </w:rPr>
+        <w:t>To</w:t>
+      </w:r>
+      <w:r>
+        <w:rPr>
+          <w:sz w:val="22"/>
+          <w:szCs w:val="18"/>
+        </w:rPr>
+        <w:t xml:space="preserve"> test the viability of a </w:t>
+      </w:r>
+      <w:r>
+        <w:rPr>
+          <w:sz w:val="22"/>
+          <w:szCs w:val="18"/>
+        </w:rPr>
+        <w:t>spell-checking</w:t>
+      </w:r>
+      <w:r>
+        <w:rPr>
+          <w:sz w:val="22"/>
+          <w:szCs w:val="18"/>
+        </w:rPr>
+        <w:t xml:space="preserve"> system, a </w:t>
+      </w:r>
+      <w:r>
+        <w:rPr>
+          <w:sz w:val="22"/>
+          <w:szCs w:val="18"/>
+        </w:rPr>
+        <w:t>prototype was created. This was made to be as simple as possible, so that a general understanding of how such a program would work, as well as test if a solution was indeed possible in reasonable time. For this, the C programming language was used, as it is a compiler language which means that it can run much faster than interpreter languages like Python. It was also used because the main system would be using C and the lessons learned from this prototype could be exploited in the final product.</w:t>
+      </w:r>
+    </w:p>
+    <w:p>
+      <w:pPr>
+        <w:rPr>
+          <w:b/>
+          <w:bCs/>
+          <w:sz w:val="22"/>
+          <w:szCs w:val="18"/>
+        </w:rPr>
+      </w:pPr>
+      <w:r>
+        <w:rPr>
+          <w:b/>
+          <w:bCs/>
+          <w:sz w:val="22"/>
+          <w:szCs w:val="18"/>
+        </w:rPr>
+        <w:t>1</w:t>
+      </w:r>
+      <w:r>
+        <w:rPr>
+          <w:b/>
+          <w:bCs/>
+          <w:sz w:val="22"/>
+          <w:szCs w:val="18"/>
+        </w:rPr>
+        <w:t>.</w:t>
+      </w:r>
+      <w:r>
+        <w:rPr>
+          <w:b/>
+          <w:bCs/>
+          <w:sz w:val="22"/>
+          <w:szCs w:val="18"/>
+        </w:rPr>
+        <w:t>5</w:t>
+      </w:r>
+      <w:r>
+        <w:rPr>
+          <w:b/>
+          <w:bCs/>
+          <w:sz w:val="22"/>
+          <w:szCs w:val="18"/>
+        </w:rPr>
+        <w:t>.1 Design</w:t>
+      </w:r>
+    </w:p>
+    <w:p>
+      <w:pPr>
+        <w:jc w:val="center"/>
+        <w:rPr>
+          <w:b/>
+          <w:bCs/>
+          <w:sz w:val="22"/>
+          <w:szCs w:val="18"/>
+        </w:rPr>
+      </w:pPr>
+      <w:r>
+        <w:rPr>
+          <w:noProof/>
+          <w:sz w:val="22"/>
+          <w:szCs w:val="18"/>
+        </w:rPr>
+        <w:drawing>
+          <wp:inline distT="0" distB="0" distL="0" distR="0" wp14:anchorId="29EDEFC3" wp14:editId="63D59576">
+            <wp:extent cx="2752725" cy="4108188"/>
+            <wp:effectExtent l="19050" t="19050" r="0" b="6985"/>
+            <wp:docPr id="414029169" name="Picture 1" descr="A diagram of a word&#10;&#10;Description automatically generated"/>
+            <wp:cNvGraphicFramePr>
+              <a:graphicFrameLocks xmlns:a="http://schemas.openxmlformats.org/drawingml/2006/main" noChangeAspect="1"/>
+            </wp:cNvGraphicFramePr>
+            <a:graphic xmlns:a="http://schemas.openxmlformats.org/drawingml/2006/main">
+              <a:graphicData uri="http://schemas.openxmlformats.org/drawingml/2006/picture">
+                <pic:pic xmlns:pic="http://schemas.openxmlformats.org/drawingml/2006/picture">
+                  <pic:nvPicPr>
+                    <pic:cNvPr id="414029169" name="Picture 1" descr="A diagram of a word&#10;&#10;Description automatically generated"/>
+                    <pic:cNvPicPr/>
+                  </pic:nvPicPr>
+                  <pic:blipFill>
+                    <a:blip r:embed="rId23"/>
+                    <a:stretch>
+                      <a:fillRect/>
+                    </a:stretch>
+                  </pic:blipFill>
+                  <pic:spPr>
+                    <a:xfrm>
+                      <a:off x="0" y="0"/>
+                      <a:ext cx="2756355" cy="4113605"/>
+                    </a:xfrm>
+                    <a:prstGeom prst="rect">
+                      <a:avLst/>
+                    </a:prstGeom>
+                    <a:ln>
+                      <a:solidFill>
+                        <a:schemeClr val="tx1"/>
+                      </a:solidFill>
+                    </a:ln>
+                  </pic:spPr>
+                </pic:pic>
+              </a:graphicData>
+            </a:graphic>
+          </wp:inline>
+        </w:drawing>
+      </w:r>
+    </w:p>
+    <w:p>
+      <w:pPr>
+        <w:jc w:val="center"/>
+        <w:rPr>
+          <w:sz w:val="22"/>
+          <w:szCs w:val="18"/>
+        </w:rPr>
+      </w:pPr>
+      <w:r>
+        <w:rPr>
+          <w:b/>
+          <w:bCs/>
+          <w:sz w:val="22"/>
+          <w:szCs w:val="18"/>
+        </w:rPr>
+        <w:t>Figure</w:t>
+      </w:r>
+      <w:r>
+        <w:rPr>
+          <w:b/>
+          <w:bCs/>
+          <w:sz w:val="22"/>
+          <w:szCs w:val="18"/>
+        </w:rPr>
+        <w:t xml:space="preserve"> 8. </w:t>
+      </w:r>
+      <w:r>
+        <w:rPr>
+          <w:sz w:val="22"/>
+          <w:szCs w:val="18"/>
+        </w:rPr>
+        <w:t>Flowchart for proof of concept</w:t>
+      </w:r>
+    </w:p>
+    <w:p>
+      <w:pPr>
+        <w:rPr>
+          <w:sz w:val="22"/>
+          <w:szCs w:val="18"/>
+        </w:rPr>
+      </w:pPr>
+      <w:r>
+        <w:rPr>
+          <w:sz w:val="22"/>
+          <w:szCs w:val="18"/>
+        </w:rPr>
+        <w:t xml:space="preserve">The proof of concept was very simple in nature, as the system would </w:t>
+      </w:r>
+      <w:r>
+        <w:rPr>
+          <w:sz w:val="22"/>
+          <w:szCs w:val="18"/>
+        </w:rPr>
+        <w:t xml:space="preserve">not perform any word list generation. Instead of having a corpus from which words could be extracted and then stored at runtime, this system instead assumed that words were already compiled and sorted in alphabetical order. Therefore, all that was needed of the code was to store the list </w:t>
+      </w:r>
+      <w:r>
+        <w:rPr>
+          <w:sz w:val="22"/>
+          <w:szCs w:val="18"/>
+        </w:rPr>
+        <w:lastRenderedPageBreak/>
+        <w:t>in its entirety while performing, then allow the user to enter a string, whereby the code would give a simple response as to whether the word exists in the list or not.</w:t>
+      </w:r>
+    </w:p>
+    <w:p>
+      <w:pPr>
+        <w:rPr>
+          <w:sz w:val="22"/>
+          <w:szCs w:val="18"/>
+        </w:rPr>
+      </w:pPr>
+      <w:r>
+        <w:rPr>
+          <w:sz w:val="22"/>
+          <w:szCs w:val="18"/>
+        </w:rPr>
+        <w:t xml:space="preserve">In this case, the prototype therefore didn’t use any </w:t>
+      </w:r>
+      <w:r>
+        <w:rPr>
+          <w:sz w:val="22"/>
+          <w:szCs w:val="18"/>
+        </w:rPr>
+        <w:t xml:space="preserve">string metric algorithms, but was instead a show that even a simple system which doesn’t use massive data servers or high-performance computing, can </w:t>
+      </w:r>
+      <w:r>
+        <w:rPr>
+          <w:sz w:val="22"/>
+          <w:szCs w:val="18"/>
+        </w:rPr>
+        <w:t>run,</w:t>
+      </w:r>
+      <w:r>
+        <w:rPr>
+          <w:sz w:val="22"/>
+          <w:szCs w:val="18"/>
+        </w:rPr>
+        <w:t xml:space="preserve"> and deliver results in reasonable time to the user.</w:t>
+      </w:r>
+    </w:p>
+    <w:p>
+      <w:pPr>
+        <w:rPr>
+          <w:b/>
+          <w:bCs/>
+          <w:sz w:val="22"/>
+          <w:szCs w:val="18"/>
+        </w:rPr>
+      </w:pPr>
+      <w:r>
+        <w:rPr>
+          <w:b/>
+          <w:bCs/>
+          <w:sz w:val="22"/>
+          <w:szCs w:val="18"/>
+        </w:rPr>
+        <w:t>1</w:t>
+      </w:r>
+      <w:r>
+        <w:rPr>
+          <w:b/>
+          <w:bCs/>
+          <w:sz w:val="22"/>
+          <w:szCs w:val="18"/>
+        </w:rPr>
+        <w:t>.</w:t>
+      </w:r>
+      <w:r>
+        <w:rPr>
+          <w:b/>
+          <w:bCs/>
+          <w:sz w:val="22"/>
+          <w:szCs w:val="18"/>
+        </w:rPr>
+        <w:t>5</w:t>
+      </w:r>
+      <w:r>
+        <w:rPr>
+          <w:b/>
+          <w:bCs/>
+          <w:sz w:val="22"/>
+          <w:szCs w:val="18"/>
+        </w:rPr>
+        <w:t xml:space="preserve">.2 </w:t>
+      </w:r>
+      <w:r>
+        <w:rPr>
+          <w:b/>
+          <w:bCs/>
+          <w:sz w:val="22"/>
+          <w:szCs w:val="18"/>
+        </w:rPr>
+        <w:t xml:space="preserve">Results and </w:t>
+      </w:r>
+      <w:r>
+        <w:rPr>
+          <w:b/>
+          <w:bCs/>
+          <w:sz w:val="22"/>
+          <w:szCs w:val="18"/>
+        </w:rPr>
+        <w:t>Conclusions</w:t>
+      </w:r>
+    </w:p>
+    <w:p>
+      <w:pPr>
+        <w:rPr>
+          <w:sz w:val="22"/>
+          <w:szCs w:val="22"/>
+        </w:rPr>
+      </w:pPr>
+      <w:r>
+        <w:rPr>
+          <w:sz w:val="22"/>
+          <w:szCs w:val="22"/>
+        </w:rPr>
+        <w:t xml:space="preserve">The proof of concept ended up using a word list which contained 307,100 words, though this could have been optimised since many of the strings would never be used in modern English and where most likely there as to give an exhaustive file of all possible words that could exist in an English sentence. The word list could also </w:t>
+      </w:r>
+      <w:r>
+        <w:rPr>
+          <w:sz w:val="22"/>
+          <w:szCs w:val="22"/>
+        </w:rPr>
+        <w:t>be</w:t>
+      </w:r>
+      <w:r>
+        <w:rPr>
+          <w:sz w:val="22"/>
+          <w:szCs w:val="22"/>
+        </w:rPr>
+        <w:t xml:space="preserve"> optimised by </w:t>
+      </w:r>
+      <w:r>
+        <w:rPr>
+          <w:sz w:val="22"/>
+          <w:szCs w:val="22"/>
+        </w:rPr>
+        <w:t>using stemming. This also ties into why the file was so large, as it stored all permutations/conjugations of a word. Whereas if stemming was used, then these words would be reduced to their base form and therefore 1 variation per word would be needed to be stored and checked.</w:t>
+      </w:r>
+    </w:p>
+    <w:p>
+      <w:pPr>
+        <w:rPr>
+          <w:sz w:val="22"/>
+          <w:szCs w:val="22"/>
+        </w:rPr>
+      </w:pPr>
+      <w:r>
+        <w:rPr>
+          <w:sz w:val="22"/>
+          <w:szCs w:val="22"/>
+        </w:rPr>
+        <w:t xml:space="preserve">Though even with these imperfections and the large size as a result, the system could handle this very easily. Though the runtime is dependent on the word entered, the </w:t>
+      </w:r>
+      <w:r>
+        <w:rPr>
+          <w:sz w:val="22"/>
+          <w:szCs w:val="22"/>
+        </w:rPr>
+        <w:t xml:space="preserve">system had a </w:t>
+      </w:r>
+      <w:r>
+        <w:rPr>
+          <w:sz w:val="22"/>
+          <w:szCs w:val="22"/>
+        </w:rPr>
+        <w:t>worst-case</w:t>
+      </w:r>
+      <w:r>
+        <w:rPr>
+          <w:sz w:val="22"/>
+          <w:szCs w:val="22"/>
+        </w:rPr>
+        <w:t xml:space="preserve"> scenario runtime of 15.6 </w:t>
+      </w:r>
+      <w:r>
+        <w:rPr>
+          <w:sz w:val="22"/>
+          <w:szCs w:val="22"/>
+        </w:rPr>
+        <w:t>milliseconds</w:t>
+      </w:r>
+      <w:r>
+        <w:rPr>
+          <w:sz w:val="22"/>
+          <w:szCs w:val="22"/>
+        </w:rPr>
+        <w:t>.</w:t>
+      </w:r>
+      <w:r>
+        <w:rPr>
+          <w:sz w:val="22"/>
+          <w:szCs w:val="22"/>
+        </w:rPr>
+        <w:t xml:space="preserve"> If even an inefficient system can perform a check in such little time, then it would be possible to work on more advanced and optimised code in confidence.</w:t>
       </w:r>
     </w:p>
     <w:p>
@@ -5655,14 +5664,6 @@
       <w:r>
         <w:t>Methods</w:t>
       </w:r>
-    </w:p>
-    <w:p>
-      <w:pPr>
-        <w:rPr>
-          <w:sz w:val="22"/>
-          <w:szCs w:val="22"/>
-        </w:rPr>
-      </w:pPr>
       <w:bookmarkStart w:id="11" w:name="_Toc281120924"/>
       <w:bookmarkStart w:id="12" w:name="_Toc281123569"/>
       <w:bookmarkStart w:id="13" w:name="_Toc281125810"/>
@@ -5670,23 +5671,22 @@
       <w:bookmarkStart w:id="15" w:name="_Toc281120923"/>
       <w:bookmarkStart w:id="16" w:name="_Toc281123568"/>
       <w:bookmarkStart w:id="17" w:name="_Toc281125809"/>
-      <w:r>
-        <w:rPr>
-          <w:sz w:val="22"/>
-          <w:szCs w:val="22"/>
-        </w:rPr>
-        <w:t>&lt;Everything that comes under the `Methods' criterion in the mark scheme should be described in one, or possibly more than one, chapter(s).&gt;</w:t>
-      </w:r>
     </w:p>
     <w:p>
       <w:pPr>
         <w:pStyle w:val="Heading2"/>
       </w:pPr>
       <w:r>
-        <w:t xml:space="preserve">2.1  </w:t>
-      </w:r>
-      <w:r>
-        <w:t>Proof of Concept</w:t>
+        <w:t>2.</w:t>
+      </w:r>
+      <w:r>
+        <w:t>1</w:t>
+      </w:r>
+      <w:r>
+        <w:t xml:space="preserve">  </w:t>
+      </w:r>
+      <w:r>
+        <w:t>General Design</w:t>
       </w:r>
     </w:p>
     <w:p>
@@ -5694,29 +5694,597 @@
         <w:rPr>
           <w:b/>
           <w:bCs/>
+          <w:sz w:val="22"/>
+          <w:szCs w:val="18"/>
         </w:rPr>
       </w:pPr>
       <w:r>
         <w:rPr>
           <w:b/>
           <w:bCs/>
-        </w:rPr>
-        <w:t>2.1.1 Design</w:t>
-      </w:r>
-    </w:p>
-    <w:p>
-      <w:pPr>
+          <w:sz w:val="22"/>
+          <w:szCs w:val="18"/>
+        </w:rPr>
+        <w:t>2</w:t>
+      </w:r>
+      <w:r>
         <w:rPr>
           <w:b/>
           <w:bCs/>
-        </w:rPr>
-      </w:pPr>
+          <w:sz w:val="22"/>
+          <w:szCs w:val="18"/>
+        </w:rPr>
+        <w:t>.</w:t>
+      </w:r>
       <w:r>
         <w:rPr>
           <w:b/>
           <w:bCs/>
-        </w:rPr>
-        <w:t>2.1.2 Conclusions</w:t>
+          <w:sz w:val="22"/>
+          <w:szCs w:val="18"/>
+        </w:rPr>
+        <w:t>1</w:t>
+      </w:r>
+      <w:r>
+        <w:rPr>
+          <w:b/>
+          <w:bCs/>
+          <w:sz w:val="22"/>
+          <w:szCs w:val="18"/>
+        </w:rPr>
+        <w:t>.</w:t>
+      </w:r>
+      <w:r>
+        <w:rPr>
+          <w:b/>
+          <w:bCs/>
+          <w:sz w:val="22"/>
+          <w:szCs w:val="18"/>
+        </w:rPr>
+        <w:t>1</w:t>
+      </w:r>
+      <w:r>
+        <w:rPr>
+          <w:b/>
+          <w:bCs/>
+          <w:sz w:val="22"/>
+          <w:szCs w:val="18"/>
+        </w:rPr>
+        <w:t xml:space="preserve"> </w:t>
+      </w:r>
+      <w:r>
+        <w:rPr>
+          <w:b/>
+          <w:bCs/>
+          <w:sz w:val="22"/>
+          <w:szCs w:val="18"/>
+        </w:rPr>
+        <w:t>Methodology</w:t>
+      </w:r>
+    </w:p>
+    <w:p>
+      <w:pPr>
+        <w:rPr>
+          <w:sz w:val="22"/>
+          <w:szCs w:val="18"/>
+        </w:rPr>
+      </w:pPr>
+      <w:r>
+        <w:rPr>
+          <w:sz w:val="22"/>
+          <w:szCs w:val="18"/>
+        </w:rPr>
+        <w:t>The original idea for the software was to develop a single program in C, which would be split into multiple files and functions depending on what they were trying to accomplish. These functions would be developed one after another depending on how important they are to serving then next function. As an example, a lot of initial time was spent developing a simple command line user interface where users could type letters on their keyboards to navigate to perform a task such as compiling the words from a corpus.</w:t>
+      </w:r>
+      <w:r>
+        <w:rPr>
+          <w:sz w:val="22"/>
+          <w:szCs w:val="18"/>
+        </w:rPr>
+        <w:t xml:space="preserve"> This was done as without this step; it would be hard to test all the functions of the code all at once.</w:t>
+      </w:r>
+    </w:p>
+    <w:p>
+      <w:pPr>
+        <w:rPr>
+          <w:sz w:val="22"/>
+          <w:szCs w:val="18"/>
+        </w:rPr>
+      </w:pPr>
+      <w:r>
+        <w:rPr>
+          <w:sz w:val="22"/>
+          <w:szCs w:val="18"/>
+        </w:rPr>
+        <w:t xml:space="preserve"> As such, </w:t>
+      </w:r>
+      <w:r>
+        <w:rPr>
+          <w:sz w:val="22"/>
+          <w:szCs w:val="18"/>
+        </w:rPr>
+        <w:t>an Iterative development (Waterfall)</w:t>
+      </w:r>
+      <w:r>
+        <w:rPr>
+          <w:sz w:val="22"/>
+          <w:szCs w:val="18"/>
+        </w:rPr>
+        <w:t xml:space="preserve"> methodology was used</w:t>
+      </w:r>
+      <w:r>
+        <w:rPr>
+          <w:sz w:val="22"/>
+          <w:szCs w:val="18"/>
+        </w:rPr>
+        <w:t xml:space="preserve">. This was done as it would allow some flexibility for the development of the final product. It was decided </w:t>
+      </w:r>
+      <w:r>
+        <w:rPr>
+          <w:sz w:val="22"/>
+          <w:szCs w:val="18"/>
+        </w:rPr>
+        <w:t xml:space="preserve">because there would be only one person working on this product, which limited the amount of work that could be output in the development timeframe. </w:t>
+      </w:r>
+      <w:r>
+        <w:rPr>
+          <w:sz w:val="22"/>
+          <w:szCs w:val="18"/>
+        </w:rPr>
+        <w:t>As such it was considered wasteful to follow a more agile development process where multiple protypes would be made and then discarded. Instead, the same software would be designed, implemented, tested, and then further adapted and optimised over time to meet all the requirements initially outlined.</w:t>
+      </w:r>
+    </w:p>
+    <w:p>
+      <w:pPr>
+        <w:rPr>
+          <w:sz w:val="22"/>
+          <w:szCs w:val="18"/>
+        </w:rPr>
+      </w:pPr>
+      <w:r>
+        <w:rPr>
+          <w:sz w:val="22"/>
+          <w:szCs w:val="18"/>
+        </w:rPr>
+        <w:t>The development of the systems would be backed up a GitHub repository, which handled all the version control for the software in case the main development machine got corrupted in some way.</w:t>
+      </w:r>
+    </w:p>
+    <w:p>
+      <w:pPr>
+        <w:rPr>
+          <w:b/>
+          <w:bCs/>
+          <w:sz w:val="22"/>
+          <w:szCs w:val="18"/>
+        </w:rPr>
+      </w:pPr>
+      <w:r>
+        <w:rPr>
+          <w:b/>
+          <w:bCs/>
+          <w:sz w:val="22"/>
+          <w:szCs w:val="18"/>
+        </w:rPr>
+        <w:t>2</w:t>
+      </w:r>
+      <w:r>
+        <w:rPr>
+          <w:b/>
+          <w:bCs/>
+          <w:sz w:val="22"/>
+          <w:szCs w:val="18"/>
+        </w:rPr>
+        <w:t>.</w:t>
+      </w:r>
+      <w:r>
+        <w:rPr>
+          <w:b/>
+          <w:bCs/>
+          <w:sz w:val="22"/>
+          <w:szCs w:val="18"/>
+        </w:rPr>
+        <w:t>1</w:t>
+      </w:r>
+      <w:r>
+        <w:rPr>
+          <w:b/>
+          <w:bCs/>
+          <w:sz w:val="22"/>
+          <w:szCs w:val="18"/>
+        </w:rPr>
+        <w:t>.</w:t>
+      </w:r>
+      <w:r>
+        <w:rPr>
+          <w:b/>
+          <w:bCs/>
+          <w:sz w:val="22"/>
+          <w:szCs w:val="18"/>
+        </w:rPr>
+        <w:t>2</w:t>
+      </w:r>
+      <w:r>
+        <w:rPr>
+          <w:b/>
+          <w:bCs/>
+          <w:sz w:val="22"/>
+          <w:szCs w:val="18"/>
+        </w:rPr>
+        <w:t xml:space="preserve"> </w:t>
+      </w:r>
+      <w:r>
+        <w:rPr>
+          <w:b/>
+          <w:bCs/>
+          <w:sz w:val="22"/>
+          <w:szCs w:val="18"/>
+        </w:rPr>
+        <w:t>Corpus Extraction</w:t>
+      </w:r>
+    </w:p>
+    <w:p>
+      <w:pPr>
+        <w:rPr>
+          <w:sz w:val="22"/>
+          <w:szCs w:val="18"/>
+        </w:rPr>
+      </w:pPr>
+      <w:r>
+        <w:rPr>
+          <w:sz w:val="22"/>
+          <w:szCs w:val="18"/>
+        </w:rPr>
+        <w:t xml:space="preserve">The first </w:t>
+      </w:r>
+      <w:r>
+        <w:rPr>
+          <w:sz w:val="22"/>
+          <w:szCs w:val="18"/>
+        </w:rPr>
+        <w:t xml:space="preserve">sprint for developing the program revolved around the extraction of words from the corpora. </w:t>
+      </w:r>
+      <w:r>
+        <w:rPr>
+          <w:sz w:val="22"/>
+          <w:szCs w:val="18"/>
+        </w:rPr>
+        <w:t>This was done not because it was to be tested for efficiency, but more as a means of generating a dictionary file for the actual spell checker to use, and assessing how the nature of its organization had any effect on the final efficiency of searching.</w:t>
+      </w:r>
+    </w:p>
+    <w:p>
+      <w:pPr>
+        <w:jc w:val="center"/>
+        <w:rPr>
+          <w:sz w:val="22"/>
+          <w:szCs w:val="18"/>
+        </w:rPr>
+      </w:pPr>
+      <w:r>
+        <w:rPr>
+          <w:noProof/>
+        </w:rPr>
+        <w:lastRenderedPageBreak/>
+        <w:drawing>
+          <wp:inline distT="0" distB="0" distL="0" distR="0" wp14:anchorId="432A47F4" wp14:editId="7B912F2E">
+            <wp:extent cx="4086225" cy="4281346"/>
+            <wp:effectExtent l="19050" t="19050" r="0" b="5080"/>
+            <wp:docPr id="1919683354" name="Picture 1" descr="A screenshot of a computer program&#10;&#10;Description automatically generated"/>
+            <wp:cNvGraphicFramePr>
+              <a:graphicFrameLocks xmlns:a="http://schemas.openxmlformats.org/drawingml/2006/main" noChangeAspect="1"/>
+            </wp:cNvGraphicFramePr>
+            <a:graphic xmlns:a="http://schemas.openxmlformats.org/drawingml/2006/main">
+              <a:graphicData uri="http://schemas.openxmlformats.org/drawingml/2006/picture">
+                <pic:pic xmlns:pic="http://schemas.openxmlformats.org/drawingml/2006/picture">
+                  <pic:nvPicPr>
+                    <pic:cNvPr id="1919683354" name="Picture 1" descr="A screenshot of a computer program&#10;&#10;Description automatically generated"/>
+                    <pic:cNvPicPr/>
+                  </pic:nvPicPr>
+                  <pic:blipFill>
+                    <a:blip r:embed="rId24"/>
+                    <a:stretch>
+                      <a:fillRect/>
+                    </a:stretch>
+                  </pic:blipFill>
+                  <pic:spPr>
+                    <a:xfrm>
+                      <a:off x="0" y="0"/>
+                      <a:ext cx="4089258" cy="4284524"/>
+                    </a:xfrm>
+                    <a:prstGeom prst="rect">
+                      <a:avLst/>
+                    </a:prstGeom>
+                    <a:ln>
+                      <a:solidFill>
+                        <a:schemeClr val="tx1"/>
+                      </a:solidFill>
+                    </a:ln>
+                  </pic:spPr>
+                </pic:pic>
+              </a:graphicData>
+            </a:graphic>
+          </wp:inline>
+        </w:drawing>
+      </w:r>
+    </w:p>
+    <w:p>
+      <w:pPr>
+        <w:jc w:val="center"/>
+        <w:rPr>
+          <w:sz w:val="22"/>
+          <w:szCs w:val="18"/>
+        </w:rPr>
+      </w:pPr>
+      <w:r>
+        <w:rPr>
+          <w:b/>
+          <w:bCs/>
+          <w:sz w:val="22"/>
+          <w:szCs w:val="18"/>
+        </w:rPr>
+        <w:t xml:space="preserve">Figure 9. </w:t>
+      </w:r>
+      <w:r>
+        <w:rPr>
+          <w:sz w:val="22"/>
+          <w:szCs w:val="18"/>
+        </w:rPr>
+        <w:t>Pseudocode of Corpus Generation Process</w:t>
+      </w:r>
+    </w:p>
+    <w:p>
+      <w:pPr>
+        <w:rPr>
+          <w:sz w:val="22"/>
+          <w:szCs w:val="18"/>
+        </w:rPr>
+      </w:pPr>
+      <w:r>
+        <w:rPr>
+          <w:sz w:val="22"/>
+          <w:szCs w:val="18"/>
+        </w:rPr>
+        <w:t>It was decided that the user could generate 4 different types of word files to test the spell checker with. These included: allowing duplicates, not allowing duplicates, allowing duplicates and sorting in alphabetical order, and not allowing duplicates and sorting in alphabetical order.</w:t>
+      </w:r>
+    </w:p>
+    <w:p>
+      <w:pPr>
+        <w:rPr>
+          <w:sz w:val="22"/>
+          <w:szCs w:val="18"/>
+        </w:rPr>
+      </w:pPr>
+      <w:r>
+        <w:rPr>
+          <w:sz w:val="22"/>
+          <w:szCs w:val="18"/>
+        </w:rPr>
+        <w:t xml:space="preserve">The reason why the user is given the option to generate a word file which allows duplicates is </w:t>
+      </w:r>
+      <w:r>
+        <w:rPr>
+          <w:sz w:val="22"/>
+          <w:szCs w:val="18"/>
+        </w:rPr>
+        <w:t>to give an option for quick word file generation. It was put there as an option purely for testing purposes. Given that the code wouldn’t need to be constantly checking if a new string is a duplicate or not, then the time to generate a new file would be drastically short and therefore good if you were unwilling to wait the time to get a standard word file.</w:t>
+      </w:r>
+    </w:p>
+    <w:p>
+      <w:pPr>
+        <w:rPr>
+          <w:sz w:val="22"/>
+          <w:szCs w:val="18"/>
+        </w:rPr>
+      </w:pPr>
+      <w:r>
+        <w:rPr>
+          <w:sz w:val="22"/>
+          <w:szCs w:val="18"/>
+        </w:rPr>
+        <w:t xml:space="preserve">Then when it came to sorting or not, this is done to check the performance for searching words if they are arranged alphabetically or not. It is also done because one of the methods, the binary search, can only work if the </w:t>
+      </w:r>
+      <w:r>
+        <w:rPr>
+          <w:sz w:val="22"/>
+          <w:szCs w:val="18"/>
+        </w:rPr>
+        <w:t>dictionary is sorted.</w:t>
+      </w:r>
+      <w:r>
+        <w:rPr>
+          <w:sz w:val="22"/>
+          <w:szCs w:val="18"/>
+        </w:rPr>
+        <w:t xml:space="preserve"> </w:t>
+      </w:r>
+    </w:p>
+    <w:p>
+      <w:pPr>
+        <w:rPr>
+          <w:b/>
+          <w:bCs/>
+          <w:sz w:val="22"/>
+          <w:szCs w:val="18"/>
+        </w:rPr>
+      </w:pPr>
+      <w:r>
+        <w:rPr>
+          <w:b/>
+          <w:bCs/>
+          <w:sz w:val="22"/>
+          <w:szCs w:val="18"/>
+        </w:rPr>
+        <w:t>2</w:t>
+      </w:r>
+      <w:r>
+        <w:rPr>
+          <w:b/>
+          <w:bCs/>
+          <w:sz w:val="22"/>
+          <w:szCs w:val="18"/>
+        </w:rPr>
+        <w:t>.</w:t>
+      </w:r>
+      <w:r>
+        <w:rPr>
+          <w:b/>
+          <w:bCs/>
+          <w:sz w:val="22"/>
+          <w:szCs w:val="18"/>
+        </w:rPr>
+        <w:t>1</w:t>
+      </w:r>
+      <w:r>
+        <w:rPr>
+          <w:b/>
+          <w:bCs/>
+          <w:sz w:val="22"/>
+          <w:szCs w:val="18"/>
+        </w:rPr>
+        <w:t>.</w:t>
+      </w:r>
+      <w:r>
+        <w:rPr>
+          <w:b/>
+          <w:bCs/>
+          <w:sz w:val="22"/>
+          <w:szCs w:val="18"/>
+        </w:rPr>
+        <w:t>3</w:t>
+      </w:r>
+      <w:r>
+        <w:rPr>
+          <w:b/>
+          <w:bCs/>
+          <w:sz w:val="22"/>
+          <w:szCs w:val="18"/>
+        </w:rPr>
+        <w:t xml:space="preserve"> </w:t>
+      </w:r>
+      <w:r>
+        <w:rPr>
+          <w:b/>
+          <w:bCs/>
+          <w:sz w:val="22"/>
+          <w:szCs w:val="18"/>
+        </w:rPr>
+        <w:t>Spell Checking</w:t>
+      </w:r>
+    </w:p>
+    <w:p>
+      <w:pPr>
+        <w:rPr>
+          <w:sz w:val="22"/>
+          <w:szCs w:val="18"/>
+        </w:rPr>
+      </w:pPr>
+      <w:r>
+        <w:rPr>
+          <w:sz w:val="22"/>
+          <w:szCs w:val="18"/>
+        </w:rPr>
+        <w:t xml:space="preserve">The second sprint was focused on the development of the actual </w:t>
+      </w:r>
+      <w:r>
+        <w:rPr>
+          <w:sz w:val="22"/>
+          <w:szCs w:val="18"/>
+        </w:rPr>
+        <w:t>spell-checking</w:t>
+      </w:r>
+      <w:r>
+        <w:rPr>
+          <w:sz w:val="22"/>
+          <w:szCs w:val="18"/>
+        </w:rPr>
+        <w:t xml:space="preserve"> program, which included the coding of all the search methods and algorithms which would be tested against each other for efficiency.</w:t>
+      </w:r>
+      <w:r>
+        <w:rPr>
+          <w:sz w:val="22"/>
+          <w:szCs w:val="18"/>
+        </w:rPr>
+        <w:t xml:space="preserve"> This part of the system was organized into a series of </w:t>
+      </w:r>
+      <w:r>
+        <w:rPr>
+          <w:sz w:val="22"/>
+          <w:szCs w:val="18"/>
+        </w:rPr>
+        <w:lastRenderedPageBreak/>
+        <w:t>menu’s which allows a user to specify everything including the word file, the search method, and the algorithm for suggestions.</w:t>
+      </w:r>
+    </w:p>
+    <w:p>
+      <w:pPr>
+        <w:rPr>
+          <w:b/>
+          <w:bCs/>
+          <w:sz w:val="22"/>
+          <w:szCs w:val="18"/>
+        </w:rPr>
+      </w:pPr>
+      <w:r>
+        <w:rPr>
+          <w:b/>
+          <w:bCs/>
+          <w:sz w:val="22"/>
+          <w:szCs w:val="18"/>
+        </w:rPr>
+        <w:t>2</w:t>
+      </w:r>
+      <w:r>
+        <w:rPr>
+          <w:b/>
+          <w:bCs/>
+          <w:sz w:val="22"/>
+          <w:szCs w:val="18"/>
+        </w:rPr>
+        <w:t>.</w:t>
+      </w:r>
+      <w:r>
+        <w:rPr>
+          <w:b/>
+          <w:bCs/>
+          <w:sz w:val="22"/>
+          <w:szCs w:val="18"/>
+        </w:rPr>
+        <w:t>1</w:t>
+      </w:r>
+      <w:r>
+        <w:rPr>
+          <w:b/>
+          <w:bCs/>
+          <w:sz w:val="22"/>
+          <w:szCs w:val="18"/>
+        </w:rPr>
+        <w:t>.</w:t>
+      </w:r>
+      <w:r>
+        <w:rPr>
+          <w:b/>
+          <w:bCs/>
+          <w:sz w:val="22"/>
+          <w:szCs w:val="18"/>
+        </w:rPr>
+        <w:t>4</w:t>
+      </w:r>
+      <w:r>
+        <w:rPr>
+          <w:b/>
+          <w:bCs/>
+          <w:sz w:val="22"/>
+          <w:szCs w:val="18"/>
+        </w:rPr>
+        <w:t xml:space="preserve"> </w:t>
+      </w:r>
+      <w:r>
+        <w:rPr>
+          <w:b/>
+          <w:bCs/>
+          <w:sz w:val="22"/>
+          <w:szCs w:val="18"/>
+        </w:rPr>
+        <w:t>Automated Testing</w:t>
       </w:r>
     </w:p>
     <w:p>
@@ -6076,7 +6644,7 @@
         </w:rPr>
         <w:t xml:space="preserve">. International Journal of Scientific and Research Publications [Accessed 18/03/24]. Available from: </w:t>
       </w:r>
-      <w:hyperlink r:id="rId23" w:history="1">
+      <w:hyperlink r:id="rId25" w:history="1">
         <w:r>
           <w:rPr>
             <w:rStyle w:val="Hyperlink"/>
@@ -6113,7 +6681,7 @@
         </w:rPr>
         <w:t xml:space="preserve">Nam, E, 2019. Understanding the Levenshtein Distance Equation for Beginners. [online]. [Accessed 18/03/24]. Available from: </w:t>
       </w:r>
-      <w:hyperlink r:id="rId24" w:history="1">
+      <w:hyperlink r:id="rId26" w:history="1">
         <w:r>
           <w:rPr>
             <w:rStyle w:val="Hyperlink"/>
@@ -6506,7 +7074,7 @@
       </w:pPr>
     </w:p>
     <w:sectPr>
-      <w:headerReference w:type="default" r:id="rId25"/>
+      <w:headerReference w:type="default" r:id="rId27"/>
       <w:footnotePr>
         <w:numRestart w:val="eachSect"/>
       </w:footnotePr>

</xml_diff>

<commit_message>
continued to work on project writeup
</commit_message>
<xml_diff>
--- a/project_writeup/FinalReportV1.docx
+++ b/project_writeup/FinalReportV1.docx
@@ -636,7 +636,60 @@
         <w:t>(Signature of student)</w:t>
       </w:r>
       <w:r>
-        <w:tab/>
+        <w:t xml:space="preserve">        </w:t>
+      </w:r>
+      <w:r>
+        <w:rPr>
+          <w:noProof/>
+        </w:rPr>
+        <w:drawing>
+          <wp:inline distT="0" distB="0" distL="0" distR="0" wp14:anchorId="1975B79B" wp14:editId="6A2A7FB3">
+            <wp:extent cx="1666875" cy="619125"/>
+            <wp:effectExtent l="0" t="0" r="0" b="0"/>
+            <wp:docPr id="1195844414" name="Picture 1" descr="A close-up of a logo&#10;&#10;Description automatically generated"/>
+            <wp:cNvGraphicFramePr>
+              <a:graphicFrameLocks xmlns:a="http://schemas.openxmlformats.org/drawingml/2006/main" noChangeAspect="1"/>
+            </wp:cNvGraphicFramePr>
+            <a:graphic xmlns:a="http://schemas.openxmlformats.org/drawingml/2006/main">
+              <a:graphicData uri="http://schemas.openxmlformats.org/drawingml/2006/picture">
+                <pic:pic xmlns:pic="http://schemas.openxmlformats.org/drawingml/2006/picture">
+                  <pic:nvPicPr>
+                    <pic:cNvPr id="1195844414" name="Picture 1" descr="A close-up of a logo&#10;&#10;Description automatically generated"/>
+                    <pic:cNvPicPr/>
+                  </pic:nvPicPr>
+                  <pic:blipFill rotWithShape="1">
+                    <a:blip r:embed="rId9">
+                      <a:extLst>
+                        <a:ext uri="{28A0092B-C50C-407E-A947-70E740481C1C}">
+                          <a14:useLocalDpi xmlns:a14="http://schemas.microsoft.com/office/drawing/2010/main" val="0"/>
+                        </a:ext>
+                      </a:extLst>
+                    </a:blip>
+                    <a:srcRect l="21633" t="41124" r="49245" b="39645"/>
+                    <a:stretch/>
+                  </pic:blipFill>
+                  <pic:spPr bwMode="auto">
+                    <a:xfrm>
+                      <a:off x="0" y="0"/>
+                      <a:ext cx="1666875" cy="619125"/>
+                    </a:xfrm>
+                    <a:prstGeom prst="rect">
+                      <a:avLst/>
+                    </a:prstGeom>
+                    <a:ln>
+                      <a:noFill/>
+                    </a:ln>
+                    <a:extLst>
+                      <a:ext uri="{53640926-AAD7-44D8-BBD7-CCE9431645EC}">
+                        <a14:shadowObscured xmlns:a14="http://schemas.microsoft.com/office/drawing/2010/main"/>
+                      </a:ext>
+                    </a:extLst>
+                  </pic:spPr>
+                </pic:pic>
+              </a:graphicData>
+            </a:graphic>
+          </wp:inline>
+        </w:drawing>
       </w:r>
     </w:p>
     <w:p/>
@@ -832,111 +885,39 @@
       <w:pPr>
         <w:jc w:val="both"/>
         <w:rPr>
-          <w:i/>
-          <w:sz w:val="22"/>
-          <w:szCs w:val="22"/>
-        </w:rPr>
-      </w:pPr>
-      <w:r>
-        <w:rPr>
-          <w:i/>
-          <w:sz w:val="22"/>
-          <w:szCs w:val="22"/>
-        </w:rPr>
-        <w:t>&lt;</w:t>
-      </w:r>
-      <w:r>
-        <w:rPr>
-          <w:i/>
-          <w:sz w:val="22"/>
-          <w:szCs w:val="22"/>
-        </w:rPr>
-        <w:t>This page should contain any acknowledgements to those who have assisted with your work.  Where you have worked as part of a team, you should</w:t>
-      </w:r>
-      <w:r>
-        <w:rPr>
-          <w:i/>
-          <w:sz w:val="22"/>
-          <w:szCs w:val="22"/>
-        </w:rPr>
-        <w:t>,</w:t>
-      </w:r>
-      <w:r>
-        <w:rPr>
-          <w:i/>
-          <w:sz w:val="22"/>
-          <w:szCs w:val="22"/>
-        </w:rPr>
-        <w:t xml:space="preserve"> </w:t>
-      </w:r>
-      <w:r>
-        <w:rPr>
-          <w:i/>
-          <w:sz w:val="22"/>
-          <w:szCs w:val="22"/>
-        </w:rPr>
-        <w:t>where appropriate, reference to any contribution made by others to the project.</w:t>
-      </w:r>
-      <w:r>
-        <w:rPr>
-          <w:i/>
-          <w:sz w:val="22"/>
-          <w:szCs w:val="22"/>
-        </w:rPr>
-        <w:t>&gt;</w:t>
+          <w:iCs/>
+          <w:sz w:val="22"/>
+        </w:rPr>
+      </w:pPr>
+      <w:r>
+        <w:rPr>
+          <w:iCs/>
+          <w:sz w:val="22"/>
+        </w:rPr>
+        <w:t>This project could not have been possible without the help of supervisor Ammar Alsalka, who gave valuable pointers and encouragement throughout the development lifecycle. It must also be noted that the advice received from assessor Brandon Bennett, who inspired the inclusion of the python version of the software was also incredibly useful in expanding and providing new ideas for the software.</w:t>
       </w:r>
     </w:p>
     <w:p>
       <w:pPr>
         <w:jc w:val="both"/>
         <w:rPr>
-          <w:i/>
-          <w:sz w:val="22"/>
-          <w:szCs w:val="22"/>
-        </w:rPr>
-      </w:pPr>
-      <w:r>
-        <w:rPr>
-          <w:i/>
-          <w:sz w:val="22"/>
-          <w:szCs w:val="22"/>
-        </w:rPr>
-        <w:t xml:space="preserve">Note that it is not acceptable to solicit </w:t>
-      </w:r>
-      <w:r>
-        <w:rPr>
-          <w:i/>
-          <w:sz w:val="22"/>
-          <w:szCs w:val="22"/>
-        </w:rPr>
-        <w:t xml:space="preserve">assistance on </w:t>
-      </w:r>
-      <w:r>
-        <w:rPr>
-          <w:i/>
-          <w:sz w:val="22"/>
-          <w:szCs w:val="22"/>
-        </w:rPr>
-        <w:t>‘proof reading’ which is defined as “the systematic checking and identification of errors in spelling, punctuation, grammar and sentence construction, formatting and layout in the text”; see</w:t>
-      </w:r>
-    </w:p>
-    <w:p>
-      <w:pPr>
-        <w:jc w:val="both"/>
-        <w:rPr>
-          <w:rFonts w:ascii="Courier" w:hAnsi="Courier"/>
-          <w:i/>
-          <w:sz w:val="21"/>
-          <w:szCs w:val="21"/>
-        </w:rPr>
-      </w:pPr>
-      <w:r>
-        <w:rPr>
-          <w:rFonts w:ascii="Courier" w:hAnsi="Courier"/>
-          <w:sz w:val="21"/>
-          <w:szCs w:val="21"/>
-        </w:rPr>
-        <w:t>https:://www.leeds.ac.uk/secretariat/documents/proof_reading_policy.pdf</w:t>
+          <w:iCs/>
+          <w:sz w:val="22"/>
+        </w:rPr>
+      </w:pPr>
+      <w:r>
+        <w:rPr>
+          <w:iCs/>
+          <w:sz w:val="22"/>
+        </w:rPr>
+        <w:t>A thank you must also be given to the British National Corpus, who’s texts were used in the running of the application</w:t>
+      </w:r>
+      <w:r>
+        <w:rPr>
+          <w:iCs/>
+          <w:sz w:val="22"/>
+        </w:rPr>
+        <w:t>.</w:t>
       </w:r>
     </w:p>
     <w:p>
@@ -2054,25 +2035,7 @@
         <w:rPr>
           <w:noProof/>
         </w:rPr>
-        <w:t>1</w:t>
-      </w:r>
-      <w:r>
-        <w:rPr>
-          <w:noProof/>
-        </w:rPr>
-        <w:t>.</w:t>
-      </w:r>
-      <w:r>
-        <w:rPr>
-          <w:noProof/>
-        </w:rPr>
-        <w:t>5</w:t>
-      </w:r>
-      <w:r>
-        <w:rPr>
-          <w:noProof/>
-        </w:rPr>
-        <w:t xml:space="preserve">  Proof of concept</w:t>
+        <w:t>1.5  Proof of concept</w:t>
       </w:r>
       <w:r>
         <w:rPr>
@@ -3279,7 +3242,7 @@
     <w:p>
       <w:pPr>
         <w:sectPr>
-          <w:headerReference w:type="default" r:id="rId9"/>
+          <w:headerReference w:type="default" r:id="rId10"/>
           <w:footnotePr>
             <w:numRestart w:val="eachSect"/>
           </w:footnotePr>
@@ -3342,7 +3305,21 @@
           <w:sz w:val="22"/>
           <w:szCs w:val="22"/>
         </w:rPr>
-        <w:t>The benefits of such mechanisms are that they reduce the workload on the person writing on their machine, given that it  can not only prevent them type/retyping badly written words, but in some cases predict what they are wanting to say and therefore cut the time to complete their work drastically.</w:t>
+        <w:t xml:space="preserve">The benefits of such mechanisms are that they reduce the workload on the person writing on their machine, given that it  </w:t>
+      </w:r>
+      <w:r>
+        <w:rPr>
+          <w:sz w:val="22"/>
+          <w:szCs w:val="22"/>
+        </w:rPr>
+        <w:t>cannot</w:t>
+      </w:r>
+      <w:r>
+        <w:rPr>
+          <w:sz w:val="22"/>
+          <w:szCs w:val="22"/>
+        </w:rPr>
+        <w:t xml:space="preserve"> only prevent them type/retyping badly written words, but in some cases predict what they are wanting to say and therefore cut the time to complete their work drastically.</w:t>
       </w:r>
     </w:p>
     <w:p>
@@ -3449,8 +3426,33 @@
       </w:r>
     </w:p>
     <w:p>
-      <w:r>
+      <w:pPr>
+        <w:rPr>
+          <w:sz w:val="22"/>
+          <w:szCs w:val="18"/>
+        </w:rPr>
+      </w:pPr>
+      <w:r>
+        <w:rPr>
+          <w:sz w:val="22"/>
+          <w:szCs w:val="18"/>
+        </w:rPr>
         <w:t>As the primary means of testing how close two strings are, a series of string metric or string similarity metric algorithms were chosen. These algorithms are designed to measure the distance between two strings, which is useful is our case as the program can take a given string, and then check its similarity to all other strings to give optimal suggestions to misspellings. Some are heavily used in not only natural language processing systems, but also in other fields such as image analysis, machine learning, data mining and many other integrations.</w:t>
+      </w:r>
+    </w:p>
+    <w:p>
+      <w:pPr>
+        <w:rPr>
+          <w:sz w:val="22"/>
+          <w:szCs w:val="18"/>
+        </w:rPr>
+      </w:pPr>
+      <w:r>
+        <w:rPr>
+          <w:sz w:val="22"/>
+          <w:szCs w:val="18"/>
+        </w:rPr>
+        <w:t>In the following algorithms, to measure the time and space complexity of them, the letters n and m will be used to refer to the lengths of both the first and second strings respectively.</w:t>
       </w:r>
     </w:p>
     <w:p>
@@ -3503,7 +3505,35 @@
           <w:sz w:val="22"/>
           <w:szCs w:val="22"/>
         </w:rPr>
-        <w:t>value. The algorithm used is recursive and works as follows:</w:t>
+        <w:t xml:space="preserve">value. The algorithm used is </w:t>
+      </w:r>
+      <w:r>
+        <w:rPr>
+          <w:sz w:val="22"/>
+          <w:szCs w:val="22"/>
+        </w:rPr>
+        <w:t>iterative</w:t>
+      </w:r>
+      <w:r>
+        <w:rPr>
+          <w:sz w:val="22"/>
+          <w:szCs w:val="22"/>
+        </w:rPr>
+        <w:t xml:space="preserve"> and works as </w:t>
+      </w:r>
+      <w:r>
+        <w:rPr>
+          <w:sz w:val="22"/>
+          <w:szCs w:val="22"/>
+        </w:rPr>
+        <w:t>described in figure 1</w:t>
+      </w:r>
+      <w:r>
+        <w:rPr>
+          <w:sz w:val="22"/>
+          <w:szCs w:val="22"/>
+        </w:rPr>
+        <w:t xml:space="preserve">, where a full 2-D matrix stores the results of calculations. It then goes through both strings comparing characters and then updating the matrix based on the cheapest of 3 actions to take from inserting a new character, deleting, and existing character, or substituting a new character for an old one. </w:t>
       </w:r>
     </w:p>
     <w:p>
@@ -3534,7 +3564,7 @@
                     <pic:cNvPicPr/>
                   </pic:nvPicPr>
                   <pic:blipFill>
-                    <a:blip r:embed="rId10"/>
+                    <a:blip r:embed="rId11"/>
                     <a:stretch>
                       <a:fillRect/>
                     </a:stretch>
@@ -3606,7 +3636,7 @@
         </w:rPr>
         <w:t xml:space="preserve">pseudocode adapted from: </w:t>
       </w:r>
-      <w:hyperlink r:id="rId11" w:history="1">
+      <w:hyperlink r:id="rId12" w:history="1">
         <w:r>
           <w:rPr>
             <w:rStyle w:val="Hyperlink"/>
@@ -3636,43 +3666,114 @@
           <w:sz w:val="22"/>
           <w:szCs w:val="22"/>
         </w:rPr>
+        <w:t>In other words, the algorithm assesses how many steps it would take to transform the first string to the second string, and the number of steps is the distance between them.</w:t>
+      </w:r>
+      <w:r>
+        <w:rPr>
+          <w:sz w:val="22"/>
+          <w:szCs w:val="22"/>
+        </w:rPr>
+        <w:t xml:space="preserve"> </w:t>
+      </w:r>
+      <w:r>
+        <w:rPr>
+          <w:sz w:val="22"/>
+          <w:szCs w:val="22"/>
+        </w:rPr>
         <w:t xml:space="preserve">The larger the distance, the more different the two strings are. </w:t>
       </w:r>
-      <w:r>
-        <w:rPr>
-          <w:sz w:val="22"/>
-          <w:szCs w:val="22"/>
-        </w:rPr>
-        <w:t xml:space="preserve">Here, each string is compared for how many insertions, deletions and replacements need to occur </w:t>
-      </w:r>
-      <w:r>
-        <w:rPr>
-          <w:sz w:val="22"/>
-          <w:szCs w:val="22"/>
-        </w:rPr>
-        <w:t>to</w:t>
-      </w:r>
-      <w:r>
-        <w:rPr>
-          <w:sz w:val="22"/>
-          <w:szCs w:val="22"/>
-        </w:rPr>
-        <w:t xml:space="preserve"> transform the first string to the second string.</w:t>
-      </w:r>
-    </w:p>
-    <w:p>
-      <w:pPr>
-        <w:rPr>
-          <w:sz w:val="22"/>
-          <w:szCs w:val="22"/>
-        </w:rPr>
-      </w:pPr>
-      <w:r>
-        <w:rPr>
-          <w:sz w:val="22"/>
-          <w:szCs w:val="22"/>
-        </w:rPr>
-        <w:t>The time complexity of this algorithm is O(3</w:t>
+    </w:p>
+    <w:p>
+      <w:pPr>
+        <w:rPr>
+          <w:sz w:val="22"/>
+          <w:szCs w:val="22"/>
+        </w:rPr>
+      </w:pPr>
+      <w:r>
+        <w:rPr>
+          <w:sz w:val="22"/>
+          <w:szCs w:val="22"/>
+        </w:rPr>
+        <w:t>The time complexity of this algorithm is O(</w:t>
+      </w:r>
+      <w:r>
+        <w:rPr>
+          <w:sz w:val="22"/>
+          <w:szCs w:val="22"/>
+        </w:rPr>
+        <w:t>n*m</w:t>
+      </w:r>
+      <w:r>
+        <w:rPr>
+          <w:sz w:val="22"/>
+          <w:szCs w:val="22"/>
+        </w:rPr>
+        <w:t>)</w:t>
+      </w:r>
+      <w:r>
+        <w:rPr>
+          <w:sz w:val="22"/>
+          <w:szCs w:val="22"/>
+        </w:rPr>
+        <w:t>.</w:t>
+      </w:r>
+      <w:r>
+        <w:rPr>
+          <w:sz w:val="22"/>
+          <w:szCs w:val="22"/>
+        </w:rPr>
+        <w:t xml:space="preserve"> Which is because there is a nested loop where n * m iterations are needed to compute a valid result.</w:t>
+      </w:r>
+      <w:r>
+        <w:rPr>
+          <w:sz w:val="22"/>
+          <w:szCs w:val="22"/>
+        </w:rPr>
+        <w:t xml:space="preserve"> While the space complexity would</w:t>
+      </w:r>
+      <w:r>
+        <w:rPr>
+          <w:sz w:val="22"/>
+          <w:szCs w:val="22"/>
+        </w:rPr>
+        <w:t xml:space="preserve"> also</w:t>
+      </w:r>
+      <w:r>
+        <w:rPr>
+          <w:sz w:val="22"/>
+          <w:szCs w:val="22"/>
+        </w:rPr>
+        <w:t xml:space="preserve"> be O(</w:t>
+      </w:r>
+      <w:r>
+        <w:rPr>
+          <w:sz w:val="22"/>
+          <w:szCs w:val="22"/>
+        </w:rPr>
+        <w:t>n*m</w:t>
+      </w:r>
+      <w:r>
+        <w:rPr>
+          <w:sz w:val="22"/>
+          <w:szCs w:val="22"/>
+        </w:rPr>
+        <w:t>) since a full matrix of n * m is needed to store the result of all calculations.</w:t>
+      </w:r>
+    </w:p>
+    <w:p>
+      <w:pPr>
+        <w:rPr>
+          <w:sz w:val="22"/>
+          <w:szCs w:val="22"/>
+        </w:rPr>
+      </w:pPr>
+      <w:r>
+        <w:rPr>
+          <w:sz w:val="22"/>
+          <w:szCs w:val="22"/>
+        </w:rPr>
+        <w:t>There exists a recursive version of this algorithm, however the time complexity of that version is O(3</w:t>
       </w:r>
       <w:r>
         <w:rPr>
@@ -3680,14 +3781,14 @@
           <w:szCs w:val="22"/>
           <w:vertAlign w:val="superscript"/>
         </w:rPr>
-        <w:t>n * m</w:t>
-      </w:r>
-      <w:r>
-        <w:rPr>
-          <w:sz w:val="22"/>
-          <w:szCs w:val="22"/>
-        </w:rPr>
-        <w:t>) where n and m are the lengths of each string. While the space complexity would be O(m + n).</w:t>
+        <w:t>n*m</w:t>
+      </w:r>
+      <w:r>
+        <w:rPr>
+          <w:sz w:val="22"/>
+          <w:szCs w:val="22"/>
+        </w:rPr>
+        <w:t>), which was considered too bad for testing and so this iterative version was chosen instead.</w:t>
       </w:r>
     </w:p>
     <w:p>
@@ -3703,6 +3804,7 @@
           <w:sz w:val="22"/>
           <w:szCs w:val="22"/>
         </w:rPr>
+        <w:lastRenderedPageBreak/>
         <w:t>1.2.2  Optimal String Alignment Distance</w:t>
       </w:r>
     </w:p>
@@ -3721,9 +3823,9 @@
           <w:szCs w:val="22"/>
         </w:rPr>
         <w:drawing>
-          <wp:inline distT="0" distB="0" distL="0" distR="0" wp14:anchorId="72EBD1DA" wp14:editId="20E73047">
-            <wp:extent cx="5429250" cy="2783196"/>
-            <wp:effectExtent l="19050" t="19050" r="19050" b="17780"/>
+          <wp:inline distT="0" distB="0" distL="0" distR="0" wp14:anchorId="72EBD1DA" wp14:editId="5B4A7570">
+            <wp:extent cx="5438775" cy="2788079"/>
+            <wp:effectExtent l="19050" t="19050" r="0" b="0"/>
             <wp:docPr id="782275208" name="Picture 1" descr="A screenshot of a computer code&#10;&#10;Description automatically generated"/>
             <wp:cNvGraphicFramePr>
               <a:graphicFrameLocks xmlns:a="http://schemas.openxmlformats.org/drawingml/2006/main" noChangeAspect="1"/>
@@ -3736,7 +3838,7 @@
                     <pic:cNvPicPr/>
                   </pic:nvPicPr>
                   <pic:blipFill>
-                    <a:blip r:embed="rId12"/>
+                    <a:blip r:embed="rId13"/>
                     <a:stretch>
                       <a:fillRect/>
                     </a:stretch>
@@ -3744,7 +3846,7 @@
                   <pic:spPr>
                     <a:xfrm>
                       <a:off x="0" y="0"/>
-                      <a:ext cx="5445382" cy="2791466"/>
+                      <a:ext cx="5500925" cy="2819939"/>
                     </a:xfrm>
                     <a:prstGeom prst="rect">
                       <a:avLst/>
@@ -3777,7 +3879,6 @@
           <w:sz w:val="22"/>
           <w:szCs w:val="22"/>
         </w:rPr>
-        <w:lastRenderedPageBreak/>
         <w:t xml:space="preserve">Figure 2. </w:t>
       </w:r>
       <w:r>
@@ -3787,7 +3888,7 @@
         </w:rPr>
         <w:t xml:space="preserve">Optimal String Alignment Algorithm pseudocode (from: </w:t>
       </w:r>
-      <w:hyperlink r:id="rId13" w:history="1">
+      <w:hyperlink r:id="rId14" w:history="1">
         <w:r>
           <w:rPr>
             <w:rStyle w:val="Hyperlink"/>
@@ -3826,6 +3927,42 @@
         </w:rPr>
         <w:t xml:space="preserve"> You are however, not allowed to apply multiple transforms to the same substring. </w:t>
       </w:r>
+      <w:r>
+        <w:rPr>
+          <w:sz w:val="22"/>
+          <w:szCs w:val="22"/>
+        </w:rPr>
+        <w:t>Again, the larger the distance, the further the words are from each other.</w:t>
+      </w:r>
+    </w:p>
+    <w:p>
+      <w:pPr>
+        <w:rPr>
+          <w:sz w:val="22"/>
+          <w:szCs w:val="22"/>
+        </w:rPr>
+      </w:pPr>
+      <w:r>
+        <w:rPr>
+          <w:sz w:val="22"/>
+          <w:szCs w:val="22"/>
+        </w:rPr>
+        <w:t>This algorithm is also iterative and uses a full matrix for storing results of calculations, giving it a time complexity of O(n*m) and a space complexity of O(m*n</w:t>
+      </w:r>
+      <w:r>
+        <w:rPr>
+          <w:sz w:val="22"/>
+          <w:szCs w:val="22"/>
+        </w:rPr>
+        <w:t>)</w:t>
+      </w:r>
+      <w:r>
+        <w:rPr>
+          <w:sz w:val="22"/>
+          <w:szCs w:val="22"/>
+        </w:rPr>
+        <w:t>. Though the extra tests for transpositions will mean it will take more time than the standard Levenshtein method</w:t>
+      </w:r>
     </w:p>
     <w:p>
       <w:pPr>
@@ -3841,6 +3978,7 @@
           <w:sz w:val="22"/>
           <w:szCs w:val="22"/>
         </w:rPr>
+        <w:lastRenderedPageBreak/>
         <w:t>1.2.3  Damerau Levenshtein Distance</w:t>
       </w:r>
     </w:p>
@@ -3859,9 +3997,9 @@
           <w:szCs w:val="22"/>
         </w:rPr>
         <w:drawing>
-          <wp:inline distT="0" distB="0" distL="0" distR="0" wp14:anchorId="22D33C44" wp14:editId="23EB44D9">
-            <wp:extent cx="4467225" cy="3400160"/>
-            <wp:effectExtent l="19050" t="19050" r="9525" b="10160"/>
+          <wp:inline distT="0" distB="0" distL="0" distR="0" wp14:anchorId="22D33C44" wp14:editId="056D6641">
+            <wp:extent cx="4392487" cy="3343275"/>
+            <wp:effectExtent l="19050" t="19050" r="8255" b="0"/>
             <wp:docPr id="776109500" name="Picture 1" descr="A screenshot of a computer program&#10;&#10;Description automatically generated"/>
             <wp:cNvGraphicFramePr>
               <a:graphicFrameLocks xmlns:a="http://schemas.openxmlformats.org/drawingml/2006/main" noChangeAspect="1"/>
@@ -3874,7 +4012,7 @@
                     <pic:cNvPicPr/>
                   </pic:nvPicPr>
                   <pic:blipFill>
-                    <a:blip r:embed="rId14"/>
+                    <a:blip r:embed="rId15"/>
                     <a:stretch>
                       <a:fillRect/>
                     </a:stretch>
@@ -3882,7 +4020,7 @@
                   <pic:spPr>
                     <a:xfrm>
                       <a:off x="0" y="0"/>
-                      <a:ext cx="4490913" cy="3418190"/>
+                      <a:ext cx="4463447" cy="3397285"/>
                     </a:xfrm>
                     <a:prstGeom prst="rect">
                       <a:avLst/>
@@ -3931,7 +4069,7 @@
         </w:rPr>
         <w:t xml:space="preserve"> (from: </w:t>
       </w:r>
-      <w:hyperlink r:id="rId15" w:history="1">
+      <w:hyperlink r:id="rId16" w:history="1">
         <w:r>
           <w:rPr>
             <w:rStyle w:val="Hyperlink"/>
@@ -3951,15 +4089,6 @@
     </w:p>
     <w:p>
       <w:pPr>
-        <w:jc w:val="center"/>
-        <w:rPr>
-          <w:sz w:val="22"/>
-          <w:szCs w:val="22"/>
-        </w:rPr>
-      </w:pPr>
-    </w:p>
-    <w:p>
-      <w:pPr>
         <w:rPr>
           <w:sz w:val="22"/>
           <w:szCs w:val="22"/>
@@ -3972,6 +4101,35 @@
         </w:rPr>
         <w:t>This algorithm is a further advancement on the Optimal String Alignment (OSA) Algorithm, as it fully incorporates the use of transpositions, which can be done on the same substring.</w:t>
       </w:r>
+      <w:r>
+        <w:rPr>
+          <w:sz w:val="22"/>
+          <w:szCs w:val="22"/>
+        </w:rPr>
+        <w:t xml:space="preserve"> As before, the larger the final distance, the more different the two strings are.</w:t>
+      </w:r>
+    </w:p>
+    <w:p>
+      <w:pPr>
+        <w:rPr>
+          <w:sz w:val="22"/>
+          <w:szCs w:val="22"/>
+        </w:rPr>
+      </w:pPr>
+      <w:r>
+        <w:rPr>
+          <w:sz w:val="22"/>
+          <w:szCs w:val="22"/>
+        </w:rPr>
+        <w:t>This is still an iterative algorithm, with a time complexity of O(n * m)</w:t>
+      </w:r>
+      <w:r>
+        <w:rPr>
+          <w:sz w:val="22"/>
+          <w:szCs w:val="22"/>
+        </w:rPr>
+        <w:t xml:space="preserve"> given its nested loop to go through both strings. However, the space complexity is O((n * m) + 26) given that an extra array is needed to store counts of each letter in the alphabet when processing.</w:t>
+      </w:r>
     </w:p>
     <w:p>
       <w:pPr>
@@ -3986,7 +4144,6 @@
           <w:sz w:val="22"/>
           <w:szCs w:val="22"/>
         </w:rPr>
-        <w:lastRenderedPageBreak/>
         <w:t>1.2.4  Hamming Distance</w:t>
       </w:r>
     </w:p>
@@ -4020,7 +4177,7 @@
                     <pic:cNvPicPr/>
                   </pic:nvPicPr>
                   <pic:blipFill>
-                    <a:blip r:embed="rId16"/>
+                    <a:blip r:embed="rId17"/>
                     <a:stretch>
                       <a:fillRect/>
                     </a:stretch>
@@ -4083,7 +4240,86 @@
           <w:sz w:val="22"/>
           <w:szCs w:val="22"/>
         </w:rPr>
-        <w:t xml:space="preserve">This is the simplest algorithm tested, given that it only works on strings of the same length. This method goes through both words, updating a local count if any characters are different at a certain index. The final count is the distance between the two strings, where a score of zero means they are identical, while large scores indicate larger divergence. </w:t>
+        <w:lastRenderedPageBreak/>
+        <w:t>This is the simplest algorithm tested, given that it only works on strings of the same length. This method goes through both words, updating a local count if any characters are different at a certain index. The final count is the distance between the two strings, wher</w:t>
+      </w:r>
+      <w:r>
+        <w:rPr>
+          <w:sz w:val="22"/>
+          <w:szCs w:val="22"/>
+        </w:rPr>
+        <w:t>e the</w:t>
+      </w:r>
+      <w:r>
+        <w:rPr>
+          <w:sz w:val="22"/>
+          <w:szCs w:val="22"/>
+        </w:rPr>
+        <w:t xml:space="preserve"> large</w:t>
+      </w:r>
+      <w:r>
+        <w:rPr>
+          <w:sz w:val="22"/>
+          <w:szCs w:val="22"/>
+        </w:rPr>
+        <w:t>r the score</w:t>
+      </w:r>
+      <w:r>
+        <w:rPr>
+          <w:sz w:val="22"/>
+          <w:szCs w:val="22"/>
+        </w:rPr>
+        <w:t xml:space="preserve"> </w:t>
+      </w:r>
+      <w:r>
+        <w:rPr>
+          <w:sz w:val="22"/>
+          <w:szCs w:val="22"/>
+        </w:rPr>
+        <w:t>the</w:t>
+      </w:r>
+      <w:r>
+        <w:rPr>
+          <w:sz w:val="22"/>
+          <w:szCs w:val="22"/>
+        </w:rPr>
+        <w:t xml:space="preserve"> larger</w:t>
+      </w:r>
+      <w:r>
+        <w:rPr>
+          <w:sz w:val="22"/>
+          <w:szCs w:val="22"/>
+        </w:rPr>
+        <w:t xml:space="preserve"> the string</w:t>
+      </w:r>
+      <w:r>
+        <w:rPr>
+          <w:sz w:val="22"/>
+          <w:szCs w:val="22"/>
+        </w:rPr>
+        <w:t xml:space="preserve"> divergence.</w:t>
+      </w:r>
+    </w:p>
+    <w:p>
+      <w:pPr>
+        <w:rPr>
+          <w:sz w:val="22"/>
+          <w:szCs w:val="22"/>
+        </w:rPr>
+      </w:pPr>
+      <w:r>
+        <w:rPr>
+          <w:sz w:val="22"/>
+          <w:szCs w:val="22"/>
+        </w:rPr>
+        <w:t>This algorithm has a time complexity of O(n) and a space complexity of O(1), making it the most efficient algorithm in terms of both time and space.</w:t>
+      </w:r>
+      <w:r>
+        <w:rPr>
+          <w:sz w:val="22"/>
+          <w:szCs w:val="22"/>
+        </w:rPr>
+        <w:t xml:space="preserve"> </w:t>
       </w:r>
     </w:p>
     <w:p>
@@ -4132,7 +4368,7 @@
                     <pic:cNvPicPr/>
                   </pic:nvPicPr>
                   <pic:blipFill>
-                    <a:blip r:embed="rId17"/>
+                    <a:blip r:embed="rId18"/>
                     <a:stretch>
                       <a:fillRect/>
                     </a:stretch>
@@ -4229,7 +4465,6 @@
               <w:sz w:val="22"/>
               <w:szCs w:val="22"/>
             </w:rPr>
-            <w:lastRenderedPageBreak/>
             <m:t>s=</m:t>
           </m:r>
           <m:f>
@@ -4513,7 +4748,21 @@
           <w:sz w:val="22"/>
           <w:szCs w:val="22"/>
         </w:rPr>
-        <w:t xml:space="preserve">This method means values are of the set [0, 1], where the more similar two strings are, the closer the coefficient </w:t>
+        <w:t xml:space="preserve">This method means values are </w:t>
+      </w:r>
+      <w:r>
+        <w:rPr>
+          <w:sz w:val="22"/>
+          <w:szCs w:val="22"/>
+        </w:rPr>
+        <w:t xml:space="preserve">in the range of </w:t>
+      </w:r>
+      <w:r>
+        <w:rPr>
+          <w:sz w:val="22"/>
+          <w:szCs w:val="22"/>
+        </w:rPr>
+        <w:t xml:space="preserve">[0, 1], where the more similar two strings are, the closer the coefficient </w:t>
       </w:r>
       <w:r>
         <w:rPr>
@@ -4532,6 +4781,21 @@
     </w:p>
     <w:p>
       <w:pPr>
+        <w:rPr>
+          <w:sz w:val="22"/>
+          <w:szCs w:val="22"/>
+        </w:rPr>
+      </w:pPr>
+      <w:r>
+        <w:rPr>
+          <w:sz w:val="22"/>
+          <w:szCs w:val="22"/>
+        </w:rPr>
+        <w:t>Depending on which string is larger, the time complexity would either be O(n) or O(m), but the space complexity is O(1).</w:t>
+      </w:r>
+    </w:p>
+    <w:p>
+      <w:pPr>
         <w:pStyle w:val="Heading2"/>
         <w:rPr>
           <w:sz w:val="22"/>
@@ -4543,6 +4807,7 @@
           <w:sz w:val="22"/>
           <w:szCs w:val="22"/>
         </w:rPr>
+        <w:lastRenderedPageBreak/>
         <w:t>1.2.4  Jaro Distance</w:t>
       </w:r>
     </w:p>
@@ -4576,7 +4841,7 @@
                     <pic:cNvPicPr/>
                   </pic:nvPicPr>
                   <pic:blipFill>
-                    <a:blip r:embed="rId18"/>
+                    <a:blip r:embed="rId19"/>
                     <a:stretch>
                       <a:fillRect/>
                     </a:stretch>
@@ -4626,7 +4891,7 @@
         </w:rPr>
         <w:t xml:space="preserve"> Jaro Distance algorithm (pseudocode adapted from: </w:t>
       </w:r>
-      <w:hyperlink r:id="rId19" w:history="1">
+      <w:hyperlink r:id="rId20" w:history="1">
         <w:r>
           <w:rPr>
             <w:rStyle w:val="Hyperlink"/>
@@ -4663,7 +4928,689 @@
           <w:sz w:val="22"/>
           <w:szCs w:val="22"/>
         </w:rPr>
-        <w:t xml:space="preserve">  </w:t>
+        <w:t xml:space="preserve"> </w:t>
+      </w:r>
+      <w:r>
+        <w:rPr>
+          <w:sz w:val="22"/>
+          <w:szCs w:val="22"/>
+        </w:rPr>
+        <w:t xml:space="preserve">It works counting the number of matching characters between the two strings, which are considered only if they are the same and not further than </w:t>
+      </w:r>
+      <m:oMath>
+        <m:d>
+          <m:dPr>
+            <m:begChr m:val="⌊"/>
+            <m:endChr m:val="⌋"/>
+            <m:ctrlPr>
+              <w:rPr>
+                <w:rFonts w:ascii="Cambria Math" w:hAnsi="Cambria Math"/>
+                <w:i/>
+                <w:sz w:val="22"/>
+                <w:szCs w:val="22"/>
+              </w:rPr>
+            </m:ctrlPr>
+          </m:dPr>
+          <m:e>
+            <m:f>
+              <m:fPr>
+                <m:ctrlPr>
+                  <w:rPr>
+                    <w:rFonts w:ascii="Cambria Math" w:hAnsi="Cambria Math"/>
+                    <w:i/>
+                    <w:sz w:val="22"/>
+                    <w:szCs w:val="22"/>
+                  </w:rPr>
+                </m:ctrlPr>
+              </m:fPr>
+              <m:num>
+                <m:r>
+                  <m:rPr>
+                    <m:sty m:val="p"/>
+                  </m:rPr>
+                  <w:rPr>
+                    <w:rFonts w:ascii="Cambria Math" w:hAnsi="Cambria Math"/>
+                    <w:sz w:val="22"/>
+                    <w:szCs w:val="22"/>
+                  </w:rPr>
+                  <m:t>max⁡</m:t>
+                </m:r>
+                <m:r>
+                  <w:rPr>
+                    <w:rFonts w:ascii="Cambria Math" w:hAnsi="Cambria Math"/>
+                    <w:sz w:val="22"/>
+                    <w:szCs w:val="22"/>
+                  </w:rPr>
+                  <m:t>(</m:t>
+                </m:r>
+                <m:d>
+                  <m:dPr>
+                    <m:begChr m:val="|"/>
+                    <m:endChr m:val="|"/>
+                    <m:ctrlPr>
+                      <w:rPr>
+                        <w:rFonts w:ascii="Cambria Math" w:hAnsi="Cambria Math"/>
+                        <w:i/>
+                        <w:sz w:val="22"/>
+                        <w:szCs w:val="22"/>
+                      </w:rPr>
+                    </m:ctrlPr>
+                  </m:dPr>
+                  <m:e>
+                    <m:sSub>
+                      <m:sSubPr>
+                        <m:ctrlPr>
+                          <w:rPr>
+                            <w:rFonts w:ascii="Cambria Math" w:hAnsi="Cambria Math"/>
+                            <w:i/>
+                            <w:sz w:val="22"/>
+                            <w:szCs w:val="22"/>
+                          </w:rPr>
+                        </m:ctrlPr>
+                      </m:sSubPr>
+                      <m:e>
+                        <m:r>
+                          <w:rPr>
+                            <w:rFonts w:ascii="Cambria Math" w:hAnsi="Cambria Math"/>
+                            <w:sz w:val="22"/>
+                            <w:szCs w:val="22"/>
+                          </w:rPr>
+                          <m:t>s</m:t>
+                        </m:r>
+                      </m:e>
+                      <m:sub>
+                        <m:r>
+                          <w:rPr>
+                            <w:rFonts w:ascii="Cambria Math" w:hAnsi="Cambria Math"/>
+                            <w:sz w:val="22"/>
+                            <w:szCs w:val="22"/>
+                          </w:rPr>
+                          <m:t>1</m:t>
+                        </m:r>
+                      </m:sub>
+                    </m:sSub>
+                  </m:e>
+                </m:d>
+                <m:d>
+                  <m:dPr>
+                    <m:begChr m:val="|"/>
+                    <m:endChr m:val="|"/>
+                    <m:ctrlPr>
+                      <w:rPr>
+                        <w:rFonts w:ascii="Cambria Math" w:hAnsi="Cambria Math"/>
+                        <w:i/>
+                        <w:sz w:val="22"/>
+                        <w:szCs w:val="22"/>
+                      </w:rPr>
+                    </m:ctrlPr>
+                  </m:dPr>
+                  <m:e>
+                    <m:sSub>
+                      <m:sSubPr>
+                        <m:ctrlPr>
+                          <w:rPr>
+                            <w:rFonts w:ascii="Cambria Math" w:hAnsi="Cambria Math"/>
+                            <w:i/>
+                            <w:sz w:val="22"/>
+                            <w:szCs w:val="22"/>
+                          </w:rPr>
+                        </m:ctrlPr>
+                      </m:sSubPr>
+                      <m:e>
+                        <m:r>
+                          <w:rPr>
+                            <w:rFonts w:ascii="Cambria Math" w:hAnsi="Cambria Math"/>
+                            <w:sz w:val="22"/>
+                            <w:szCs w:val="22"/>
+                          </w:rPr>
+                          <m:t>s</m:t>
+                        </m:r>
+                      </m:e>
+                      <m:sub>
+                        <m:r>
+                          <w:rPr>
+                            <w:rFonts w:ascii="Cambria Math" w:hAnsi="Cambria Math"/>
+                            <w:sz w:val="22"/>
+                            <w:szCs w:val="22"/>
+                          </w:rPr>
+                          <m:t>2</m:t>
+                        </m:r>
+                      </m:sub>
+                    </m:sSub>
+                  </m:e>
+                </m:d>
+              </m:num>
+              <m:den>
+                <m:r>
+                  <w:rPr>
+                    <w:rFonts w:ascii="Cambria Math" w:hAnsi="Cambria Math"/>
+                    <w:sz w:val="22"/>
+                    <w:szCs w:val="22"/>
+                  </w:rPr>
+                  <m:t>2</m:t>
+                </m:r>
+              </m:den>
+            </m:f>
+          </m:e>
+        </m:d>
+        <m:r>
+          <w:rPr>
+            <w:rFonts w:ascii="Cambria Math" w:hAnsi="Cambria Math"/>
+            <w:sz w:val="22"/>
+            <w:szCs w:val="22"/>
+          </w:rPr>
+          <m:t>-1</m:t>
+        </m:r>
+      </m:oMath>
+      <w:r>
+        <w:rPr>
+          <w:sz w:val="22"/>
+          <w:szCs w:val="22"/>
+        </w:rPr>
+        <w:t xml:space="preserve"> characters apart, where s1 and s2 are strings 1 and strings 2 respectively. If </w:t>
+      </w:r>
+      <w:r>
+        <w:rPr>
+          <w:sz w:val="22"/>
+          <w:szCs w:val="22"/>
+        </w:rPr>
+        <w:t>there are some</w:t>
+      </w:r>
+      <w:r>
+        <w:rPr>
+          <w:sz w:val="22"/>
+          <w:szCs w:val="22"/>
+        </w:rPr>
+        <w:t xml:space="preserve"> matching </w:t>
+      </w:r>
+      <w:r>
+        <w:rPr>
+          <w:sz w:val="22"/>
+          <w:szCs w:val="22"/>
+        </w:rPr>
+        <w:t>characters</w:t>
+      </w:r>
+      <w:r>
+        <w:rPr>
+          <w:sz w:val="22"/>
+          <w:szCs w:val="22"/>
+        </w:rPr>
+        <w:t xml:space="preserve"> found this way, then the number of transpositions </w:t>
+      </w:r>
+      <w:r>
+        <w:rPr>
+          <w:sz w:val="22"/>
+          <w:szCs w:val="22"/>
+        </w:rPr>
+        <w:t>is</w:t>
+      </w:r>
+      <w:r>
+        <w:rPr>
+          <w:sz w:val="22"/>
+          <w:szCs w:val="22"/>
+        </w:rPr>
+        <w:t xml:space="preserve"> found, which are regarded as matching characters that are not in the right order divided by two. The result is then calculated as:</w:t>
+      </w:r>
+    </w:p>
+    <w:p>
+      <w:pPr>
+        <w:rPr>
+          <w:sz w:val="22"/>
+          <w:szCs w:val="22"/>
+        </w:rPr>
+      </w:pPr>
+      <m:oMathPara>
+        <m:oMath>
+          <m:sSub>
+            <m:sSubPr>
+              <m:ctrlPr>
+                <w:rPr>
+                  <w:rFonts w:ascii="Cambria Math" w:hAnsi="Cambria Math"/>
+                  <w:i/>
+                  <w:sz w:val="22"/>
+                  <w:szCs w:val="22"/>
+                </w:rPr>
+              </m:ctrlPr>
+            </m:sSubPr>
+            <m:e>
+              <m:r>
+                <w:rPr>
+                  <w:rFonts w:ascii="Cambria Math" w:hAnsi="Cambria Math"/>
+                  <w:sz w:val="22"/>
+                  <w:szCs w:val="22"/>
+                </w:rPr>
+                <m:t>sim</m:t>
+              </m:r>
+            </m:e>
+            <m:sub>
+              <m:r>
+                <w:rPr>
+                  <w:rFonts w:ascii="Cambria Math" w:hAnsi="Cambria Math"/>
+                  <w:sz w:val="22"/>
+                  <w:szCs w:val="22"/>
+                </w:rPr>
+                <m:t>j</m:t>
+              </m:r>
+            </m:sub>
+          </m:sSub>
+          <m:r>
+            <w:rPr>
+              <w:rFonts w:ascii="Cambria Math" w:hAnsi="Cambria Math"/>
+              <w:sz w:val="22"/>
+              <w:szCs w:val="22"/>
+            </w:rPr>
+            <m:t>=</m:t>
+          </m:r>
+          <m:d>
+            <m:dPr>
+              <m:begChr m:val="{"/>
+              <m:endChr m:val=""/>
+              <m:ctrlPr>
+                <w:rPr>
+                  <w:rFonts w:ascii="Cambria Math" w:hAnsi="Cambria Math"/>
+                  <w:i/>
+                  <w:sz w:val="22"/>
+                  <w:szCs w:val="22"/>
+                </w:rPr>
+              </m:ctrlPr>
+            </m:dPr>
+            <m:e>
+              <m:m>
+                <m:mPr>
+                  <m:mcs>
+                    <m:mc>
+                      <m:mcPr>
+                        <m:count m:val="1"/>
+                        <m:mcJc m:val="center"/>
+                      </m:mcPr>
+                    </m:mc>
+                  </m:mcs>
+                  <m:ctrlPr>
+                    <w:rPr>
+                      <w:rFonts w:ascii="Cambria Math" w:hAnsi="Cambria Math"/>
+                      <w:i/>
+                      <w:sz w:val="22"/>
+                      <w:szCs w:val="22"/>
+                    </w:rPr>
+                  </m:ctrlPr>
+                </m:mPr>
+                <m:mr>
+                  <m:e>
+                    <m:r>
+                      <w:rPr>
+                        <w:rFonts w:ascii="Cambria Math" w:hAnsi="Cambria Math"/>
+                        <w:sz w:val="22"/>
+                        <w:szCs w:val="22"/>
+                      </w:rPr>
+                      <m:t>0                                               if m=0</m:t>
+                    </m:r>
+                  </m:e>
+                </m:mr>
+                <m:mr>
+                  <m:e>
+                    <m:f>
+                      <m:fPr>
+                        <m:ctrlPr>
+                          <w:rPr>
+                            <w:rFonts w:ascii="Cambria Math" w:hAnsi="Cambria Math"/>
+                            <w:i/>
+                            <w:sz w:val="22"/>
+                            <w:szCs w:val="22"/>
+                          </w:rPr>
+                        </m:ctrlPr>
+                      </m:fPr>
+                      <m:num>
+                        <m:r>
+                          <w:rPr>
+                            <w:rFonts w:ascii="Cambria Math" w:hAnsi="Cambria Math"/>
+                            <w:sz w:val="22"/>
+                            <w:szCs w:val="22"/>
+                          </w:rPr>
+                          <m:t>1</m:t>
+                        </m:r>
+                      </m:num>
+                      <m:den>
+                        <m:r>
+                          <w:rPr>
+                            <w:rFonts w:ascii="Cambria Math" w:hAnsi="Cambria Math"/>
+                            <w:sz w:val="22"/>
+                            <w:szCs w:val="22"/>
+                          </w:rPr>
+                          <m:t>3</m:t>
+                        </m:r>
+                      </m:den>
+                    </m:f>
+                    <m:r>
+                      <w:rPr>
+                        <w:rFonts w:ascii="Cambria Math" w:hAnsi="Cambria Math"/>
+                        <w:sz w:val="22"/>
+                        <w:szCs w:val="22"/>
+                      </w:rPr>
+                      <m:t xml:space="preserve"> </m:t>
+                    </m:r>
+                    <m:d>
+                      <m:dPr>
+                        <m:ctrlPr>
+                          <w:rPr>
+                            <w:rFonts w:ascii="Cambria Math" w:hAnsi="Cambria Math"/>
+                            <w:i/>
+                            <w:sz w:val="22"/>
+                            <w:szCs w:val="22"/>
+                          </w:rPr>
+                        </m:ctrlPr>
+                      </m:dPr>
+                      <m:e>
+                        <m:f>
+                          <m:fPr>
+                            <m:ctrlPr>
+                              <w:rPr>
+                                <w:rFonts w:ascii="Cambria Math" w:hAnsi="Cambria Math"/>
+                                <w:i/>
+                                <w:sz w:val="22"/>
+                                <w:szCs w:val="22"/>
+                              </w:rPr>
+                            </m:ctrlPr>
+                          </m:fPr>
+                          <m:num>
+                            <m:r>
+                              <w:rPr>
+                                <w:rFonts w:ascii="Cambria Math" w:hAnsi="Cambria Math"/>
+                                <w:sz w:val="22"/>
+                                <w:szCs w:val="22"/>
+                              </w:rPr>
+                              <m:t>m</m:t>
+                            </m:r>
+                          </m:num>
+                          <m:den>
+                            <m:d>
+                              <m:dPr>
+                                <m:begChr m:val="|"/>
+                                <m:endChr m:val="|"/>
+                                <m:ctrlPr>
+                                  <w:rPr>
+                                    <w:rFonts w:ascii="Cambria Math" w:hAnsi="Cambria Math"/>
+                                    <w:i/>
+                                    <w:sz w:val="22"/>
+                                    <w:szCs w:val="22"/>
+                                  </w:rPr>
+                                </m:ctrlPr>
+                              </m:dPr>
+                              <m:e>
+                                <m:sSub>
+                                  <m:sSubPr>
+                                    <m:ctrlPr>
+                                      <w:rPr>
+                                        <w:rFonts w:ascii="Cambria Math" w:hAnsi="Cambria Math"/>
+                                        <w:i/>
+                                        <w:sz w:val="22"/>
+                                        <w:szCs w:val="22"/>
+                                      </w:rPr>
+                                    </m:ctrlPr>
+                                  </m:sSubPr>
+                                  <m:e>
+                                    <m:r>
+                                      <w:rPr>
+                                        <w:rFonts w:ascii="Cambria Math" w:hAnsi="Cambria Math"/>
+                                        <w:sz w:val="22"/>
+                                        <w:szCs w:val="22"/>
+                                      </w:rPr>
+                                      <m:t>s</m:t>
+                                    </m:r>
+                                  </m:e>
+                                  <m:sub>
+                                    <m:r>
+                                      <w:rPr>
+                                        <w:rFonts w:ascii="Cambria Math" w:hAnsi="Cambria Math"/>
+                                        <w:sz w:val="22"/>
+                                        <w:szCs w:val="22"/>
+                                      </w:rPr>
+                                      <m:t>1</m:t>
+                                    </m:r>
+                                  </m:sub>
+                                </m:sSub>
+                              </m:e>
+                            </m:d>
+                          </m:den>
+                        </m:f>
+                        <m:r>
+                          <w:rPr>
+                            <w:rFonts w:ascii="Cambria Math" w:hAnsi="Cambria Math"/>
+                            <w:sz w:val="22"/>
+                            <w:szCs w:val="22"/>
+                          </w:rPr>
+                          <m:t>+</m:t>
+                        </m:r>
+                        <m:f>
+                          <m:fPr>
+                            <m:ctrlPr>
+                              <w:rPr>
+                                <w:rFonts w:ascii="Cambria Math" w:hAnsi="Cambria Math"/>
+                                <w:i/>
+                                <w:sz w:val="22"/>
+                                <w:szCs w:val="22"/>
+                              </w:rPr>
+                            </m:ctrlPr>
+                          </m:fPr>
+                          <m:num>
+                            <m:r>
+                              <w:rPr>
+                                <w:rFonts w:ascii="Cambria Math" w:hAnsi="Cambria Math"/>
+                                <w:sz w:val="22"/>
+                                <w:szCs w:val="22"/>
+                              </w:rPr>
+                              <m:t>m</m:t>
+                            </m:r>
+                          </m:num>
+                          <m:den>
+                            <m:d>
+                              <m:dPr>
+                                <m:begChr m:val="|"/>
+                                <m:endChr m:val="|"/>
+                                <m:ctrlPr>
+                                  <w:rPr>
+                                    <w:rFonts w:ascii="Cambria Math" w:hAnsi="Cambria Math"/>
+                                    <w:i/>
+                                    <w:sz w:val="22"/>
+                                    <w:szCs w:val="22"/>
+                                  </w:rPr>
+                                </m:ctrlPr>
+                              </m:dPr>
+                              <m:e>
+                                <m:sSub>
+                                  <m:sSubPr>
+                                    <m:ctrlPr>
+                                      <w:rPr>
+                                        <w:rFonts w:ascii="Cambria Math" w:hAnsi="Cambria Math"/>
+                                        <w:i/>
+                                        <w:sz w:val="22"/>
+                                        <w:szCs w:val="22"/>
+                                      </w:rPr>
+                                    </m:ctrlPr>
+                                  </m:sSubPr>
+                                  <m:e>
+                                    <m:r>
+                                      <w:rPr>
+                                        <w:rFonts w:ascii="Cambria Math" w:hAnsi="Cambria Math"/>
+                                        <w:sz w:val="22"/>
+                                        <w:szCs w:val="22"/>
+                                      </w:rPr>
+                                      <m:t>s</m:t>
+                                    </m:r>
+                                  </m:e>
+                                  <m:sub>
+                                    <m:r>
+                                      <w:rPr>
+                                        <w:rFonts w:ascii="Cambria Math" w:hAnsi="Cambria Math"/>
+                                        <w:sz w:val="22"/>
+                                        <w:szCs w:val="22"/>
+                                      </w:rPr>
+                                      <m:t>2</m:t>
+                                    </m:r>
+                                  </m:sub>
+                                </m:sSub>
+                              </m:e>
+                            </m:d>
+                          </m:den>
+                        </m:f>
+                        <m:r>
+                          <w:rPr>
+                            <w:rFonts w:ascii="Cambria Math" w:hAnsi="Cambria Math"/>
+                            <w:sz w:val="22"/>
+                            <w:szCs w:val="22"/>
+                          </w:rPr>
+                          <m:t>+</m:t>
+                        </m:r>
+                        <m:f>
+                          <m:fPr>
+                            <m:ctrlPr>
+                              <w:rPr>
+                                <w:rFonts w:ascii="Cambria Math" w:hAnsi="Cambria Math"/>
+                                <w:i/>
+                                <w:sz w:val="22"/>
+                                <w:szCs w:val="22"/>
+                              </w:rPr>
+                            </m:ctrlPr>
+                          </m:fPr>
+                          <m:num>
+                            <m:r>
+                              <w:rPr>
+                                <w:rFonts w:ascii="Cambria Math" w:hAnsi="Cambria Math"/>
+                                <w:sz w:val="22"/>
+                                <w:szCs w:val="22"/>
+                              </w:rPr>
+                              <m:t>m</m:t>
+                            </m:r>
+                            <m:r>
+                              <w:rPr>
+                                <w:rFonts w:ascii="Cambria Math" w:hAnsi="Cambria Math"/>
+                                <w:sz w:val="22"/>
+                                <w:szCs w:val="22"/>
+                              </w:rPr>
+                              <m:t>-t</m:t>
+                            </m:r>
+                          </m:num>
+                          <m:den>
+                            <m:r>
+                              <w:rPr>
+                                <w:rFonts w:ascii="Cambria Math" w:hAnsi="Cambria Math"/>
+                                <w:sz w:val="22"/>
+                                <w:szCs w:val="22"/>
+                              </w:rPr>
+                              <m:t>m</m:t>
+                            </m:r>
+                          </m:den>
+                        </m:f>
+                      </m:e>
+                    </m:d>
+                    <m:r>
+                      <w:rPr>
+                        <w:rFonts w:ascii="Cambria Math" w:hAnsi="Cambria Math"/>
+                        <w:sz w:val="22"/>
+                        <w:szCs w:val="22"/>
+                      </w:rPr>
+                      <m:t xml:space="preserve"> otherwise</m:t>
+                    </m:r>
+                  </m:e>
+                </m:mr>
+              </m:m>
+            </m:e>
+          </m:d>
+        </m:oMath>
+      </m:oMathPara>
+    </w:p>
+    <w:p>
+      <w:pPr>
+        <w:rPr>
+          <w:sz w:val="22"/>
+          <w:szCs w:val="22"/>
+        </w:rPr>
+      </w:pPr>
+      <w:r>
+        <w:rPr>
+          <w:sz w:val="22"/>
+          <w:szCs w:val="22"/>
+        </w:rPr>
+        <w:t xml:space="preserve"> </w:t>
+      </w:r>
+      <w:r>
+        <w:rPr>
+          <w:sz w:val="22"/>
+          <w:szCs w:val="22"/>
+        </w:rPr>
+        <w:t xml:space="preserve">Where </w:t>
+      </w:r>
+      <m:oMath>
+        <m:d>
+          <m:dPr>
+            <m:begChr m:val="|"/>
+            <m:endChr m:val="|"/>
+            <m:ctrlPr>
+              <w:rPr>
+                <w:rFonts w:ascii="Cambria Math" w:hAnsi="Cambria Math"/>
+                <w:i/>
+                <w:sz w:val="22"/>
+                <w:szCs w:val="22"/>
+              </w:rPr>
+            </m:ctrlPr>
+          </m:dPr>
+          <m:e>
+            <m:sSub>
+              <m:sSubPr>
+                <m:ctrlPr>
+                  <w:rPr>
+                    <w:rFonts w:ascii="Cambria Math" w:hAnsi="Cambria Math"/>
+                    <w:i/>
+                    <w:sz w:val="22"/>
+                    <w:szCs w:val="22"/>
+                  </w:rPr>
+                </m:ctrlPr>
+              </m:sSubPr>
+              <m:e>
+                <m:r>
+                  <w:rPr>
+                    <w:rFonts w:ascii="Cambria Math" w:hAnsi="Cambria Math"/>
+                    <w:sz w:val="22"/>
+                    <w:szCs w:val="22"/>
+                  </w:rPr>
+                  <m:t>s</m:t>
+                </m:r>
+              </m:e>
+              <m:sub>
+                <m:r>
+                  <w:rPr>
+                    <w:rFonts w:ascii="Cambria Math" w:hAnsi="Cambria Math"/>
+                    <w:sz w:val="22"/>
+                    <w:szCs w:val="22"/>
+                  </w:rPr>
+                  <m:t>i</m:t>
+                </m:r>
+              </m:sub>
+            </m:sSub>
+          </m:e>
+        </m:d>
+      </m:oMath>
+      <w:r>
+        <w:rPr>
+          <w:sz w:val="22"/>
+          <w:szCs w:val="22"/>
+        </w:rPr>
+        <w:t xml:space="preserve"> is the length of the string, m is the number of matching characters, and t is the number of transpositions.</w:t>
+      </w:r>
+    </w:p>
+    <w:p>
+      <w:pPr>
+        <w:rPr>
+          <w:sz w:val="22"/>
+          <w:szCs w:val="22"/>
+        </w:rPr>
+      </w:pPr>
+      <w:r>
+        <w:rPr>
+          <w:sz w:val="22"/>
+          <w:szCs w:val="22"/>
+        </w:rPr>
+        <w:lastRenderedPageBreak/>
+        <w:t>This algorithm has a worst-case time complexity of O(n * m) with a space complexity of O(n + m).</w:t>
       </w:r>
     </w:p>
     <w:p>
@@ -4679,7 +5626,6 @@
           <w:sz w:val="22"/>
           <w:szCs w:val="22"/>
         </w:rPr>
-        <w:lastRenderedPageBreak/>
         <w:t>1.2.4  Jaro-Winkler Distance</w:t>
       </w:r>
     </w:p>
@@ -4713,7 +5659,7 @@
                     <pic:cNvPicPr/>
                   </pic:nvPicPr>
                   <pic:blipFill>
-                    <a:blip r:embed="rId20"/>
+                    <a:blip r:embed="rId21"/>
                     <a:stretch>
                       <a:fillRect/>
                     </a:stretch>
@@ -4763,7 +5709,7 @@
         </w:rPr>
         <w:t xml:space="preserve"> Jaro-Winkler Distance algorithm (pseudocode adapted from: </w:t>
       </w:r>
-      <w:hyperlink r:id="rId21" w:history="1">
+      <w:hyperlink r:id="rId22" w:history="1">
         <w:r>
           <w:rPr>
             <w:rStyle w:val="Hyperlink"/>
@@ -4783,12 +5729,251 @@
     </w:p>
     <w:p>
       <w:pPr>
-        <w:jc w:val="center"/>
-        <w:rPr>
-          <w:sz w:val="22"/>
-          <w:szCs w:val="22"/>
-        </w:rPr>
-      </w:pPr>
+        <w:rPr>
+          <w:sz w:val="22"/>
+          <w:szCs w:val="22"/>
+        </w:rPr>
+      </w:pPr>
+      <w:r>
+        <w:rPr>
+          <w:sz w:val="22"/>
+          <w:szCs w:val="22"/>
+        </w:rPr>
+        <w:t xml:space="preserve">This algorithm is an advancement of the Jaro Distance method. </w:t>
+      </w:r>
+      <w:r>
+        <w:rPr>
+          <w:sz w:val="22"/>
+          <w:szCs w:val="22"/>
+        </w:rPr>
+        <w:t>It builds upon the values generated from the original by using a prefix scale which makes stings, that match from the beginning for a set prefix length, more favourable ratings.</w:t>
+      </w:r>
+    </w:p>
+    <w:p>
+      <w:pPr>
+        <w:rPr>
+          <w:sz w:val="22"/>
+          <w:szCs w:val="22"/>
+        </w:rPr>
+      </w:pPr>
+      <w:r>
+        <w:rPr>
+          <w:sz w:val="22"/>
+          <w:szCs w:val="22"/>
+        </w:rPr>
+        <w:t>So the new final result coefficient for two strings is:</w:t>
+      </w:r>
+    </w:p>
+    <w:p>
+      <w:pPr>
+        <w:rPr>
+          <w:sz w:val="22"/>
+          <w:szCs w:val="22"/>
+        </w:rPr>
+      </w:pPr>
+      <m:oMathPara>
+        <m:oMath>
+          <m:sSub>
+            <m:sSubPr>
+              <m:ctrlPr>
+                <w:rPr>
+                  <w:rFonts w:ascii="Cambria Math" w:hAnsi="Cambria Math"/>
+                  <w:i/>
+                  <w:sz w:val="22"/>
+                  <w:szCs w:val="22"/>
+                </w:rPr>
+              </m:ctrlPr>
+            </m:sSubPr>
+            <m:e>
+              <m:r>
+                <w:rPr>
+                  <w:rFonts w:ascii="Cambria Math" w:hAnsi="Cambria Math"/>
+                  <w:sz w:val="22"/>
+                  <w:szCs w:val="22"/>
+                </w:rPr>
+                <m:t>sim</m:t>
+              </m:r>
+            </m:e>
+            <m:sub>
+              <m:r>
+                <w:rPr>
+                  <w:rFonts w:ascii="Cambria Math" w:hAnsi="Cambria Math"/>
+                  <w:sz w:val="22"/>
+                  <w:szCs w:val="22"/>
+                </w:rPr>
+                <m:t>j</m:t>
+              </m:r>
+              <m:r>
+                <w:rPr>
+                  <w:rFonts w:ascii="Cambria Math" w:hAnsi="Cambria Math"/>
+                  <w:sz w:val="22"/>
+                  <w:szCs w:val="22"/>
+                </w:rPr>
+                <m:t>w</m:t>
+              </m:r>
+            </m:sub>
+          </m:sSub>
+          <m:r>
+            <w:rPr>
+              <w:rFonts w:ascii="Cambria Math" w:hAnsi="Cambria Math"/>
+              <w:sz w:val="22"/>
+              <w:szCs w:val="22"/>
+            </w:rPr>
+            <m:t>=</m:t>
+          </m:r>
+          <m:sSub>
+            <m:sSubPr>
+              <m:ctrlPr>
+                <w:rPr>
+                  <w:rFonts w:ascii="Cambria Math" w:hAnsi="Cambria Math"/>
+                  <w:i/>
+                  <w:sz w:val="22"/>
+                  <w:szCs w:val="22"/>
+                </w:rPr>
+              </m:ctrlPr>
+            </m:sSubPr>
+            <m:e>
+              <m:r>
+                <w:rPr>
+                  <w:rFonts w:ascii="Cambria Math" w:hAnsi="Cambria Math"/>
+                  <w:sz w:val="22"/>
+                  <w:szCs w:val="22"/>
+                </w:rPr>
+                <m:t>sim</m:t>
+              </m:r>
+            </m:e>
+            <m:sub>
+              <m:r>
+                <w:rPr>
+                  <w:rFonts w:ascii="Cambria Math" w:hAnsi="Cambria Math"/>
+                  <w:sz w:val="22"/>
+                  <w:szCs w:val="22"/>
+                </w:rPr>
+                <m:t>j</m:t>
+              </m:r>
+            </m:sub>
+          </m:sSub>
+          <m:r>
+            <w:rPr>
+              <w:rFonts w:ascii="Cambria Math" w:hAnsi="Cambria Math"/>
+              <w:sz w:val="22"/>
+              <w:szCs w:val="22"/>
+            </w:rPr>
+            <m:t>+lp(1-</m:t>
+          </m:r>
+          <m:sSub>
+            <m:sSubPr>
+              <m:ctrlPr>
+                <w:rPr>
+                  <w:rFonts w:ascii="Cambria Math" w:hAnsi="Cambria Math"/>
+                  <w:i/>
+                  <w:sz w:val="22"/>
+                  <w:szCs w:val="22"/>
+                </w:rPr>
+              </m:ctrlPr>
+            </m:sSubPr>
+            <m:e>
+              <m:r>
+                <w:rPr>
+                  <w:rFonts w:ascii="Cambria Math" w:hAnsi="Cambria Math"/>
+                  <w:sz w:val="22"/>
+                  <w:szCs w:val="22"/>
+                </w:rPr>
+                <m:t>sim</m:t>
+              </m:r>
+            </m:e>
+            <m:sub>
+              <m:r>
+                <w:rPr>
+                  <w:rFonts w:ascii="Cambria Math" w:hAnsi="Cambria Math"/>
+                  <w:sz w:val="22"/>
+                  <w:szCs w:val="22"/>
+                </w:rPr>
+                <m:t>j</m:t>
+              </m:r>
+            </m:sub>
+          </m:sSub>
+          <m:r>
+            <w:rPr>
+              <w:rFonts w:ascii="Cambria Math" w:hAnsi="Cambria Math"/>
+              <w:sz w:val="22"/>
+              <w:szCs w:val="22"/>
+            </w:rPr>
+            <m:t>)</m:t>
+          </m:r>
+        </m:oMath>
+      </m:oMathPara>
+    </w:p>
+    <w:p>
+      <w:pPr>
+        <w:rPr>
+          <w:sz w:val="22"/>
+          <w:szCs w:val="22"/>
+        </w:rPr>
+      </w:pPr>
+      <w:r>
+        <w:rPr>
+          <w:sz w:val="22"/>
+          <w:szCs w:val="22"/>
+        </w:rPr>
+        <w:t xml:space="preserve">Where </w:t>
+      </w:r>
+      <m:oMath>
+        <m:sSub>
+          <m:sSubPr>
+            <m:ctrlPr>
+              <w:rPr>
+                <w:rFonts w:ascii="Cambria Math" w:hAnsi="Cambria Math"/>
+                <w:i/>
+                <w:sz w:val="22"/>
+                <w:szCs w:val="22"/>
+              </w:rPr>
+            </m:ctrlPr>
+          </m:sSubPr>
+          <m:e>
+            <m:r>
+              <w:rPr>
+                <w:rFonts w:ascii="Cambria Math" w:hAnsi="Cambria Math"/>
+                <w:sz w:val="22"/>
+                <w:szCs w:val="22"/>
+              </w:rPr>
+              <m:t>sim</m:t>
+            </m:r>
+          </m:e>
+          <m:sub>
+            <m:r>
+              <w:rPr>
+                <w:rFonts w:ascii="Cambria Math" w:hAnsi="Cambria Math"/>
+                <w:sz w:val="22"/>
+                <w:szCs w:val="22"/>
+              </w:rPr>
+              <m:t>j</m:t>
+            </m:r>
+          </m:sub>
+        </m:sSub>
+      </m:oMath>
+      <w:r>
+        <w:rPr>
+          <w:sz w:val="22"/>
+          <w:szCs w:val="22"/>
+        </w:rPr>
+        <w:t xml:space="preserve"> is the original Jaro distance, p is the prefix scale, and l is the prefix length. </w:t>
+      </w:r>
+    </w:p>
+    <w:p>
+      <w:pPr>
+        <w:rPr>
+          <w:sz w:val="22"/>
+          <w:szCs w:val="22"/>
+        </w:rPr>
+      </w:pPr>
+      <w:r>
+        <w:rPr>
+          <w:sz w:val="22"/>
+          <w:szCs w:val="22"/>
+        </w:rPr>
+        <w:t>This algorithm however does not affect the overall time and space complexities, which remain O(n * m) and O(n + m) respectively.</w:t>
+      </w:r>
     </w:p>
     <w:p>
       <w:pPr>
@@ -4834,6 +6019,7 @@
           <w:sz w:val="22"/>
           <w:szCs w:val="22"/>
         </w:rPr>
+        <w:lastRenderedPageBreak/>
         <w:t>1.3.1  Linear Search</w:t>
       </w:r>
     </w:p>
@@ -4909,7 +6095,6 @@
           <w:sz w:val="22"/>
           <w:szCs w:val="22"/>
         </w:rPr>
-        <w:lastRenderedPageBreak/>
         <w:t>1.3.1  Binary Search</w:t>
       </w:r>
     </w:p>
@@ -5085,7 +6270,7 @@
       <w:r>
         <w:t xml:space="preserve"> </w:t>
       </w:r>
-      <w:hyperlink r:id="rId22" w:history="1">
+      <w:hyperlink r:id="rId23" w:history="1">
         <w:r>
           <w:rPr>
             <w:rStyle w:val="Hyperlink"/>
@@ -5108,6 +6293,7 @@
           <w:sz w:val="22"/>
           <w:szCs w:val="22"/>
         </w:rPr>
+        <w:lastRenderedPageBreak/>
         <w:t xml:space="preserve">For some cases of developing spell checkers the implementation seems quite simple and straightforward. As outlined in </w:t>
       </w:r>
       <w:r>
@@ -5199,15 +6385,7 @@
           <w:sz w:val="22"/>
           <w:szCs w:val="22"/>
         </w:rPr>
-        <w:t xml:space="preserve">The also make </w:t>
-      </w:r>
-      <w:r>
-        <w:rPr>
-          <w:sz w:val="22"/>
-          <w:szCs w:val="22"/>
-        </w:rPr>
-        <w:lastRenderedPageBreak/>
-        <w:t>the point to say that the algorithm provides easy identification of misspellings and can offer results very quickly, reducing the runtime of the application used.</w:t>
+        <w:t>The also make the point to say that the algorithm provides easy identification of misspellings and can offer results very quickly, reducing the runtime of the application used.</w:t>
       </w:r>
     </w:p>
     <w:p>
@@ -5297,52 +6475,26 @@
           <w:sz w:val="22"/>
           <w:szCs w:val="18"/>
         </w:rPr>
-        <w:t>1</w:t>
-      </w:r>
-      <w:r>
+        <w:t>1.5.1 Design</w:t>
+      </w:r>
+    </w:p>
+    <w:p>
+      <w:pPr>
+        <w:jc w:val="center"/>
         <w:rPr>
           <w:b/>
           <w:bCs/>
           <w:sz w:val="22"/>
           <w:szCs w:val="18"/>
         </w:rPr>
-        <w:t>.</w:t>
-      </w:r>
-      <w:r>
-        <w:rPr>
-          <w:b/>
-          <w:bCs/>
-          <w:sz w:val="22"/>
-          <w:szCs w:val="18"/>
-        </w:rPr>
-        <w:t>5</w:t>
-      </w:r>
-      <w:r>
-        <w:rPr>
-          <w:b/>
-          <w:bCs/>
-          <w:sz w:val="22"/>
-          <w:szCs w:val="18"/>
-        </w:rPr>
-        <w:t>.1 Design</w:t>
-      </w:r>
-    </w:p>
-    <w:p>
-      <w:pPr>
-        <w:jc w:val="center"/>
-        <w:rPr>
-          <w:b/>
-          <w:bCs/>
-          <w:sz w:val="22"/>
-          <w:szCs w:val="18"/>
-        </w:rPr>
-      </w:pPr>
-      <w:r>
-        <w:rPr>
-          <w:noProof/>
-          <w:sz w:val="22"/>
-          <w:szCs w:val="18"/>
-        </w:rPr>
+      </w:pPr>
+      <w:r>
+        <w:rPr>
+          <w:noProof/>
+          <w:sz w:val="22"/>
+          <w:szCs w:val="18"/>
+        </w:rPr>
+        <w:lastRenderedPageBreak/>
         <w:drawing>
           <wp:inline distT="0" distB="0" distL="0" distR="0" wp14:anchorId="29EDEFC3" wp14:editId="63D59576">
             <wp:extent cx="2752725" cy="4108188"/>
@@ -5359,7 +6511,7 @@
                     <pic:cNvPicPr/>
                   </pic:nvPicPr>
                   <pic:blipFill>
-                    <a:blip r:embed="rId23"/>
+                    <a:blip r:embed="rId24"/>
                     <a:stretch>
                       <a:fillRect/>
                     </a:stretch>
@@ -5438,15 +6590,7 @@
           <w:sz w:val="22"/>
           <w:szCs w:val="18"/>
         </w:rPr>
-        <w:t xml:space="preserve">not perform any word list generation. Instead of having a corpus from which words could be extracted and then stored at runtime, this system instead assumed that words were already compiled and sorted in alphabetical order. Therefore, all that was needed of the code was to store the list </w:t>
-      </w:r>
-      <w:r>
-        <w:rPr>
-          <w:sz w:val="22"/>
-          <w:szCs w:val="18"/>
-        </w:rPr>
-        <w:lastRenderedPageBreak/>
-        <w:t>in its entirety while performing, then allow the user to enter a string, whereby the code would give a simple response as to whether the word exists in the list or not.</w:t>
+        <w:t>not perform any word list generation. Instead of having a corpus from which words could be extracted and then stored at runtime, this system instead assumed that words were already compiled and sorted in alphabetical order. Therefore, all that was needed of the code was to store the list in its entirety while performing, then allow the user to enter a string, whereby the code would give a simple response as to whether the word exists in the list or not.</w:t>
       </w:r>
     </w:p>
     <w:p>
@@ -5501,7 +6645,7 @@
           <w:sz w:val="22"/>
           <w:szCs w:val="18"/>
         </w:rPr>
-        <w:t>1</w:t>
+        <w:t xml:space="preserve">1.5.2 </w:t>
       </w:r>
       <w:r>
         <w:rPr>
@@ -5510,7 +6654,7 @@
           <w:sz w:val="22"/>
           <w:szCs w:val="18"/>
         </w:rPr>
-        <w:t>.</w:t>
+        <w:t xml:space="preserve">Results and </w:t>
       </w:r>
       <w:r>
         <w:rPr>
@@ -5519,33 +6663,6 @@
           <w:sz w:val="22"/>
           <w:szCs w:val="18"/>
         </w:rPr>
-        <w:t>5</w:t>
-      </w:r>
-      <w:r>
-        <w:rPr>
-          <w:b/>
-          <w:bCs/>
-          <w:sz w:val="22"/>
-          <w:szCs w:val="18"/>
-        </w:rPr>
-        <w:t xml:space="preserve">.2 </w:t>
-      </w:r>
-      <w:r>
-        <w:rPr>
-          <w:b/>
-          <w:bCs/>
-          <w:sz w:val="22"/>
-          <w:szCs w:val="18"/>
-        </w:rPr>
-        <w:t xml:space="preserve">Results and </w:t>
-      </w:r>
-      <w:r>
-        <w:rPr>
-          <w:b/>
-          <w:bCs/>
-          <w:sz w:val="22"/>
-          <w:szCs w:val="18"/>
-        </w:rPr>
         <w:t>Conclusions</w:t>
       </w:r>
     </w:p>
@@ -5597,6 +6714,7 @@
           <w:sz w:val="22"/>
           <w:szCs w:val="22"/>
         </w:rPr>
+        <w:lastRenderedPageBreak/>
         <w:t xml:space="preserve">Though even with these imperfections and the large size as a result, the system could handle this very easily. Though the runtime is dependent on the word entered, the </w:t>
       </w:r>
       <w:r>
@@ -5965,10 +7083,10 @@
         </w:rPr>
         <w:lastRenderedPageBreak/>
         <w:drawing>
-          <wp:inline distT="0" distB="0" distL="0" distR="0" wp14:anchorId="432A47F4" wp14:editId="7B912F2E">
-            <wp:extent cx="4086225" cy="4281346"/>
-            <wp:effectExtent l="19050" t="19050" r="0" b="5080"/>
-            <wp:docPr id="1919683354" name="Picture 1" descr="A screenshot of a computer program&#10;&#10;Description automatically generated"/>
+          <wp:inline distT="0" distB="0" distL="0" distR="0" wp14:anchorId="36361706" wp14:editId="7512B2B4">
+            <wp:extent cx="3962400" cy="4188046"/>
+            <wp:effectExtent l="19050" t="19050" r="0" b="3175"/>
+            <wp:docPr id="230074715" name="Picture 1" descr="A screenshot of a computer program&#10;&#10;Description automatically generated"/>
             <wp:cNvGraphicFramePr>
               <a:graphicFrameLocks xmlns:a="http://schemas.openxmlformats.org/drawingml/2006/main" noChangeAspect="1"/>
             </wp:cNvGraphicFramePr>
@@ -5976,11 +7094,11 @@
               <a:graphicData uri="http://schemas.openxmlformats.org/drawingml/2006/picture">
                 <pic:pic xmlns:pic="http://schemas.openxmlformats.org/drawingml/2006/picture">
                   <pic:nvPicPr>
-                    <pic:cNvPr id="1919683354" name="Picture 1" descr="A screenshot of a computer program&#10;&#10;Description automatically generated"/>
+                    <pic:cNvPr id="230074715" name="Picture 1" descr="A screenshot of a computer program&#10;&#10;Description automatically generated"/>
                     <pic:cNvPicPr/>
                   </pic:nvPicPr>
                   <pic:blipFill>
-                    <a:blip r:embed="rId24"/>
+                    <a:blip r:embed="rId25"/>
                     <a:stretch>
                       <a:fillRect/>
                     </a:stretch>
@@ -5988,7 +7106,7 @@
                   <pic:spPr>
                     <a:xfrm>
                       <a:off x="0" y="0"/>
-                      <a:ext cx="4089258" cy="4284524"/>
+                      <a:ext cx="3964428" cy="4190189"/>
                     </a:xfrm>
                     <a:prstGeom prst="rect">
                       <a:avLst/>
@@ -6028,7 +7146,28 @@
           <w:sz w:val="22"/>
           <w:szCs w:val="18"/>
         </w:rPr>
-        <w:t>Pseudocode of Corpus Generation Process</w:t>
+        <w:t xml:space="preserve">Pseudocode of Corpus </w:t>
+      </w:r>
+      <w:r>
+        <w:rPr>
+          <w:sz w:val="22"/>
+          <w:szCs w:val="18"/>
+        </w:rPr>
+        <w:t xml:space="preserve">Extraction </w:t>
+      </w:r>
+      <w:r>
+        <w:rPr>
+          <w:sz w:val="22"/>
+          <w:szCs w:val="18"/>
+        </w:rPr>
+        <w:t>p</w:t>
+      </w:r>
+      <w:r>
+        <w:rPr>
+          <w:sz w:val="22"/>
+          <w:szCs w:val="18"/>
+        </w:rPr>
+        <w:t>rocess</w:t>
       </w:r>
     </w:p>
     <w:p>
@@ -6095,6 +7234,72 @@
           <w:szCs w:val="18"/>
         </w:rPr>
         <w:t xml:space="preserve"> </w:t>
+      </w:r>
+    </w:p>
+    <w:p>
+      <w:pPr>
+        <w:rPr>
+          <w:sz w:val="22"/>
+          <w:szCs w:val="18"/>
+        </w:rPr>
+      </w:pPr>
+      <w:r>
+        <w:rPr>
+          <w:sz w:val="22"/>
+          <w:szCs w:val="18"/>
+        </w:rPr>
+        <w:t xml:space="preserve">The corpus chosen came from the British National </w:t>
+      </w:r>
+      <w:r>
+        <w:rPr>
+          <w:sz w:val="22"/>
+          <w:szCs w:val="18"/>
+        </w:rPr>
+        <w:t>Corpus and</w:t>
+      </w:r>
+      <w:r>
+        <w:rPr>
+          <w:sz w:val="22"/>
+          <w:szCs w:val="18"/>
+        </w:rPr>
+        <w:t xml:space="preserve"> contains</w:t>
+      </w:r>
+      <w:r>
+        <w:rPr>
+          <w:sz w:val="22"/>
+          <w:szCs w:val="18"/>
+        </w:rPr>
+        <w:t xml:space="preserve"> a series of folders of xml files relating to various texts of different genres and content. It was decided that using this content would be much better than say a list of text files as they took the time to also define the type of each word, such as if it was a verb, adjective, etc. This would be useful in the long term as it would prevent the need of developing a function to classify words, and </w:t>
+      </w:r>
+      <w:r>
+        <w:rPr>
+          <w:sz w:val="22"/>
+          <w:szCs w:val="18"/>
+        </w:rPr>
+        <w:lastRenderedPageBreak/>
+        <w:t>therefore if a system was to be implemented which could analyse the syntax of sentences and longer English texts, then the job would be a lot easier.</w:t>
+      </w:r>
+    </w:p>
+    <w:p>
+      <w:pPr>
+        <w:rPr>
+          <w:sz w:val="22"/>
+          <w:szCs w:val="18"/>
+        </w:rPr>
+      </w:pPr>
+      <w:r>
+        <w:rPr>
+          <w:sz w:val="22"/>
+          <w:szCs w:val="18"/>
+        </w:rPr>
+        <w:t xml:space="preserve">When selecting which words were valid or not, </w:t>
+      </w:r>
+      <w:r>
+        <w:rPr>
+          <w:sz w:val="22"/>
+          <w:szCs w:val="18"/>
+        </w:rPr>
+        <w:t>corpus extractor would follow a strict policy. It didn’t store single letter words, which is self-explanatory for why. It also only stored words in lower case, and disregarded hyphenated words and strings with apostrophes. This of course would mean that the spell checker wouldn’t be able to handle these types of words. However, this was done to simplify the storage of words, since the way the corpus worked made it hard to store these kinds of words.</w:t>
       </w:r>
     </w:p>
     <w:p>
@@ -6203,19 +7408,19 @@
           <w:sz w:val="22"/>
           <w:szCs w:val="18"/>
         </w:rPr>
-        <w:t xml:space="preserve"> This part of the system was organized into a series of </w:t>
-      </w:r>
-      <w:r>
-        <w:rPr>
-          <w:sz w:val="22"/>
-          <w:szCs w:val="18"/>
-        </w:rPr>
-        <w:lastRenderedPageBreak/>
-        <w:t>menu’s which allows a user to specify everything including the word file, the search method, and the algorithm for suggestions.</w:t>
-      </w:r>
-    </w:p>
-    <w:p>
-      <w:pPr>
+        <w:t xml:space="preserve"> This part of the system was organized into a series of menu’s which allows a user to specify everything including the word file, the search method, and the algorithm for suggestions.</w:t>
+      </w:r>
+      <w:r>
+        <w:rPr>
+          <w:sz w:val="22"/>
+          <w:szCs w:val="18"/>
+        </w:rPr>
+        <w:t xml:space="preserve"> </w:t>
+      </w:r>
+    </w:p>
+    <w:p>
+      <w:pPr>
+        <w:jc w:val="center"/>
         <w:rPr>
           <w:b/>
           <w:bCs/>
@@ -6225,13 +7430,67 @@
       </w:pPr>
       <w:r>
         <w:rPr>
+          <w:noProof/>
+        </w:rPr>
+        <w:drawing>
+          <wp:inline distT="0" distB="0" distL="0" distR="0" wp14:anchorId="710BBBAC" wp14:editId="25E06C45">
+            <wp:extent cx="5019675" cy="4644283"/>
+            <wp:effectExtent l="19050" t="19050" r="0" b="4445"/>
+            <wp:docPr id="637410491" name="Picture 1" descr="A screenshot of a computer program&#10;&#10;Description automatically generated"/>
+            <wp:cNvGraphicFramePr>
+              <a:graphicFrameLocks xmlns:a="http://schemas.openxmlformats.org/drawingml/2006/main" noChangeAspect="1"/>
+            </wp:cNvGraphicFramePr>
+            <a:graphic xmlns:a="http://schemas.openxmlformats.org/drawingml/2006/main">
+              <a:graphicData uri="http://schemas.openxmlformats.org/drawingml/2006/picture">
+                <pic:pic xmlns:pic="http://schemas.openxmlformats.org/drawingml/2006/picture">
+                  <pic:nvPicPr>
+                    <pic:cNvPr id="637410491" name="Picture 1" descr="A screenshot of a computer program&#10;&#10;Description automatically generated"/>
+                    <pic:cNvPicPr/>
+                  </pic:nvPicPr>
+                  <pic:blipFill>
+                    <a:blip r:embed="rId26"/>
+                    <a:stretch>
+                      <a:fillRect/>
+                    </a:stretch>
+                  </pic:blipFill>
+                  <pic:spPr>
+                    <a:xfrm>
+                      <a:off x="0" y="0"/>
+                      <a:ext cx="5037180" cy="4660479"/>
+                    </a:xfrm>
+                    <a:prstGeom prst="rect">
+                      <a:avLst/>
+                    </a:prstGeom>
+                    <a:ln>
+                      <a:solidFill>
+                        <a:schemeClr val="tx1"/>
+                      </a:solidFill>
+                    </a:ln>
+                  </pic:spPr>
+                </pic:pic>
+              </a:graphicData>
+            </a:graphic>
+          </wp:inline>
+        </w:drawing>
+      </w:r>
+      <w:r>
+        <w:rPr>
           <w:b/>
           <w:bCs/>
           <w:sz w:val="22"/>
           <w:szCs w:val="18"/>
         </w:rPr>
-        <w:t>2</w:t>
-      </w:r>
+        <w:t xml:space="preserve"> </w:t>
+      </w:r>
+    </w:p>
+    <w:p>
+      <w:pPr>
+        <w:jc w:val="center"/>
+        <w:rPr>
+          <w:sz w:val="22"/>
+          <w:szCs w:val="18"/>
+        </w:rPr>
+      </w:pPr>
       <w:r>
         <w:rPr>
           <w:b/>
@@ -6239,17 +7498,92 @@
           <w:sz w:val="22"/>
           <w:szCs w:val="18"/>
         </w:rPr>
-        <w:t>.</w:t>
-      </w:r>
-      <w:r>
+        <w:t xml:space="preserve">Figure 10. </w:t>
+      </w:r>
+      <w:r>
+        <w:rPr>
+          <w:sz w:val="22"/>
+          <w:szCs w:val="18"/>
+        </w:rPr>
+        <w:t>Pseudocode of Spell Checker process</w:t>
+      </w:r>
+    </w:p>
+    <w:p>
+      <w:pPr>
+        <w:rPr>
+          <w:sz w:val="22"/>
+          <w:szCs w:val="18"/>
+        </w:rPr>
+      </w:pPr>
+    </w:p>
+    <w:p>
+      <w:pPr>
+        <w:rPr>
+          <w:sz w:val="22"/>
+          <w:szCs w:val="18"/>
+        </w:rPr>
+      </w:pPr>
+      <w:r>
+        <w:rPr>
+          <w:sz w:val="22"/>
+          <w:szCs w:val="18"/>
+        </w:rPr>
+        <w:lastRenderedPageBreak/>
+        <w:t xml:space="preserve">Once the user had selected all the actual </w:t>
+      </w:r>
+      <w:r>
+        <w:rPr>
+          <w:sz w:val="22"/>
+          <w:szCs w:val="18"/>
+        </w:rPr>
+        <w:t>parameters for their search, they are then given prompt to enter a desired word they wish to test. This word must be valid, i.e. no numbers or non-letter characters. After being entered and validated, the system will load the words from the file type specified into a data type that the method chosen can handle. Then when everything is in place, then the user’s string is searched for</w:t>
+      </w:r>
+      <w:r>
+        <w:rPr>
+          <w:sz w:val="22"/>
+          <w:szCs w:val="18"/>
+        </w:rPr>
+        <w:t xml:space="preserve">. If it exists in the data structure, then no more processes are needed. However, if not, then the code will loop linearly through the data structure and use the algorithm called for by the user to calculate the distance between the user word and every other word in the list. Once </w:t>
+      </w:r>
+      <w:r>
+        <w:rPr>
+          <w:sz w:val="22"/>
+          <w:szCs w:val="18"/>
+        </w:rPr>
+        <w:t>all these values are compiled, the top ten closest words by distance are then displayed to the user.</w:t>
+      </w:r>
+      <w:r>
+        <w:rPr>
+          <w:sz w:val="22"/>
+          <w:szCs w:val="18"/>
+        </w:rPr>
+        <w:t xml:space="preserve"> Then the time to compile all this data is displayed to the user.</w:t>
+      </w:r>
+    </w:p>
+    <w:p>
+      <w:pPr>
+        <w:rPr>
+          <w:sz w:val="22"/>
+          <w:szCs w:val="18"/>
+        </w:rPr>
+      </w:pPr>
+      <w:r>
+        <w:rPr>
+          <w:sz w:val="22"/>
+          <w:szCs w:val="18"/>
+        </w:rPr>
+        <w:t>This way, the user can get complete control of what they want to check, with the main two metrics of time complexity and suggestion closeness being shown immediately after completion to allow for easy assessment of how effective the algorithm was in correcting the spelling mistake.</w:t>
+      </w:r>
+    </w:p>
+    <w:p>
+      <w:pPr>
         <w:rPr>
           <w:b/>
           <w:bCs/>
           <w:sz w:val="22"/>
           <w:szCs w:val="18"/>
         </w:rPr>
-        <w:t>1</w:t>
-      </w:r>
+      </w:pPr>
       <w:r>
         <w:rPr>
           <w:b/>
@@ -6257,7 +7591,7 @@
           <w:sz w:val="22"/>
           <w:szCs w:val="18"/>
         </w:rPr>
-        <w:t>.</w:t>
+        <w:t>2</w:t>
       </w:r>
       <w:r>
         <w:rPr>
@@ -6266,7 +7600,7 @@
           <w:sz w:val="22"/>
           <w:szCs w:val="18"/>
         </w:rPr>
-        <w:t>4</w:t>
+        <w:t>.</w:t>
       </w:r>
       <w:r>
         <w:rPr>
@@ -6275,7 +7609,7 @@
           <w:sz w:val="22"/>
           <w:szCs w:val="18"/>
         </w:rPr>
-        <w:t xml:space="preserve"> </w:t>
+        <w:t>1</w:t>
       </w:r>
       <w:r>
         <w:rPr>
@@ -6284,44 +7618,186 @@
           <w:sz w:val="22"/>
           <w:szCs w:val="18"/>
         </w:rPr>
+        <w:t>.</w:t>
+      </w:r>
+      <w:r>
+        <w:rPr>
+          <w:b/>
+          <w:bCs/>
+          <w:sz w:val="22"/>
+          <w:szCs w:val="18"/>
+        </w:rPr>
+        <w:t>4</w:t>
+      </w:r>
+      <w:r>
+        <w:rPr>
+          <w:b/>
+          <w:bCs/>
+          <w:sz w:val="22"/>
+          <w:szCs w:val="18"/>
+        </w:rPr>
+        <w:t xml:space="preserve"> </w:t>
+      </w:r>
+      <w:r>
+        <w:rPr>
+          <w:b/>
+          <w:bCs/>
+          <w:sz w:val="22"/>
+          <w:szCs w:val="18"/>
+        </w:rPr>
         <w:t>Automated Testing</w:t>
       </w:r>
     </w:p>
     <w:p>
       <w:pPr>
-        <w:pStyle w:val="Heading2"/>
-      </w:pPr>
-      <w:r>
-        <w:t>2.</w:t>
-      </w:r>
-      <w:r>
-        <w:t>2</w:t>
-      </w:r>
-      <w:r>
-        <w:t xml:space="preserve">  </w:t>
-      </w:r>
-      <w:r>
-        <w:t>C Program</w:t>
-      </w:r>
-    </w:p>
-    <w:p>
-      <w:pPr>
-        <w:pStyle w:val="Heading2"/>
-      </w:pPr>
-      <w:r>
-        <w:t>2.</w:t>
-      </w:r>
-      <w:r>
-        <w:t>3</w:t>
-      </w:r>
-      <w:r>
-        <w:t xml:space="preserve">  </w:t>
-      </w:r>
-      <w:r>
-        <w:t>P</w:t>
-      </w:r>
-      <w:r>
-        <w:t>ython Program</w:t>
+        <w:rPr>
+          <w:sz w:val="22"/>
+          <w:szCs w:val="18"/>
+        </w:rPr>
+      </w:pPr>
+      <w:r>
+        <w:rPr>
+          <w:sz w:val="22"/>
+          <w:szCs w:val="18"/>
+        </w:rPr>
+        <w:t xml:space="preserve">The final sprint was dedicated to the development of a function to be able to see all the algorithms work together </w:t>
+      </w:r>
+      <w:r>
+        <w:rPr>
+          <w:sz w:val="22"/>
+          <w:szCs w:val="18"/>
+        </w:rPr>
+        <w:t>to</w:t>
+      </w:r>
+      <w:r>
+        <w:rPr>
+          <w:sz w:val="22"/>
+          <w:szCs w:val="18"/>
+        </w:rPr>
+        <w:t xml:space="preserve"> make comparing results much </w:t>
+      </w:r>
+      <w:r>
+        <w:rPr>
+          <w:sz w:val="22"/>
+          <w:szCs w:val="18"/>
+        </w:rPr>
+        <w:t>easier and more accessible</w:t>
+      </w:r>
+      <w:r>
+        <w:rPr>
+          <w:sz w:val="22"/>
+          <w:szCs w:val="18"/>
+        </w:rPr>
+        <w:t>.</w:t>
+      </w:r>
+      <w:r>
+        <w:rPr>
+          <w:sz w:val="22"/>
+          <w:szCs w:val="18"/>
+        </w:rPr>
+        <w:t xml:space="preserve"> </w:t>
+      </w:r>
+    </w:p>
+    <w:p>
+      <w:pPr>
+        <w:jc w:val="center"/>
+        <w:rPr>
+          <w:sz w:val="22"/>
+          <w:szCs w:val="18"/>
+        </w:rPr>
+      </w:pPr>
+      <w:r>
+        <w:rPr>
+          <w:noProof/>
+        </w:rPr>
+        <w:drawing>
+          <wp:inline distT="0" distB="0" distL="0" distR="0" wp14:anchorId="5ECB57B5" wp14:editId="3D6642A8">
+            <wp:extent cx="5381625" cy="4288128"/>
+            <wp:effectExtent l="19050" t="19050" r="0" b="0"/>
+            <wp:docPr id="162574037" name="Picture 1" descr="A screenshot of a computer program&#10;&#10;Description automatically generated"/>
+            <wp:cNvGraphicFramePr>
+              <a:graphicFrameLocks xmlns:a="http://schemas.openxmlformats.org/drawingml/2006/main" noChangeAspect="1"/>
+            </wp:cNvGraphicFramePr>
+            <a:graphic xmlns:a="http://schemas.openxmlformats.org/drawingml/2006/main">
+              <a:graphicData uri="http://schemas.openxmlformats.org/drawingml/2006/picture">
+                <pic:pic xmlns:pic="http://schemas.openxmlformats.org/drawingml/2006/picture">
+                  <pic:nvPicPr>
+                    <pic:cNvPr id="162574037" name="Picture 1" descr="A screenshot of a computer program&#10;&#10;Description automatically generated"/>
+                    <pic:cNvPicPr/>
+                  </pic:nvPicPr>
+                  <pic:blipFill>
+                    <a:blip r:embed="rId27"/>
+                    <a:stretch>
+                      <a:fillRect/>
+                    </a:stretch>
+                  </pic:blipFill>
+                  <pic:spPr>
+                    <a:xfrm>
+                      <a:off x="0" y="0"/>
+                      <a:ext cx="5387629" cy="4292912"/>
+                    </a:xfrm>
+                    <a:prstGeom prst="rect">
+                      <a:avLst/>
+                    </a:prstGeom>
+                    <a:ln>
+                      <a:solidFill>
+                        <a:schemeClr val="tx1"/>
+                      </a:solidFill>
+                    </a:ln>
+                  </pic:spPr>
+                </pic:pic>
+              </a:graphicData>
+            </a:graphic>
+          </wp:inline>
+        </w:drawing>
+      </w:r>
+    </w:p>
+    <w:p>
+      <w:pPr>
+        <w:jc w:val="center"/>
+        <w:rPr>
+          <w:sz w:val="22"/>
+          <w:szCs w:val="18"/>
+        </w:rPr>
+      </w:pPr>
+      <w:r>
+        <w:rPr>
+          <w:b/>
+          <w:bCs/>
+          <w:sz w:val="22"/>
+          <w:szCs w:val="18"/>
+        </w:rPr>
+        <w:t xml:space="preserve">Figure 11. </w:t>
+      </w:r>
+      <w:r>
+        <w:rPr>
+          <w:sz w:val="22"/>
+          <w:szCs w:val="18"/>
+        </w:rPr>
+        <w:t>Automatic testing function pseudocode</w:t>
+      </w:r>
+    </w:p>
+    <w:p>
+      <w:pPr>
+        <w:rPr>
+          <w:sz w:val="22"/>
+          <w:szCs w:val="18"/>
+        </w:rPr>
+      </w:pPr>
+      <w:r>
+        <w:rPr>
+          <w:sz w:val="22"/>
+          <w:szCs w:val="18"/>
+        </w:rPr>
+        <w:lastRenderedPageBreak/>
+        <w:t xml:space="preserve">As such, a new interface would be needed for the program. Here the user would generate a new file word file just as you would using the corpus extraction function. Then once complete, the user would get a prompt for a word they wish to check exists or not. Then the same process </w:t>
+      </w:r>
+      <w:r>
+        <w:rPr>
+          <w:sz w:val="22"/>
+          <w:szCs w:val="18"/>
+        </w:rPr>
+        <w:t>used in the spell checker function is employed here, where every method is tested one, and for each method every algorithm is tested. The results for each will then be displayed in a table of sorts, to allow for easy reading of how quickly each ran as well as what suggestions, if any, they deliver.</w:t>
       </w:r>
     </w:p>
     <w:p>
@@ -6400,6 +7876,46 @@
     </w:p>
     <w:p>
       <w:pPr>
+        <w:pStyle w:val="Heading2"/>
+      </w:pPr>
+      <w:r>
+        <w:t>3</w:t>
+      </w:r>
+      <w:r>
+        <w:t>.</w:t>
+      </w:r>
+      <w:r>
+        <w:t>1</w:t>
+      </w:r>
+      <w:r>
+        <w:t xml:space="preserve">  </w:t>
+      </w:r>
+      <w:r>
+        <w:t>C Program</w:t>
+      </w:r>
+    </w:p>
+    <w:p>
+      <w:pPr>
+        <w:pStyle w:val="Heading2"/>
+      </w:pPr>
+      <w:r>
+        <w:t>3</w:t>
+      </w:r>
+      <w:r>
+        <w:t>.</w:t>
+      </w:r>
+      <w:r>
+        <w:t>2</w:t>
+      </w:r>
+      <w:r>
+        <w:t xml:space="preserve">  </w:t>
+      </w:r>
+      <w:r>
+        <w:t>Python Program</w:t>
+      </w:r>
+    </w:p>
+    <w:p>
+      <w:pPr>
         <w:rPr>
           <w:sz w:val="22"/>
           <w:szCs w:val="22"/>
@@ -6644,7 +8160,7 @@
         </w:rPr>
         <w:t xml:space="preserve">. International Journal of Scientific and Research Publications [Accessed 18/03/24]. Available from: </w:t>
       </w:r>
-      <w:hyperlink r:id="rId25" w:history="1">
+      <w:hyperlink r:id="rId28" w:history="1">
         <w:r>
           <w:rPr>
             <w:rStyle w:val="Hyperlink"/>
@@ -6681,7 +8197,7 @@
         </w:rPr>
         <w:t xml:space="preserve">Nam, E, 2019. Understanding the Levenshtein Distance Equation for Beginners. [online]. [Accessed 18/03/24]. Available from: </w:t>
       </w:r>
-      <w:hyperlink r:id="rId26" w:history="1">
+      <w:hyperlink r:id="rId29" w:history="1">
         <w:r>
           <w:rPr>
             <w:rStyle w:val="Hyperlink"/>
@@ -7074,7 +8590,7 @@
       </w:pPr>
     </w:p>
     <w:sectPr>
-      <w:headerReference w:type="default" r:id="rId27"/>
+      <w:headerReference w:type="default" r:id="rId30"/>
       <w:footnotePr>
         <w:numRestart w:val="eachSect"/>
       </w:footnotePr>

</xml_diff>

<commit_message>
continued writeup, now working on a testing suite using mispelled words
</commit_message>
<xml_diff>
--- a/project_writeup/FinalReportV1.docx
+++ b/project_writeup/FinalReportV1.docx
@@ -314,7 +314,21 @@
         <w:rPr>
           <w:i/>
         </w:rPr>
-        <w:t xml:space="preserve"> example&gt;</w:t>
+        <w:t xml:space="preserve"> </w:t>
+      </w:r>
+      <w:proofErr w:type="gramStart"/>
+      <w:r>
+        <w:rPr>
+          <w:i/>
+        </w:rPr>
+        <w:t>example</w:t>
+      </w:r>
+      <w:proofErr w:type="gramEnd"/>
+      <w:r>
+        <w:rPr>
+          <w:i/>
+        </w:rPr>
+        <w:t>&gt;</w:t>
       </w:r>
     </w:p>
     <w:tbl>
@@ -3666,14 +3680,7 @@
           <w:sz w:val="22"/>
           <w:szCs w:val="22"/>
         </w:rPr>
-        <w:t>In other words, the algorithm assesses how many steps it would take to transform the first string to the second string, and the number of steps is the distance between them.</w:t>
-      </w:r>
-      <w:r>
-        <w:rPr>
-          <w:sz w:val="22"/>
-          <w:szCs w:val="22"/>
-        </w:rPr>
-        <w:t xml:space="preserve"> </w:t>
+        <w:t xml:space="preserve">In other words, the algorithm assesses how many steps it would take to transform the first string to the second string, and the number of steps is the distance between them. </w:t>
       </w:r>
       <w:r>
         <w:rPr>
@@ -5478,15 +5485,7 @@
                                 <w:sz w:val="22"/>
                                 <w:szCs w:val="22"/>
                               </w:rPr>
-                              <m:t>m</m:t>
-                            </m:r>
-                            <m:r>
-                              <w:rPr>
-                                <w:rFonts w:ascii="Cambria Math" w:hAnsi="Cambria Math"/>
-                                <w:sz w:val="22"/>
-                                <w:szCs w:val="22"/>
-                              </w:rPr>
-                              <m:t>-t</m:t>
+                              <m:t>m-t</m:t>
                             </m:r>
                           </m:num>
                           <m:den>
@@ -5756,12 +5755,21 @@
           <w:szCs w:val="22"/>
         </w:rPr>
       </w:pPr>
-      <w:r>
-        <w:rPr>
-          <w:sz w:val="22"/>
-          <w:szCs w:val="22"/>
-        </w:rPr>
-        <w:t>So the new final result coefficient for two strings is:</w:t>
+      <w:proofErr w:type="gramStart"/>
+      <w:r>
+        <w:rPr>
+          <w:sz w:val="22"/>
+          <w:szCs w:val="22"/>
+        </w:rPr>
+        <w:t>So</w:t>
+      </w:r>
+      <w:proofErr w:type="gramEnd"/>
+      <w:r>
+        <w:rPr>
+          <w:sz w:val="22"/>
+          <w:szCs w:val="22"/>
+        </w:rPr>
+        <w:t xml:space="preserve"> the new final result coefficient for two strings is:</w:t>
       </w:r>
     </w:p>
     <w:p>
@@ -5801,15 +5809,7 @@
                   <w:sz w:val="22"/>
                   <w:szCs w:val="22"/>
                 </w:rPr>
-                <m:t>j</m:t>
-              </m:r>
-              <m:r>
-                <w:rPr>
-                  <w:rFonts w:ascii="Cambria Math" w:hAnsi="Cambria Math"/>
-                  <w:sz w:val="22"/>
-                  <w:szCs w:val="22"/>
-                </w:rPr>
-                <m:t>w</m:t>
+                <m:t>jw</m:t>
               </m:r>
             </m:sub>
           </m:sSub>
@@ -7830,52 +7830,6 @@
     </w:p>
     <w:p>
       <w:pPr>
-        <w:rPr>
-          <w:sz w:val="22"/>
-          <w:szCs w:val="22"/>
-        </w:rPr>
-      </w:pPr>
-      <w:r>
-        <w:rPr>
-          <w:sz w:val="22"/>
-          <w:szCs w:val="22"/>
-        </w:rPr>
-        <w:t>&lt;</w:t>
-      </w:r>
-      <w:r>
-        <w:rPr>
-          <w:sz w:val="22"/>
-          <w:szCs w:val="22"/>
-        </w:rPr>
-        <w:t xml:space="preserve">Results, evaluation (including user evaluation) </w:t>
-      </w:r>
-      <w:r>
-        <w:rPr>
-          <w:i/>
-          <w:iCs/>
-          <w:sz w:val="22"/>
-          <w:szCs w:val="22"/>
-        </w:rPr>
-        <w:t>etc</w:t>
-      </w:r>
-      <w:r>
-        <w:rPr>
-          <w:sz w:val="22"/>
-          <w:szCs w:val="22"/>
-        </w:rPr>
-        <w:t>. should be described in one or more chapters. See the `Results and Discussion' criterion in the mark scheme for the sorts of material that may be included here.&gt;</w:t>
-      </w:r>
-    </w:p>
-    <w:p>
-      <w:pPr>
-        <w:rPr>
-          <w:sz w:val="22"/>
-          <w:szCs w:val="22"/>
-        </w:rPr>
-      </w:pPr>
-    </w:p>
-    <w:p>
-      <w:pPr>
         <w:pStyle w:val="Heading2"/>
       </w:pPr>
       <w:r>
@@ -7896,6 +7850,430 @@
     </w:p>
     <w:p>
       <w:pPr>
+        <w:rPr>
+          <w:sz w:val="22"/>
+          <w:szCs w:val="18"/>
+        </w:rPr>
+      </w:pPr>
+      <w:r>
+        <w:rPr>
+          <w:sz w:val="22"/>
+          <w:szCs w:val="18"/>
+        </w:rPr>
+        <w:t xml:space="preserve">It was decided that to better gauge the speed of the algorithms at runtime, two variations of the same program were drafted. One in C, and one in Python. With C being a compiled language and Python being an interpreted language, it would help to see if there was any major difference in speed and storage complexity which could then determine and optimal solution for a future product. </w:t>
+      </w:r>
+    </w:p>
+    <w:p>
+      <w:pPr>
+        <w:rPr>
+          <w:b/>
+          <w:bCs/>
+          <w:sz w:val="22"/>
+          <w:szCs w:val="18"/>
+        </w:rPr>
+      </w:pPr>
+      <w:r>
+        <w:rPr>
+          <w:b/>
+          <w:bCs/>
+          <w:sz w:val="22"/>
+          <w:szCs w:val="18"/>
+        </w:rPr>
+        <w:t>3</w:t>
+      </w:r>
+      <w:r>
+        <w:rPr>
+          <w:b/>
+          <w:bCs/>
+          <w:sz w:val="22"/>
+          <w:szCs w:val="18"/>
+        </w:rPr>
+        <w:t>.</w:t>
+      </w:r>
+      <w:r>
+        <w:rPr>
+          <w:b/>
+          <w:bCs/>
+          <w:sz w:val="22"/>
+          <w:szCs w:val="18"/>
+        </w:rPr>
+        <w:t>1</w:t>
+      </w:r>
+      <w:r>
+        <w:rPr>
+          <w:b/>
+          <w:bCs/>
+          <w:sz w:val="22"/>
+          <w:szCs w:val="18"/>
+        </w:rPr>
+        <w:t>.</w:t>
+      </w:r>
+      <w:r>
+        <w:rPr>
+          <w:b/>
+          <w:bCs/>
+          <w:sz w:val="22"/>
+          <w:szCs w:val="18"/>
+        </w:rPr>
+        <w:t>1</w:t>
+      </w:r>
+      <w:r>
+        <w:rPr>
+          <w:b/>
+          <w:bCs/>
+          <w:sz w:val="22"/>
+          <w:szCs w:val="18"/>
+        </w:rPr>
+        <w:t xml:space="preserve"> </w:t>
+      </w:r>
+      <w:r>
+        <w:rPr>
+          <w:b/>
+          <w:bCs/>
+          <w:sz w:val="22"/>
+          <w:szCs w:val="18"/>
+        </w:rPr>
+        <w:t>Implementation</w:t>
+      </w:r>
+    </w:p>
+    <w:p>
+      <w:pPr>
+        <w:rPr>
+          <w:sz w:val="22"/>
+          <w:szCs w:val="18"/>
+        </w:rPr>
+      </w:pPr>
+      <w:r>
+        <w:rPr>
+          <w:sz w:val="22"/>
+          <w:szCs w:val="18"/>
+        </w:rPr>
+        <w:t xml:space="preserve">The first spell checker program was developed in C. This was chosen because the C language is compiled all at once before running, which was hypothesised to give the fastest speeds for running the algorithms. This would be very useful for the project, as the code base would have to be able to deal with word comparison with counts ranging from </w:t>
+      </w:r>
+      <w:r>
+        <w:rPr>
+          <w:sz w:val="22"/>
+          <w:szCs w:val="18"/>
+        </w:rPr>
+        <w:t>minimum</w:t>
+      </w:r>
+      <w:r>
+        <w:rPr>
+          <w:sz w:val="22"/>
+          <w:szCs w:val="18"/>
+        </w:rPr>
+        <w:t xml:space="preserve"> 4</w:t>
+      </w:r>
+      <w:r>
+        <w:rPr>
+          <w:sz w:val="22"/>
+          <w:szCs w:val="18"/>
+        </w:rPr>
+        <w:t>,</w:t>
+      </w:r>
+      <w:r>
+        <w:rPr>
+          <w:sz w:val="22"/>
+          <w:szCs w:val="18"/>
+        </w:rPr>
+        <w:t>000 strings to 10</w:t>
+      </w:r>
+      <w:r>
+        <w:rPr>
+          <w:sz w:val="22"/>
+          <w:szCs w:val="18"/>
+        </w:rPr>
+        <w:t>0,</w:t>
+      </w:r>
+      <w:r>
+        <w:rPr>
+          <w:sz w:val="22"/>
+          <w:szCs w:val="18"/>
+        </w:rPr>
+        <w:t>000 strings</w:t>
+      </w:r>
+      <w:r>
+        <w:rPr>
+          <w:sz w:val="22"/>
+          <w:szCs w:val="18"/>
+        </w:rPr>
+        <w:t xml:space="preserve"> and beyond</w:t>
+      </w:r>
+      <w:r>
+        <w:rPr>
+          <w:sz w:val="22"/>
+          <w:szCs w:val="18"/>
+        </w:rPr>
+        <w:t xml:space="preserve">. All of which needed to be done in time frame </w:t>
+      </w:r>
+      <w:r>
+        <w:rPr>
+          <w:sz w:val="22"/>
+          <w:szCs w:val="18"/>
+        </w:rPr>
+        <w:t>as low as possible, since an actual industry product would need to be able to do the same thing in real time.</w:t>
+      </w:r>
+    </w:p>
+    <w:p>
+      <w:pPr>
+        <w:rPr>
+          <w:sz w:val="22"/>
+          <w:szCs w:val="18"/>
+        </w:rPr>
+      </w:pPr>
+      <w:r>
+        <w:rPr>
+          <w:sz w:val="22"/>
+          <w:szCs w:val="18"/>
+        </w:rPr>
+        <w:t>However, the nature of C being a fast and optimised language also made it harder to write the code. C has limited options for storing data at run-time dynamically. The main issue was storing all the words at runtime, which had to be done with a fixed size array which was big enough to work for any of the given corpora. The language also made developing the corpus extraction process more difficult, requiring time being spent on a long list of loops which would read the files character by character. Despite the speed of the C program being good, it took a lot longer to understand and develop the final product.</w:t>
+      </w:r>
+    </w:p>
+    <w:p>
+      <w:pPr>
+        <w:rPr>
+          <w:b/>
+          <w:bCs/>
+          <w:sz w:val="22"/>
+          <w:szCs w:val="18"/>
+        </w:rPr>
+      </w:pPr>
+      <w:r>
+        <w:rPr>
+          <w:b/>
+          <w:bCs/>
+          <w:sz w:val="22"/>
+          <w:szCs w:val="18"/>
+        </w:rPr>
+        <w:t>3</w:t>
+      </w:r>
+      <w:r>
+        <w:rPr>
+          <w:b/>
+          <w:bCs/>
+          <w:sz w:val="22"/>
+          <w:szCs w:val="18"/>
+        </w:rPr>
+        <w:t>.</w:t>
+      </w:r>
+      <w:r>
+        <w:rPr>
+          <w:b/>
+          <w:bCs/>
+          <w:sz w:val="22"/>
+          <w:szCs w:val="18"/>
+        </w:rPr>
+        <w:t>1</w:t>
+      </w:r>
+      <w:r>
+        <w:rPr>
+          <w:b/>
+          <w:bCs/>
+          <w:sz w:val="22"/>
+          <w:szCs w:val="18"/>
+        </w:rPr>
+        <w:t>.</w:t>
+      </w:r>
+      <w:r>
+        <w:rPr>
+          <w:b/>
+          <w:bCs/>
+          <w:sz w:val="22"/>
+          <w:szCs w:val="18"/>
+        </w:rPr>
+        <w:t>3</w:t>
+      </w:r>
+      <w:r>
+        <w:rPr>
+          <w:b/>
+          <w:bCs/>
+          <w:sz w:val="22"/>
+          <w:szCs w:val="18"/>
+        </w:rPr>
+        <w:t xml:space="preserve"> </w:t>
+      </w:r>
+      <w:r>
+        <w:rPr>
+          <w:b/>
+          <w:bCs/>
+          <w:sz w:val="22"/>
+          <w:szCs w:val="18"/>
+        </w:rPr>
+        <w:t>Testing</w:t>
+      </w:r>
+    </w:p>
+    <w:p>
+      <w:pPr>
+        <w:rPr>
+          <w:sz w:val="22"/>
+          <w:szCs w:val="18"/>
+        </w:rPr>
+      </w:pPr>
+      <w:r>
+        <w:rPr>
+          <w:sz w:val="22"/>
+          <w:szCs w:val="18"/>
+        </w:rPr>
+        <w:t xml:space="preserve">Most initial testing was done with one of the corpora, specifically from the ‘D’ folder. This was due to its small number of xml files to parse, totalling 11 word-files which would give a total of 4395 non duplicate words to use. This number meant that the program could extract everything in less than a second, and therefore made it easy to move immediately on to the spell checking / algorithm checking process, which is what was being assessed. It was only later for more thorough tests that the much larger corpora were used, which could usually take a couple minutes to parse, even with the immense speed of the </w:t>
+      </w:r>
+      <w:r>
+        <w:rPr>
+          <w:sz w:val="22"/>
+          <w:szCs w:val="18"/>
+        </w:rPr>
+        <w:t>C language.</w:t>
+      </w:r>
+    </w:p>
+    <w:p>
+      <w:pPr>
+        <w:rPr>
+          <w:sz w:val="22"/>
+          <w:szCs w:val="18"/>
+        </w:rPr>
+      </w:pPr>
+      <w:r>
+        <w:rPr>
+          <w:sz w:val="22"/>
+          <w:szCs w:val="18"/>
+        </w:rPr>
+        <w:lastRenderedPageBreak/>
+        <w:t>There was however a drawback to using this small subset of words, in that there were instances where you entered a word for an algorithm and the result was a so instantaneous that the cord reported a runtime of 0 milliseconds.</w:t>
+      </w:r>
+    </w:p>
+    <w:p>
+      <w:pPr>
+        <w:jc w:val="center"/>
+        <w:rPr>
+          <w:sz w:val="22"/>
+          <w:szCs w:val="18"/>
+        </w:rPr>
+      </w:pPr>
+      <w:r>
+        <w:rPr>
+          <w:noProof/>
+        </w:rPr>
+        <w:drawing>
+          <wp:inline distT="0" distB="0" distL="0" distR="0" wp14:anchorId="2FB4AFD2" wp14:editId="2EBF59BB">
+            <wp:extent cx="5731510" cy="2259330"/>
+            <wp:effectExtent l="0" t="0" r="0" b="0"/>
+            <wp:docPr id="84566764" name="Picture 1" descr="A screen shot of a computer&#10;&#10;Description automatically generated"/>
+            <wp:cNvGraphicFramePr>
+              <a:graphicFrameLocks xmlns:a="http://schemas.openxmlformats.org/drawingml/2006/main" noChangeAspect="1"/>
+            </wp:cNvGraphicFramePr>
+            <a:graphic xmlns:a="http://schemas.openxmlformats.org/drawingml/2006/main">
+              <a:graphicData uri="http://schemas.openxmlformats.org/drawingml/2006/picture">
+                <pic:pic xmlns:pic="http://schemas.openxmlformats.org/drawingml/2006/picture">
+                  <pic:nvPicPr>
+                    <pic:cNvPr id="84566764" name="Picture 1" descr="A screen shot of a computer&#10;&#10;Description automatically generated"/>
+                    <pic:cNvPicPr/>
+                  </pic:nvPicPr>
+                  <pic:blipFill>
+                    <a:blip r:embed="rId28"/>
+                    <a:stretch>
+                      <a:fillRect/>
+                    </a:stretch>
+                  </pic:blipFill>
+                  <pic:spPr>
+                    <a:xfrm>
+                      <a:off x="0" y="0"/>
+                      <a:ext cx="5731510" cy="2259330"/>
+                    </a:xfrm>
+                    <a:prstGeom prst="rect">
+                      <a:avLst/>
+                    </a:prstGeom>
+                  </pic:spPr>
+                </pic:pic>
+              </a:graphicData>
+            </a:graphic>
+          </wp:inline>
+        </w:drawing>
+      </w:r>
+    </w:p>
+    <w:p>
+      <w:pPr>
+        <w:jc w:val="center"/>
+        <w:rPr>
+          <w:sz w:val="22"/>
+          <w:szCs w:val="18"/>
+        </w:rPr>
+      </w:pPr>
+      <w:r>
+        <w:rPr>
+          <w:b/>
+          <w:bCs/>
+          <w:sz w:val="22"/>
+          <w:szCs w:val="18"/>
+        </w:rPr>
+        <w:t xml:space="preserve">Figure 12. </w:t>
+      </w:r>
+      <w:r>
+        <w:rPr>
+          <w:sz w:val="22"/>
+          <w:szCs w:val="18"/>
+        </w:rPr>
+        <w:t>Extract of C program automated test showing runtime of 0 milliseconds.</w:t>
+      </w:r>
+    </w:p>
+    <w:p>
+      <w:pPr>
+        <w:rPr>
+          <w:sz w:val="22"/>
+          <w:szCs w:val="18"/>
+        </w:rPr>
+      </w:pPr>
+      <w:r>
+        <w:rPr>
+          <w:sz w:val="22"/>
+          <w:szCs w:val="18"/>
+        </w:rPr>
+        <w:t>This could have been considered an error if not for the fact that some of the other algorithms and methods were showing positive times, which indicates more to the idea that the program was able to execute so quickly that the time library didn’t regard it as significant enough to produce a positive run-time.</w:t>
+      </w:r>
+    </w:p>
+    <w:p>
+      <w:pPr>
+        <w:rPr>
+          <w:sz w:val="22"/>
+          <w:szCs w:val="18"/>
+        </w:rPr>
+      </w:pPr>
+      <w:r>
+        <w:rPr>
+          <w:sz w:val="22"/>
+          <w:szCs w:val="18"/>
+        </w:rPr>
+        <w:t>As such, later testing was done on the larger ‘</w:t>
+      </w:r>
+      <w:r>
+        <w:rPr>
+          <w:sz w:val="22"/>
+          <w:szCs w:val="18"/>
+        </w:rPr>
+        <w:t>H</w:t>
+      </w:r>
+      <w:r>
+        <w:rPr>
+          <w:sz w:val="22"/>
+          <w:szCs w:val="18"/>
+        </w:rPr>
+        <w:t>’ corpus, which</w:t>
+      </w:r>
+      <w:r>
+        <w:rPr>
+          <w:sz w:val="22"/>
+          <w:szCs w:val="18"/>
+        </w:rPr>
+        <w:t xml:space="preserve"> contains a total of 136,000 non duplicate words. This was chosen as it was the largest corpus to use, which would help in assessing the capabilities of the system </w:t>
+      </w:r>
+      <w:r>
+        <w:rPr>
+          <w:sz w:val="22"/>
+          <w:szCs w:val="18"/>
+        </w:rPr>
+        <w:t xml:space="preserve">better than with the ‘D’ corpus. </w:t>
+      </w:r>
+    </w:p>
+    <w:p>
+      <w:pPr>
         <w:pStyle w:val="Heading2"/>
       </w:pPr>
       <w:r>
@@ -7913,6 +8291,278 @@
       <w:r>
         <w:t>Python Program</w:t>
       </w:r>
+    </w:p>
+    <w:p>
+      <w:pPr>
+        <w:rPr>
+          <w:b/>
+          <w:bCs/>
+          <w:sz w:val="22"/>
+          <w:szCs w:val="18"/>
+        </w:rPr>
+      </w:pPr>
+      <w:r>
+        <w:rPr>
+          <w:b/>
+          <w:bCs/>
+          <w:sz w:val="22"/>
+          <w:szCs w:val="18"/>
+        </w:rPr>
+        <w:t>3</w:t>
+      </w:r>
+      <w:r>
+        <w:rPr>
+          <w:b/>
+          <w:bCs/>
+          <w:sz w:val="22"/>
+          <w:szCs w:val="18"/>
+        </w:rPr>
+        <w:t>.</w:t>
+      </w:r>
+      <w:r>
+        <w:rPr>
+          <w:b/>
+          <w:bCs/>
+          <w:sz w:val="22"/>
+          <w:szCs w:val="18"/>
+        </w:rPr>
+        <w:t>2</w:t>
+      </w:r>
+      <w:r>
+        <w:rPr>
+          <w:b/>
+          <w:bCs/>
+          <w:sz w:val="22"/>
+          <w:szCs w:val="18"/>
+        </w:rPr>
+        <w:t>.</w:t>
+      </w:r>
+      <w:r>
+        <w:rPr>
+          <w:b/>
+          <w:bCs/>
+          <w:sz w:val="22"/>
+          <w:szCs w:val="18"/>
+        </w:rPr>
+        <w:t>1</w:t>
+      </w:r>
+      <w:r>
+        <w:rPr>
+          <w:b/>
+          <w:bCs/>
+          <w:sz w:val="22"/>
+          <w:szCs w:val="18"/>
+        </w:rPr>
+        <w:t xml:space="preserve"> </w:t>
+      </w:r>
+      <w:r>
+        <w:rPr>
+          <w:b/>
+          <w:bCs/>
+          <w:sz w:val="22"/>
+          <w:szCs w:val="18"/>
+        </w:rPr>
+        <w:t>Implementation</w:t>
+      </w:r>
+    </w:p>
+    <w:p>
+      <w:pPr>
+        <w:rPr>
+          <w:sz w:val="22"/>
+          <w:szCs w:val="18"/>
+        </w:rPr>
+      </w:pPr>
+      <w:r>
+        <w:rPr>
+          <w:sz w:val="22"/>
+          <w:szCs w:val="18"/>
+        </w:rPr>
+        <w:t xml:space="preserve">The python version was worked on after the C program was nearly completed. Therefore, development lessons and ideas could be copied and adapted over, which saved a large amount of time creating the application. </w:t>
+      </w:r>
+    </w:p>
+    <w:p>
+      <w:pPr>
+        <w:rPr>
+          <w:sz w:val="22"/>
+          <w:szCs w:val="18"/>
+        </w:rPr>
+      </w:pPr>
+      <w:r>
+        <w:rPr>
+          <w:sz w:val="22"/>
+          <w:szCs w:val="18"/>
+        </w:rPr>
+        <w:t>Coding was a lot easier with python, given that it has access to many libraries and data structures that C lacks. One of the most helpful libraries was BeautifulSoup, which could do all the word extraction from the xml files in a few function calls. Python’s</w:t>
+      </w:r>
+      <w:r>
+        <w:rPr>
+          <w:sz w:val="22"/>
+          <w:szCs w:val="18"/>
+        </w:rPr>
+        <w:t xml:space="preserve"> dynamically sized array and</w:t>
+      </w:r>
+      <w:r>
+        <w:rPr>
+          <w:sz w:val="22"/>
+          <w:szCs w:val="18"/>
+        </w:rPr>
+        <w:t xml:space="preserve"> dictionary</w:t>
+      </w:r>
+      <w:r>
+        <w:rPr>
+          <w:sz w:val="22"/>
+          <w:szCs w:val="18"/>
+        </w:rPr>
+        <w:t xml:space="preserve"> data</w:t>
+      </w:r>
+      <w:r>
+        <w:rPr>
+          <w:sz w:val="22"/>
+          <w:szCs w:val="18"/>
+        </w:rPr>
+        <w:t xml:space="preserve"> structures were also invaluable in </w:t>
+      </w:r>
+      <w:r>
+        <w:rPr>
+          <w:sz w:val="22"/>
+          <w:szCs w:val="18"/>
+        </w:rPr>
+        <w:t xml:space="preserve">holding the large quantity of words at runtime. </w:t>
+      </w:r>
+      <w:r>
+        <w:rPr>
+          <w:sz w:val="22"/>
+          <w:szCs w:val="18"/>
+        </w:rPr>
+        <w:t>All</w:t>
+      </w:r>
+      <w:r>
+        <w:rPr>
+          <w:sz w:val="22"/>
+          <w:szCs w:val="18"/>
+        </w:rPr>
+        <w:t xml:space="preserve"> these benefits drastically cut down of the amount of time spent coding compared to C, which helped the final product be delivered in such a short timeframe. </w:t>
+      </w:r>
+    </w:p>
+    <w:p>
+      <w:pPr>
+        <w:rPr>
+          <w:b/>
+          <w:bCs/>
+          <w:sz w:val="22"/>
+          <w:szCs w:val="18"/>
+        </w:rPr>
+      </w:pPr>
+      <w:r>
+        <w:rPr>
+          <w:b/>
+          <w:bCs/>
+          <w:sz w:val="22"/>
+          <w:szCs w:val="18"/>
+        </w:rPr>
+        <w:t>3</w:t>
+      </w:r>
+      <w:r>
+        <w:rPr>
+          <w:b/>
+          <w:bCs/>
+          <w:sz w:val="22"/>
+          <w:szCs w:val="18"/>
+        </w:rPr>
+        <w:t>.</w:t>
+      </w:r>
+      <w:r>
+        <w:rPr>
+          <w:b/>
+          <w:bCs/>
+          <w:sz w:val="22"/>
+          <w:szCs w:val="18"/>
+        </w:rPr>
+        <w:t>1</w:t>
+      </w:r>
+      <w:r>
+        <w:rPr>
+          <w:b/>
+          <w:bCs/>
+          <w:sz w:val="22"/>
+          <w:szCs w:val="18"/>
+        </w:rPr>
+        <w:t>.</w:t>
+      </w:r>
+      <w:r>
+        <w:rPr>
+          <w:b/>
+          <w:bCs/>
+          <w:sz w:val="22"/>
+          <w:szCs w:val="18"/>
+        </w:rPr>
+        <w:t>3</w:t>
+      </w:r>
+      <w:r>
+        <w:rPr>
+          <w:b/>
+          <w:bCs/>
+          <w:sz w:val="22"/>
+          <w:szCs w:val="18"/>
+        </w:rPr>
+        <w:t xml:space="preserve"> </w:t>
+      </w:r>
+      <w:r>
+        <w:rPr>
+          <w:b/>
+          <w:bCs/>
+          <w:sz w:val="22"/>
+          <w:szCs w:val="18"/>
+        </w:rPr>
+        <w:t>Testing</w:t>
+      </w:r>
+    </w:p>
+    <w:p>
+      <w:pPr>
+        <w:rPr>
+          <w:sz w:val="22"/>
+          <w:szCs w:val="18"/>
+        </w:rPr>
+      </w:pPr>
+      <w:r>
+        <w:rPr>
+          <w:sz w:val="22"/>
+          <w:szCs w:val="18"/>
+        </w:rPr>
+        <w:lastRenderedPageBreak/>
+        <w:t>As with the C program, the main corpus that was used for testing during development was the ‘D’ corpus, given its small size</w:t>
+      </w:r>
+      <w:r>
+        <w:rPr>
+          <w:sz w:val="22"/>
+          <w:szCs w:val="18"/>
+        </w:rPr>
+        <w:t xml:space="preserve"> and word count which could be parsed in around 2 and a half seconds</w:t>
+      </w:r>
+      <w:r>
+        <w:rPr>
+          <w:sz w:val="22"/>
+          <w:szCs w:val="18"/>
+        </w:rPr>
+        <w:t xml:space="preserve">. With this version, there was no issue with the timer with no zero results. However, </w:t>
+      </w:r>
+      <w:r>
+        <w:rPr>
+          <w:sz w:val="22"/>
+          <w:szCs w:val="18"/>
+        </w:rPr>
+        <w:t>it was clear even with this reduced data set Python was slower than its other counterpart.</w:t>
+      </w:r>
+    </w:p>
+    <w:p>
+      <w:pPr>
+        <w:rPr>
+          <w:b/>
+          <w:bCs/>
+          <w:sz w:val="22"/>
+          <w:szCs w:val="18"/>
+        </w:rPr>
+      </w:pPr>
     </w:p>
     <w:p>
       <w:pPr>
@@ -7977,50 +8627,32 @@
         <w:pStyle w:val="Heading2"/>
       </w:pPr>
       <w:r>
-        <w:t>4.1  Conclusions</w:t>
-      </w:r>
-    </w:p>
-    <w:p>
-      <w:pPr>
-        <w:rPr>
-          <w:sz w:val="22"/>
-          <w:szCs w:val="22"/>
-        </w:rPr>
-      </w:pPr>
-      <w:r>
-        <w:rPr>
-          <w:sz w:val="22"/>
-          <w:szCs w:val="22"/>
-        </w:rPr>
-        <w:t>&lt;Text in 11</w:t>
-      </w:r>
-      <w:r>
-        <w:rPr>
-          <w:sz w:val="22"/>
-          <w:szCs w:val="22"/>
-        </w:rPr>
-        <w:t>-</w:t>
-      </w:r>
-      <w:r>
-        <w:rPr>
-          <w:sz w:val="22"/>
-          <w:szCs w:val="22"/>
-        </w:rPr>
-        <w:t>point</w:t>
-      </w:r>
-      <w:r>
-        <w:rPr>
-          <w:sz w:val="22"/>
-          <w:szCs w:val="22"/>
-        </w:rPr>
-        <w:t xml:space="preserve"> size and 1.5 line spacing.</w:t>
-      </w:r>
-      <w:r>
-        <w:rPr>
-          <w:sz w:val="22"/>
-          <w:szCs w:val="22"/>
-        </w:rPr>
-        <w:t>&gt;</w:t>
+        <w:t xml:space="preserve">4.1  </w:t>
+      </w:r>
+      <w:r>
+        <w:t>Possible Improvements</w:t>
+      </w:r>
+    </w:p>
+    <w:p>
+      <w:pPr>
+        <w:rPr>
+          <w:sz w:val="22"/>
+          <w:szCs w:val="18"/>
+        </w:rPr>
+      </w:pPr>
+      <w:r>
+        <w:rPr>
+          <w:sz w:val="22"/>
+          <w:szCs w:val="18"/>
+        </w:rPr>
+        <w:t>The system would have benefited from word stemming</w:t>
+      </w:r>
+      <w:r>
+        <w:rPr>
+          <w:sz w:val="22"/>
+          <w:szCs w:val="18"/>
+        </w:rPr>
+        <w:t xml:space="preserve">. That would involve an automatic check on each new word parsed but the corpus extractor, which would reduce the inflected string down to its root. Without needed to store all this extra data, and disregarding the </w:t>
       </w:r>
     </w:p>
     <w:p>
@@ -8028,7 +8660,42 @@
         <w:pStyle w:val="Heading2"/>
       </w:pPr>
       <w:r>
-        <w:t>4.2  Ideas for future work</w:t>
+        <w:t>4.</w:t>
+      </w:r>
+      <w:r>
+        <w:t>2</w:t>
+      </w:r>
+      <w:r>
+        <w:t xml:space="preserve">  Conclusions</w:t>
+      </w:r>
+    </w:p>
+    <w:p>
+      <w:pPr>
+        <w:rPr>
+          <w:sz w:val="22"/>
+          <w:szCs w:val="22"/>
+        </w:rPr>
+      </w:pPr>
+      <w:r>
+        <w:rPr>
+          <w:sz w:val="22"/>
+          <w:szCs w:val="22"/>
+        </w:rPr>
+        <w:t>In the end it is clear to say that the C program was the better choice when looking at the performance of the algorithms</w:t>
+      </w:r>
+    </w:p>
+    <w:p>
+      <w:pPr>
+        <w:pStyle w:val="Heading2"/>
+      </w:pPr>
+      <w:r>
+        <w:t>4.</w:t>
+      </w:r>
+      <w:r>
+        <w:t>3</w:t>
+      </w:r>
+      <w:r>
+        <w:t xml:space="preserve">  Ideas for future work</w:t>
       </w:r>
     </w:p>
     <w:p>
@@ -8123,7 +8790,25 @@
           <w:sz w:val="22"/>
           <w:szCs w:val="22"/>
         </w:rPr>
-        <w:t>It is expected that the list would reflect the breadth and depth of scholarly research undertaken by the student during the course of the project.</w:t>
+        <w:t xml:space="preserve">It is expected that the list would reflect the breadth and depth of scholarly research undertaken by the student </w:t>
+      </w:r>
+      <w:proofErr w:type="gramStart"/>
+      <w:r>
+        <w:rPr>
+          <w:i/>
+          <w:sz w:val="22"/>
+          <w:szCs w:val="22"/>
+        </w:rPr>
+        <w:t>during the course of</w:t>
+      </w:r>
+      <w:proofErr w:type="gramEnd"/>
+      <w:r>
+        <w:rPr>
+          <w:i/>
+          <w:sz w:val="22"/>
+          <w:szCs w:val="22"/>
+        </w:rPr>
+        <w:t xml:space="preserve"> the project.</w:t>
       </w:r>
       <w:r>
         <w:rPr>
@@ -8160,7 +8845,7 @@
         </w:rPr>
         <w:t xml:space="preserve">. International Journal of Scientific and Research Publications [Accessed 18/03/24]. Available from: </w:t>
       </w:r>
-      <w:hyperlink r:id="rId28" w:history="1">
+      <w:hyperlink r:id="rId29" w:history="1">
         <w:r>
           <w:rPr>
             <w:rStyle w:val="Hyperlink"/>
@@ -8197,7 +8882,7 @@
         </w:rPr>
         <w:t xml:space="preserve">Nam, E, 2019. Understanding the Levenshtein Distance Equation for Beginners. [online]. [Accessed 18/03/24]. Available from: </w:t>
       </w:r>
-      <w:hyperlink r:id="rId29" w:history="1">
+      <w:hyperlink r:id="rId30" w:history="1">
         <w:r>
           <w:rPr>
             <w:rStyle w:val="Hyperlink"/>
@@ -8340,7 +9025,15 @@
         <w:pStyle w:val="Heading2"/>
       </w:pPr>
       <w:r>
-        <w:t>A.3 Legal, social, ethical and professional issues</w:t>
+        <w:t xml:space="preserve">A.3 Legal, social, </w:t>
+      </w:r>
+      <w:proofErr w:type="gramStart"/>
+      <w:r>
+        <w:t>ethical</w:t>
+      </w:r>
+      <w:proofErr w:type="gramEnd"/>
+      <w:r>
+        <w:t xml:space="preserve"> and professional issues</w:t>
       </w:r>
     </w:p>
     <w:p>
@@ -8578,7 +9271,23 @@
           <w:sz w:val="22"/>
           <w:szCs w:val="22"/>
         </w:rPr>
-        <w:t>&lt;This appendix should provide a brief record of materials used in the solution that are not the student's own work. Such materials might be pieces of codes made available from a research group/company or from the internet, datasets prepared by external users or any preliminary materials/drafts/notes provided by a supervisor. It should be clear what was used as ready-made components and what was developed as part of the project. This appendix should be included even if no external materials were used, in which case a statement to that effect is all that is required.&gt;</w:t>
+        <w:t xml:space="preserve">&lt;This appendix should provide a brief record of materials used in the solution that are not the student's own work. Such materials might be pieces of codes made available from a research group/company or from the internet, datasets prepared by external </w:t>
+      </w:r>
+      <w:proofErr w:type="gramStart"/>
+      <w:r>
+        <w:rPr>
+          <w:sz w:val="22"/>
+          <w:szCs w:val="22"/>
+        </w:rPr>
+        <w:t>users</w:t>
+      </w:r>
+      <w:proofErr w:type="gramEnd"/>
+      <w:r>
+        <w:rPr>
+          <w:sz w:val="22"/>
+          <w:szCs w:val="22"/>
+        </w:rPr>
+        <w:t xml:space="preserve"> or any preliminary materials/drafts/notes provided by a supervisor. It should be clear what was used as ready-made components and what was developed as part of the project. This appendix should be included even if no external materials were used, in which case a statement to that effect is all that is required.&gt;</w:t>
       </w:r>
     </w:p>
     <w:p>
@@ -8590,7 +9299,7 @@
       </w:pPr>
     </w:p>
     <w:sectPr>
-      <w:headerReference w:type="default" r:id="rId30"/>
+      <w:headerReference w:type="default" r:id="rId31"/>
       <w:footnotePr>
         <w:numRestart w:val="eachSect"/>
       </w:footnotePr>

</xml_diff>

<commit_message>
made some progress with coding, adjusted the python and c code so auto tester works
</commit_message>
<xml_diff>
--- a/project_writeup/FinalReportV1.docx
+++ b/project_writeup/FinalReportV1.docx
@@ -917,14 +917,28 @@
           <w:iCs/>
           <w:sz w:val="22"/>
         </w:rPr>
-        <w:t>eful in build dictionaries for the spell checker to use when comparing words. Without this the system couldn’t function. Another thanks should be given to Roger Mitton</w:t>
+        <w:t xml:space="preserve">eful in build dictionaries for the spell checker to use when comparing words. Without this the system couldn’t function. </w:t>
       </w:r>
       <w:r>
         <w:rPr>
           <w:iCs/>
           <w:sz w:val="22"/>
         </w:rPr>
-        <w:t>, who’s collection of misspelled words where vital in providing exhaustive test data so that the capabilities of each algorithm could be gauged.</w:t>
+        <w:t>As well,</w:t>
+      </w:r>
+      <w:r>
+        <w:rPr>
+          <w:iCs/>
+          <w:sz w:val="22"/>
+        </w:rPr>
+        <w:t xml:space="preserve"> thanks should be given to Roger Mitton</w:t>
+      </w:r>
+      <w:r>
+        <w:rPr>
+          <w:iCs/>
+          <w:sz w:val="22"/>
+        </w:rPr>
+        <w:t xml:space="preserve"> who’s collection of misspelled words where vital in providing exhaustive test data so that the capabilities of each algorithm could be gauged.</w:t>
       </w:r>
     </w:p>
     <w:p>
@@ -4766,7 +4780,42 @@
           <w:sz w:val="22"/>
           <w:szCs w:val="22"/>
         </w:rPr>
-        <w:t>Depending on which string is larger, the time complexity would either be O(n) or O(m), but the space complexity is O(1).</w:t>
+        <w:t>T</w:t>
+      </w:r>
+      <w:r>
+        <w:rPr>
+          <w:sz w:val="22"/>
+          <w:szCs w:val="22"/>
+        </w:rPr>
+        <w:t xml:space="preserve">he time complexity would </w:t>
+      </w:r>
+      <w:r>
+        <w:rPr>
+          <w:sz w:val="22"/>
+          <w:szCs w:val="22"/>
+        </w:rPr>
+        <w:t>be O(m + n)</w:t>
+      </w:r>
+      <w:r>
+        <w:rPr>
+          <w:sz w:val="22"/>
+          <w:szCs w:val="22"/>
+        </w:rPr>
+        <w:t xml:space="preserve">, </w:t>
+      </w:r>
+      <w:r>
+        <w:rPr>
+          <w:sz w:val="22"/>
+          <w:szCs w:val="22"/>
+        </w:rPr>
+        <w:t>with</w:t>
+      </w:r>
+      <w:r>
+        <w:rPr>
+          <w:sz w:val="22"/>
+          <w:szCs w:val="22"/>
+        </w:rPr>
+        <w:t xml:space="preserve"> the space complexity is O(1).</w:t>
       </w:r>
     </w:p>
     <w:p>
@@ -6176,7 +6225,35 @@
           <w:sz w:val="22"/>
           <w:szCs w:val="18"/>
         </w:rPr>
-        <w:t xml:space="preserve">The final approach to searching is with the use of hash tables and linked lists. This method works by organising the words into a hash table, where each string would be used to calculate a hash value, which would then be used as the index for where to store the word. If there is the case that there is a clash and two words would be put in the same spot, then a linked list would be used, which would be organised </w:t>
+        <w:t>The final approach to searching is with the use of hash tables and linked lists. This method works by organising the words into a hash table, where each string would be used to calculate a hash value, which would then be used as the index for where to store the word. If there is the case that there is a clash and two words would be put in the same spot,</w:t>
+      </w:r>
+      <w:r>
+        <w:rPr>
+          <w:sz w:val="22"/>
+          <w:szCs w:val="18"/>
+        </w:rPr>
+        <w:t xml:space="preserve"> then the resolution technique would involve separate chaining to each node in the table. In this organisation</w:t>
+      </w:r>
+      <w:r>
+        <w:rPr>
+          <w:sz w:val="22"/>
+          <w:szCs w:val="18"/>
+        </w:rPr>
+        <w:t xml:space="preserve"> a linked list</w:t>
+      </w:r>
+      <w:r>
+        <w:rPr>
+          <w:sz w:val="22"/>
+          <w:szCs w:val="18"/>
+        </w:rPr>
+        <w:t xml:space="preserve"> would be used,</w:t>
+      </w:r>
+      <w:r>
+        <w:rPr>
+          <w:sz w:val="22"/>
+          <w:szCs w:val="18"/>
+        </w:rPr>
+        <w:t xml:space="preserve"> which would be organised </w:t>
       </w:r>
       <w:r>
         <w:rPr>
@@ -6191,6 +6268,13 @@
           <w:szCs w:val="18"/>
         </w:rPr>
         <w:t xml:space="preserve"> an array that the other search methods used.</w:t>
+      </w:r>
+      <w:r>
+        <w:rPr>
+          <w:sz w:val="22"/>
+          <w:szCs w:val="18"/>
+        </w:rPr>
+        <w:t xml:space="preserve"> This was decided over other such techniques such as open addressing, as it would keep the number of hashing indexes low and be much easier to design and search.</w:t>
       </w:r>
     </w:p>
     <w:p>
@@ -6312,7 +6396,15 @@
           <w:sz w:val="22"/>
           <w:szCs w:val="22"/>
         </w:rPr>
-        <w:t xml:space="preserve">, the obvious choice would be to use the </w:t>
+        <w:t xml:space="preserve">, the obvious choice </w:t>
+      </w:r>
+      <w:r>
+        <w:rPr>
+          <w:sz w:val="22"/>
+          <w:szCs w:val="22"/>
+        </w:rPr>
+        <w:lastRenderedPageBreak/>
+        <w:t xml:space="preserve">would be to use the </w:t>
       </w:r>
       <w:r>
         <w:rPr>
@@ -6361,15 +6453,7 @@
           <w:sz w:val="22"/>
           <w:szCs w:val="22"/>
         </w:rPr>
-        <w:t xml:space="preserve"> list of suggestions by comparing a misspelled word to those in a dictionary the </w:t>
-      </w:r>
-      <w:r>
-        <w:rPr>
-          <w:sz w:val="22"/>
-          <w:szCs w:val="22"/>
-        </w:rPr>
-        <w:lastRenderedPageBreak/>
-        <w:t xml:space="preserve">program has access to, one of which should be correct spelling of the word. </w:t>
+        <w:t xml:space="preserve"> list of suggestions by comparing a misspelled word to those in a dictionary the program has access to, one of which should be correct spelling of the word. </w:t>
       </w:r>
       <w:r>
         <w:rPr>
@@ -6573,6 +6657,7 @@
           <w:sz w:val="22"/>
           <w:szCs w:val="18"/>
         </w:rPr>
+        <w:lastRenderedPageBreak/>
         <w:t xml:space="preserve">The proof of concept was very simple in nature, as the system would </w:t>
       </w:r>
       <w:r>
@@ -6580,15 +6665,7 @@
           <w:sz w:val="22"/>
           <w:szCs w:val="18"/>
         </w:rPr>
-        <w:t xml:space="preserve">not perform any word list generation. Instead of having a corpus from which words could be extracted and then stored at runtime, this system instead assumed that words were already compiled and </w:t>
-      </w:r>
-      <w:r>
-        <w:rPr>
-          <w:sz w:val="22"/>
-          <w:szCs w:val="18"/>
-        </w:rPr>
-        <w:lastRenderedPageBreak/>
-        <w:t>sorted in alphabetical order. Therefore, all that was needed of the code was to store the list in its entirety while performing, then allow the user to enter a string, whereby the code would give a simple response as to whether the word exists in the list or not.</w:t>
+        <w:t>not perform any word list generation. Instead of having a corpus from which words could be extracted and then stored at runtime, this system instead assumed that words were already compiled and sorted in alphabetical order. Therefore, all that was needed of the code was to store the list in its entirety while performing, then allow the user to enter a string, whereby the code would give a simple response as to whether the word exists in the list or not.</w:t>
       </w:r>
     </w:p>
     <w:p>
@@ -8389,7 +8466,22 @@
           <w:sz w:val="22"/>
           <w:szCs w:val="18"/>
         </w:rPr>
-        <w:t>Coding was a lot easier with python, given that it has access to many libraries and data structures that C lacks. One of the most helpful libraries was BeautifulSoup, which could do all the word extraction from the xml files in a few function calls. Python’s</w:t>
+        <w:t xml:space="preserve">Coding was a lot easier with python, given that it has access to many libraries and data structures that C lacks. </w:t>
+      </w:r>
+    </w:p>
+    <w:p>
+      <w:pPr>
+        <w:rPr>
+          <w:sz w:val="22"/>
+          <w:szCs w:val="18"/>
+        </w:rPr>
+      </w:pPr>
+      <w:r>
+        <w:rPr>
+          <w:sz w:val="22"/>
+          <w:szCs w:val="18"/>
+        </w:rPr>
+        <w:t>One of the most helpful libraries was BeautifulSoup, which could do all the word extraction from the xml files in a few function calls. Python’s</w:t>
       </w:r>
       <w:r>
         <w:rPr>
@@ -8439,6 +8531,57 @@
           <w:szCs w:val="18"/>
         </w:rPr>
         <w:t xml:space="preserve"> these benefits drastically cut down of the amount of time spent coding compared to C, which helped the final product be delivered in such a short timeframe. </w:t>
+      </w:r>
+    </w:p>
+    <w:p>
+      <w:pPr>
+        <w:rPr>
+          <w:sz w:val="22"/>
+          <w:szCs w:val="18"/>
+        </w:rPr>
+      </w:pPr>
+      <w:r>
+        <w:rPr>
+          <w:sz w:val="22"/>
+          <w:szCs w:val="18"/>
+        </w:rPr>
+        <w:lastRenderedPageBreak/>
+        <w:t xml:space="preserve">Another useful discovery was the library strsimpy, which had </w:t>
+      </w:r>
+      <w:r>
+        <w:rPr>
+          <w:sz w:val="22"/>
+          <w:szCs w:val="18"/>
+        </w:rPr>
+        <w:t>several of</w:t>
+      </w:r>
+      <w:r>
+        <w:rPr>
+          <w:sz w:val="22"/>
+          <w:szCs w:val="18"/>
+        </w:rPr>
+        <w:t xml:space="preserve"> the string metric algorithms already created and ready to use</w:t>
+      </w:r>
+      <w:r>
+        <w:rPr>
+          <w:sz w:val="22"/>
+          <w:szCs w:val="18"/>
+        </w:rPr>
+        <w:t xml:space="preserve"> which included the Levenshtein, Optimal String Alignment, Damerau-Levenshtein, Sorensen Dice and Jaro Winkler algorithms</w:t>
+      </w:r>
+      <w:r>
+        <w:rPr>
+          <w:sz w:val="22"/>
+          <w:szCs w:val="18"/>
+        </w:rPr>
+        <w:t xml:space="preserve">. </w:t>
+      </w:r>
+      <w:r>
+        <w:rPr>
+          <w:sz w:val="22"/>
+          <w:szCs w:val="18"/>
+        </w:rPr>
+        <w:t>These were eventually used over personal versions since they were more easily accessible and were guaranteed to work with most scenarios and comparisons, and they would be more likely to be optimal solutions.</w:t>
       </w:r>
     </w:p>
     <w:p>
@@ -8526,7 +8669,6 @@
           <w:sz w:val="22"/>
           <w:szCs w:val="18"/>
         </w:rPr>
-        <w:lastRenderedPageBreak/>
         <w:t>As with the C program, the main corpus that was used for testing during development was the ‘D’ corpus, given its small size</w:t>
       </w:r>
       <w:r>
@@ -8707,7 +8849,21 @@
           <w:sz w:val="22"/>
           <w:szCs w:val="22"/>
         </w:rPr>
-        <w:t>The next stage of development would involve the creation of a natural language processor which could handle the checking of multiple words in a sentence. This could then be extrapolated into making a system which could take series of texts, which could then be looked at and then used to return any errors that my be.</w:t>
+        <w:t xml:space="preserve">The next stage of development would involve the creation of a natural language processor which could handle the checking of multiple words in a sentence. This could then be extrapolated into making a system which could take series of texts, which could then be looked at and then used to return any errors that </w:t>
+      </w:r>
+      <w:r>
+        <w:rPr>
+          <w:sz w:val="22"/>
+          <w:szCs w:val="22"/>
+        </w:rPr>
+        <w:t>may</w:t>
+      </w:r>
+      <w:r>
+        <w:rPr>
+          <w:sz w:val="22"/>
+          <w:szCs w:val="22"/>
+        </w:rPr>
+        <w:t xml:space="preserve"> be.</w:t>
       </w:r>
     </w:p>
     <w:p/>

</xml_diff>

<commit_message>
finished coding the autotester, hopefully finished coding completely apart from bug fixes
</commit_message>
<xml_diff>
--- a/project_writeup/FinalReportV1.docx
+++ b/project_writeup/FinalReportV1.docx
@@ -938,7 +938,21 @@
           <w:iCs/>
           <w:sz w:val="22"/>
         </w:rPr>
-        <w:t xml:space="preserve"> who’s collection of misspelled words where vital in providing exhaustive test data so that the capabilities of each algorithm could be gauged.</w:t>
+        <w:t xml:space="preserve"> </w:t>
+      </w:r>
+      <w:r>
+        <w:rPr>
+          <w:iCs/>
+          <w:sz w:val="22"/>
+        </w:rPr>
+        <w:t>whose</w:t>
+      </w:r>
+      <w:r>
+        <w:rPr>
+          <w:iCs/>
+          <w:sz w:val="22"/>
+        </w:rPr>
+        <w:t xml:space="preserve"> collection of misspelled words where vital in providing exhaustive test data so that the capabilities of each algorithm could be gauged.</w:t>
       </w:r>
     </w:p>
     <w:p>
@@ -2194,7 +2208,7 @@
         <w:rPr>
           <w:noProof/>
         </w:rPr>
-        <w:t>C Program</w:t>
+        <w:t>General Design</w:t>
       </w:r>
       <w:r>
         <w:rPr>
@@ -2230,247 +2244,6 @@
           <w:noProof/>
         </w:rPr>
         <w:t>2</w:t>
-      </w:r>
-      <w:r>
-        <w:rPr>
-          <w:noProof/>
-        </w:rPr>
-        <w:fldChar w:fldCharType="end"/>
-      </w:r>
-    </w:p>
-    <w:p>
-      <w:pPr>
-        <w:pStyle w:val="TOC2"/>
-        <w:rPr>
-          <w:noProof/>
-        </w:rPr>
-      </w:pPr>
-      <w:r>
-        <w:rPr>
-          <w:noProof/>
-        </w:rPr>
-        <w:tab/>
-        <w:t>2.2.1  Corpus Extraction</w:t>
-      </w:r>
-      <w:r>
-        <w:rPr>
-          <w:noProof/>
-        </w:rPr>
-        <w:tab/>
-      </w:r>
-      <w:r>
-        <w:rPr>
-          <w:noProof/>
-        </w:rPr>
-        <w:fldChar w:fldCharType="begin"/>
-      </w:r>
-      <w:r>
-        <w:rPr>
-          <w:noProof/>
-        </w:rPr>
-        <w:instrText xml:space="preserve"> PAGEREF _Toc407145091 \h </w:instrText>
-      </w:r>
-      <w:r>
-        <w:rPr>
-          <w:noProof/>
-        </w:rPr>
-      </w:r>
-      <w:r>
-        <w:rPr>
-          <w:noProof/>
-        </w:rPr>
-        <w:fldChar w:fldCharType="separate"/>
-      </w:r>
-      <w:r>
-        <w:rPr>
-          <w:noProof/>
-        </w:rPr>
-        <w:t>1</w:t>
-      </w:r>
-      <w:r>
-        <w:rPr>
-          <w:noProof/>
-        </w:rPr>
-        <w:fldChar w:fldCharType="end"/>
-      </w:r>
-    </w:p>
-    <w:p>
-      <w:pPr>
-        <w:pStyle w:val="TOC2"/>
-        <w:rPr>
-          <w:noProof/>
-        </w:rPr>
-      </w:pPr>
-      <w:r>
-        <w:rPr>
-          <w:noProof/>
-        </w:rPr>
-        <w:tab/>
-        <w:t>2.2.1  Spell Checking and Testing</w:t>
-      </w:r>
-      <w:r>
-        <w:rPr>
-          <w:noProof/>
-        </w:rPr>
-        <w:tab/>
-      </w:r>
-      <w:r>
-        <w:rPr>
-          <w:noProof/>
-        </w:rPr>
-        <w:fldChar w:fldCharType="begin"/>
-      </w:r>
-      <w:r>
-        <w:rPr>
-          <w:noProof/>
-        </w:rPr>
-        <w:instrText xml:space="preserve"> PAGEREF _Toc407145091 \h </w:instrText>
-      </w:r>
-      <w:r>
-        <w:rPr>
-          <w:noProof/>
-        </w:rPr>
-      </w:r>
-      <w:r>
-        <w:rPr>
-          <w:noProof/>
-        </w:rPr>
-        <w:fldChar w:fldCharType="separate"/>
-      </w:r>
-      <w:r>
-        <w:rPr>
-          <w:noProof/>
-        </w:rPr>
-        <w:t>1</w:t>
-      </w:r>
-      <w:r>
-        <w:rPr>
-          <w:noProof/>
-        </w:rPr>
-        <w:fldChar w:fldCharType="end"/>
-      </w:r>
-    </w:p>
-    <w:p>
-      <w:pPr>
-        <w:pStyle w:val="TOC2"/>
-        <w:rPr>
-          <w:noProof/>
-        </w:rPr>
-      </w:pPr>
-      <w:r>
-        <w:rPr>
-          <w:noProof/>
-        </w:rPr>
-        <w:t>2.</w:t>
-      </w:r>
-      <w:r>
-        <w:rPr>
-          <w:noProof/>
-        </w:rPr>
-        <w:t>2</w:t>
-      </w:r>
-      <w:r>
-        <w:rPr>
-          <w:noProof/>
-        </w:rPr>
-        <w:t xml:space="preserve">  </w:t>
-      </w:r>
-      <w:r>
-        <w:rPr>
-          <w:noProof/>
-        </w:rPr>
-        <w:t>Python Program</w:t>
-      </w:r>
-      <w:r>
-        <w:rPr>
-          <w:noProof/>
-        </w:rPr>
-        <w:tab/>
-      </w:r>
-      <w:r>
-        <w:rPr>
-          <w:noProof/>
-        </w:rPr>
-        <w:fldChar w:fldCharType="begin"/>
-      </w:r>
-      <w:r>
-        <w:rPr>
-          <w:noProof/>
-        </w:rPr>
-        <w:instrText xml:space="preserve"> PAGEREF _Toc407145096 \h </w:instrText>
-      </w:r>
-      <w:r>
-        <w:rPr>
-          <w:noProof/>
-        </w:rPr>
-      </w:r>
-      <w:r>
-        <w:rPr>
-          <w:noProof/>
-        </w:rPr>
-        <w:fldChar w:fldCharType="separate"/>
-      </w:r>
-      <w:r>
-        <w:rPr>
-          <w:noProof/>
-        </w:rPr>
-        <w:t>2</w:t>
-      </w:r>
-      <w:r>
-        <w:rPr>
-          <w:noProof/>
-        </w:rPr>
-        <w:fldChar w:fldCharType="end"/>
-      </w:r>
-    </w:p>
-    <w:p>
-      <w:pPr>
-        <w:pStyle w:val="TOC2"/>
-        <w:rPr>
-          <w:noProof/>
-        </w:rPr>
-      </w:pPr>
-      <w:r>
-        <w:rPr>
-          <w:noProof/>
-        </w:rPr>
-        <w:tab/>
-        <w:t>2.2.1  Corpus Extraction</w:t>
-      </w:r>
-      <w:r>
-        <w:rPr>
-          <w:noProof/>
-        </w:rPr>
-        <w:tab/>
-      </w:r>
-      <w:r>
-        <w:rPr>
-          <w:noProof/>
-        </w:rPr>
-        <w:fldChar w:fldCharType="begin"/>
-      </w:r>
-      <w:r>
-        <w:rPr>
-          <w:noProof/>
-        </w:rPr>
-        <w:instrText xml:space="preserve"> PAGEREF _Toc407145091 \h </w:instrText>
-      </w:r>
-      <w:r>
-        <w:rPr>
-          <w:noProof/>
-        </w:rPr>
-      </w:r>
-      <w:r>
-        <w:rPr>
-          <w:noProof/>
-        </w:rPr>
-        <w:fldChar w:fldCharType="separate"/>
-      </w:r>
-      <w:r>
-        <w:rPr>
-          <w:noProof/>
-        </w:rPr>
-        <w:t>1</w:t>
       </w:r>
       <w:r>
         <w:rPr>
@@ -2497,19 +2270,205 @@
         <w:rPr>
           <w:noProof/>
         </w:rPr>
-        <w:t>Spell Checking and</w:t>
-      </w:r>
-      <w:r>
-        <w:rPr>
-          <w:noProof/>
-        </w:rPr>
-        <w:t xml:space="preserve"> </w:t>
-      </w:r>
-      <w:r>
-        <w:rPr>
-          <w:noProof/>
-        </w:rPr>
-        <w:t>Testing</w:t>
+        <w:t>Methodology</w:t>
+      </w:r>
+      <w:r>
+        <w:rPr>
+          <w:noProof/>
+        </w:rPr>
+        <w:tab/>
+      </w:r>
+      <w:r>
+        <w:rPr>
+          <w:noProof/>
+        </w:rPr>
+        <w:fldChar w:fldCharType="begin"/>
+      </w:r>
+      <w:r>
+        <w:rPr>
+          <w:noProof/>
+        </w:rPr>
+        <w:instrText xml:space="preserve"> PAGEREF _Toc407145091 \h </w:instrText>
+      </w:r>
+      <w:r>
+        <w:rPr>
+          <w:noProof/>
+        </w:rPr>
+      </w:r>
+      <w:r>
+        <w:rPr>
+          <w:noProof/>
+        </w:rPr>
+        <w:fldChar w:fldCharType="separate"/>
+      </w:r>
+      <w:r>
+        <w:rPr>
+          <w:noProof/>
+        </w:rPr>
+        <w:t>1</w:t>
+      </w:r>
+      <w:r>
+        <w:rPr>
+          <w:noProof/>
+        </w:rPr>
+        <w:fldChar w:fldCharType="end"/>
+      </w:r>
+    </w:p>
+    <w:p>
+      <w:pPr>
+        <w:pStyle w:val="TOC2"/>
+        <w:rPr>
+          <w:noProof/>
+        </w:rPr>
+      </w:pPr>
+      <w:r>
+        <w:rPr>
+          <w:noProof/>
+        </w:rPr>
+        <w:tab/>
+        <w:t>2.2.</w:t>
+      </w:r>
+      <w:r>
+        <w:rPr>
+          <w:noProof/>
+        </w:rPr>
+        <w:t>2</w:t>
+      </w:r>
+      <w:r>
+        <w:rPr>
+          <w:noProof/>
+        </w:rPr>
+        <w:t xml:space="preserve">  </w:t>
+      </w:r>
+      <w:r>
+        <w:rPr>
+          <w:noProof/>
+        </w:rPr>
+        <w:t>Corpus Extraction</w:t>
+      </w:r>
+      <w:r>
+        <w:rPr>
+          <w:noProof/>
+        </w:rPr>
+        <w:tab/>
+      </w:r>
+      <w:r>
+        <w:rPr>
+          <w:noProof/>
+        </w:rPr>
+        <w:fldChar w:fldCharType="begin"/>
+      </w:r>
+      <w:r>
+        <w:rPr>
+          <w:noProof/>
+        </w:rPr>
+        <w:instrText xml:space="preserve"> PAGEREF _Toc407145091 \h </w:instrText>
+      </w:r>
+      <w:r>
+        <w:rPr>
+          <w:noProof/>
+        </w:rPr>
+      </w:r>
+      <w:r>
+        <w:rPr>
+          <w:noProof/>
+        </w:rPr>
+        <w:fldChar w:fldCharType="separate"/>
+      </w:r>
+      <w:r>
+        <w:rPr>
+          <w:noProof/>
+        </w:rPr>
+        <w:t>1</w:t>
+      </w:r>
+      <w:r>
+        <w:rPr>
+          <w:noProof/>
+        </w:rPr>
+        <w:fldChar w:fldCharType="end"/>
+      </w:r>
+    </w:p>
+    <w:p>
+      <w:pPr>
+        <w:pStyle w:val="TOC2"/>
+        <w:rPr>
+          <w:noProof/>
+        </w:rPr>
+      </w:pPr>
+      <w:r>
+        <w:rPr>
+          <w:noProof/>
+        </w:rPr>
+        <w:tab/>
+        <w:t xml:space="preserve">2.2.1  </w:t>
+      </w:r>
+      <w:r>
+        <w:rPr>
+          <w:noProof/>
+        </w:rPr>
+        <w:t>Spell Checking</w:t>
+      </w:r>
+      <w:r>
+        <w:rPr>
+          <w:noProof/>
+        </w:rPr>
+        <w:tab/>
+      </w:r>
+      <w:r>
+        <w:rPr>
+          <w:noProof/>
+        </w:rPr>
+        <w:fldChar w:fldCharType="begin"/>
+      </w:r>
+      <w:r>
+        <w:rPr>
+          <w:noProof/>
+        </w:rPr>
+        <w:instrText xml:space="preserve"> PAGEREF _Toc407145091 \h </w:instrText>
+      </w:r>
+      <w:r>
+        <w:rPr>
+          <w:noProof/>
+        </w:rPr>
+      </w:r>
+      <w:r>
+        <w:rPr>
+          <w:noProof/>
+        </w:rPr>
+        <w:fldChar w:fldCharType="separate"/>
+      </w:r>
+      <w:r>
+        <w:rPr>
+          <w:noProof/>
+        </w:rPr>
+        <w:t>1</w:t>
+      </w:r>
+      <w:r>
+        <w:rPr>
+          <w:noProof/>
+        </w:rPr>
+        <w:fldChar w:fldCharType="end"/>
+      </w:r>
+    </w:p>
+    <w:p>
+      <w:pPr>
+        <w:pStyle w:val="TOC2"/>
+        <w:rPr>
+          <w:noProof/>
+        </w:rPr>
+      </w:pPr>
+      <w:r>
+        <w:rPr>
+          <w:noProof/>
+        </w:rPr>
+        <w:tab/>
+        <w:t xml:space="preserve">2.2.1  </w:t>
+      </w:r>
+      <w:r>
+        <w:rPr>
+          <w:noProof/>
+        </w:rPr>
+        <w:t>Automated Testing</w:t>
       </w:r>
       <w:r>
         <w:rPr>
@@ -2565,7 +2524,19 @@
         <w:rPr>
           <w:noProof/>
         </w:rPr>
-        <w:t>Chapter 3 Results</w:t>
+        <w:t xml:space="preserve">Chapter 3 </w:t>
+      </w:r>
+      <w:r>
+        <w:rPr>
+          <w:noProof/>
+        </w:rPr>
+        <w:t xml:space="preserve">Implementation and </w:t>
+      </w:r>
+      <w:r>
+        <w:rPr>
+          <w:noProof/>
+        </w:rPr>
+        <w:t>Results</w:t>
       </w:r>
       <w:r>
         <w:rPr>
@@ -2620,7 +2591,13 @@
         <w:rPr>
           <w:noProof/>
         </w:rPr>
-        <w:t>3.1  Results from automated testing</w:t>
+        <w:t>3</w:t>
+      </w:r>
+      <w:r>
+        <w:rPr>
+          <w:noProof/>
+        </w:rPr>
+        <w:t>.1  C Program</w:t>
       </w:r>
       <w:r>
         <w:rPr>
@@ -2675,24 +2652,194 @@
         <w:rPr>
           <w:noProof/>
         </w:rPr>
-        <w:t>3.2  Results from user testing</w:t>
-      </w:r>
-      <w:r>
-        <w:rPr>
-          <w:noProof/>
-        </w:rPr>
         <w:tab/>
       </w:r>
       <w:r>
         <w:rPr>
           <w:noProof/>
         </w:rPr>
+        <w:t>3</w:t>
+      </w:r>
+      <w:r>
+        <w:rPr>
+          <w:noProof/>
+        </w:rPr>
+        <w:t>.</w:t>
+      </w:r>
+      <w:r>
+        <w:rPr>
+          <w:noProof/>
+        </w:rPr>
+        <w:t>1</w:t>
+      </w:r>
+      <w:r>
+        <w:rPr>
+          <w:noProof/>
+        </w:rPr>
+        <w:t xml:space="preserve">.1  </w:t>
+      </w:r>
+      <w:r>
+        <w:rPr>
+          <w:noProof/>
+        </w:rPr>
+        <w:t>Implementation</w:t>
+      </w:r>
+      <w:r>
+        <w:rPr>
+          <w:noProof/>
+        </w:rPr>
+        <w:tab/>
+      </w:r>
+      <w:r>
+        <w:rPr>
+          <w:noProof/>
+        </w:rPr>
         <w:fldChar w:fldCharType="begin"/>
       </w:r>
       <w:r>
         <w:rPr>
           <w:noProof/>
         </w:rPr>
+        <w:instrText xml:space="preserve"> PAGEREF _Toc407145091 \h </w:instrText>
+      </w:r>
+      <w:r>
+        <w:rPr>
+          <w:noProof/>
+        </w:rPr>
+      </w:r>
+      <w:r>
+        <w:rPr>
+          <w:noProof/>
+        </w:rPr>
+        <w:fldChar w:fldCharType="separate"/>
+      </w:r>
+      <w:r>
+        <w:rPr>
+          <w:noProof/>
+        </w:rPr>
+        <w:t>1</w:t>
+      </w:r>
+      <w:r>
+        <w:rPr>
+          <w:noProof/>
+        </w:rPr>
+        <w:fldChar w:fldCharType="end"/>
+      </w:r>
+    </w:p>
+    <w:p>
+      <w:pPr>
+        <w:pStyle w:val="TOC2"/>
+        <w:rPr>
+          <w:noProof/>
+        </w:rPr>
+      </w:pPr>
+      <w:r>
+        <w:rPr>
+          <w:noProof/>
+        </w:rPr>
+        <w:tab/>
+      </w:r>
+      <w:r>
+        <w:rPr>
+          <w:noProof/>
+        </w:rPr>
+        <w:t>3</w:t>
+      </w:r>
+      <w:r>
+        <w:rPr>
+          <w:noProof/>
+        </w:rPr>
+        <w:t>.</w:t>
+      </w:r>
+      <w:r>
+        <w:rPr>
+          <w:noProof/>
+        </w:rPr>
+        <w:t>1</w:t>
+      </w:r>
+      <w:r>
+        <w:rPr>
+          <w:noProof/>
+        </w:rPr>
+        <w:t>.1  Testing</w:t>
+      </w:r>
+      <w:r>
+        <w:rPr>
+          <w:noProof/>
+        </w:rPr>
+        <w:tab/>
+      </w:r>
+      <w:r>
+        <w:rPr>
+          <w:noProof/>
+        </w:rPr>
+        <w:fldChar w:fldCharType="begin"/>
+      </w:r>
+      <w:r>
+        <w:rPr>
+          <w:noProof/>
+        </w:rPr>
+        <w:instrText xml:space="preserve"> PAGEREF _Toc407145091 \h </w:instrText>
+      </w:r>
+      <w:r>
+        <w:rPr>
+          <w:noProof/>
+        </w:rPr>
+      </w:r>
+      <w:r>
+        <w:rPr>
+          <w:noProof/>
+        </w:rPr>
+        <w:fldChar w:fldCharType="separate"/>
+      </w:r>
+      <w:r>
+        <w:rPr>
+          <w:noProof/>
+        </w:rPr>
+        <w:t>1</w:t>
+      </w:r>
+      <w:r>
+        <w:rPr>
+          <w:noProof/>
+        </w:rPr>
+        <w:fldChar w:fldCharType="end"/>
+      </w:r>
+    </w:p>
+    <w:p>
+      <w:pPr>
+        <w:pStyle w:val="TOC2"/>
+        <w:rPr>
+          <w:noProof/>
+        </w:rPr>
+      </w:pPr>
+      <w:r>
+        <w:rPr>
+          <w:noProof/>
+        </w:rPr>
+        <w:t>3</w:t>
+      </w:r>
+      <w:r>
+        <w:rPr>
+          <w:noProof/>
+        </w:rPr>
+        <w:t>.2  Python Program</w:t>
+      </w:r>
+      <w:r>
+        <w:rPr>
+          <w:noProof/>
+        </w:rPr>
+        <w:tab/>
+      </w:r>
+      <w:r>
+        <w:rPr>
+          <w:noProof/>
+        </w:rPr>
+        <w:fldChar w:fldCharType="begin"/>
+      </w:r>
+      <w:r>
+        <w:rPr>
+          <w:noProof/>
+        </w:rPr>
         <w:instrText xml:space="preserve"> PAGEREF _Toc407145096 \h </w:instrText>
       </w:r>
       <w:r>
@@ -2721,6 +2868,146 @@
     </w:p>
     <w:p>
       <w:pPr>
+        <w:pStyle w:val="TOC2"/>
+        <w:rPr>
+          <w:noProof/>
+        </w:rPr>
+      </w:pPr>
+      <w:r>
+        <w:rPr>
+          <w:noProof/>
+        </w:rPr>
+        <w:tab/>
+      </w:r>
+      <w:r>
+        <w:rPr>
+          <w:noProof/>
+        </w:rPr>
+        <w:t>3</w:t>
+      </w:r>
+      <w:r>
+        <w:rPr>
+          <w:noProof/>
+        </w:rPr>
+        <w:t xml:space="preserve">.2.1  </w:t>
+      </w:r>
+      <w:r>
+        <w:rPr>
+          <w:noProof/>
+        </w:rPr>
+        <w:t>Implementation</w:t>
+      </w:r>
+      <w:r>
+        <w:rPr>
+          <w:noProof/>
+        </w:rPr>
+        <w:tab/>
+      </w:r>
+      <w:r>
+        <w:rPr>
+          <w:noProof/>
+        </w:rPr>
+        <w:fldChar w:fldCharType="begin"/>
+      </w:r>
+      <w:r>
+        <w:rPr>
+          <w:noProof/>
+        </w:rPr>
+        <w:instrText xml:space="preserve"> PAGEREF _Toc407145091 \h </w:instrText>
+      </w:r>
+      <w:r>
+        <w:rPr>
+          <w:noProof/>
+        </w:rPr>
+      </w:r>
+      <w:r>
+        <w:rPr>
+          <w:noProof/>
+        </w:rPr>
+        <w:fldChar w:fldCharType="separate"/>
+      </w:r>
+      <w:r>
+        <w:rPr>
+          <w:noProof/>
+        </w:rPr>
+        <w:t>1</w:t>
+      </w:r>
+      <w:r>
+        <w:rPr>
+          <w:noProof/>
+        </w:rPr>
+        <w:fldChar w:fldCharType="end"/>
+      </w:r>
+    </w:p>
+    <w:p>
+      <w:pPr>
+        <w:pStyle w:val="TOC2"/>
+        <w:rPr>
+          <w:noProof/>
+        </w:rPr>
+      </w:pPr>
+      <w:r>
+        <w:rPr>
+          <w:noProof/>
+        </w:rPr>
+        <w:tab/>
+      </w:r>
+      <w:r>
+        <w:rPr>
+          <w:noProof/>
+        </w:rPr>
+        <w:t>3</w:t>
+      </w:r>
+      <w:r>
+        <w:rPr>
+          <w:noProof/>
+        </w:rPr>
+        <w:t>.2.1  Testing</w:t>
+      </w:r>
+      <w:r>
+        <w:rPr>
+          <w:noProof/>
+        </w:rPr>
+        <w:tab/>
+      </w:r>
+      <w:r>
+        <w:rPr>
+          <w:noProof/>
+        </w:rPr>
+        <w:fldChar w:fldCharType="begin"/>
+      </w:r>
+      <w:r>
+        <w:rPr>
+          <w:noProof/>
+        </w:rPr>
+        <w:instrText xml:space="preserve"> PAGEREF _Toc407145096 \h </w:instrText>
+      </w:r>
+      <w:r>
+        <w:rPr>
+          <w:noProof/>
+        </w:rPr>
+      </w:r>
+      <w:r>
+        <w:rPr>
+          <w:noProof/>
+        </w:rPr>
+        <w:fldChar w:fldCharType="separate"/>
+      </w:r>
+      <w:r>
+        <w:rPr>
+          <w:noProof/>
+        </w:rPr>
+        <w:t>2</w:t>
+      </w:r>
+      <w:r>
+        <w:rPr>
+          <w:noProof/>
+        </w:rPr>
+        <w:fldChar w:fldCharType="end"/>
+      </w:r>
+    </w:p>
+    <w:p>
+      <w:pPr>
         <w:pStyle w:val="TOC1"/>
         <w:rPr>
           <w:noProof/>
@@ -2730,6 +3017,7 @@
         <w:rPr>
           <w:noProof/>
         </w:rPr>
+        <w:lastRenderedPageBreak/>
         <w:t>Chapter 4 Discussion</w:t>
       </w:r>
       <w:r>
@@ -2895,7 +3183,6 @@
         <w:rPr>
           <w:noProof/>
         </w:rPr>
-        <w:lastRenderedPageBreak/>
         <w:t>List of References</w:t>
       </w:r>
       <w:r>
@@ -7899,7 +8186,12 @@
       </w:r>
       <w:r>
         <w:br/>
-        <w:t>Results</w:t>
+      </w:r>
+      <w:r>
+        <w:t>Implementation</w:t>
+      </w:r>
+      <w:r>
+        <w:t xml:space="preserve"> and Results</w:t>
       </w:r>
     </w:p>
     <w:p>
@@ -8348,6 +8640,28 @@
     </w:p>
     <w:p>
       <w:pPr>
+        <w:rPr>
+          <w:sz w:val="22"/>
+          <w:szCs w:val="18"/>
+        </w:rPr>
+      </w:pPr>
+      <w:r>
+        <w:rPr>
+          <w:sz w:val="22"/>
+          <w:szCs w:val="18"/>
+        </w:rPr>
+        <w:t xml:space="preserve">To test the capabilities of each algorithm properly, a dataset of misspelled words was used from Roger Mitton. His collection contained a multitude of files containing misspellings and their correct equivalents, which could be fed into the system one after the other. </w:t>
+      </w:r>
+      <w:r>
+        <w:rPr>
+          <w:sz w:val="22"/>
+          <w:szCs w:val="18"/>
+        </w:rPr>
+        <w:t>After all of these words were checked, then each search method and algorithm could be analysed for how fast they ran and if the correct spelling appeared in one of the top 10 suggested words.</w:t>
+      </w:r>
+    </w:p>
+    <w:p>
+      <w:pPr>
         <w:pStyle w:val="Heading2"/>
       </w:pPr>
       <w:r>
@@ -8481,6 +8795,7 @@
           <w:sz w:val="22"/>
           <w:szCs w:val="18"/>
         </w:rPr>
+        <w:lastRenderedPageBreak/>
         <w:t>One of the most helpful libraries was BeautifulSoup, which could do all the word extraction from the xml files in a few function calls. Python’s</w:t>
       </w:r>
       <w:r>
@@ -8545,7 +8860,6 @@
           <w:sz w:val="22"/>
           <w:szCs w:val="18"/>
         </w:rPr>
-        <w:lastRenderedPageBreak/>
         <w:t xml:space="preserve">Another useful discovery was the library strsimpy, which had </w:t>
       </w:r>
       <w:r>

</xml_diff>

<commit_message>
worked on writeup and fixed some small bugs
</commit_message>
<xml_diff>
--- a/project_writeup/FinalReportV1.docx
+++ b/project_writeup/FinalReportV1.docx
@@ -291,31 +291,6 @@
           <w:i/>
         </w:rPr>
       </w:pPr>
-    </w:p>
-    <w:p>
-      <w:pPr>
-        <w:rPr>
-          <w:i/>
-        </w:rPr>
-      </w:pPr>
-      <w:r>
-        <w:rPr>
-          <w:i/>
-        </w:rPr>
-        <w:t>&lt;</w:t>
-      </w:r>
-      <w:r>
-        <w:rPr>
-          <w:i/>
-        </w:rPr>
-        <w:t>As an</w:t>
-      </w:r>
-      <w:r>
-        <w:rPr>
-          <w:i/>
-        </w:rPr>
-        <w:t xml:space="preserve"> example&gt;</w:t>
-      </w:r>
     </w:p>
     <w:tbl>
       <w:tblPr>
@@ -459,7 +434,43 @@
               <w:rPr>
                 <w:i/>
               </w:rPr>
-              <w:t>ploaded to Minerva (DD/MM/YY)</w:t>
+              <w:t>ploaded to Minerva (</w:t>
+            </w:r>
+            <w:r>
+              <w:rPr>
+                <w:i/>
+              </w:rPr>
+              <w:t>30</w:t>
+            </w:r>
+            <w:r>
+              <w:rPr>
+                <w:i/>
+              </w:rPr>
+              <w:t>/</w:t>
+            </w:r>
+            <w:r>
+              <w:rPr>
+                <w:i/>
+              </w:rPr>
+              <w:t>04</w:t>
+            </w:r>
+            <w:r>
+              <w:rPr>
+                <w:i/>
+              </w:rPr>
+              <w:t>/</w:t>
+            </w:r>
+            <w:r>
+              <w:rPr>
+                <w:i/>
+              </w:rPr>
+              <w:t>24</w:t>
+            </w:r>
+            <w:r>
+              <w:rPr>
+                <w:i/>
+              </w:rPr>
+              <w:t>)</w:t>
             </w:r>
           </w:p>
         </w:tc>
@@ -545,7 +556,7 @@
               <w:rPr>
                 <w:i/>
               </w:rPr>
-              <w:t>DD</w:t>
+              <w:t>30</w:t>
             </w:r>
             <w:r>
               <w:rPr>
@@ -557,7 +568,7 @@
               <w:rPr>
                 <w:i/>
               </w:rPr>
-              <w:t>MM</w:t>
+              <w:t>04</w:t>
             </w:r>
             <w:r>
               <w:rPr>
@@ -569,7 +580,7 @@
               <w:rPr>
                 <w:i/>
               </w:rPr>
-              <w:t>YY</w:t>
+              <w:t>24</w:t>
             </w:r>
             <w:r>
               <w:rPr>
@@ -723,62 +734,93 @@
       <w:pPr>
         <w:jc w:val="both"/>
         <w:rPr>
-          <w:i/>
-          <w:sz w:val="22"/>
-          <w:szCs w:val="22"/>
-        </w:rPr>
-      </w:pPr>
-      <w:r>
-        <w:rPr>
-          <w:i/>
-          <w:sz w:val="22"/>
-          <w:szCs w:val="22"/>
-        </w:rPr>
-        <w:t>&lt;</w:t>
-      </w:r>
-      <w:r>
-        <w:rPr>
-          <w:i/>
-          <w:color w:val="111111"/>
-          <w:sz w:val="22"/>
-          <w:szCs w:val="22"/>
-        </w:rPr>
-        <w:t>Concise statement of the problem you intended to solve</w:t>
-      </w:r>
-      <w:r>
-        <w:rPr>
-          <w:i/>
-          <w:sz w:val="22"/>
-          <w:szCs w:val="22"/>
-        </w:rPr>
-        <w:t xml:space="preserve"> and main achievements</w:t>
-      </w:r>
-      <w:r>
-        <w:rPr>
-          <w:i/>
-          <w:sz w:val="22"/>
-          <w:szCs w:val="22"/>
-        </w:rPr>
-        <w:t xml:space="preserve"> </w:t>
-      </w:r>
-      <w:r>
-        <w:rPr>
-          <w:i/>
-          <w:sz w:val="22"/>
-          <w:szCs w:val="22"/>
-        </w:rPr>
-        <w:t>(no more than one A4 page)&gt;</w:t>
+          <w:iCs/>
+          <w:sz w:val="22"/>
+          <w:szCs w:val="22"/>
+        </w:rPr>
+      </w:pPr>
+      <w:r>
+        <w:rPr>
+          <w:iCs/>
+          <w:sz w:val="22"/>
+          <w:szCs w:val="22"/>
+        </w:rPr>
+        <w:t xml:space="preserve">In this report, </w:t>
+      </w:r>
+      <w:r>
+        <w:rPr>
+          <w:iCs/>
+          <w:sz w:val="22"/>
+          <w:szCs w:val="22"/>
+        </w:rPr>
+        <w:t>an</w:t>
+      </w:r>
+      <w:r>
+        <w:rPr>
+          <w:iCs/>
+          <w:sz w:val="22"/>
+          <w:szCs w:val="22"/>
+        </w:rPr>
+        <w:t xml:space="preserve"> attempt</w:t>
+      </w:r>
+      <w:r>
+        <w:rPr>
+          <w:iCs/>
+          <w:sz w:val="22"/>
+          <w:szCs w:val="22"/>
+        </w:rPr>
+        <w:t xml:space="preserve"> was made</w:t>
+      </w:r>
+      <w:r>
+        <w:rPr>
+          <w:iCs/>
+          <w:sz w:val="22"/>
+          <w:szCs w:val="22"/>
+        </w:rPr>
+        <w:t xml:space="preserve"> to establish an understanding of how spell checkers work on a fundamental level and analyse how they find words like others that are misspelled. For this, research was done into the primary method of measuring string similarity, L</w:t>
+      </w:r>
+      <w:r>
+        <w:rPr>
+          <w:iCs/>
+          <w:sz w:val="22"/>
+          <w:szCs w:val="22"/>
+        </w:rPr>
+        <w:t xml:space="preserve">evenshtein </w:t>
+      </w:r>
+      <w:r>
+        <w:rPr>
+          <w:iCs/>
+          <w:sz w:val="22"/>
+          <w:szCs w:val="22"/>
+        </w:rPr>
+        <w:t>Distance. To help analyse the use of this algorithm, a separate system was implemented which collects words for a corpus and stores them in a piece of software for use in the spell checker to see if a given word is valid or not. This task naturally allowed for the further analysis of other searching and storing algorithms for collecting and then finding words in efficient ways.</w:t>
       </w:r>
     </w:p>
     <w:p>
       <w:pPr>
         <w:jc w:val="both"/>
         <w:rPr>
-          <w:i/>
-          <w:sz w:val="22"/>
-          <w:szCs w:val="22"/>
-        </w:rPr>
-      </w:pPr>
+          <w:iCs/>
+          <w:sz w:val="22"/>
+          <w:szCs w:val="22"/>
+        </w:rPr>
+      </w:pPr>
+      <w:r>
+        <w:rPr>
+          <w:iCs/>
+          <w:sz w:val="22"/>
+          <w:szCs w:val="22"/>
+        </w:rPr>
+        <w:t xml:space="preserve">To fulfil this pledge, two separate systems were created to test the capabilities of the various algorithms and search methods available. One was written entirely in C, the other in Python. Both kept the exact same design of having a corpus extraction module, a spell checker module, and an automated testing menu. The </w:t>
+      </w:r>
+      <w:r>
+        <w:rPr>
+          <w:iCs/>
+          <w:sz w:val="22"/>
+          <w:szCs w:val="22"/>
+        </w:rPr>
+        <w:t>…</w:t>
+      </w:r>
     </w:p>
     <w:p>
       <w:pPr>
@@ -795,59 +837,7 @@
           <w:sz w:val="22"/>
           <w:szCs w:val="22"/>
         </w:rPr>
-        <w:t>In this report, I attempted to establish an understanding of how spell checkers work on a fundamental level and analyse how they find words like others that are misspelled. For this, research was done into the primary method of measuring string similarity, L</w:t>
-      </w:r>
-      <w:r>
-        <w:rPr>
-          <w:iCs/>
-          <w:sz w:val="22"/>
-          <w:szCs w:val="22"/>
-        </w:rPr>
-        <w:t xml:space="preserve">evenshtein </w:t>
-      </w:r>
-      <w:r>
-        <w:rPr>
-          <w:iCs/>
-          <w:sz w:val="22"/>
-          <w:szCs w:val="22"/>
-        </w:rPr>
-        <w:t>Distance. To help analyse the use of this algorithm, a separate system was implemented which collects words for a corpus and stores them in a piece of software for use in the spell checker to see if a given word is valid or not. This task naturally allowed for the further analysis of other searching and storing algorithms for collecting and then finding words in efficient ways.</w:t>
-      </w:r>
-    </w:p>
-    <w:p>
-      <w:pPr>
-        <w:jc w:val="both"/>
-        <w:rPr>
-          <w:iCs/>
-          <w:sz w:val="22"/>
-          <w:szCs w:val="22"/>
-        </w:rPr>
-      </w:pPr>
-      <w:r>
-        <w:rPr>
-          <w:iCs/>
-          <w:sz w:val="22"/>
-          <w:szCs w:val="22"/>
-        </w:rPr>
-        <w:t xml:space="preserve">To fulfil this pledge, two separate systems were created to test the capabilities of the various algorithms and search methods available. One was written entirely in C, the other in Python. Both kept the exact same design of having a corpus extraction module, a spell checker module, and an automated testing menu. The </w:t>
-      </w:r>
-    </w:p>
-    <w:p>
-      <w:pPr>
-        <w:jc w:val="both"/>
-        <w:rPr>
-          <w:iCs/>
-          <w:sz w:val="22"/>
-          <w:szCs w:val="22"/>
-        </w:rPr>
-      </w:pPr>
-      <w:r>
-        <w:rPr>
-          <w:iCs/>
-          <w:sz w:val="22"/>
-          <w:szCs w:val="22"/>
-        </w:rPr>
-        <w:t>…conclusion?</w:t>
+        <w:t>After analysing the results of the automated testing, it was immediately clear that the best system was one written in C, which produced drastically faster runtimes and was therefore more reliable for the job of a spell checker. The fastest search method was found to be …</w:t>
       </w:r>
     </w:p>
     <w:p>
@@ -2591,13 +2581,7 @@
         <w:rPr>
           <w:noProof/>
         </w:rPr>
-        <w:t>3</w:t>
-      </w:r>
-      <w:r>
-        <w:rPr>
-          <w:noProof/>
-        </w:rPr>
-        <w:t>.1  C Program</w:t>
+        <w:t>3.1  C Program</w:t>
       </w:r>
       <w:r>
         <w:rPr>
@@ -2653,18 +2637,36 @@
           <w:noProof/>
         </w:rPr>
         <w:tab/>
-      </w:r>
-      <w:r>
-        <w:rPr>
-          <w:noProof/>
-        </w:rPr>
-        <w:t>3</w:t>
-      </w:r>
-      <w:r>
-        <w:rPr>
-          <w:noProof/>
-        </w:rPr>
-        <w:t>.</w:t>
+        <w:t>3.1.1  Implementation</w:t>
+      </w:r>
+      <w:r>
+        <w:rPr>
+          <w:noProof/>
+        </w:rPr>
+        <w:tab/>
+      </w:r>
+      <w:r>
+        <w:rPr>
+          <w:noProof/>
+        </w:rPr>
+        <w:fldChar w:fldCharType="begin"/>
+      </w:r>
+      <w:r>
+        <w:rPr>
+          <w:noProof/>
+        </w:rPr>
+        <w:instrText xml:space="preserve"> PAGEREF _Toc407145091 \h </w:instrText>
+      </w:r>
+      <w:r>
+        <w:rPr>
+          <w:noProof/>
+        </w:rPr>
+      </w:r>
+      <w:r>
+        <w:rPr>
+          <w:noProof/>
+        </w:rPr>
+        <w:fldChar w:fldCharType="separate"/>
       </w:r>
       <w:r>
         <w:rPr>
@@ -2676,19 +2678,28 @@
         <w:rPr>
           <w:noProof/>
         </w:rPr>
-        <w:t xml:space="preserve">.1  </w:t>
-      </w:r>
-      <w:r>
-        <w:rPr>
-          <w:noProof/>
-        </w:rPr>
-        <w:t>Implementation</w:t>
-      </w:r>
+        <w:fldChar w:fldCharType="end"/>
+      </w:r>
+    </w:p>
+    <w:p>
+      <w:pPr>
+        <w:pStyle w:val="TOC2"/>
+        <w:rPr>
+          <w:noProof/>
+        </w:rPr>
+      </w:pPr>
       <w:r>
         <w:rPr>
           <w:noProof/>
         </w:rPr>
         <w:tab/>
+        <w:t>3.1.1  Testing</w:t>
+      </w:r>
+      <w:r>
+        <w:rPr>
+          <w:noProof/>
+        </w:rPr>
+        <w:tab/>
       </w:r>
       <w:r>
         <w:rPr>
@@ -2737,19 +2748,92 @@
         <w:rPr>
           <w:noProof/>
         </w:rPr>
+        <w:t>3.2  Python Program</w:t>
+      </w:r>
+      <w:r>
+        <w:rPr>
+          <w:noProof/>
+        </w:rPr>
         <w:tab/>
       </w:r>
       <w:r>
         <w:rPr>
           <w:noProof/>
         </w:rPr>
-        <w:t>3</w:t>
-      </w:r>
-      <w:r>
-        <w:rPr>
-          <w:noProof/>
-        </w:rPr>
-        <w:t>.</w:t>
+        <w:fldChar w:fldCharType="begin"/>
+      </w:r>
+      <w:r>
+        <w:rPr>
+          <w:noProof/>
+        </w:rPr>
+        <w:instrText xml:space="preserve"> PAGEREF _Toc407145096 \h </w:instrText>
+      </w:r>
+      <w:r>
+        <w:rPr>
+          <w:noProof/>
+        </w:rPr>
+      </w:r>
+      <w:r>
+        <w:rPr>
+          <w:noProof/>
+        </w:rPr>
+        <w:fldChar w:fldCharType="separate"/>
+      </w:r>
+      <w:r>
+        <w:rPr>
+          <w:noProof/>
+        </w:rPr>
+        <w:t>2</w:t>
+      </w:r>
+      <w:r>
+        <w:rPr>
+          <w:noProof/>
+        </w:rPr>
+        <w:fldChar w:fldCharType="end"/>
+      </w:r>
+    </w:p>
+    <w:p>
+      <w:pPr>
+        <w:pStyle w:val="TOC2"/>
+        <w:rPr>
+          <w:noProof/>
+        </w:rPr>
+      </w:pPr>
+      <w:r>
+        <w:rPr>
+          <w:noProof/>
+        </w:rPr>
+        <w:tab/>
+        <w:t>3.2.1  Implementation</w:t>
+      </w:r>
+      <w:r>
+        <w:rPr>
+          <w:noProof/>
+        </w:rPr>
+        <w:tab/>
+      </w:r>
+      <w:r>
+        <w:rPr>
+          <w:noProof/>
+        </w:rPr>
+        <w:fldChar w:fldCharType="begin"/>
+      </w:r>
+      <w:r>
+        <w:rPr>
+          <w:noProof/>
+        </w:rPr>
+        <w:instrText xml:space="preserve"> PAGEREF _Toc407145091 \h </w:instrText>
+      </w:r>
+      <w:r>
+        <w:rPr>
+          <w:noProof/>
+        </w:rPr>
+      </w:r>
+      <w:r>
+        <w:rPr>
+          <w:noProof/>
+        </w:rPr>
+        <w:fldChar w:fldCharType="separate"/>
       </w:r>
       <w:r>
         <w:rPr>
@@ -2761,208 +2845,22 @@
         <w:rPr>
           <w:noProof/>
         </w:rPr>
-        <w:t>.1  Testing</w:t>
-      </w:r>
+        <w:fldChar w:fldCharType="end"/>
+      </w:r>
+    </w:p>
+    <w:p>
+      <w:pPr>
+        <w:pStyle w:val="TOC2"/>
+        <w:rPr>
+          <w:noProof/>
+        </w:rPr>
+      </w:pPr>
       <w:r>
         <w:rPr>
           <w:noProof/>
         </w:rPr>
         <w:tab/>
-      </w:r>
-      <w:r>
-        <w:rPr>
-          <w:noProof/>
-        </w:rPr>
-        <w:fldChar w:fldCharType="begin"/>
-      </w:r>
-      <w:r>
-        <w:rPr>
-          <w:noProof/>
-        </w:rPr>
-        <w:instrText xml:space="preserve"> PAGEREF _Toc407145091 \h </w:instrText>
-      </w:r>
-      <w:r>
-        <w:rPr>
-          <w:noProof/>
-        </w:rPr>
-      </w:r>
-      <w:r>
-        <w:rPr>
-          <w:noProof/>
-        </w:rPr>
-        <w:fldChar w:fldCharType="separate"/>
-      </w:r>
-      <w:r>
-        <w:rPr>
-          <w:noProof/>
-        </w:rPr>
-        <w:t>1</w:t>
-      </w:r>
-      <w:r>
-        <w:rPr>
-          <w:noProof/>
-        </w:rPr>
-        <w:fldChar w:fldCharType="end"/>
-      </w:r>
-    </w:p>
-    <w:p>
-      <w:pPr>
-        <w:pStyle w:val="TOC2"/>
-        <w:rPr>
-          <w:noProof/>
-        </w:rPr>
-      </w:pPr>
-      <w:r>
-        <w:rPr>
-          <w:noProof/>
-        </w:rPr>
-        <w:t>3</w:t>
-      </w:r>
-      <w:r>
-        <w:rPr>
-          <w:noProof/>
-        </w:rPr>
-        <w:t>.2  Python Program</w:t>
-      </w:r>
-      <w:r>
-        <w:rPr>
-          <w:noProof/>
-        </w:rPr>
-        <w:tab/>
-      </w:r>
-      <w:r>
-        <w:rPr>
-          <w:noProof/>
-        </w:rPr>
-        <w:fldChar w:fldCharType="begin"/>
-      </w:r>
-      <w:r>
-        <w:rPr>
-          <w:noProof/>
-        </w:rPr>
-        <w:instrText xml:space="preserve"> PAGEREF _Toc407145096 \h </w:instrText>
-      </w:r>
-      <w:r>
-        <w:rPr>
-          <w:noProof/>
-        </w:rPr>
-      </w:r>
-      <w:r>
-        <w:rPr>
-          <w:noProof/>
-        </w:rPr>
-        <w:fldChar w:fldCharType="separate"/>
-      </w:r>
-      <w:r>
-        <w:rPr>
-          <w:noProof/>
-        </w:rPr>
-        <w:t>2</w:t>
-      </w:r>
-      <w:r>
-        <w:rPr>
-          <w:noProof/>
-        </w:rPr>
-        <w:fldChar w:fldCharType="end"/>
-      </w:r>
-    </w:p>
-    <w:p>
-      <w:pPr>
-        <w:pStyle w:val="TOC2"/>
-        <w:rPr>
-          <w:noProof/>
-        </w:rPr>
-      </w:pPr>
-      <w:r>
-        <w:rPr>
-          <w:noProof/>
-        </w:rPr>
-        <w:tab/>
-      </w:r>
-      <w:r>
-        <w:rPr>
-          <w:noProof/>
-        </w:rPr>
-        <w:t>3</w:t>
-      </w:r>
-      <w:r>
-        <w:rPr>
-          <w:noProof/>
-        </w:rPr>
-        <w:t xml:space="preserve">.2.1  </w:t>
-      </w:r>
-      <w:r>
-        <w:rPr>
-          <w:noProof/>
-        </w:rPr>
-        <w:t>Implementation</w:t>
-      </w:r>
-      <w:r>
-        <w:rPr>
-          <w:noProof/>
-        </w:rPr>
-        <w:tab/>
-      </w:r>
-      <w:r>
-        <w:rPr>
-          <w:noProof/>
-        </w:rPr>
-        <w:fldChar w:fldCharType="begin"/>
-      </w:r>
-      <w:r>
-        <w:rPr>
-          <w:noProof/>
-        </w:rPr>
-        <w:instrText xml:space="preserve"> PAGEREF _Toc407145091 \h </w:instrText>
-      </w:r>
-      <w:r>
-        <w:rPr>
-          <w:noProof/>
-        </w:rPr>
-      </w:r>
-      <w:r>
-        <w:rPr>
-          <w:noProof/>
-        </w:rPr>
-        <w:fldChar w:fldCharType="separate"/>
-      </w:r>
-      <w:r>
-        <w:rPr>
-          <w:noProof/>
-        </w:rPr>
-        <w:t>1</w:t>
-      </w:r>
-      <w:r>
-        <w:rPr>
-          <w:noProof/>
-        </w:rPr>
-        <w:fldChar w:fldCharType="end"/>
-      </w:r>
-    </w:p>
-    <w:p>
-      <w:pPr>
-        <w:pStyle w:val="TOC2"/>
-        <w:rPr>
-          <w:noProof/>
-        </w:rPr>
-      </w:pPr>
-      <w:r>
-        <w:rPr>
-          <w:noProof/>
-        </w:rPr>
-        <w:tab/>
-      </w:r>
-      <w:r>
-        <w:rPr>
-          <w:noProof/>
-        </w:rPr>
-        <w:t>3</w:t>
-      </w:r>
-      <w:r>
-        <w:rPr>
-          <w:noProof/>
-        </w:rPr>
-        <w:t>.2.1  Testing</w:t>
+        <w:t>3.2.1  Testing</w:t>
       </w:r>
       <w:r>
         <w:rPr>
@@ -8392,7 +8290,87 @@
           <w:sz w:val="22"/>
           <w:szCs w:val="18"/>
         </w:rPr>
-        <w:t>However, the nature of C being a fast and optimised language also made it harder to write the code. C has limited options for storing data at run-time dynamically. The main issue was storing all the words at runtime, which had to be done with a fixed size array which was big enough to work for any of the given corpora. The language also made developing the corpus extraction process more difficult, requiring time being spent on a long list of loops which would read the files character by character. Despite the speed of the C program being good, it took a lot longer to understand and develop the final product.</w:t>
+        <w:t xml:space="preserve">However, the nature of C being a fast and optimised language also made it harder to write the code. C has limited options for storing data at run-time dynamically. The main issue was storing all the words at runtime, which had to be done with a fixed size array which was big enough to work for any of the given corpora. </w:t>
+      </w:r>
+    </w:p>
+    <w:p>
+      <w:pPr>
+        <w:rPr>
+          <w:sz w:val="22"/>
+          <w:szCs w:val="18"/>
+        </w:rPr>
+      </w:pPr>
+      <w:r>
+        <w:rPr>
+          <w:sz w:val="22"/>
+          <w:szCs w:val="18"/>
+        </w:rPr>
+        <w:t>The language also made developing the corpus extraction process more difficult, requiring time being spent on a long list of loops which would read the files character by character.</w:t>
+      </w:r>
+      <w:r>
+        <w:rPr>
+          <w:sz w:val="22"/>
+          <w:szCs w:val="18"/>
+        </w:rPr>
+        <w:t xml:space="preserve"> Furthermore, C has a limited number of premade libraries to use, which meant all the string metric algorithms had to be personally developed and tested for correctness, which took even more time to complete.</w:t>
+      </w:r>
+      <w:r>
+        <w:rPr>
+          <w:sz w:val="22"/>
+          <w:szCs w:val="18"/>
+        </w:rPr>
+        <w:t xml:space="preserve"> Despite the</w:t>
+      </w:r>
+      <w:r>
+        <w:rPr>
+          <w:sz w:val="22"/>
+          <w:szCs w:val="18"/>
+        </w:rPr>
+        <w:t xml:space="preserve"> overall</w:t>
+      </w:r>
+      <w:r>
+        <w:rPr>
+          <w:sz w:val="22"/>
+          <w:szCs w:val="18"/>
+        </w:rPr>
+        <w:t xml:space="preserve"> speed of the C program being good, it took a lot longer to understand and develop the final product.</w:t>
+      </w:r>
+    </w:p>
+    <w:p>
+      <w:pPr>
+        <w:rPr>
+          <w:sz w:val="22"/>
+          <w:szCs w:val="18"/>
+        </w:rPr>
+      </w:pPr>
+      <w:r>
+        <w:rPr>
+          <w:sz w:val="22"/>
+          <w:szCs w:val="18"/>
+        </w:rPr>
+        <w:t xml:space="preserve">Another issue found concerned finding the top 10 suggested words for any given misspelled string. </w:t>
+      </w:r>
+      <w:r>
+        <w:rPr>
+          <w:sz w:val="22"/>
+          <w:szCs w:val="18"/>
+        </w:rPr>
+        <w:t xml:space="preserve">The way the system worked was that after the search method failed to find a given word in the database, it would loop linearly through all the stored strings and calculate the distance between them and the user’s word. Once completed, to find the smallest values the program would loop through the entire list linearly and then get the smallest value each time. This meant that to find all these suggestions would require 10 full loops through the entire </w:t>
+      </w:r>
+      <w:r>
+        <w:rPr>
+          <w:sz w:val="22"/>
+          <w:szCs w:val="18"/>
+        </w:rPr>
+        <w:lastRenderedPageBreak/>
+        <w:t xml:space="preserve">dataset. Which would eventually be a problem as testing was done on corpora with words in the range of </w:t>
+      </w:r>
+      <w:r>
+        <w:rPr>
+          <w:sz w:val="22"/>
+          <w:szCs w:val="18"/>
+        </w:rPr>
+        <w:t>around 100,000.</w:t>
       </w:r>
     </w:p>
     <w:p>
@@ -8447,7 +8425,7 @@
           <w:sz w:val="22"/>
           <w:szCs w:val="18"/>
         </w:rPr>
-        <w:t>3</w:t>
+        <w:t>2</w:t>
       </w:r>
       <w:r>
         <w:rPr>
@@ -8502,7 +8480,6 @@
           <w:sz w:val="22"/>
           <w:szCs w:val="18"/>
         </w:rPr>
-        <w:lastRenderedPageBreak/>
         <w:t>There was however a drawback to using this small subset of words, in that there were instances where you entered a word for an algorithm and the result was a so instantaneous that the cord reported a runtime of 0 milliseconds.</w:t>
       </w:r>
     </w:p>
@@ -8637,19 +8614,34 @@
         </w:rPr>
         <w:t xml:space="preserve">better than with the ‘D’ corpus. </w:t>
       </w:r>
-    </w:p>
-    <w:p>
-      <w:pPr>
-        <w:rPr>
-          <w:sz w:val="22"/>
-          <w:szCs w:val="18"/>
-        </w:rPr>
-      </w:pPr>
-      <w:r>
-        <w:rPr>
-          <w:sz w:val="22"/>
-          <w:szCs w:val="18"/>
-        </w:rPr>
+      <w:r>
+        <w:rPr>
+          <w:sz w:val="22"/>
+          <w:szCs w:val="18"/>
+        </w:rPr>
+        <w:t>It would also hopefully reduce the issue of  zero runtimes and more clearly define the benefits and drawbacks of each search method and algorithm to handle such a large dataset.</w:t>
+      </w:r>
+      <w:r>
+        <w:rPr>
+          <w:sz w:val="22"/>
+          <w:szCs w:val="18"/>
+        </w:rPr>
+        <w:t xml:space="preserve"> Furthermore, it would increase the chance that the correct spelling for a word did exist in the list, which would be useful in automated testing stage of the program to ensure the results were as fair as possible.</w:t>
+      </w:r>
+    </w:p>
+    <w:p>
+      <w:pPr>
+        <w:rPr>
+          <w:sz w:val="22"/>
+          <w:szCs w:val="18"/>
+        </w:rPr>
+      </w:pPr>
+      <w:r>
+        <w:rPr>
+          <w:sz w:val="22"/>
+          <w:szCs w:val="18"/>
+        </w:rPr>
+        <w:lastRenderedPageBreak/>
         <w:t xml:space="preserve">To test the capabilities of each algorithm properly, a dataset of misspelled words was used from Roger Mitton. His collection contained a multitude of files containing misspellings and their correct equivalents, which could be fed into the system one after the other. </w:t>
       </w:r>
       <w:r>
@@ -8657,27 +8649,57 @@
           <w:sz w:val="22"/>
           <w:szCs w:val="18"/>
         </w:rPr>
-        <w:t>After all of these words were checked, then each search method and algorithm could be analysed for how fast they ran and if the correct spelling appeared in one of the top 10 suggested words.</w:t>
-      </w:r>
-    </w:p>
-    <w:p>
-      <w:pPr>
-        <w:pStyle w:val="Heading2"/>
-      </w:pPr>
-      <w:r>
-        <w:t>3</w:t>
-      </w:r>
-      <w:r>
-        <w:t>.</w:t>
-      </w:r>
-      <w:r>
-        <w:t>2</w:t>
-      </w:r>
-      <w:r>
-        <w:t xml:space="preserve">  </w:t>
-      </w:r>
-      <w:r>
-        <w:t>Python Program</w:t>
+        <w:t xml:space="preserve">After </w:t>
+      </w:r>
+      <w:r>
+        <w:rPr>
+          <w:sz w:val="22"/>
+          <w:szCs w:val="18"/>
+        </w:rPr>
+        <w:t>all</w:t>
+      </w:r>
+      <w:r>
+        <w:rPr>
+          <w:sz w:val="22"/>
+          <w:szCs w:val="18"/>
+        </w:rPr>
+        <w:t xml:space="preserve"> these words were checked, then each search method and algorithm could be analysed for how fast they ran and if the correct spelling appeared in one of the top 10 suggested words.</w:t>
+      </w:r>
+      <w:r>
+        <w:rPr>
+          <w:sz w:val="22"/>
+          <w:szCs w:val="18"/>
+        </w:rPr>
+        <w:t xml:space="preserve"> </w:t>
+      </w:r>
+      <w:r>
+        <w:rPr>
+          <w:sz w:val="22"/>
+          <w:szCs w:val="18"/>
+        </w:rPr>
+        <w:t>To further examine the effects of different word organisations, two tests were conducted. One with a sorted dataset and one without.</w:t>
+      </w:r>
+    </w:p>
+    <w:p>
+      <w:pPr>
+        <w:rPr>
+          <w:sz w:val="22"/>
+          <w:szCs w:val="18"/>
+        </w:rPr>
+      </w:pPr>
+      <w:r>
+        <w:rPr>
+          <w:sz w:val="22"/>
+          <w:szCs w:val="18"/>
+        </w:rPr>
+        <w:t>In the end however, only one file of his was used which contained over 508 misspelled words. There were other larger test sets of 4,000 and even 40,000 words, however these were soon rejected due to the performance of the Python program to keep the test results fair. With this small dataset, the C program could completely compile the results in around 20 minutes.</w:t>
+      </w:r>
+      <w:r>
+        <w:rPr>
+          <w:sz w:val="22"/>
+          <w:szCs w:val="18"/>
+        </w:rPr>
+        <w:t xml:space="preserve"> This long time can be attributed to the fact that for every one of the 508 misspelled words, the system tested each 3 search methods, where for each method 8 algorithmic tests were performed. Combine that with the implementation issue of having a minimum of 10 full loops though the whole set in order to find the suggested word, and you can understand why it takes so long to complete testing.</w:t>
       </w:r>
     </w:p>
     <w:p>
@@ -8714,7 +8736,7 @@
           <w:sz w:val="22"/>
           <w:szCs w:val="18"/>
         </w:rPr>
-        <w:t>2</w:t>
+        <w:t>1</w:t>
       </w:r>
       <w:r>
         <w:rPr>
@@ -8732,7 +8754,7 @@
           <w:sz w:val="22"/>
           <w:szCs w:val="18"/>
         </w:rPr>
-        <w:t>1</w:t>
+        <w:t>3</w:t>
       </w:r>
       <w:r>
         <w:rPr>
@@ -8750,37 +8772,167 @@
           <w:sz w:val="22"/>
           <w:szCs w:val="18"/>
         </w:rPr>
-        <w:t>Implementation</w:t>
-      </w:r>
-    </w:p>
-    <w:p>
-      <w:pPr>
-        <w:rPr>
-          <w:sz w:val="22"/>
-          <w:szCs w:val="18"/>
-        </w:rPr>
-      </w:pPr>
-      <w:r>
-        <w:rPr>
-          <w:sz w:val="22"/>
-          <w:szCs w:val="18"/>
-        </w:rPr>
-        <w:t xml:space="preserve">The python version was worked on after the C program was nearly completed. Therefore, development lessons and ideas could be copied and adapted over, which saved a large amount of time creating the application. </w:t>
-      </w:r>
-    </w:p>
-    <w:p>
-      <w:pPr>
-        <w:rPr>
-          <w:sz w:val="22"/>
-          <w:szCs w:val="18"/>
-        </w:rPr>
-      </w:pPr>
-      <w:r>
-        <w:rPr>
-          <w:sz w:val="22"/>
-          <w:szCs w:val="18"/>
-        </w:rPr>
-        <w:t xml:space="preserve">Coding was a lot easier with python, given that it has access to many libraries and data structures that C lacks. </w:t>
+        <w:t>Results</w:t>
+      </w:r>
+    </w:p>
+    <w:p>
+      <w:pPr>
+        <w:rPr>
+          <w:sz w:val="22"/>
+          <w:szCs w:val="18"/>
+        </w:rPr>
+      </w:pPr>
+      <w:r>
+        <w:rPr>
+          <w:sz w:val="22"/>
+          <w:szCs w:val="18"/>
+        </w:rPr>
+        <w:t>Once all the tests had been completed, a python program was developed to work compile and display the results in a series of graphs</w:t>
+      </w:r>
+      <w:r>
+        <w:rPr>
+          <w:sz w:val="22"/>
+          <w:szCs w:val="18"/>
+        </w:rPr>
+        <w:t xml:space="preserve"> using the library matplotlib</w:t>
+      </w:r>
+      <w:r>
+        <w:rPr>
+          <w:sz w:val="22"/>
+          <w:szCs w:val="18"/>
+        </w:rPr>
+        <w:t>.</w:t>
+      </w:r>
+      <w:r>
+        <w:rPr>
+          <w:sz w:val="22"/>
+          <w:szCs w:val="18"/>
+        </w:rPr>
+        <w:t xml:space="preserve"> These were divided based on three criteria for assessment, which were runtime, suggestion number, and miss counts.</w:t>
+      </w:r>
+    </w:p>
+    <w:p>
+      <w:pPr>
+        <w:rPr>
+          <w:sz w:val="22"/>
+          <w:szCs w:val="18"/>
+        </w:rPr>
+      </w:pPr>
+      <w:r>
+        <w:rPr>
+          <w:sz w:val="22"/>
+          <w:szCs w:val="18"/>
+        </w:rPr>
+        <w:t>Both the sorted and unsorted dataset tests produced similar runtimes, for the linear and hash search methods, so it was easy to compare all three methods together. From looking at the various times in figure 13, a general trend appears between each of the algorithms</w:t>
+      </w:r>
+      <w:r>
+        <w:rPr>
+          <w:sz w:val="22"/>
+          <w:szCs w:val="18"/>
+        </w:rPr>
+        <w:t xml:space="preserve">. </w:t>
+      </w:r>
+      <w:proofErr w:type="gramStart"/>
+      <w:r>
+        <w:rPr>
+          <w:sz w:val="22"/>
+          <w:szCs w:val="18"/>
+        </w:rPr>
+        <w:t>First of all</w:t>
+      </w:r>
+      <w:proofErr w:type="gramEnd"/>
+      <w:r>
+        <w:rPr>
+          <w:sz w:val="22"/>
+          <w:szCs w:val="18"/>
+        </w:rPr>
+        <w:t xml:space="preserve">, it is clear that binary searching provides the fastest runtimes as given by the fact that the </w:t>
+      </w:r>
+      <w:r>
+        <w:rPr>
+          <w:sz w:val="22"/>
+          <w:szCs w:val="18"/>
+        </w:rPr>
+        <w:t>average</w:t>
+      </w:r>
+      <w:r>
+        <w:rPr>
+          <w:sz w:val="22"/>
+          <w:szCs w:val="18"/>
+        </w:rPr>
+        <w:t xml:space="preserve"> for each algorithm is lower compared to the others.</w:t>
+      </w:r>
+    </w:p>
+    <w:p>
+      <w:pPr>
+        <w:rPr>
+          <w:sz w:val="22"/>
+          <w:szCs w:val="18"/>
+        </w:rPr>
+      </w:pPr>
+      <w:r>
+        <w:rPr>
+          <w:sz w:val="22"/>
+          <w:szCs w:val="18"/>
+        </w:rPr>
+        <w:t xml:space="preserve">Secondly, </w:t>
+      </w:r>
+      <w:r>
+        <w:rPr>
+          <w:sz w:val="22"/>
+          <w:szCs w:val="18"/>
+        </w:rPr>
+        <w:t xml:space="preserve"> algorithms such as Hamming Distance and </w:t>
+      </w:r>
+      <w:r>
+        <w:rPr>
+          <w:sz w:val="22"/>
+          <w:szCs w:val="18"/>
+        </w:rPr>
+        <w:t>Sørensen–Dice</w:t>
+      </w:r>
+      <w:r>
+        <w:rPr>
+          <w:sz w:val="22"/>
+          <w:szCs w:val="18"/>
+        </w:rPr>
+        <w:t xml:space="preserve"> being on average very fast algorithms given their low mean line, compared to the much slower algorithm of Damerau-Levenshtein. This in turn confirms the time complexities of each of the algorithms since the former two algorithms also have the lowest compared to the others. </w:t>
+      </w:r>
+    </w:p>
+    <w:p>
+      <w:pPr>
+        <w:rPr>
+          <w:sz w:val="22"/>
+          <w:szCs w:val="18"/>
+        </w:rPr>
+      </w:pPr>
+      <w:r>
+        <w:rPr>
+          <w:sz w:val="22"/>
+          <w:szCs w:val="18"/>
+        </w:rPr>
+        <w:t>However, the case of Jaro and Jaro Winkler defies this as it has a complexity of O(m * n</w:t>
+      </w:r>
+      <w:r>
+        <w:rPr>
+          <w:sz w:val="22"/>
+          <w:szCs w:val="18"/>
+        </w:rPr>
+        <w:t>) yet</w:t>
+      </w:r>
+      <w:r>
+        <w:rPr>
+          <w:sz w:val="22"/>
+          <w:szCs w:val="18"/>
+        </w:rPr>
+        <w:t xml:space="preserve"> </w:t>
+      </w:r>
+      <w:r>
+        <w:rPr>
+          <w:sz w:val="22"/>
+          <w:szCs w:val="18"/>
+        </w:rPr>
+        <w:t xml:space="preserve">keeps its average runtime lower than Levenshtein Distance which should run in the same quadratic time frame. This could be due to the implementation of the Jaro algorithm, which does have a case to break from the calculation loop if a string doesn’t meet certain criteria, whereas Levenshtein doesn’t have such a system and must complete the full loop each time. </w:t>
       </w:r>
     </w:p>
     <w:p>
@@ -8796,116 +8948,373 @@
           <w:szCs w:val="18"/>
         </w:rPr>
         <w:lastRenderedPageBreak/>
-        <w:t>One of the most helpful libraries was BeautifulSoup, which could do all the word extraction from the xml files in a few function calls. Python’s</w:t>
-      </w:r>
-      <w:r>
-        <w:rPr>
-          <w:sz w:val="22"/>
-          <w:szCs w:val="18"/>
-        </w:rPr>
-        <w:t xml:space="preserve"> dynamically sized array and</w:t>
-      </w:r>
-      <w:r>
-        <w:rPr>
-          <w:sz w:val="22"/>
-          <w:szCs w:val="18"/>
-        </w:rPr>
-        <w:t xml:space="preserve"> dictionary</w:t>
-      </w:r>
-      <w:r>
-        <w:rPr>
-          <w:sz w:val="22"/>
-          <w:szCs w:val="18"/>
-        </w:rPr>
-        <w:t xml:space="preserve"> data</w:t>
-      </w:r>
-      <w:r>
-        <w:rPr>
-          <w:sz w:val="22"/>
-          <w:szCs w:val="18"/>
-        </w:rPr>
-        <w:t xml:space="preserve"> structures were also invaluable in </w:t>
-      </w:r>
-      <w:r>
-        <w:rPr>
-          <w:sz w:val="22"/>
-          <w:szCs w:val="18"/>
-        </w:rPr>
-        <w:t xml:space="preserve">holding the large quantity of words at runtime. </w:t>
-      </w:r>
-      <w:r>
-        <w:rPr>
-          <w:sz w:val="22"/>
-          <w:szCs w:val="18"/>
-        </w:rPr>
-        <w:t>All</w:t>
-      </w:r>
-      <w:r>
-        <w:rPr>
-          <w:sz w:val="22"/>
-          <w:szCs w:val="18"/>
-        </w:rPr>
-        <w:t xml:space="preserve"> these benefits drastically cut down of the amount of time spent coding compared to C, which helped the final product be delivered in such a short timeframe. </w:t>
-      </w:r>
-    </w:p>
-    <w:p>
-      <w:pPr>
-        <w:rPr>
-          <w:sz w:val="22"/>
-          <w:szCs w:val="18"/>
-        </w:rPr>
-      </w:pPr>
-      <w:r>
-        <w:rPr>
-          <w:sz w:val="22"/>
-          <w:szCs w:val="18"/>
-        </w:rPr>
-        <w:t xml:space="preserve">Another useful discovery was the library strsimpy, which had </w:t>
-      </w:r>
-      <w:r>
-        <w:rPr>
-          <w:sz w:val="22"/>
-          <w:szCs w:val="18"/>
-        </w:rPr>
-        <w:t>several of</w:t>
-      </w:r>
-      <w:r>
-        <w:rPr>
-          <w:sz w:val="22"/>
-          <w:szCs w:val="18"/>
-        </w:rPr>
-        <w:t xml:space="preserve"> the string metric algorithms already created and ready to use</w:t>
-      </w:r>
-      <w:r>
-        <w:rPr>
-          <w:sz w:val="22"/>
-          <w:szCs w:val="18"/>
-        </w:rPr>
-        <w:t xml:space="preserve"> which included the Levenshtein, Optimal String Alignment, Damerau-Levenshtein, Sorensen Dice and Jaro Winkler algorithms</w:t>
-      </w:r>
-      <w:r>
-        <w:rPr>
-          <w:sz w:val="22"/>
-          <w:szCs w:val="18"/>
-        </w:rPr>
-        <w:t xml:space="preserve">. </w:t>
-      </w:r>
-      <w:r>
-        <w:rPr>
-          <w:sz w:val="22"/>
-          <w:szCs w:val="18"/>
-        </w:rPr>
-        <w:t>These were eventually used over personal versions since they were more easily accessible and were guaranteed to work with most scenarios and comparisons, and they would be more likely to be optimal solutions.</w:t>
-      </w:r>
-    </w:p>
-    <w:p>
-      <w:pPr>
+        <w:t>It is also clear that the more complex the algorithm is, the greater the variance is it is runtime, since the IQR for both Damerau and Optimal String Alignment is a lot larger than its counterparts.</w:t>
+      </w:r>
+      <w:r>
+        <w:rPr>
+          <w:sz w:val="22"/>
+          <w:szCs w:val="18"/>
+        </w:rPr>
+        <w:t xml:space="preserve"> This is most likely because these two algorithms </w:t>
+      </w:r>
+      <w:proofErr w:type="gramStart"/>
+      <w:r>
+        <w:rPr>
+          <w:sz w:val="22"/>
+          <w:szCs w:val="18"/>
+        </w:rPr>
+        <w:t>have to</w:t>
+      </w:r>
+      <w:proofErr w:type="gramEnd"/>
+      <w:r>
+        <w:rPr>
+          <w:sz w:val="22"/>
+          <w:szCs w:val="18"/>
+        </w:rPr>
+        <w:t xml:space="preserve"> perform look for 4 separate operations for each letter, so the number of checks can vary depending on a word’s length.</w:t>
+      </w:r>
+    </w:p>
+    <w:p>
+      <w:pPr>
+        <w:jc w:val="center"/>
+        <w:rPr>
+          <w:sz w:val="22"/>
+          <w:szCs w:val="18"/>
+        </w:rPr>
+      </w:pPr>
+      <w:r>
+        <w:rPr>
+          <w:noProof/>
+        </w:rPr>
+        <w:drawing>
+          <wp:inline distT="0" distB="0" distL="0" distR="0" wp14:anchorId="495AA806" wp14:editId="7A3AEB0D">
+            <wp:extent cx="4600658" cy="2425719"/>
+            <wp:effectExtent l="19050" t="19050" r="9525" b="0"/>
+            <wp:docPr id="2140009256" name="Picture 1" descr="A graph with lines and dots&#10;&#10;Description automatically generated with medium confidence"/>
+            <wp:cNvGraphicFramePr>
+              <a:graphicFrameLocks xmlns:a="http://schemas.openxmlformats.org/drawingml/2006/main" noChangeAspect="1"/>
+            </wp:cNvGraphicFramePr>
+            <a:graphic xmlns:a="http://schemas.openxmlformats.org/drawingml/2006/main">
+              <a:graphicData uri="http://schemas.openxmlformats.org/drawingml/2006/picture">
+                <pic:pic xmlns:pic="http://schemas.openxmlformats.org/drawingml/2006/picture">
+                  <pic:nvPicPr>
+                    <pic:cNvPr id="2140009256" name="Picture 1" descr="A graph with lines and dots&#10;&#10;Description automatically generated with medium confidence"/>
+                    <pic:cNvPicPr/>
+                  </pic:nvPicPr>
+                  <pic:blipFill>
+                    <a:blip r:embed="rId24"/>
+                    <a:stretch>
+                      <a:fillRect/>
+                    </a:stretch>
+                  </pic:blipFill>
+                  <pic:spPr>
+                    <a:xfrm>
+                      <a:off x="0" y="0"/>
+                      <a:ext cx="4631472" cy="2441966"/>
+                    </a:xfrm>
+                    <a:prstGeom prst="rect">
+                      <a:avLst/>
+                    </a:prstGeom>
+                    <a:ln>
+                      <a:solidFill>
+                        <a:schemeClr val="tx1"/>
+                      </a:solidFill>
+                    </a:ln>
+                  </pic:spPr>
+                </pic:pic>
+              </a:graphicData>
+            </a:graphic>
+          </wp:inline>
+        </w:drawing>
+      </w:r>
+      <w:r>
+        <w:rPr>
+          <w:noProof/>
+        </w:rPr>
+        <w:drawing>
+          <wp:inline distT="0" distB="0" distL="0" distR="0" wp14:anchorId="1F1475DE" wp14:editId="38162AB2">
+            <wp:extent cx="4592348" cy="2450213"/>
+            <wp:effectExtent l="19050" t="19050" r="0" b="7620"/>
+            <wp:docPr id="830537091" name="Picture 1"/>
+            <wp:cNvGraphicFramePr>
+              <a:graphicFrameLocks xmlns:a="http://schemas.openxmlformats.org/drawingml/2006/main" noChangeAspect="1"/>
+            </wp:cNvGraphicFramePr>
+            <a:graphic xmlns:a="http://schemas.openxmlformats.org/drawingml/2006/main">
+              <a:graphicData uri="http://schemas.openxmlformats.org/drawingml/2006/picture">
+                <pic:pic xmlns:pic="http://schemas.openxmlformats.org/drawingml/2006/picture">
+                  <pic:nvPicPr>
+                    <pic:cNvPr id="830537091" name="Picture 1"/>
+                    <pic:cNvPicPr/>
+                  </pic:nvPicPr>
+                  <pic:blipFill>
+                    <a:blip r:embed="rId25" cstate="print">
+                      <a:extLst>
+                        <a:ext uri="{28A0092B-C50C-407E-A947-70E740481C1C}">
+                          <a14:useLocalDpi xmlns:a14="http://schemas.microsoft.com/office/drawing/2010/main" val="0"/>
+                        </a:ext>
+                      </a:extLst>
+                    </a:blip>
+                    <a:stretch>
+                      <a:fillRect/>
+                    </a:stretch>
+                  </pic:blipFill>
+                  <pic:spPr>
+                    <a:xfrm>
+                      <a:off x="0" y="0"/>
+                      <a:ext cx="4614770" cy="2462176"/>
+                    </a:xfrm>
+                    <a:prstGeom prst="rect">
+                      <a:avLst/>
+                    </a:prstGeom>
+                    <a:ln>
+                      <a:solidFill>
+                        <a:schemeClr val="tx1"/>
+                      </a:solidFill>
+                    </a:ln>
+                  </pic:spPr>
+                </pic:pic>
+              </a:graphicData>
+            </a:graphic>
+          </wp:inline>
+        </w:drawing>
+      </w:r>
+      <w:r>
+        <w:rPr>
+          <w:noProof/>
+        </w:rPr>
+        <w:drawing>
+          <wp:inline distT="0" distB="0" distL="0" distR="0" wp14:anchorId="6AA4A7AD" wp14:editId="2705F096">
+            <wp:extent cx="4529096" cy="2375944"/>
+            <wp:effectExtent l="19050" t="19050" r="5080" b="5715"/>
+            <wp:docPr id="912339359" name="Picture 1" descr="A graph with lines and dots&#10;&#10;Description automatically generated with medium confidence"/>
+            <wp:cNvGraphicFramePr>
+              <a:graphicFrameLocks xmlns:a="http://schemas.openxmlformats.org/drawingml/2006/main" noChangeAspect="1"/>
+            </wp:cNvGraphicFramePr>
+            <a:graphic xmlns:a="http://schemas.openxmlformats.org/drawingml/2006/main">
+              <a:graphicData uri="http://schemas.openxmlformats.org/drawingml/2006/picture">
+                <pic:pic xmlns:pic="http://schemas.openxmlformats.org/drawingml/2006/picture">
+                  <pic:nvPicPr>
+                    <pic:cNvPr id="912339359" name="Picture 1" descr="A graph with lines and dots&#10;&#10;Description automatically generated with medium confidence"/>
+                    <pic:cNvPicPr/>
+                  </pic:nvPicPr>
+                  <pic:blipFill>
+                    <a:blip r:embed="rId26"/>
+                    <a:stretch>
+                      <a:fillRect/>
+                    </a:stretch>
+                  </pic:blipFill>
+                  <pic:spPr>
+                    <a:xfrm>
+                      <a:off x="0" y="0"/>
+                      <a:ext cx="4553651" cy="2388825"/>
+                    </a:xfrm>
+                    <a:prstGeom prst="rect">
+                      <a:avLst/>
+                    </a:prstGeom>
+                    <a:ln>
+                      <a:solidFill>
+                        <a:schemeClr val="tx1"/>
+                      </a:solidFill>
+                    </a:ln>
+                  </pic:spPr>
+                </pic:pic>
+              </a:graphicData>
+            </a:graphic>
+          </wp:inline>
+        </w:drawing>
+      </w:r>
+    </w:p>
+    <w:p>
+      <w:pPr>
+        <w:jc w:val="center"/>
+        <w:rPr>
+          <w:sz w:val="22"/>
+          <w:szCs w:val="18"/>
+        </w:rPr>
+      </w:pPr>
+      <w:r>
         <w:rPr>
           <w:b/>
           <w:bCs/>
           <w:sz w:val="22"/>
           <w:szCs w:val="18"/>
         </w:rPr>
+        <w:t>Figure 13.</w:t>
+      </w:r>
+      <w:r>
+        <w:rPr>
+          <w:sz w:val="22"/>
+          <w:szCs w:val="18"/>
+        </w:rPr>
+        <w:t xml:space="preserve"> Runtimes for C program with each search method and algorithm</w:t>
+      </w:r>
+      <w:r>
+        <w:rPr>
+          <w:sz w:val="22"/>
+          <w:szCs w:val="18"/>
+        </w:rPr>
+        <w:t xml:space="preserve"> in C</w:t>
+      </w:r>
+    </w:p>
+    <w:p>
+      <w:pPr>
+        <w:rPr>
+          <w:sz w:val="22"/>
+          <w:szCs w:val="18"/>
+        </w:rPr>
+      </w:pPr>
+    </w:p>
+    <w:p>
+      <w:pPr>
+        <w:jc w:val="center"/>
+        <w:rPr>
+          <w:sz w:val="22"/>
+          <w:szCs w:val="18"/>
+        </w:rPr>
+      </w:pPr>
+      <w:r>
+        <w:rPr>
+          <w:noProof/>
+        </w:rPr>
+        <w:drawing>
+          <wp:inline distT="0" distB="0" distL="0" distR="0" wp14:anchorId="6CE9D3C1" wp14:editId="5D93BEDD">
+            <wp:extent cx="4673637" cy="2477659"/>
+            <wp:effectExtent l="19050" t="19050" r="0" b="0"/>
+            <wp:docPr id="1432149219" name="Picture 1" descr="A graph with lines and numbers&#10;&#10;Description automatically generated"/>
+            <wp:cNvGraphicFramePr>
+              <a:graphicFrameLocks xmlns:a="http://schemas.openxmlformats.org/drawingml/2006/main" noChangeAspect="1"/>
+            </wp:cNvGraphicFramePr>
+            <a:graphic xmlns:a="http://schemas.openxmlformats.org/drawingml/2006/main">
+              <a:graphicData uri="http://schemas.openxmlformats.org/drawingml/2006/picture">
+                <pic:pic xmlns:pic="http://schemas.openxmlformats.org/drawingml/2006/picture">
+                  <pic:nvPicPr>
+                    <pic:cNvPr id="1432149219" name="Picture 1" descr="A graph with lines and numbers&#10;&#10;Description automatically generated"/>
+                    <pic:cNvPicPr/>
+                  </pic:nvPicPr>
+                  <pic:blipFill>
+                    <a:blip r:embed="rId27"/>
+                    <a:stretch>
+                      <a:fillRect/>
+                    </a:stretch>
+                  </pic:blipFill>
+                  <pic:spPr>
+                    <a:xfrm>
+                      <a:off x="0" y="0"/>
+                      <a:ext cx="4689657" cy="2486152"/>
+                    </a:xfrm>
+                    <a:prstGeom prst="rect">
+                      <a:avLst/>
+                    </a:prstGeom>
+                    <a:ln>
+                      <a:solidFill>
+                        <a:schemeClr val="tx1"/>
+                      </a:solidFill>
+                    </a:ln>
+                  </pic:spPr>
+                </pic:pic>
+              </a:graphicData>
+            </a:graphic>
+          </wp:inline>
+        </w:drawing>
+      </w:r>
+      <w:r>
+        <w:rPr>
+          <w:noProof/>
+        </w:rPr>
+        <w:drawing>
+          <wp:inline distT="0" distB="0" distL="0" distR="0" wp14:anchorId="653D8E7B" wp14:editId="058FE93E">
+            <wp:extent cx="4705350" cy="2529399"/>
+            <wp:effectExtent l="19050" t="19050" r="0" b="4445"/>
+            <wp:docPr id="1392205198" name="Picture 1" descr="A graph with lines and numbers&#10;&#10;Description automatically generated"/>
+            <wp:cNvGraphicFramePr>
+              <a:graphicFrameLocks xmlns:a="http://schemas.openxmlformats.org/drawingml/2006/main" noChangeAspect="1"/>
+            </wp:cNvGraphicFramePr>
+            <a:graphic xmlns:a="http://schemas.openxmlformats.org/drawingml/2006/main">
+              <a:graphicData uri="http://schemas.openxmlformats.org/drawingml/2006/picture">
+                <pic:pic xmlns:pic="http://schemas.openxmlformats.org/drawingml/2006/picture">
+                  <pic:nvPicPr>
+                    <pic:cNvPr id="1392205198" name="Picture 1" descr="A graph with lines and numbers&#10;&#10;Description automatically generated"/>
+                    <pic:cNvPicPr/>
+                  </pic:nvPicPr>
+                  <pic:blipFill>
+                    <a:blip r:embed="rId28"/>
+                    <a:stretch>
+                      <a:fillRect/>
+                    </a:stretch>
+                  </pic:blipFill>
+                  <pic:spPr>
+                    <a:xfrm>
+                      <a:off x="0" y="0"/>
+                      <a:ext cx="4721072" cy="2537851"/>
+                    </a:xfrm>
+                    <a:prstGeom prst="rect">
+                      <a:avLst/>
+                    </a:prstGeom>
+                    <a:ln>
+                      <a:solidFill>
+                        <a:schemeClr val="tx1"/>
+                      </a:solidFill>
+                    </a:ln>
+                  </pic:spPr>
+                </pic:pic>
+              </a:graphicData>
+            </a:graphic>
+          </wp:inline>
+        </w:drawing>
+      </w:r>
+      <w:r>
+        <w:rPr>
+          <w:noProof/>
+        </w:rPr>
+        <w:drawing>
+          <wp:inline distT="0" distB="0" distL="0" distR="0" wp14:anchorId="7BF6642B" wp14:editId="366DBE55">
+            <wp:extent cx="4657725" cy="2419168"/>
+            <wp:effectExtent l="19050" t="19050" r="0" b="635"/>
+            <wp:docPr id="1769333519" name="Picture 1" descr="A graph with lines and numbers&#10;&#10;Description automatically generated"/>
+            <wp:cNvGraphicFramePr>
+              <a:graphicFrameLocks xmlns:a="http://schemas.openxmlformats.org/drawingml/2006/main" noChangeAspect="1"/>
+            </wp:cNvGraphicFramePr>
+            <a:graphic xmlns:a="http://schemas.openxmlformats.org/drawingml/2006/main">
+              <a:graphicData uri="http://schemas.openxmlformats.org/drawingml/2006/picture">
+                <pic:pic xmlns:pic="http://schemas.openxmlformats.org/drawingml/2006/picture">
+                  <pic:nvPicPr>
+                    <pic:cNvPr id="1769333519" name="Picture 1" descr="A graph with lines and numbers&#10;&#10;Description automatically generated"/>
+                    <pic:cNvPicPr/>
+                  </pic:nvPicPr>
+                  <pic:blipFill>
+                    <a:blip r:embed="rId29"/>
+                    <a:stretch>
+                      <a:fillRect/>
+                    </a:stretch>
+                  </pic:blipFill>
+                  <pic:spPr>
+                    <a:xfrm>
+                      <a:off x="0" y="0"/>
+                      <a:ext cx="4670030" cy="2425559"/>
+                    </a:xfrm>
+                    <a:prstGeom prst="rect">
+                      <a:avLst/>
+                    </a:prstGeom>
+                    <a:ln>
+                      <a:solidFill>
+                        <a:schemeClr val="tx1"/>
+                      </a:solidFill>
+                    </a:ln>
+                  </pic:spPr>
+                </pic:pic>
+              </a:graphicData>
+            </a:graphic>
+          </wp:inline>
+        </w:drawing>
+      </w:r>
+    </w:p>
+    <w:p>
+      <w:pPr>
+        <w:jc w:val="center"/>
+        <w:rPr>
+          <w:sz w:val="22"/>
+          <w:szCs w:val="18"/>
+        </w:rPr>
       </w:pPr>
       <w:r>
         <w:rPr>
@@ -8914,8 +9323,269 @@
           <w:sz w:val="22"/>
           <w:szCs w:val="18"/>
         </w:rPr>
-        <w:t>3</w:t>
-      </w:r>
+        <w:t>Figure 14.</w:t>
+      </w:r>
+      <w:r>
+        <w:rPr>
+          <w:sz w:val="22"/>
+          <w:szCs w:val="18"/>
+        </w:rPr>
+        <w:t xml:space="preserve"> Comparison of suggestion numbers with </w:t>
+      </w:r>
+      <w:r>
+        <w:rPr>
+          <w:sz w:val="22"/>
+          <w:szCs w:val="18"/>
+        </w:rPr>
+        <w:t>each search method and algorithm in C.</w:t>
+      </w:r>
+    </w:p>
+    <w:p>
+      <w:pPr>
+        <w:rPr>
+          <w:sz w:val="22"/>
+          <w:szCs w:val="18"/>
+        </w:rPr>
+      </w:pPr>
+      <w:r>
+        <w:rPr>
+          <w:sz w:val="22"/>
+          <w:szCs w:val="18"/>
+        </w:rPr>
+        <w:t xml:space="preserve">When looking at figure 14, we assess the average suggestion number of each algorithm and search method. This number refers to where in the top 10 suggestions the correct spelling for a misspelled word was. </w:t>
+      </w:r>
+      <w:r>
+        <w:rPr>
+          <w:sz w:val="22"/>
+          <w:szCs w:val="18"/>
+        </w:rPr>
+        <w:t>So,</w:t>
+      </w:r>
+      <w:r>
+        <w:rPr>
+          <w:sz w:val="22"/>
+          <w:szCs w:val="18"/>
+        </w:rPr>
+        <w:t xml:space="preserve"> if the average is close to 1, that means that </w:t>
+      </w:r>
+      <w:r>
+        <w:rPr>
+          <w:sz w:val="22"/>
+          <w:szCs w:val="18"/>
+        </w:rPr>
+        <w:t>for</w:t>
+      </w:r>
+      <w:r>
+        <w:rPr>
+          <w:sz w:val="22"/>
+          <w:szCs w:val="18"/>
+        </w:rPr>
+        <w:t xml:space="preserve"> any given </w:t>
+      </w:r>
+      <w:r>
+        <w:rPr>
+          <w:sz w:val="22"/>
+          <w:szCs w:val="18"/>
+        </w:rPr>
+        <w:lastRenderedPageBreak/>
+        <w:t xml:space="preserve">misspelled word, its correct spelling was </w:t>
+      </w:r>
+      <w:r>
+        <w:rPr>
+          <w:sz w:val="22"/>
+          <w:szCs w:val="18"/>
+        </w:rPr>
+        <w:t xml:space="preserve">usually the top suggested word. </w:t>
+      </w:r>
+      <w:r>
+        <w:rPr>
+          <w:sz w:val="22"/>
+          <w:szCs w:val="18"/>
+        </w:rPr>
+        <w:t>There is no variation between the three search methods as to their numbers, since they have no baring on the results .</w:t>
+      </w:r>
+    </w:p>
+    <w:p>
+      <w:pPr>
+        <w:rPr>
+          <w:sz w:val="22"/>
+          <w:szCs w:val="18"/>
+        </w:rPr>
+      </w:pPr>
+      <w:r>
+        <w:rPr>
+          <w:sz w:val="22"/>
+          <w:szCs w:val="18"/>
+        </w:rPr>
+        <w:t xml:space="preserve">From the figure we can see that the average suggestions where best for all but </w:t>
+      </w:r>
+      <w:r>
+        <w:rPr>
+          <w:sz w:val="22"/>
+          <w:szCs w:val="18"/>
+        </w:rPr>
+        <w:t>Sørensen–Dice</w:t>
+      </w:r>
+      <w:r>
+        <w:rPr>
+          <w:sz w:val="22"/>
+          <w:szCs w:val="18"/>
+        </w:rPr>
+        <w:t xml:space="preserve"> and Optimal String Alignment. This may be because these algorithms are not considered metric distances, so they don’t obey the triangle inequality and are therefore less accurate in their results than those who do obey.</w:t>
+      </w:r>
+    </w:p>
+    <w:p>
+      <w:pPr>
+        <w:jc w:val="center"/>
+        <w:rPr>
+          <w:sz w:val="22"/>
+          <w:szCs w:val="18"/>
+        </w:rPr>
+      </w:pPr>
+      <w:r>
+        <w:rPr>
+          <w:noProof/>
+        </w:rPr>
+        <w:drawing>
+          <wp:inline distT="0" distB="0" distL="0" distR="0" wp14:anchorId="7BAD22D9" wp14:editId="6A1C62E8">
+            <wp:extent cx="3900230" cy="2064192"/>
+            <wp:effectExtent l="19050" t="19050" r="5080" b="0"/>
+            <wp:docPr id="753874743" name="Picture 1" descr="A screenshot of a graph&#10;&#10;Description automatically generated"/>
+            <wp:cNvGraphicFramePr>
+              <a:graphicFrameLocks xmlns:a="http://schemas.openxmlformats.org/drawingml/2006/main" noChangeAspect="1"/>
+            </wp:cNvGraphicFramePr>
+            <a:graphic xmlns:a="http://schemas.openxmlformats.org/drawingml/2006/main">
+              <a:graphicData uri="http://schemas.openxmlformats.org/drawingml/2006/picture">
+                <pic:pic xmlns:pic="http://schemas.openxmlformats.org/drawingml/2006/picture">
+                  <pic:nvPicPr>
+                    <pic:cNvPr id="753874743" name="Picture 1" descr="A screenshot of a graph&#10;&#10;Description automatically generated"/>
+                    <pic:cNvPicPr/>
+                  </pic:nvPicPr>
+                  <pic:blipFill>
+                    <a:blip r:embed="rId30"/>
+                    <a:stretch>
+                      <a:fillRect/>
+                    </a:stretch>
+                  </pic:blipFill>
+                  <pic:spPr>
+                    <a:xfrm>
+                      <a:off x="0" y="0"/>
+                      <a:ext cx="3925426" cy="2077527"/>
+                    </a:xfrm>
+                    <a:prstGeom prst="rect">
+                      <a:avLst/>
+                    </a:prstGeom>
+                    <a:ln>
+                      <a:solidFill>
+                        <a:schemeClr val="tx1"/>
+                      </a:solidFill>
+                    </a:ln>
+                  </pic:spPr>
+                </pic:pic>
+              </a:graphicData>
+            </a:graphic>
+          </wp:inline>
+        </w:drawing>
+      </w:r>
+      <w:r>
+        <w:rPr>
+          <w:noProof/>
+        </w:rPr>
+        <w:drawing>
+          <wp:inline distT="0" distB="0" distL="0" distR="0" wp14:anchorId="2118665C" wp14:editId="30F0CE8E">
+            <wp:extent cx="3916058" cy="2095997"/>
+            <wp:effectExtent l="19050" t="19050" r="8255" b="0"/>
+            <wp:docPr id="710212068" name="Picture 1" descr="A group of pie charts&#10;&#10;Description automatically generated"/>
+            <wp:cNvGraphicFramePr>
+              <a:graphicFrameLocks xmlns:a="http://schemas.openxmlformats.org/drawingml/2006/main" noChangeAspect="1"/>
+            </wp:cNvGraphicFramePr>
+            <a:graphic xmlns:a="http://schemas.openxmlformats.org/drawingml/2006/main">
+              <a:graphicData uri="http://schemas.openxmlformats.org/drawingml/2006/picture">
+                <pic:pic xmlns:pic="http://schemas.openxmlformats.org/drawingml/2006/picture">
+                  <pic:nvPicPr>
+                    <pic:cNvPr id="710212068" name="Picture 1" descr="A group of pie charts&#10;&#10;Description automatically generated"/>
+                    <pic:cNvPicPr/>
+                  </pic:nvPicPr>
+                  <pic:blipFill>
+                    <a:blip r:embed="rId31"/>
+                    <a:stretch>
+                      <a:fillRect/>
+                    </a:stretch>
+                  </pic:blipFill>
+                  <pic:spPr>
+                    <a:xfrm>
+                      <a:off x="0" y="0"/>
+                      <a:ext cx="3947269" cy="2112702"/>
+                    </a:xfrm>
+                    <a:prstGeom prst="rect">
+                      <a:avLst/>
+                    </a:prstGeom>
+                    <a:ln>
+                      <a:solidFill>
+                        <a:schemeClr val="tx1"/>
+                      </a:solidFill>
+                    </a:ln>
+                  </pic:spPr>
+                </pic:pic>
+              </a:graphicData>
+            </a:graphic>
+          </wp:inline>
+        </w:drawing>
+      </w:r>
+      <w:r>
+        <w:rPr>
+          <w:noProof/>
+        </w:rPr>
+        <w:drawing>
+          <wp:inline distT="0" distB="0" distL="0" distR="0" wp14:anchorId="0DF515A7" wp14:editId="70873776">
+            <wp:extent cx="3916846" cy="2060401"/>
+            <wp:effectExtent l="19050" t="19050" r="7620" b="0"/>
+            <wp:docPr id="389190639" name="Picture 1" descr="A group of pie charts&#10;&#10;Description automatically generated"/>
+            <wp:cNvGraphicFramePr>
+              <a:graphicFrameLocks xmlns:a="http://schemas.openxmlformats.org/drawingml/2006/main" noChangeAspect="1"/>
+            </wp:cNvGraphicFramePr>
+            <a:graphic xmlns:a="http://schemas.openxmlformats.org/drawingml/2006/main">
+              <a:graphicData uri="http://schemas.openxmlformats.org/drawingml/2006/picture">
+                <pic:pic xmlns:pic="http://schemas.openxmlformats.org/drawingml/2006/picture">
+                  <pic:nvPicPr>
+                    <pic:cNvPr id="389190639" name="Picture 1" descr="A group of pie charts&#10;&#10;Description automatically generated"/>
+                    <pic:cNvPicPr/>
+                  </pic:nvPicPr>
+                  <pic:blipFill>
+                    <a:blip r:embed="rId32"/>
+                    <a:stretch>
+                      <a:fillRect/>
+                    </a:stretch>
+                  </pic:blipFill>
+                  <pic:spPr>
+                    <a:xfrm>
+                      <a:off x="0" y="0"/>
+                      <a:ext cx="3947075" cy="2076303"/>
+                    </a:xfrm>
+                    <a:prstGeom prst="rect">
+                      <a:avLst/>
+                    </a:prstGeom>
+                    <a:ln>
+                      <a:solidFill>
+                        <a:schemeClr val="tx1"/>
+                      </a:solidFill>
+                    </a:ln>
+                  </pic:spPr>
+                </pic:pic>
+              </a:graphicData>
+            </a:graphic>
+          </wp:inline>
+        </w:drawing>
+      </w:r>
+    </w:p>
+    <w:p>
+      <w:pPr>
+        <w:jc w:val="center"/>
+        <w:rPr>
+          <w:sz w:val="22"/>
+          <w:szCs w:val="18"/>
+        </w:rPr>
+      </w:pPr>
       <w:r>
         <w:rPr>
           <w:b/>
@@ -8923,7 +9593,7 @@
           <w:sz w:val="22"/>
           <w:szCs w:val="18"/>
         </w:rPr>
-        <w:t>.</w:t>
+        <w:t>Figure 1</w:t>
       </w:r>
       <w:r>
         <w:rPr>
@@ -8932,7 +9602,7 @@
           <w:sz w:val="22"/>
           <w:szCs w:val="18"/>
         </w:rPr>
-        <w:t>1</w:t>
+        <w:t>5</w:t>
       </w:r>
       <w:r>
         <w:rPr>
@@ -8945,13 +9615,107 @@
       </w:r>
       <w:r>
         <w:rPr>
+          <w:sz w:val="22"/>
+          <w:szCs w:val="18"/>
+        </w:rPr>
+        <w:t xml:space="preserve"> Comparison of the ratios of misses to non misses for each search method and </w:t>
+      </w:r>
+      <w:r>
+        <w:rPr>
+          <w:sz w:val="22"/>
+          <w:szCs w:val="18"/>
+        </w:rPr>
+        <w:t>algorithm</w:t>
+      </w:r>
+      <w:r>
+        <w:rPr>
+          <w:sz w:val="22"/>
+          <w:szCs w:val="18"/>
+        </w:rPr>
+        <w:t xml:space="preserve"> in C.</w:t>
+      </w:r>
+    </w:p>
+    <w:p>
+      <w:pPr>
+        <w:rPr>
+          <w:sz w:val="22"/>
+          <w:szCs w:val="18"/>
+        </w:rPr>
+      </w:pPr>
+      <w:r>
+        <w:rPr>
+          <w:sz w:val="22"/>
+          <w:szCs w:val="18"/>
+        </w:rPr>
+        <w:lastRenderedPageBreak/>
+        <w:t>Then finally, from figure 15 we can see that the miss counts for each of the search methods and algorithms. This measures the ratio of how many times the correct spelling for a word didn’t appear in the top 10 search results (miss) compared to how many times they did (non-miss). Again the 3 search methods have very little affect on the outcome, so results are dependent on each of the algorithms.</w:t>
+      </w:r>
+    </w:p>
+    <w:p>
+      <w:pPr>
+        <w:rPr>
+          <w:sz w:val="22"/>
+          <w:szCs w:val="18"/>
+        </w:rPr>
+      </w:pPr>
+      <w:r>
+        <w:rPr>
+          <w:sz w:val="22"/>
+          <w:szCs w:val="18"/>
+        </w:rPr>
+        <w:t xml:space="preserve">Here </w:t>
+      </w:r>
+      <w:r>
+        <w:rPr>
+          <w:sz w:val="22"/>
+          <w:szCs w:val="18"/>
+        </w:rPr>
+        <w:t xml:space="preserve">another trend appears, with algorithms such as Levenshtein, Damerau, Jaro and Jaro-Winkler being the most likely to find you the correct spellings. This compares to the other 3, which each are more likely to miss a correct spelling than not. With Hamming Distance this would be since it is restricted to find words of the same length, and as such won’t find spellings where extra letters are needed. However, with </w:t>
+      </w:r>
+      <w:r>
+        <w:rPr>
+          <w:sz w:val="22"/>
+          <w:szCs w:val="18"/>
+        </w:rPr>
+        <w:t>Sørensen–Dice</w:t>
+      </w:r>
+      <w:r>
+        <w:rPr>
+          <w:sz w:val="22"/>
+          <w:szCs w:val="18"/>
+        </w:rPr>
+        <w:t xml:space="preserve"> and Optimal String Alignment, this most likely ties into the same fact as stated with the suggestion number. As they cannot follow the triangle inequality, they therefore cannot be reliable in finding results the same as those who can.</w:t>
+      </w:r>
+    </w:p>
+    <w:p>
+      <w:pPr>
+        <w:pStyle w:val="Heading2"/>
+      </w:pPr>
+      <w:r>
+        <w:t>3</w:t>
+      </w:r>
+      <w:r>
+        <w:t>.</w:t>
+      </w:r>
+      <w:r>
+        <w:t>2</w:t>
+      </w:r>
+      <w:r>
+        <w:t xml:space="preserve">  </w:t>
+      </w:r>
+      <w:r>
+        <w:t>Python Program</w:t>
+      </w:r>
+    </w:p>
+    <w:p>
+      <w:pPr>
+        <w:rPr>
           <w:b/>
           <w:bCs/>
           <w:sz w:val="22"/>
           <w:szCs w:val="18"/>
         </w:rPr>
-        <w:t>3</w:t>
-      </w:r>
+      </w:pPr>
       <w:r>
         <w:rPr>
           <w:b/>
@@ -8959,7 +9723,7 @@
           <w:sz w:val="22"/>
           <w:szCs w:val="18"/>
         </w:rPr>
-        <w:t xml:space="preserve"> </w:t>
+        <w:t>3</w:t>
       </w:r>
       <w:r>
         <w:rPr>
@@ -8968,70 +9732,1353 @@
           <w:sz w:val="22"/>
           <w:szCs w:val="18"/>
         </w:rPr>
-        <w:t>Testing</w:t>
-      </w:r>
-    </w:p>
-    <w:p>
-      <w:pPr>
-        <w:rPr>
-          <w:sz w:val="22"/>
-          <w:szCs w:val="18"/>
-        </w:rPr>
-      </w:pPr>
-      <w:r>
-        <w:rPr>
-          <w:sz w:val="22"/>
-          <w:szCs w:val="18"/>
-        </w:rPr>
-        <w:t>As with the C program, the main corpus that was used for testing during development was the ‘D’ corpus, given its small size</w:t>
-      </w:r>
-      <w:r>
-        <w:rPr>
-          <w:sz w:val="22"/>
-          <w:szCs w:val="18"/>
-        </w:rPr>
-        <w:t xml:space="preserve"> and word count which could be parsed in around 2 and a half seconds</w:t>
-      </w:r>
-      <w:r>
-        <w:rPr>
-          <w:sz w:val="22"/>
-          <w:szCs w:val="18"/>
-        </w:rPr>
-        <w:t xml:space="preserve">. With this version, there was no issue with the timer with no zero results. However, </w:t>
-      </w:r>
-      <w:r>
-        <w:rPr>
-          <w:sz w:val="22"/>
-          <w:szCs w:val="18"/>
-        </w:rPr>
-        <w:t>it was clear even with this reduced data set Python was slower than its other counterpart.</w:t>
-      </w:r>
-    </w:p>
-    <w:p>
-      <w:pPr>
+        <w:t>.</w:t>
+      </w:r>
+      <w:r>
         <w:rPr>
           <w:b/>
           <w:bCs/>
           <w:sz w:val="22"/>
           <w:szCs w:val="18"/>
         </w:rPr>
-      </w:pPr>
-    </w:p>
-    <w:p>
-      <w:pPr>
-        <w:rPr>
-          <w:sz w:val="22"/>
-          <w:szCs w:val="22"/>
-        </w:rPr>
-      </w:pPr>
-    </w:p>
-    <w:p>
-      <w:pPr>
-        <w:rPr>
-          <w:sz w:val="22"/>
-          <w:szCs w:val="22"/>
-        </w:rPr>
-      </w:pPr>
+        <w:t>2</w:t>
+      </w:r>
+      <w:r>
+        <w:rPr>
+          <w:b/>
+          <w:bCs/>
+          <w:sz w:val="22"/>
+          <w:szCs w:val="18"/>
+        </w:rPr>
+        <w:t>.</w:t>
+      </w:r>
+      <w:r>
+        <w:rPr>
+          <w:b/>
+          <w:bCs/>
+          <w:sz w:val="22"/>
+          <w:szCs w:val="18"/>
+        </w:rPr>
+        <w:t>1</w:t>
+      </w:r>
+      <w:r>
+        <w:rPr>
+          <w:b/>
+          <w:bCs/>
+          <w:sz w:val="22"/>
+          <w:szCs w:val="18"/>
+        </w:rPr>
+        <w:t xml:space="preserve"> </w:t>
+      </w:r>
+      <w:r>
+        <w:rPr>
+          <w:b/>
+          <w:bCs/>
+          <w:sz w:val="22"/>
+          <w:szCs w:val="18"/>
+        </w:rPr>
+        <w:t>Implementation</w:t>
+      </w:r>
+    </w:p>
+    <w:p>
+      <w:pPr>
+        <w:rPr>
+          <w:sz w:val="22"/>
+          <w:szCs w:val="18"/>
+        </w:rPr>
+      </w:pPr>
+      <w:r>
+        <w:rPr>
+          <w:sz w:val="22"/>
+          <w:szCs w:val="18"/>
+        </w:rPr>
+        <w:t xml:space="preserve">The python version was worked on after the C program was nearly completed. Therefore, development lessons and ideas could be copied and adapted over, which saved a large amount of time creating the application. </w:t>
+      </w:r>
+    </w:p>
+    <w:p>
+      <w:pPr>
+        <w:rPr>
+          <w:sz w:val="22"/>
+          <w:szCs w:val="18"/>
+        </w:rPr>
+      </w:pPr>
+      <w:r>
+        <w:rPr>
+          <w:sz w:val="22"/>
+          <w:szCs w:val="18"/>
+        </w:rPr>
+        <w:t xml:space="preserve">Coding was a lot easier with python, given that it has access to many libraries and data structures that C lacks. </w:t>
+      </w:r>
+    </w:p>
+    <w:p>
+      <w:pPr>
+        <w:rPr>
+          <w:sz w:val="22"/>
+          <w:szCs w:val="18"/>
+        </w:rPr>
+      </w:pPr>
+      <w:r>
+        <w:rPr>
+          <w:sz w:val="22"/>
+          <w:szCs w:val="18"/>
+        </w:rPr>
+        <w:t>One of the most helpful libraries was BeautifulSoup, which could do all the word extraction from the xml files in a few function calls. Python’s</w:t>
+      </w:r>
+      <w:r>
+        <w:rPr>
+          <w:sz w:val="22"/>
+          <w:szCs w:val="18"/>
+        </w:rPr>
+        <w:t xml:space="preserve"> dynamically sized array and</w:t>
+      </w:r>
+      <w:r>
+        <w:rPr>
+          <w:sz w:val="22"/>
+          <w:szCs w:val="18"/>
+        </w:rPr>
+        <w:t xml:space="preserve"> dictionary</w:t>
+      </w:r>
+      <w:r>
+        <w:rPr>
+          <w:sz w:val="22"/>
+          <w:szCs w:val="18"/>
+        </w:rPr>
+        <w:t xml:space="preserve"> data</w:t>
+      </w:r>
+      <w:r>
+        <w:rPr>
+          <w:sz w:val="22"/>
+          <w:szCs w:val="18"/>
+        </w:rPr>
+        <w:t xml:space="preserve"> structures were also invaluable in </w:t>
+      </w:r>
+      <w:r>
+        <w:rPr>
+          <w:sz w:val="22"/>
+          <w:szCs w:val="18"/>
+        </w:rPr>
+        <w:t xml:space="preserve">holding the large quantity of words at runtime. </w:t>
+      </w:r>
+      <w:r>
+        <w:rPr>
+          <w:sz w:val="22"/>
+          <w:szCs w:val="18"/>
+        </w:rPr>
+        <w:t>All</w:t>
+      </w:r>
+      <w:r>
+        <w:rPr>
+          <w:sz w:val="22"/>
+          <w:szCs w:val="18"/>
+        </w:rPr>
+        <w:t xml:space="preserve"> these benefits drastically cut down of the amount of time spent coding compared to C, which helped the final product be delivered in such a short timeframe. </w:t>
+      </w:r>
+    </w:p>
+    <w:p>
+      <w:pPr>
+        <w:rPr>
+          <w:sz w:val="22"/>
+          <w:szCs w:val="18"/>
+        </w:rPr>
+      </w:pPr>
+      <w:r>
+        <w:rPr>
+          <w:sz w:val="22"/>
+          <w:szCs w:val="18"/>
+        </w:rPr>
+        <w:t xml:space="preserve">Another useful discovery was the library strsimpy, which had </w:t>
+      </w:r>
+      <w:r>
+        <w:rPr>
+          <w:sz w:val="22"/>
+          <w:szCs w:val="18"/>
+        </w:rPr>
+        <w:t>several of</w:t>
+      </w:r>
+      <w:r>
+        <w:rPr>
+          <w:sz w:val="22"/>
+          <w:szCs w:val="18"/>
+        </w:rPr>
+        <w:t xml:space="preserve"> the string metric algorithms already created and ready to use</w:t>
+      </w:r>
+      <w:r>
+        <w:rPr>
+          <w:sz w:val="22"/>
+          <w:szCs w:val="18"/>
+        </w:rPr>
+        <w:t xml:space="preserve"> which included the Levenshtein, Optimal String Alignment, Damerau-Levenshtein, Sorensen Dice and Jaro Winkler algorithms</w:t>
+      </w:r>
+      <w:r>
+        <w:rPr>
+          <w:sz w:val="22"/>
+          <w:szCs w:val="18"/>
+        </w:rPr>
+        <w:t xml:space="preserve">. </w:t>
+      </w:r>
+      <w:r>
+        <w:rPr>
+          <w:sz w:val="22"/>
+          <w:szCs w:val="18"/>
+        </w:rPr>
+        <w:t>These were eventually used over personal versions since they were more easily accessible and were guaranteed to work with most scenarios and comparisons, and they would be more likely to be optimal solutions.</w:t>
+      </w:r>
+    </w:p>
+    <w:p>
+      <w:pPr>
+        <w:rPr>
+          <w:b/>
+          <w:bCs/>
+          <w:sz w:val="22"/>
+          <w:szCs w:val="18"/>
+        </w:rPr>
+      </w:pPr>
+      <w:r>
+        <w:rPr>
+          <w:b/>
+          <w:bCs/>
+          <w:sz w:val="22"/>
+          <w:szCs w:val="18"/>
+        </w:rPr>
+        <w:t>3</w:t>
+      </w:r>
+      <w:r>
+        <w:rPr>
+          <w:b/>
+          <w:bCs/>
+          <w:sz w:val="22"/>
+          <w:szCs w:val="18"/>
+        </w:rPr>
+        <w:t>.</w:t>
+      </w:r>
+      <w:r>
+        <w:rPr>
+          <w:b/>
+          <w:bCs/>
+          <w:sz w:val="22"/>
+          <w:szCs w:val="18"/>
+        </w:rPr>
+        <w:t>1</w:t>
+      </w:r>
+      <w:r>
+        <w:rPr>
+          <w:b/>
+          <w:bCs/>
+          <w:sz w:val="22"/>
+          <w:szCs w:val="18"/>
+        </w:rPr>
+        <w:t>.</w:t>
+      </w:r>
+      <w:r>
+        <w:rPr>
+          <w:b/>
+          <w:bCs/>
+          <w:sz w:val="22"/>
+          <w:szCs w:val="18"/>
+        </w:rPr>
+        <w:t>3</w:t>
+      </w:r>
+      <w:r>
+        <w:rPr>
+          <w:b/>
+          <w:bCs/>
+          <w:sz w:val="22"/>
+          <w:szCs w:val="18"/>
+        </w:rPr>
+        <w:t xml:space="preserve"> </w:t>
+      </w:r>
+      <w:r>
+        <w:rPr>
+          <w:b/>
+          <w:bCs/>
+          <w:sz w:val="22"/>
+          <w:szCs w:val="18"/>
+        </w:rPr>
+        <w:t>Testing</w:t>
+      </w:r>
+    </w:p>
+    <w:p>
+      <w:pPr>
+        <w:rPr>
+          <w:sz w:val="22"/>
+          <w:szCs w:val="18"/>
+        </w:rPr>
+      </w:pPr>
+      <w:r>
+        <w:rPr>
+          <w:sz w:val="22"/>
+          <w:szCs w:val="18"/>
+        </w:rPr>
+        <w:t>As with the C program, the main corpus that was used for testing during development was the ‘D’ corpus, given its small size</w:t>
+      </w:r>
+      <w:r>
+        <w:rPr>
+          <w:sz w:val="22"/>
+          <w:szCs w:val="18"/>
+        </w:rPr>
+        <w:t xml:space="preserve"> and word count which could be parsed in around 2 and a </w:t>
+      </w:r>
+      <w:r>
+        <w:rPr>
+          <w:sz w:val="22"/>
+          <w:szCs w:val="18"/>
+        </w:rPr>
+        <w:lastRenderedPageBreak/>
+        <w:t>half seconds</w:t>
+      </w:r>
+      <w:r>
+        <w:rPr>
+          <w:sz w:val="22"/>
+          <w:szCs w:val="18"/>
+        </w:rPr>
+        <w:t>.</w:t>
+      </w:r>
+      <w:r>
+        <w:rPr>
+          <w:sz w:val="22"/>
+          <w:szCs w:val="18"/>
+        </w:rPr>
+        <w:t xml:space="preserve"> This was done so that testing could be done swiftly and without having to wait for larger corpora to be compiles. With</w:t>
+      </w:r>
+      <w:r>
+        <w:rPr>
+          <w:sz w:val="22"/>
+          <w:szCs w:val="18"/>
+        </w:rPr>
+        <w:t xml:space="preserve"> this version, there was no issue with the timer with no zero results. However, </w:t>
+      </w:r>
+      <w:r>
+        <w:rPr>
+          <w:sz w:val="22"/>
+          <w:szCs w:val="18"/>
+        </w:rPr>
+        <w:t>it was clear even with this reduced data set Python was slower than its other counterpart.</w:t>
+      </w:r>
+    </w:p>
+    <w:p>
+      <w:pPr>
+        <w:rPr>
+          <w:sz w:val="22"/>
+          <w:szCs w:val="18"/>
+        </w:rPr>
+      </w:pPr>
+      <w:r>
+        <w:rPr>
+          <w:sz w:val="22"/>
+          <w:szCs w:val="18"/>
+        </w:rPr>
+        <w:t xml:space="preserve">As </w:t>
+      </w:r>
+      <w:r>
+        <w:rPr>
+          <w:sz w:val="22"/>
+          <w:szCs w:val="18"/>
+        </w:rPr>
+        <w:t>with the C Program</w:t>
+      </w:r>
+      <w:r>
+        <w:rPr>
+          <w:sz w:val="22"/>
+          <w:szCs w:val="18"/>
+        </w:rPr>
+        <w:t xml:space="preserve">, later testing was done on the larger ‘H’ corpus. This was chosen </w:t>
+      </w:r>
+      <w:r>
+        <w:rPr>
+          <w:sz w:val="22"/>
+          <w:szCs w:val="18"/>
+        </w:rPr>
+        <w:t xml:space="preserve">to keep the testing of both systems fair and to have the benefit of having so many spellings to call upon to prevent the risk of </w:t>
+      </w:r>
+      <w:r>
+        <w:rPr>
+          <w:sz w:val="22"/>
+          <w:szCs w:val="18"/>
+        </w:rPr>
+        <w:t>a</w:t>
+      </w:r>
+      <w:r>
+        <w:rPr>
+          <w:sz w:val="22"/>
+          <w:szCs w:val="18"/>
+        </w:rPr>
+        <w:t xml:space="preserve"> </w:t>
+      </w:r>
+      <w:r>
+        <w:rPr>
+          <w:sz w:val="22"/>
+          <w:szCs w:val="18"/>
+        </w:rPr>
+        <w:t>valid</w:t>
+      </w:r>
+      <w:r>
+        <w:rPr>
+          <w:sz w:val="22"/>
+          <w:szCs w:val="18"/>
+        </w:rPr>
+        <w:t xml:space="preserve"> word not appearing in the list. However, despite the help of the external libraries of BeautifulSoup and the easy of development, the Python would run exceptionally slower. Compared to the couple of minutes of the C code, this version took around an hour to retrieve all the words. As such, it was decided to speed up testing that future word files would be generated by the C program, then copies into the Python folder to save time waiting.</w:t>
+      </w:r>
+    </w:p>
+    <w:p>
+      <w:pPr>
+        <w:rPr>
+          <w:sz w:val="22"/>
+          <w:szCs w:val="18"/>
+        </w:rPr>
+      </w:pPr>
+      <w:r>
+        <w:rPr>
+          <w:sz w:val="22"/>
+          <w:szCs w:val="18"/>
+        </w:rPr>
+        <w:t xml:space="preserve">To test the capabilities of each algorithm properly, </w:t>
+      </w:r>
+      <w:r>
+        <w:rPr>
+          <w:sz w:val="22"/>
+          <w:szCs w:val="18"/>
+        </w:rPr>
+        <w:t>and to keep the results of testing fair, the same</w:t>
+      </w:r>
+      <w:r>
+        <w:rPr>
+          <w:sz w:val="22"/>
+          <w:szCs w:val="18"/>
+        </w:rPr>
+        <w:t xml:space="preserve"> dataset of misspelled words</w:t>
+      </w:r>
+      <w:r>
+        <w:rPr>
+          <w:sz w:val="22"/>
+          <w:szCs w:val="18"/>
+        </w:rPr>
+        <w:t xml:space="preserve"> as before</w:t>
+      </w:r>
+      <w:r>
+        <w:rPr>
+          <w:sz w:val="22"/>
+          <w:szCs w:val="18"/>
+        </w:rPr>
+        <w:t xml:space="preserve"> </w:t>
+      </w:r>
+      <w:r>
+        <w:rPr>
+          <w:sz w:val="22"/>
+          <w:szCs w:val="18"/>
+        </w:rPr>
+        <w:t>was used again</w:t>
+      </w:r>
+      <w:r>
+        <w:rPr>
+          <w:sz w:val="22"/>
+          <w:szCs w:val="18"/>
+        </w:rPr>
+        <w:t>.</w:t>
+      </w:r>
+      <w:r>
+        <w:rPr>
+          <w:sz w:val="22"/>
+          <w:szCs w:val="18"/>
+        </w:rPr>
+        <w:t xml:space="preserve"> Both sorted and unsorted word files were also analysed as well to test that as a factor as well.</w:t>
+      </w:r>
+      <w:r>
+        <w:rPr>
+          <w:sz w:val="22"/>
+          <w:szCs w:val="18"/>
+        </w:rPr>
+        <w:t xml:space="preserve"> </w:t>
+      </w:r>
+      <w:r>
+        <w:rPr>
+          <w:sz w:val="22"/>
+          <w:szCs w:val="18"/>
+        </w:rPr>
+        <w:t xml:space="preserve">A similar system was adopted to test everything. For every misspelled word, each method was run with all algorithms giving a total of 24 tests per word. The same issue of finding the top 10 suggestions also proliferated here, </w:t>
+      </w:r>
+      <w:r>
+        <w:rPr>
+          <w:sz w:val="22"/>
+          <w:szCs w:val="18"/>
+        </w:rPr>
+        <w:t>since you had to find the minimum for each test 10 times meant there was a large amount of processing needed to return a single result, let alone all 24.</w:t>
+      </w:r>
+    </w:p>
+    <w:p>
+      <w:pPr>
+        <w:rPr>
+          <w:sz w:val="22"/>
+          <w:szCs w:val="18"/>
+        </w:rPr>
+      </w:pPr>
+      <w:r>
+        <w:rPr>
+          <w:sz w:val="22"/>
+          <w:szCs w:val="18"/>
+        </w:rPr>
+        <w:t>This combined with the slow runtime of Python meant that to even test the 508 words of the smallest misspelled dataset took hours to complete. This was why the larger files were unable to be used, as while the C program could have returned results in reasonable time, the Python would be unable to give its data in reasonable time.</w:t>
+      </w:r>
+    </w:p>
+    <w:p>
+      <w:pPr>
+        <w:rPr>
+          <w:b/>
+          <w:bCs/>
+          <w:sz w:val="22"/>
+          <w:szCs w:val="18"/>
+        </w:rPr>
+      </w:pPr>
+      <w:r>
+        <w:rPr>
+          <w:b/>
+          <w:bCs/>
+          <w:sz w:val="22"/>
+          <w:szCs w:val="18"/>
+        </w:rPr>
+        <w:t>3</w:t>
+      </w:r>
+      <w:r>
+        <w:rPr>
+          <w:b/>
+          <w:bCs/>
+          <w:sz w:val="22"/>
+          <w:szCs w:val="18"/>
+        </w:rPr>
+        <w:t>.</w:t>
+      </w:r>
+      <w:r>
+        <w:rPr>
+          <w:b/>
+          <w:bCs/>
+          <w:sz w:val="22"/>
+          <w:szCs w:val="18"/>
+        </w:rPr>
+        <w:t>2</w:t>
+      </w:r>
+      <w:r>
+        <w:rPr>
+          <w:b/>
+          <w:bCs/>
+          <w:sz w:val="22"/>
+          <w:szCs w:val="18"/>
+        </w:rPr>
+        <w:t>.</w:t>
+      </w:r>
+      <w:r>
+        <w:rPr>
+          <w:b/>
+          <w:bCs/>
+          <w:sz w:val="22"/>
+          <w:szCs w:val="18"/>
+        </w:rPr>
+        <w:t>3</w:t>
+      </w:r>
+      <w:r>
+        <w:rPr>
+          <w:b/>
+          <w:bCs/>
+          <w:sz w:val="22"/>
+          <w:szCs w:val="18"/>
+        </w:rPr>
+        <w:t xml:space="preserve"> </w:t>
+      </w:r>
+      <w:r>
+        <w:rPr>
+          <w:b/>
+          <w:bCs/>
+          <w:sz w:val="22"/>
+          <w:szCs w:val="18"/>
+        </w:rPr>
+        <w:t>Results</w:t>
+      </w:r>
+    </w:p>
+    <w:p>
+      <w:pPr>
+        <w:rPr>
+          <w:sz w:val="22"/>
+          <w:szCs w:val="18"/>
+        </w:rPr>
+      </w:pPr>
+      <w:r>
+        <w:rPr>
+          <w:sz w:val="22"/>
+          <w:szCs w:val="18"/>
+        </w:rPr>
+        <w:t xml:space="preserve">As with the C program, the same 3 metrics </w:t>
+      </w:r>
+      <w:r>
+        <w:rPr>
+          <w:sz w:val="22"/>
+          <w:szCs w:val="18"/>
+        </w:rPr>
+        <w:t>of runtime, suggestion number and miscounts were analysed. Here, whether the dataset was sorted or not didn’t affect the results and so the generated graphs show the general cases for each metric and search method.</w:t>
+      </w:r>
+    </w:p>
+    <w:p>
+      <w:pPr>
+        <w:rPr>
+          <w:sz w:val="22"/>
+          <w:szCs w:val="18"/>
+        </w:rPr>
+      </w:pPr>
+      <w:r>
+        <w:rPr>
+          <w:sz w:val="22"/>
+          <w:szCs w:val="18"/>
+        </w:rPr>
+        <w:t xml:space="preserve">Firstly, there is a stark difference between the runtimes of the C program and this version, as indicated by the greater averages for each algorithm. This is especially apparent for the quadratic algorithms of Damerau and Optimal String Alignment, which have </w:t>
+      </w:r>
+      <w:r>
+        <w:rPr>
+          <w:sz w:val="22"/>
+          <w:szCs w:val="18"/>
+        </w:rPr>
+        <w:t>a</w:t>
+      </w:r>
+      <w:r>
+        <w:rPr>
+          <w:sz w:val="22"/>
+          <w:szCs w:val="18"/>
+        </w:rPr>
+        <w:t xml:space="preserve"> mean </w:t>
+      </w:r>
+      <w:r>
+        <w:rPr>
+          <w:sz w:val="22"/>
+          <w:szCs w:val="18"/>
+        </w:rPr>
+        <w:t xml:space="preserve">time over 10 times that of is C counterpart. It is therefore clear that Python doesn’t do a lot to run these actions swiftly. </w:t>
+      </w:r>
+    </w:p>
+    <w:p>
+      <w:pPr>
+        <w:rPr>
+          <w:sz w:val="22"/>
+          <w:szCs w:val="18"/>
+        </w:rPr>
+      </w:pPr>
+      <w:r>
+        <w:rPr>
+          <w:sz w:val="22"/>
+          <w:szCs w:val="18"/>
+        </w:rPr>
+        <w:t>Despite this</w:t>
+      </w:r>
+      <w:r>
+        <w:rPr>
+          <w:sz w:val="22"/>
+          <w:szCs w:val="18"/>
+        </w:rPr>
+        <w:t>,</w:t>
+      </w:r>
+      <w:r>
+        <w:rPr>
+          <w:sz w:val="22"/>
+          <w:szCs w:val="18"/>
+        </w:rPr>
+        <w:t xml:space="preserve"> the general trend of the run times for each algorithm remains the same as before, with </w:t>
+      </w:r>
+      <w:r>
+        <w:rPr>
+          <w:sz w:val="22"/>
+          <w:szCs w:val="18"/>
+        </w:rPr>
+        <w:t xml:space="preserve">the fastest remaining </w:t>
+      </w:r>
+      <w:r>
+        <w:rPr>
+          <w:sz w:val="22"/>
+          <w:szCs w:val="18"/>
+        </w:rPr>
+        <w:t>Sørensen–Dice</w:t>
+      </w:r>
+      <w:r>
+        <w:rPr>
+          <w:sz w:val="22"/>
+          <w:szCs w:val="18"/>
+        </w:rPr>
+        <w:t xml:space="preserve"> and Hamming distance for their linear time complexity. Whilst the larger algorithms of Damerau and Optimal String Alignment take </w:t>
+      </w:r>
+      <w:r>
+        <w:rPr>
+          <w:sz w:val="22"/>
+          <w:szCs w:val="18"/>
+        </w:rPr>
+        <w:lastRenderedPageBreak/>
+        <w:t>longer on average, due to them having to loop through a full matrix to compute their distances.</w:t>
+      </w:r>
+    </w:p>
+    <w:p>
+      <w:pPr>
+        <w:jc w:val="center"/>
+        <w:rPr>
+          <w:b/>
+          <w:bCs/>
+          <w:sz w:val="22"/>
+          <w:szCs w:val="18"/>
+        </w:rPr>
+      </w:pPr>
+      <w:r>
+        <w:rPr>
+          <w:noProof/>
+        </w:rPr>
+        <w:drawing>
+          <wp:inline distT="0" distB="0" distL="0" distR="0" wp14:anchorId="359621B2" wp14:editId="6ECE6096">
+            <wp:extent cx="4686300" cy="2434529"/>
+            <wp:effectExtent l="19050" t="19050" r="0" b="4445"/>
+            <wp:docPr id="284741619" name="Picture 1" descr="A graph with lines and dots&#10;&#10;Description automatically generated with medium confidence"/>
+            <wp:cNvGraphicFramePr>
+              <a:graphicFrameLocks xmlns:a="http://schemas.openxmlformats.org/drawingml/2006/main" noChangeAspect="1"/>
+            </wp:cNvGraphicFramePr>
+            <a:graphic xmlns:a="http://schemas.openxmlformats.org/drawingml/2006/main">
+              <a:graphicData uri="http://schemas.openxmlformats.org/drawingml/2006/picture">
+                <pic:pic xmlns:pic="http://schemas.openxmlformats.org/drawingml/2006/picture">
+                  <pic:nvPicPr>
+                    <pic:cNvPr id="284741619" name="Picture 1" descr="A graph with lines and dots&#10;&#10;Description automatically generated with medium confidence"/>
+                    <pic:cNvPicPr/>
+                  </pic:nvPicPr>
+                  <pic:blipFill>
+                    <a:blip r:embed="rId33"/>
+                    <a:stretch>
+                      <a:fillRect/>
+                    </a:stretch>
+                  </pic:blipFill>
+                  <pic:spPr>
+                    <a:xfrm>
+                      <a:off x="0" y="0"/>
+                      <a:ext cx="4697001" cy="2440088"/>
+                    </a:xfrm>
+                    <a:prstGeom prst="rect">
+                      <a:avLst/>
+                    </a:prstGeom>
+                    <a:ln>
+                      <a:solidFill>
+                        <a:schemeClr val="tx1"/>
+                      </a:solidFill>
+                    </a:ln>
+                  </pic:spPr>
+                </pic:pic>
+              </a:graphicData>
+            </a:graphic>
+          </wp:inline>
+        </w:drawing>
+      </w:r>
+      <w:r>
+        <w:rPr>
+          <w:noProof/>
+        </w:rPr>
+        <w:drawing>
+          <wp:inline distT="0" distB="0" distL="0" distR="0" wp14:anchorId="3B694F6A" wp14:editId="753DE4BC">
+            <wp:extent cx="4667250" cy="2480479"/>
+            <wp:effectExtent l="19050" t="19050" r="0" b="0"/>
+            <wp:docPr id="1068259703" name="Picture 1" descr="A white grid with black squares and lines&#10;&#10;Description automatically generated"/>
+            <wp:cNvGraphicFramePr>
+              <a:graphicFrameLocks xmlns:a="http://schemas.openxmlformats.org/drawingml/2006/main" noChangeAspect="1"/>
+            </wp:cNvGraphicFramePr>
+            <a:graphic xmlns:a="http://schemas.openxmlformats.org/drawingml/2006/main">
+              <a:graphicData uri="http://schemas.openxmlformats.org/drawingml/2006/picture">
+                <pic:pic xmlns:pic="http://schemas.openxmlformats.org/drawingml/2006/picture">
+                  <pic:nvPicPr>
+                    <pic:cNvPr id="1068259703" name="Picture 1" descr="A white grid with black squares and lines&#10;&#10;Description automatically generated"/>
+                    <pic:cNvPicPr/>
+                  </pic:nvPicPr>
+                  <pic:blipFill>
+                    <a:blip r:embed="rId34"/>
+                    <a:stretch>
+                      <a:fillRect/>
+                    </a:stretch>
+                  </pic:blipFill>
+                  <pic:spPr>
+                    <a:xfrm>
+                      <a:off x="0" y="0"/>
+                      <a:ext cx="4679833" cy="2487166"/>
+                    </a:xfrm>
+                    <a:prstGeom prst="rect">
+                      <a:avLst/>
+                    </a:prstGeom>
+                    <a:ln>
+                      <a:solidFill>
+                        <a:schemeClr val="tx1"/>
+                      </a:solidFill>
+                    </a:ln>
+                  </pic:spPr>
+                </pic:pic>
+              </a:graphicData>
+            </a:graphic>
+          </wp:inline>
+        </w:drawing>
+      </w:r>
+      <w:r>
+        <w:rPr>
+          <w:noProof/>
+        </w:rPr>
+        <w:drawing>
+          <wp:inline distT="0" distB="0" distL="0" distR="0" wp14:anchorId="31C7D051" wp14:editId="19E1E9E0">
+            <wp:extent cx="4686300" cy="2513967"/>
+            <wp:effectExtent l="19050" t="19050" r="0" b="635"/>
+            <wp:docPr id="2101035918" name="Picture 1" descr="A graph with lines and dots&#10;&#10;Description automatically generated"/>
+            <wp:cNvGraphicFramePr>
+              <a:graphicFrameLocks xmlns:a="http://schemas.openxmlformats.org/drawingml/2006/main" noChangeAspect="1"/>
+            </wp:cNvGraphicFramePr>
+            <a:graphic xmlns:a="http://schemas.openxmlformats.org/drawingml/2006/main">
+              <a:graphicData uri="http://schemas.openxmlformats.org/drawingml/2006/picture">
+                <pic:pic xmlns:pic="http://schemas.openxmlformats.org/drawingml/2006/picture">
+                  <pic:nvPicPr>
+                    <pic:cNvPr id="2101035918" name="Picture 1" descr="A graph with lines and dots&#10;&#10;Description automatically generated"/>
+                    <pic:cNvPicPr/>
+                  </pic:nvPicPr>
+                  <pic:blipFill>
+                    <a:blip r:embed="rId35"/>
+                    <a:stretch>
+                      <a:fillRect/>
+                    </a:stretch>
+                  </pic:blipFill>
+                  <pic:spPr>
+                    <a:xfrm>
+                      <a:off x="0" y="0"/>
+                      <a:ext cx="4711633" cy="2527557"/>
+                    </a:xfrm>
+                    <a:prstGeom prst="rect">
+                      <a:avLst/>
+                    </a:prstGeom>
+                    <a:ln>
+                      <a:solidFill>
+                        <a:schemeClr val="tx1"/>
+                      </a:solidFill>
+                    </a:ln>
+                  </pic:spPr>
+                </pic:pic>
+              </a:graphicData>
+            </a:graphic>
+          </wp:inline>
+        </w:drawing>
+      </w:r>
+    </w:p>
+    <w:p>
+      <w:pPr>
+        <w:jc w:val="center"/>
+        <w:rPr>
+          <w:sz w:val="22"/>
+          <w:szCs w:val="18"/>
+        </w:rPr>
+      </w:pPr>
+      <w:r>
+        <w:rPr>
+          <w:b/>
+          <w:bCs/>
+          <w:sz w:val="22"/>
+          <w:szCs w:val="18"/>
+        </w:rPr>
+        <w:t xml:space="preserve">Figure 16. </w:t>
+      </w:r>
+      <w:r>
+        <w:rPr>
+          <w:sz w:val="22"/>
+          <w:szCs w:val="18"/>
+        </w:rPr>
+        <w:t>boxplots of the run times for each search method and algorithm in Python</w:t>
+      </w:r>
+    </w:p>
+    <w:p>
+      <w:pPr>
+        <w:rPr>
+          <w:sz w:val="22"/>
+          <w:szCs w:val="18"/>
+        </w:rPr>
+      </w:pPr>
+      <w:r>
+        <w:rPr>
+          <w:sz w:val="22"/>
+          <w:szCs w:val="18"/>
+        </w:rPr>
+        <w:t xml:space="preserve">Secondly, </w:t>
+      </w:r>
+      <w:r>
+        <w:rPr>
+          <w:sz w:val="22"/>
+          <w:szCs w:val="18"/>
+        </w:rPr>
+        <w:t>regarding</w:t>
+      </w:r>
+      <w:r>
+        <w:rPr>
+          <w:sz w:val="22"/>
+          <w:szCs w:val="18"/>
+        </w:rPr>
+        <w:t xml:space="preserve"> the suggestion numbers </w:t>
+      </w:r>
+      <w:r>
+        <w:rPr>
+          <w:sz w:val="22"/>
+          <w:szCs w:val="18"/>
+        </w:rPr>
+        <w:t xml:space="preserve">the search methods once again don’t have a baring on the results. </w:t>
+      </w:r>
+      <w:r>
+        <w:rPr>
+          <w:sz w:val="22"/>
+          <w:szCs w:val="18"/>
+        </w:rPr>
+        <w:t>So,</w:t>
+      </w:r>
+      <w:r>
+        <w:rPr>
+          <w:sz w:val="22"/>
+          <w:szCs w:val="18"/>
+        </w:rPr>
+        <w:t xml:space="preserve"> when looking a</w:t>
+      </w:r>
+      <w:r>
+        <w:rPr>
+          <w:sz w:val="22"/>
+          <w:szCs w:val="18"/>
+        </w:rPr>
+        <w:t xml:space="preserve">cross the algorithms their numbers indicate that </w:t>
+      </w:r>
+      <w:r>
+        <w:rPr>
+          <w:sz w:val="22"/>
+          <w:szCs w:val="18"/>
+        </w:rPr>
+        <w:lastRenderedPageBreak/>
+        <w:t xml:space="preserve">apart from </w:t>
+      </w:r>
+      <w:r>
+        <w:rPr>
+          <w:sz w:val="22"/>
+          <w:szCs w:val="18"/>
+        </w:rPr>
+        <w:t>Sørensen–Dice</w:t>
+      </w:r>
+      <w:r>
+        <w:rPr>
+          <w:sz w:val="22"/>
+          <w:szCs w:val="18"/>
+        </w:rPr>
+        <w:t xml:space="preserve"> they all average at 1, so they are all very likely to give the correct spelling to a typo as their first suggestion. The only major difference between this and the C code’s performance is that regarding the Optimal String Alignment Algorithm (OSA). Unlike the personally developed version, the strsimpy python function seems to be more correct as shown by the fact that its average and IQR are the same as many of the others. This could be indicative of the fact that the version of OSA is more correct than the C alternative and is therefore able to produce better results.</w:t>
+      </w:r>
+    </w:p>
+    <w:p>
+      <w:pPr>
+        <w:jc w:val="center"/>
+        <w:rPr>
+          <w:b/>
+          <w:bCs/>
+          <w:sz w:val="22"/>
+          <w:szCs w:val="18"/>
+        </w:rPr>
+      </w:pPr>
+      <w:r>
+        <w:rPr>
+          <w:noProof/>
+        </w:rPr>
+        <w:drawing>
+          <wp:inline distT="0" distB="0" distL="0" distR="0" wp14:anchorId="5A2A7B3E" wp14:editId="01AE1568">
+            <wp:extent cx="4048201" cy="2176592"/>
+            <wp:effectExtent l="19050" t="19050" r="0" b="0"/>
+            <wp:docPr id="1100437666" name="Picture 1" descr="A graph of a graph&#10;&#10;Description automatically generated with medium confidence"/>
+            <wp:cNvGraphicFramePr>
+              <a:graphicFrameLocks xmlns:a="http://schemas.openxmlformats.org/drawingml/2006/main" noChangeAspect="1"/>
+            </wp:cNvGraphicFramePr>
+            <a:graphic xmlns:a="http://schemas.openxmlformats.org/drawingml/2006/main">
+              <a:graphicData uri="http://schemas.openxmlformats.org/drawingml/2006/picture">
+                <pic:pic xmlns:pic="http://schemas.openxmlformats.org/drawingml/2006/picture">
+                  <pic:nvPicPr>
+                    <pic:cNvPr id="1100437666" name="Picture 1" descr="A graph of a graph&#10;&#10;Description automatically generated with medium confidence"/>
+                    <pic:cNvPicPr/>
+                  </pic:nvPicPr>
+                  <pic:blipFill>
+                    <a:blip r:embed="rId36"/>
+                    <a:stretch>
+                      <a:fillRect/>
+                    </a:stretch>
+                  </pic:blipFill>
+                  <pic:spPr>
+                    <a:xfrm>
+                      <a:off x="0" y="0"/>
+                      <a:ext cx="4073733" cy="2190320"/>
+                    </a:xfrm>
+                    <a:prstGeom prst="rect">
+                      <a:avLst/>
+                    </a:prstGeom>
+                    <a:ln>
+                      <a:solidFill>
+                        <a:schemeClr val="tx1"/>
+                      </a:solidFill>
+                    </a:ln>
+                  </pic:spPr>
+                </pic:pic>
+              </a:graphicData>
+            </a:graphic>
+          </wp:inline>
+        </w:drawing>
+      </w:r>
+      <w:r>
+        <w:rPr>
+          <w:noProof/>
+        </w:rPr>
+        <w:drawing>
+          <wp:inline distT="0" distB="0" distL="0" distR="0" wp14:anchorId="4E630190" wp14:editId="3B7934CF">
+            <wp:extent cx="4048201" cy="2152373"/>
+            <wp:effectExtent l="19050" t="19050" r="0" b="635"/>
+            <wp:docPr id="1247826410" name="Picture 1" descr="A graph with lines and numbers&#10;&#10;Description automatically generated"/>
+            <wp:cNvGraphicFramePr>
+              <a:graphicFrameLocks xmlns:a="http://schemas.openxmlformats.org/drawingml/2006/main" noChangeAspect="1"/>
+            </wp:cNvGraphicFramePr>
+            <a:graphic xmlns:a="http://schemas.openxmlformats.org/drawingml/2006/main">
+              <a:graphicData uri="http://schemas.openxmlformats.org/drawingml/2006/picture">
+                <pic:pic xmlns:pic="http://schemas.openxmlformats.org/drawingml/2006/picture">
+                  <pic:nvPicPr>
+                    <pic:cNvPr id="1247826410" name="Picture 1" descr="A graph with lines and numbers&#10;&#10;Description automatically generated"/>
+                    <pic:cNvPicPr/>
+                  </pic:nvPicPr>
+                  <pic:blipFill>
+                    <a:blip r:embed="rId37"/>
+                    <a:stretch>
+                      <a:fillRect/>
+                    </a:stretch>
+                  </pic:blipFill>
+                  <pic:spPr>
+                    <a:xfrm>
+                      <a:off x="0" y="0"/>
+                      <a:ext cx="4081138" cy="2169885"/>
+                    </a:xfrm>
+                    <a:prstGeom prst="rect">
+                      <a:avLst/>
+                    </a:prstGeom>
+                    <a:ln>
+                      <a:solidFill>
+                        <a:schemeClr val="tx1"/>
+                      </a:solidFill>
+                    </a:ln>
+                  </pic:spPr>
+                </pic:pic>
+              </a:graphicData>
+            </a:graphic>
+          </wp:inline>
+        </w:drawing>
+      </w:r>
+      <w:r>
+        <w:rPr>
+          <w:noProof/>
+        </w:rPr>
+        <w:drawing>
+          <wp:inline distT="0" distB="0" distL="0" distR="0" wp14:anchorId="3EE1AE51" wp14:editId="67748C07">
+            <wp:extent cx="4048201" cy="2140263"/>
+            <wp:effectExtent l="19050" t="19050" r="0" b="0"/>
+            <wp:docPr id="1643255959" name="Picture 1" descr="A graph with lines and numbers&#10;&#10;Description automatically generated"/>
+            <wp:cNvGraphicFramePr>
+              <a:graphicFrameLocks xmlns:a="http://schemas.openxmlformats.org/drawingml/2006/main" noChangeAspect="1"/>
+            </wp:cNvGraphicFramePr>
+            <a:graphic xmlns:a="http://schemas.openxmlformats.org/drawingml/2006/main">
+              <a:graphicData uri="http://schemas.openxmlformats.org/drawingml/2006/picture">
+                <pic:pic xmlns:pic="http://schemas.openxmlformats.org/drawingml/2006/picture">
+                  <pic:nvPicPr>
+                    <pic:cNvPr id="1643255959" name="Picture 1" descr="A graph with lines and numbers&#10;&#10;Description automatically generated"/>
+                    <pic:cNvPicPr/>
+                  </pic:nvPicPr>
+                  <pic:blipFill>
+                    <a:blip r:embed="rId38"/>
+                    <a:stretch>
+                      <a:fillRect/>
+                    </a:stretch>
+                  </pic:blipFill>
+                  <pic:spPr>
+                    <a:xfrm>
+                      <a:off x="0" y="0"/>
+                      <a:ext cx="4078983" cy="2156537"/>
+                    </a:xfrm>
+                    <a:prstGeom prst="rect">
+                      <a:avLst/>
+                    </a:prstGeom>
+                    <a:ln>
+                      <a:solidFill>
+                        <a:schemeClr val="tx1"/>
+                      </a:solidFill>
+                    </a:ln>
+                  </pic:spPr>
+                </pic:pic>
+              </a:graphicData>
+            </a:graphic>
+          </wp:inline>
+        </w:drawing>
+      </w:r>
+    </w:p>
+    <w:p>
+      <w:pPr>
+        <w:jc w:val="center"/>
+        <w:rPr>
+          <w:sz w:val="22"/>
+          <w:szCs w:val="18"/>
+        </w:rPr>
+      </w:pPr>
+      <w:r>
+        <w:rPr>
+          <w:b/>
+          <w:bCs/>
+          <w:sz w:val="22"/>
+          <w:szCs w:val="18"/>
+        </w:rPr>
+        <w:t xml:space="preserve">Figure 17. </w:t>
+      </w:r>
+      <w:r>
+        <w:rPr>
+          <w:sz w:val="22"/>
+          <w:szCs w:val="18"/>
+        </w:rPr>
+        <w:t>Boxplots of the suggestion numbers for each search method and algorithm in Python</w:t>
+      </w:r>
+    </w:p>
+    <w:p>
+      <w:pPr>
+        <w:jc w:val="center"/>
+        <w:rPr>
+          <w:b/>
+          <w:bCs/>
+          <w:sz w:val="22"/>
+          <w:szCs w:val="18"/>
+        </w:rPr>
+      </w:pPr>
+    </w:p>
+    <w:p>
+      <w:pPr>
+        <w:jc w:val="center"/>
+        <w:rPr>
+          <w:b/>
+          <w:bCs/>
+          <w:sz w:val="22"/>
+          <w:szCs w:val="18"/>
+        </w:rPr>
+      </w:pPr>
+      <w:r>
+        <w:rPr>
+          <w:noProof/>
+        </w:rPr>
+        <w:drawing>
+          <wp:inline distT="0" distB="0" distL="0" distR="0" wp14:anchorId="59C4BCC5" wp14:editId="247FEFC9">
+            <wp:extent cx="3876675" cy="2184012"/>
+            <wp:effectExtent l="19050" t="19050" r="0" b="6985"/>
+            <wp:docPr id="1040751961" name="Picture 1" descr="A group of pie charts&#10;&#10;Description automatically generated"/>
+            <wp:cNvGraphicFramePr>
+              <a:graphicFrameLocks xmlns:a="http://schemas.openxmlformats.org/drawingml/2006/main" noChangeAspect="1"/>
+            </wp:cNvGraphicFramePr>
+            <a:graphic xmlns:a="http://schemas.openxmlformats.org/drawingml/2006/main">
+              <a:graphicData uri="http://schemas.openxmlformats.org/drawingml/2006/picture">
+                <pic:pic xmlns:pic="http://schemas.openxmlformats.org/drawingml/2006/picture">
+                  <pic:nvPicPr>
+                    <pic:cNvPr id="1040751961" name="Picture 1" descr="A group of pie charts&#10;&#10;Description automatically generated"/>
+                    <pic:cNvPicPr/>
+                  </pic:nvPicPr>
+                  <pic:blipFill>
+                    <a:blip r:embed="rId39"/>
+                    <a:stretch>
+                      <a:fillRect/>
+                    </a:stretch>
+                  </pic:blipFill>
+                  <pic:spPr>
+                    <a:xfrm>
+                      <a:off x="0" y="0"/>
+                      <a:ext cx="3882526" cy="2187308"/>
+                    </a:xfrm>
+                    <a:prstGeom prst="rect">
+                      <a:avLst/>
+                    </a:prstGeom>
+                    <a:ln>
+                      <a:solidFill>
+                        <a:schemeClr val="tx1"/>
+                      </a:solidFill>
+                    </a:ln>
+                  </pic:spPr>
+                </pic:pic>
+              </a:graphicData>
+            </a:graphic>
+          </wp:inline>
+        </w:drawing>
+      </w:r>
+      <w:r>
+        <w:rPr>
+          <w:noProof/>
+        </w:rPr>
+        <w:drawing>
+          <wp:inline distT="0" distB="0" distL="0" distR="0" wp14:anchorId="1DA49438" wp14:editId="28965149">
+            <wp:extent cx="3905250" cy="2273664"/>
+            <wp:effectExtent l="19050" t="19050" r="0" b="0"/>
+            <wp:docPr id="1122775891" name="Picture 1" descr="A group of pie charts&#10;&#10;Description automatically generated"/>
+            <wp:cNvGraphicFramePr>
+              <a:graphicFrameLocks xmlns:a="http://schemas.openxmlformats.org/drawingml/2006/main" noChangeAspect="1"/>
+            </wp:cNvGraphicFramePr>
+            <a:graphic xmlns:a="http://schemas.openxmlformats.org/drawingml/2006/main">
+              <a:graphicData uri="http://schemas.openxmlformats.org/drawingml/2006/picture">
+                <pic:pic xmlns:pic="http://schemas.openxmlformats.org/drawingml/2006/picture">
+                  <pic:nvPicPr>
+                    <pic:cNvPr id="1122775891" name="Picture 1" descr="A group of pie charts&#10;&#10;Description automatically generated"/>
+                    <pic:cNvPicPr/>
+                  </pic:nvPicPr>
+                  <pic:blipFill>
+                    <a:blip r:embed="rId40"/>
+                    <a:stretch>
+                      <a:fillRect/>
+                    </a:stretch>
+                  </pic:blipFill>
+                  <pic:spPr>
+                    <a:xfrm>
+                      <a:off x="0" y="0"/>
+                      <a:ext cx="3923042" cy="2284023"/>
+                    </a:xfrm>
+                    <a:prstGeom prst="rect">
+                      <a:avLst/>
+                    </a:prstGeom>
+                    <a:ln>
+                      <a:solidFill>
+                        <a:schemeClr val="tx1"/>
+                      </a:solidFill>
+                    </a:ln>
+                  </pic:spPr>
+                </pic:pic>
+              </a:graphicData>
+            </a:graphic>
+          </wp:inline>
+        </w:drawing>
+      </w:r>
+      <w:r>
+        <w:rPr>
+          <w:noProof/>
+        </w:rPr>
+        <w:drawing>
+          <wp:inline distT="0" distB="0" distL="0" distR="0" wp14:anchorId="6A96A76C" wp14:editId="6AE6EC00">
+            <wp:extent cx="3924300" cy="2185626"/>
+            <wp:effectExtent l="19050" t="19050" r="0" b="5715"/>
+            <wp:docPr id="2125513548" name="Picture 1" descr="A group of pie charts&#10;&#10;Description automatically generated"/>
+            <wp:cNvGraphicFramePr>
+              <a:graphicFrameLocks xmlns:a="http://schemas.openxmlformats.org/drawingml/2006/main" noChangeAspect="1"/>
+            </wp:cNvGraphicFramePr>
+            <a:graphic xmlns:a="http://schemas.openxmlformats.org/drawingml/2006/main">
+              <a:graphicData uri="http://schemas.openxmlformats.org/drawingml/2006/picture">
+                <pic:pic xmlns:pic="http://schemas.openxmlformats.org/drawingml/2006/picture">
+                  <pic:nvPicPr>
+                    <pic:cNvPr id="2125513548" name="Picture 1" descr="A group of pie charts&#10;&#10;Description automatically generated"/>
+                    <pic:cNvPicPr/>
+                  </pic:nvPicPr>
+                  <pic:blipFill>
+                    <a:blip r:embed="rId41"/>
+                    <a:stretch>
+                      <a:fillRect/>
+                    </a:stretch>
+                  </pic:blipFill>
+                  <pic:spPr>
+                    <a:xfrm>
+                      <a:off x="0" y="0"/>
+                      <a:ext cx="3950144" cy="2200020"/>
+                    </a:xfrm>
+                    <a:prstGeom prst="rect">
+                      <a:avLst/>
+                    </a:prstGeom>
+                    <a:ln>
+                      <a:solidFill>
+                        <a:schemeClr val="tx1"/>
+                      </a:solidFill>
+                    </a:ln>
+                  </pic:spPr>
+                </pic:pic>
+              </a:graphicData>
+            </a:graphic>
+          </wp:inline>
+        </w:drawing>
+      </w:r>
+    </w:p>
+    <w:p>
+      <w:pPr>
+        <w:jc w:val="center"/>
+        <w:rPr>
+          <w:sz w:val="22"/>
+          <w:szCs w:val="18"/>
+        </w:rPr>
+      </w:pPr>
+      <w:r>
+        <w:rPr>
+          <w:b/>
+          <w:bCs/>
+          <w:sz w:val="22"/>
+          <w:szCs w:val="18"/>
+        </w:rPr>
+        <w:t>Figure 18.</w:t>
+      </w:r>
+      <w:r>
+        <w:rPr>
+          <w:b/>
+          <w:bCs/>
+          <w:sz w:val="22"/>
+          <w:szCs w:val="18"/>
+        </w:rPr>
+        <w:t xml:space="preserve"> </w:t>
+      </w:r>
+      <w:r>
+        <w:rPr>
+          <w:sz w:val="22"/>
+          <w:szCs w:val="18"/>
+        </w:rPr>
+        <w:t xml:space="preserve">Pie Chars showing the ratios of misses to non-misses for each search method and algorithm in </w:t>
+      </w:r>
+      <w:r>
+        <w:rPr>
+          <w:sz w:val="22"/>
+          <w:szCs w:val="18"/>
+        </w:rPr>
+        <w:t>Python.</w:t>
+      </w:r>
+    </w:p>
+    <w:p>
+      <w:pPr>
+        <w:rPr>
+          <w:sz w:val="22"/>
+          <w:szCs w:val="18"/>
+        </w:rPr>
+      </w:pPr>
+      <w:r>
+        <w:rPr>
+          <w:sz w:val="22"/>
+          <w:szCs w:val="18"/>
+        </w:rPr>
+        <w:t xml:space="preserve">Finally, we look at the miss and non-miss counts from figure 18. </w:t>
+      </w:r>
+      <w:r>
+        <w:rPr>
+          <w:sz w:val="22"/>
+          <w:szCs w:val="18"/>
+        </w:rPr>
+        <w:t>Here, the search methods do seem to affect the percentage of misses to non-misses in a small way, with the ratios of missed being lowest with linear searching and higher with binary searching. This could be indicative of some small errors in implementation or perhaps an element of uncontrollable randomness regarding how the data results are collected.</w:t>
+      </w:r>
+    </w:p>
+    <w:p>
+      <w:pPr>
+        <w:rPr>
+          <w:sz w:val="22"/>
+          <w:szCs w:val="18"/>
+        </w:rPr>
+      </w:pPr>
+      <w:r>
+        <w:rPr>
+          <w:sz w:val="22"/>
+          <w:szCs w:val="18"/>
+        </w:rPr>
+        <w:lastRenderedPageBreak/>
+        <w:t>Then, comparing each algorithm we can assess a major difference with the OSA algorithm again. I the C version it had the highest miss rate of all the algorithms, whereas here it has a ratio like those of Levenshtein and such. This further reinforces the idea that this Python implementation of OSA is better and gives more accurate readings.</w:t>
+      </w:r>
+    </w:p>
+    <w:p>
+      <w:pPr>
+        <w:rPr>
+          <w:sz w:val="22"/>
+          <w:szCs w:val="18"/>
+        </w:rPr>
+      </w:pPr>
+      <w:r>
+        <w:rPr>
+          <w:sz w:val="22"/>
+          <w:szCs w:val="18"/>
+        </w:rPr>
+        <w:t>Despite that, the general trend of ratios for the other algorithms are like that of the C program. Now, the worst algorithm is Hamming Distance, which is limited like before due to its specificity of needing strings of equal length to work, discarding all others in the process. However, the difference between the other algorithms is very small with each having a very similar number of misses to non-misses. This makes it a lot harder to dedicate a strictly better choice. But it can be said that Jaro-Winkler is the most consistent algorithm across the three search methods, with a high non-miss score that indicates that it is one of the better algorithms for finding the correct spelling of the word you were trying to search for.</w:t>
+      </w:r>
     </w:p>
     <w:p/>
     <w:p>
@@ -9055,28 +11102,6 @@
     </w:p>
     <w:p>
       <w:pPr>
-        <w:rPr>
-          <w:sz w:val="22"/>
-          <w:szCs w:val="22"/>
-        </w:rPr>
-      </w:pPr>
-      <w:r>
-        <w:rPr>
-          <w:sz w:val="22"/>
-          <w:szCs w:val="22"/>
-        </w:rPr>
-        <w:t>&lt;</w:t>
-      </w:r>
-      <w:r>
-        <w:rPr>
-          <w:sz w:val="22"/>
-          <w:szCs w:val="22"/>
-        </w:rPr>
-        <w:t>Everything that comes under the `Results and Discussion' criterion in the mark scheme that has not been addressed in an earlier chapter should be included in this final chapter. The following section headings are suggestions only.&gt;</w:t>
-      </w:r>
-    </w:p>
-    <w:p>
-      <w:pPr>
         <w:pStyle w:val="Heading2"/>
       </w:pPr>
       <w:r>
@@ -9105,7 +11130,36 @@
           <w:sz w:val="22"/>
           <w:szCs w:val="18"/>
         </w:rPr>
-        <w:t xml:space="preserve">. That would involve an automatic check on each new word parsed but the corpus extractor, which would reduce the inflected string down to its root. Without needed to store all this extra data, and disregarding the </w:t>
+        <w:t>. That would involve an automatic check on each new word parsed but the corpus extractor, which would reduce the inflected string down to its root. Without needed to store all this extra data,</w:t>
+      </w:r>
+      <w:r>
+        <w:rPr>
+          <w:sz w:val="22"/>
+          <w:szCs w:val="18"/>
+        </w:rPr>
+        <w:t xml:space="preserve"> the number of words that would have needed to be stored could have been cut drastically and greatly improved the performance of the systems.</w:t>
+      </w:r>
+    </w:p>
+    <w:p>
+      <w:pPr>
+        <w:rPr>
+          <w:sz w:val="22"/>
+          <w:szCs w:val="18"/>
+        </w:rPr>
+      </w:pPr>
+      <w:r>
+        <w:rPr>
+          <w:sz w:val="22"/>
+          <w:szCs w:val="18"/>
+        </w:rPr>
+        <w:t xml:space="preserve">The overall project could have also benefited from the development of a basic natural language processor. This could have also included checks on grammar and word types, which could also be assessing in real time. </w:t>
+      </w:r>
+      <w:r>
+        <w:rPr>
+          <w:sz w:val="22"/>
+          <w:szCs w:val="18"/>
+        </w:rPr>
+        <w:t>This would have put the algorithms to the test in correcting typos from sentences and texts of large amounts of words to better simulate an actual spell checker program.</w:t>
       </w:r>
     </w:p>
     <w:p>
@@ -9135,6 +11189,20 @@
           <w:szCs w:val="22"/>
         </w:rPr>
         <w:t>In the end it is clear to say that the C program was the better choice when looking at the performance of the algorithms</w:t>
+      </w:r>
+      <w:r>
+        <w:rPr>
+          <w:sz w:val="22"/>
+          <w:szCs w:val="22"/>
+        </w:rPr>
+        <w:t>. With one of the metrics being runtime, without a doubt the compiled nature of C gave it an advantage that python didn’t have, which makes it the better choice for such an application. Then, when going specifically into the runtimes of each search method and algorithm, the logarithmic time complexity of the binary search made it apparent that it was the better choice</w:t>
+      </w:r>
+      <w:r>
+        <w:rPr>
+          <w:sz w:val="22"/>
+          <w:szCs w:val="22"/>
+        </w:rPr>
+        <w:t xml:space="preserve"> for speed, which therefore made it clear that a sorted dataset was also needed for optimal search speeds. </w:t>
       </w:r>
     </w:p>
     <w:p>
@@ -9229,7 +11297,25 @@
           <w:sz w:val="22"/>
           <w:szCs w:val="22"/>
         </w:rPr>
-        <w:t>It is expected that the list would reflect the breadth and depth of scholarly research undertaken by the student during the course of the project.</w:t>
+        <w:t xml:space="preserve">It is expected that the list would reflect the breadth and depth of scholarly research undertaken by the student </w:t>
+      </w:r>
+      <w:proofErr w:type="gramStart"/>
+      <w:r>
+        <w:rPr>
+          <w:i/>
+          <w:sz w:val="22"/>
+          <w:szCs w:val="22"/>
+        </w:rPr>
+        <w:t>during the course of</w:t>
+      </w:r>
+      <w:proofErr w:type="gramEnd"/>
+      <w:r>
+        <w:rPr>
+          <w:i/>
+          <w:sz w:val="22"/>
+          <w:szCs w:val="22"/>
+        </w:rPr>
+        <w:t xml:space="preserve"> the project.</w:t>
       </w:r>
       <w:r>
         <w:rPr>
@@ -9266,7 +11352,7 @@
         </w:rPr>
         <w:t xml:space="preserve">. International Journal of Scientific and Research Publications [Accessed 18/03/24]. Available from: </w:t>
       </w:r>
-      <w:hyperlink r:id="rId24" w:history="1">
+      <w:hyperlink r:id="rId42" w:history="1">
         <w:r>
           <w:rPr>
             <w:rStyle w:val="Hyperlink"/>
@@ -9303,7 +11389,7 @@
         </w:rPr>
         <w:t xml:space="preserve">Nam, E, 2019. Understanding the Levenshtein Distance Equation for Beginners. [online]. [Accessed 18/03/24]. Available from: </w:t>
       </w:r>
-      <w:hyperlink r:id="rId25" w:history="1">
+      <w:hyperlink r:id="rId43" w:history="1">
         <w:r>
           <w:rPr>
             <w:rStyle w:val="Hyperlink"/>
@@ -9446,7 +11532,15 @@
         <w:pStyle w:val="Heading2"/>
       </w:pPr>
       <w:r>
-        <w:t>A.3 Legal, social, ethical and professional issues</w:t>
+        <w:t xml:space="preserve">A.3 Legal, social, </w:t>
+      </w:r>
+      <w:proofErr w:type="gramStart"/>
+      <w:r>
+        <w:t>ethical</w:t>
+      </w:r>
+      <w:proofErr w:type="gramEnd"/>
+      <w:r>
+        <w:t xml:space="preserve"> and professional issues</w:t>
       </w:r>
     </w:p>
     <w:p>
@@ -9684,7 +11778,23 @@
           <w:sz w:val="22"/>
           <w:szCs w:val="22"/>
         </w:rPr>
-        <w:t>&lt;This appendix should provide a brief record of materials used in the solution that are not the student's own work. Such materials might be pieces of codes made available from a research group/company or from the internet, datasets prepared by external users or any preliminary materials/drafts/notes provided by a supervisor. It should be clear what was used as ready-made components and what was developed as part of the project. This appendix should be included even if no external materials were used, in which case a statement to that effect is all that is required.&gt;</w:t>
+        <w:t xml:space="preserve">&lt;This appendix should provide a brief record of materials used in the solution that are not the student's own work. Such materials might be pieces of codes made available from a research group/company or from the internet, datasets prepared by external </w:t>
+      </w:r>
+      <w:proofErr w:type="gramStart"/>
+      <w:r>
+        <w:rPr>
+          <w:sz w:val="22"/>
+          <w:szCs w:val="22"/>
+        </w:rPr>
+        <w:t>users</w:t>
+      </w:r>
+      <w:proofErr w:type="gramEnd"/>
+      <w:r>
+        <w:rPr>
+          <w:sz w:val="22"/>
+          <w:szCs w:val="22"/>
+        </w:rPr>
+        <w:t xml:space="preserve"> or any preliminary materials/drafts/notes provided by a supervisor. It should be clear what was used as ready-made components and what was developed as part of the project. This appendix should be included even if no external materials were used, in which case a statement to that effect is all that is required.&gt;</w:t>
       </w:r>
     </w:p>
     <w:p>
@@ -9696,7 +11806,7 @@
       </w:pPr>
     </w:p>
     <w:sectPr>
-      <w:headerReference w:type="default" r:id="rId26"/>
+      <w:headerReference w:type="default" r:id="rId44"/>
       <w:footnotePr>
         <w:numRestart w:val="eachSect"/>
       </w:footnotePr>

</xml_diff>

<commit_message>
made changes to writeup
</commit_message>
<xml_diff>
--- a/project_writeup/FinalReportV1.docx
+++ b/project_writeup/FinalReportV1.docx
@@ -1478,7 +1478,23 @@
           <w:iCs/>
           <w:sz w:val="22"/>
         </w:rPr>
-        <w:t xml:space="preserve"> mention should be given to dwyl on GitHub, who provided the precompiled list of English words that were used by the prototype.</w:t>
+        <w:t xml:space="preserve"> mention should be given to </w:t>
+      </w:r>
+      <w:proofErr w:type="spellStart"/>
+      <w:r>
+        <w:rPr>
+          <w:iCs/>
+          <w:sz w:val="22"/>
+        </w:rPr>
+        <w:t>dwyl</w:t>
+      </w:r>
+      <w:proofErr w:type="spellEnd"/>
+      <w:r>
+        <w:rPr>
+          <w:iCs/>
+          <w:sz w:val="22"/>
+        </w:rPr>
+        <w:t xml:space="preserve"> on GitHub, who provided the precompiled list of English words that were used by the prototype.</w:t>
       </w:r>
     </w:p>
     <w:p>
@@ -2836,34 +2852,7 @@
         <w:rPr>
           <w:noProof/>
         </w:rPr>
-        <w:fldChar w:fldCharType="begin"/>
-      </w:r>
-      <w:r>
-        <w:rPr>
-          <w:noProof/>
-        </w:rPr>
-        <w:instrText xml:space="preserve"> PAGEREF _Toc407145096 \h </w:instrText>
-      </w:r>
-      <w:r>
-        <w:rPr>
-          <w:noProof/>
-        </w:rPr>
-        <w:fldChar w:fldCharType="separate"/>
-      </w:r>
-      <w:r>
-        <w:rPr>
-          <w:b/>
-          <w:bCs/>
-          <w:noProof/>
-          <w:lang w:val="en-US"/>
-        </w:rPr>
-        <w:t>Error! Bookmark not defined.</w:t>
-      </w:r>
-      <w:r>
-        <w:rPr>
-          <w:noProof/>
-        </w:rPr>
-        <w:fldChar w:fldCharType="end"/>
+        <w:t>2</w:t>
       </w:r>
       <w:r>
         <w:rPr>
@@ -2984,36 +2973,7 @@
         <w:rPr>
           <w:noProof/>
         </w:rPr>
-        <w:fldChar w:fldCharType="begin"/>
-      </w:r>
-      <w:r>
-        <w:rPr>
-          <w:noProof/>
-        </w:rPr>
-        <w:instrText xml:space="preserve"> PAGEREF _Toc407145094 \h </w:instrText>
-      </w:r>
-      <w:r>
-        <w:rPr>
-          <w:noProof/>
-        </w:rPr>
-      </w:r>
-      <w:r>
-        <w:rPr>
-          <w:noProof/>
-        </w:rPr>
-        <w:fldChar w:fldCharType="separate"/>
-      </w:r>
-      <w:r>
-        <w:rPr>
-          <w:noProof/>
-        </w:rPr>
-        <w:t>11</w:t>
-      </w:r>
-      <w:r>
-        <w:rPr>
-          <w:noProof/>
-        </w:rPr>
-        <w:fldChar w:fldCharType="end"/>
+        <w:t>2</w:t>
       </w:r>
       <w:r>
         <w:rPr>
@@ -3160,42 +3120,7 @@
         <w:rPr>
           <w:noProof/>
         </w:rPr>
-        <w:fldChar w:fldCharType="begin"/>
-      </w:r>
-      <w:r>
-        <w:rPr>
-          <w:noProof/>
-        </w:rPr>
-        <w:instrText xml:space="preserve"> PAGEREF _Toc407145097 \h </w:instrText>
-      </w:r>
-      <w:r>
-        <w:rPr>
-          <w:noProof/>
-        </w:rPr>
-      </w:r>
-      <w:r>
-        <w:rPr>
-          <w:noProof/>
-        </w:rPr>
-        <w:fldChar w:fldCharType="separate"/>
-      </w:r>
-      <w:r>
-        <w:rPr>
-          <w:noProof/>
-        </w:rPr>
-        <w:t>29</w:t>
-      </w:r>
-      <w:r>
-        <w:rPr>
-          <w:noProof/>
-        </w:rPr>
-        <w:fldChar w:fldCharType="end"/>
-      </w:r>
-      <w:r>
-        <w:rPr>
-          <w:noProof/>
-        </w:rPr>
-        <w:t>1</w:t>
+        <w:t>31</w:t>
       </w:r>
     </w:p>
     <w:p>
@@ -6410,7 +6335,21 @@
           <w:sz w:val="22"/>
           <w:szCs w:val="22"/>
         </w:rPr>
-        <w:t>1.2.4  Jaro Distance</w:t>
+        <w:t>1.2.</w:t>
+      </w:r>
+      <w:r>
+        <w:rPr>
+          <w:sz w:val="22"/>
+          <w:szCs w:val="22"/>
+        </w:rPr>
+        <w:t>6</w:t>
+      </w:r>
+      <w:r>
+        <w:rPr>
+          <w:sz w:val="22"/>
+          <w:szCs w:val="22"/>
+        </w:rPr>
+        <w:t xml:space="preserve">  Jaro Distance</w:t>
       </w:r>
     </w:p>
     <w:p>
@@ -7423,7 +7362,21 @@
           <w:sz w:val="22"/>
           <w:szCs w:val="22"/>
         </w:rPr>
-        <w:t>1.2.4  Jaro-Winkler Distance</w:t>
+        <w:t>1.2.</w:t>
+      </w:r>
+      <w:r>
+        <w:rPr>
+          <w:sz w:val="22"/>
+          <w:szCs w:val="22"/>
+        </w:rPr>
+        <w:t>7</w:t>
+      </w:r>
+      <w:r>
+        <w:rPr>
+          <w:sz w:val="22"/>
+          <w:szCs w:val="22"/>
+        </w:rPr>
+        <w:t xml:space="preserve">  Jaro-Winkler Distance</w:t>
       </w:r>
     </w:p>
     <w:p>
@@ -8207,7 +8160,21 @@
           <w:sz w:val="22"/>
           <w:szCs w:val="22"/>
         </w:rPr>
-        <w:t>1.3.1  Binary Search</w:t>
+        <w:t>1.3.</w:t>
+      </w:r>
+      <w:r>
+        <w:rPr>
+          <w:sz w:val="22"/>
+          <w:szCs w:val="22"/>
+        </w:rPr>
+        <w:t>2</w:t>
+      </w:r>
+      <w:r>
+        <w:rPr>
+          <w:sz w:val="22"/>
+          <w:szCs w:val="22"/>
+        </w:rPr>
+        <w:t xml:space="preserve">  Binary Search</w:t>
       </w:r>
     </w:p>
     <w:p>
@@ -8281,7 +8248,21 @@
           <w:sz w:val="22"/>
           <w:szCs w:val="16"/>
         </w:rPr>
-        <w:t>1.3.1  Hash Tables and Linked Lists</w:t>
+        <w:t>1.3.</w:t>
+      </w:r>
+      <w:r>
+        <w:rPr>
+          <w:sz w:val="22"/>
+          <w:szCs w:val="16"/>
+        </w:rPr>
+        <w:t>3</w:t>
+      </w:r>
+      <w:r>
+        <w:rPr>
+          <w:sz w:val="22"/>
+          <w:szCs w:val="16"/>
+        </w:rPr>
+        <w:t xml:space="preserve">  Hash Tables and Linked Lists</w:t>
       </w:r>
     </w:p>
     <w:p>
@@ -9242,7 +9223,23 @@
           <w:sz w:val="22"/>
           <w:szCs w:val="22"/>
         </w:rPr>
-        <w:t xml:space="preserve">To save time on the developing a word file, a precompiled dictionary was sourced from GitHub user dwyl [4]. </w:t>
+        <w:t xml:space="preserve">To save time on the developing a word file, a precompiled dictionary was sourced from GitHub user </w:t>
+      </w:r>
+      <w:proofErr w:type="spellStart"/>
+      <w:r>
+        <w:rPr>
+          <w:sz w:val="22"/>
+          <w:szCs w:val="22"/>
+        </w:rPr>
+        <w:t>dwyl</w:t>
+      </w:r>
+      <w:proofErr w:type="spellEnd"/>
+      <w:r>
+        <w:rPr>
+          <w:sz w:val="22"/>
+          <w:szCs w:val="22"/>
+        </w:rPr>
+        <w:t xml:space="preserve"> [4]. </w:t>
       </w:r>
       <w:r>
         <w:rPr>
@@ -13417,14 +13414,28 @@
           <w:sz w:val="22"/>
           <w:szCs w:val="18"/>
         </w:rPr>
-        <w:t xml:space="preserve"> Runtimes for C program with each search method and algorithm</w:t>
-      </w:r>
-      <w:r>
-        <w:rPr>
-          <w:sz w:val="22"/>
-          <w:szCs w:val="18"/>
-        </w:rPr>
-        <w:t xml:space="preserve"> in C</w:t>
+        <w:t xml:space="preserve"> </w:t>
+      </w:r>
+      <w:r>
+        <w:rPr>
+          <w:sz w:val="22"/>
+          <w:szCs w:val="18"/>
+        </w:rPr>
+        <w:t>Boxplots of r</w:t>
+      </w:r>
+      <w:r>
+        <w:rPr>
+          <w:sz w:val="22"/>
+          <w:szCs w:val="18"/>
+        </w:rPr>
+        <w:t>untimes for C program with each search method and algor</w:t>
+      </w:r>
+      <w:r>
+        <w:rPr>
+          <w:sz w:val="22"/>
+          <w:szCs w:val="18"/>
+        </w:rPr>
+        <w:t>ithm</w:t>
       </w:r>
     </w:p>
     <w:p>
@@ -13601,7 +13612,21 @@
           <w:sz w:val="22"/>
           <w:szCs w:val="18"/>
         </w:rPr>
-        <w:t xml:space="preserve"> Comparison of suggestion numbers with </w:t>
+        <w:t xml:space="preserve"> </w:t>
+      </w:r>
+      <w:r>
+        <w:rPr>
+          <w:sz w:val="22"/>
+          <w:szCs w:val="18"/>
+        </w:rPr>
+        <w:t>Boxplots for the c</w:t>
+      </w:r>
+      <w:r>
+        <w:rPr>
+          <w:sz w:val="22"/>
+          <w:szCs w:val="18"/>
+        </w:rPr>
+        <w:t xml:space="preserve">omparison of suggestion numbers with </w:t>
       </w:r>
       <w:r>
         <w:rPr>
@@ -13637,7 +13662,15 @@
           <w:sz w:val="22"/>
           <w:szCs w:val="18"/>
         </w:rPr>
-        <w:t xml:space="preserve"> suggestions the correct spelling for a misspelled word was. </w:t>
+        <w:t xml:space="preserve"> suggestions the correct spelling </w:t>
+      </w:r>
+      <w:r>
+        <w:rPr>
+          <w:sz w:val="22"/>
+          <w:szCs w:val="18"/>
+        </w:rPr>
+        <w:lastRenderedPageBreak/>
+        <w:t xml:space="preserve">for a misspelled word was. </w:t>
       </w:r>
       <w:r>
         <w:rPr>
@@ -13679,15 +13712,7 @@
           <w:sz w:val="22"/>
           <w:szCs w:val="18"/>
         </w:rPr>
-        <w:t xml:space="preserve"> any given </w:t>
-      </w:r>
-      <w:r>
-        <w:rPr>
-          <w:sz w:val="22"/>
-          <w:szCs w:val="18"/>
-        </w:rPr>
-        <w:lastRenderedPageBreak/>
-        <w:t xml:space="preserve">misspelled word, its correct spelling was </w:t>
+        <w:t xml:space="preserve"> any given misspelled word, its correct spelling was </w:t>
       </w:r>
       <w:r>
         <w:rPr>
@@ -13994,7 +14019,21 @@
           <w:sz w:val="22"/>
           <w:szCs w:val="18"/>
         </w:rPr>
-        <w:t xml:space="preserve"> Comparison of the ratios of misses to non misses for each search method and </w:t>
+        <w:t xml:space="preserve"> </w:t>
+      </w:r>
+      <w:r>
+        <w:rPr>
+          <w:sz w:val="22"/>
+          <w:szCs w:val="18"/>
+        </w:rPr>
+        <w:t>Pie charts for the c</w:t>
+      </w:r>
+      <w:r>
+        <w:rPr>
+          <w:sz w:val="22"/>
+          <w:szCs w:val="18"/>
+        </w:rPr>
+        <w:t xml:space="preserve">omparison of the ratios of misses to non misses for each search method and </w:t>
       </w:r>
       <w:r>
         <w:rPr>
@@ -17385,12 +17424,21 @@
           <w:szCs w:val="22"/>
         </w:rPr>
       </w:pPr>
-      <w:r>
-        <w:rPr>
-          <w:sz w:val="22"/>
-          <w:szCs w:val="22"/>
-        </w:rPr>
-        <w:t xml:space="preserve">dwyl. 2023. English words files. [Online]. [Accessed </w:t>
+      <w:proofErr w:type="spellStart"/>
+      <w:r>
+        <w:rPr>
+          <w:sz w:val="22"/>
+          <w:szCs w:val="22"/>
+        </w:rPr>
+        <w:t>dwyl</w:t>
+      </w:r>
+      <w:proofErr w:type="spellEnd"/>
+      <w:r>
+        <w:rPr>
+          <w:sz w:val="22"/>
+          <w:szCs w:val="22"/>
+        </w:rPr>
+        <w:t xml:space="preserve">. 2023. English words files. [Online]. [Accessed </w:t>
       </w:r>
       <w:r>
         <w:rPr>
@@ -18904,7 +18952,23 @@
           <w:sz w:val="22"/>
           <w:szCs w:val="22"/>
         </w:rPr>
-        <w:t xml:space="preserve">The list of words for the prototype was retrieved from GitHub user dwyl at: </w:t>
+        <w:t xml:space="preserve">The list of words for the prototype was retrieved from GitHub user </w:t>
+      </w:r>
+      <w:proofErr w:type="spellStart"/>
+      <w:r>
+        <w:rPr>
+          <w:sz w:val="22"/>
+          <w:szCs w:val="22"/>
+        </w:rPr>
+        <w:t>dwyl</w:t>
+      </w:r>
+      <w:proofErr w:type="spellEnd"/>
+      <w:r>
+        <w:rPr>
+          <w:sz w:val="22"/>
+          <w:szCs w:val="22"/>
+        </w:rPr>
+        <w:t xml:space="preserve"> at: </w:t>
       </w:r>
       <w:hyperlink r:id="rId50" w:history="1">
         <w:r>

</xml_diff>